<commit_message>
Capítulo 3: contrato de fornecimento de hidrogênio
Parâmetros D^h2, D̄^h2 e π^def na Tabela 3.1, variável de déficit q^def_d,
multa na função objetivo, Equações de entrega mínima (flexível) e máxima
diária, justificativa (H2 ilimitado vale ~R$ 609/MWh e anula o MCP),
casos de 2 e 3 t/dia, contagem de variáveis atualizada e nova hipótese j).

Co-Authored-By: Claude Opus 5.5 <noreply@anthropic.com>
Claude-Session: https://claude.ai/code/session_01YFtn9hiQUHbNLSX7rUNYuK
</commit_message>
<xml_diff>
--- a/docs/dissertacao/cap3_metodologia.docx
+++ b/docs/dissertacao/cap3_metodologia.docx
@@ -559,7 +559,7 @@
         <w:pStyle w:val="FirstParagraph"/>
       </w:pPr>
       <w:r>
-        <w:t xml:space="preserve">A Figura 3.1 apresenta a topologia do sistema modelado. No lado mercantil, a usina FV, o módulo mercantil do BESS e o eletrolisador estão conectados a um barramento comum, no qual se impõe o balanço de potência. O hidrogênio produzido é armazenado em um tanque e comercializado a preço fixo. A energia excedente pode ser exportada ao SIN e liquidada ao PLD. O módulo LRCAP, embora fisicamente instalado no mesmo sítio, possui ponto de medição próprio e segue um perfil de descarga e recarga determinado pelo ONS. Os fluxos de ambos os lados convergem para o ponto de conexão compartilhado, cuja capacidade limita o fluxo líquido em cada hora.</w:t>
+        <w:t xml:space="preserve">A Figura 3.1 apresenta a topologia do sistema modelado. No lado mercantil, a usina FV, o módulo mercantil do BESS e o eletrolisador estão conectados a um barramento comum, no qual se impõe o balanço de potência. O hidrogênio produzido é armazenado em um tanque e comercializado a preço fixo, seja sem limite de volume, seja por meio de um contrato de fornecimento com entrega diária (Seção 3.4.5). A energia excedente pode ser exportada ao SIN e liquidada ao PLD. O módulo LRCAP, embora fisicamente instalado no mesmo sítio, possui ponto de medição próprio e segue um perfil de descarga e recarga determinado pelo ONS. Os fluxos de ambos os lados convergem para o ponto de conexão compartilhado, cuja capacidade limita o fluxo líquido em cada hora.</w:t>
       </w:r>
     </w:p>
     <w:p>
@@ -1962,7 +1962,7 @@
               <w:pStyle w:val="Compact"/>
             </w:pPr>
             <w:r>
-              <w:t xml:space="preserve">Entrega mínima diária de H₂</w:t>
+              <w:t xml:space="preserve">Entrega mínima diária de H₂ (contrato)</w:t>
             </w:r>
           </w:p>
         </w:tc>
@@ -1984,7 +1984,157 @@
               <w:pStyle w:val="Compact"/>
             </w:pPr>
             <w:r>
-              <w:t xml:space="preserve">0</w:t>
+              <w:t xml:space="preserve">0 (sem contrato); 2.000 ou 3.000</w:t>
+            </w:r>
+          </w:p>
+        </w:tc>
+      </w:tr>
+      <w:tr>
+        <w:tc>
+          <w:tcPr/>
+          <w:p>
+            <w:pPr>
+              <w:pStyle w:val="Compact"/>
+            </w:pPr>
+            <m:oMath>
+              <m:sSup>
+                <m:e>
+                  <m:acc>
+                    <m:accPr>
+                      <m:chr m:val="‾"/>
+                    </m:accPr>
+                    <m:e>
+                      <m:r>
+                        <m:t>D</m:t>
+                      </m:r>
+                    </m:e>
+                  </m:acc>
+                </m:e>
+                <m:sup>
+                  <m:r>
+                    <m:t>h</m:t>
+                  </m:r>
+                  <m:r>
+                    <m:t>2</m:t>
+                  </m:r>
+                </m:sup>
+              </m:sSup>
+            </m:oMath>
+          </w:p>
+        </w:tc>
+        <w:tc>
+          <w:tcPr/>
+          <w:p>
+            <w:pPr>
+              <w:pStyle w:val="Compact"/>
+            </w:pPr>
+            <w:r>
+              <w:t xml:space="preserve">Entrega máxima diária de H₂ (demanda do comprador)</w:t>
+            </w:r>
+          </w:p>
+        </w:tc>
+        <w:tc>
+          <w:tcPr/>
+          <w:p>
+            <w:pPr>
+              <w:pStyle w:val="Compact"/>
+            </w:pPr>
+            <w:r>
+              <w:t xml:space="preserve">kg/dia</w:t>
+            </w:r>
+          </w:p>
+        </w:tc>
+        <w:tc>
+          <w:tcPr/>
+          <w:p>
+            <w:pPr>
+              <w:pStyle w:val="Compact"/>
+            </w:pPr>
+            <w:r>
+              <w:t xml:space="preserve">ilimitada (sem contrato); igual a</w:t>
+            </w:r>
+            <w:r>
+              <w:t xml:space="preserve"> </w:t>
+            </w:r>
+            <m:oMath>
+              <m:sSup>
+                <m:e>
+                  <m:r>
+                    <m:t>D</m:t>
+                  </m:r>
+                </m:e>
+                <m:sup>
+                  <m:r>
+                    <m:t>h</m:t>
+                  </m:r>
+                  <m:r>
+                    <m:t>2</m:t>
+                  </m:r>
+                </m:sup>
+              </m:sSup>
+            </m:oMath>
+          </w:p>
+        </w:tc>
+      </w:tr>
+      <w:tr>
+        <w:tc>
+          <w:tcPr/>
+          <w:p>
+            <w:pPr>
+              <w:pStyle w:val="Compact"/>
+            </w:pPr>
+            <m:oMath>
+              <m:sSup>
+                <m:e>
+                  <m:r>
+                    <m:t>π</m:t>
+                  </m:r>
+                </m:e>
+                <m:sup>
+                  <m:r>
+                    <m:t>d</m:t>
+                  </m:r>
+                  <m:r>
+                    <m:t>e</m:t>
+                  </m:r>
+                  <m:r>
+                    <m:t>f</m:t>
+                  </m:r>
+                </m:sup>
+              </m:sSup>
+            </m:oMath>
+          </w:p>
+        </w:tc>
+        <w:tc>
+          <w:tcPr/>
+          <w:p>
+            <w:pPr>
+              <w:pStyle w:val="Compact"/>
+            </w:pPr>
+            <w:r>
+              <w:t xml:space="preserve">Multa por kg de H₂ não entregue</w:t>
+            </w:r>
+          </w:p>
+        </w:tc>
+        <w:tc>
+          <w:tcPr/>
+          <w:p>
+            <w:pPr>
+              <w:pStyle w:val="Compact"/>
+            </w:pPr>
+            <w:r>
+              <w:t xml:space="preserve">R$/kg</w:t>
+            </w:r>
+          </w:p>
+        </w:tc>
+        <w:tc>
+          <w:tcPr/>
+          <w:p>
+            <w:pPr>
+              <w:pStyle w:val="Compact"/>
+            </w:pPr>
+            <w:r>
+              <w:t xml:space="preserve">35</w:t>
             </w:r>
           </w:p>
         </w:tc>
@@ -3366,6 +3516,95 @@
                 </m:rPr>
                 <m:t>]</m:t>
               </m:r>
+            </m:oMath>
+            <w:r>
+              <w:t xml:space="preserve">, kg</w:t>
+            </w:r>
+          </w:p>
+        </w:tc>
+      </w:tr>
+      <w:tr>
+        <w:tc>
+          <w:tcPr/>
+          <w:p>
+            <w:pPr>
+              <w:pStyle w:val="Compact"/>
+            </w:pPr>
+            <m:oMath>
+              <m:sSubSup>
+                <m:e>
+                  <m:r>
+                    <m:t>q</m:t>
+                  </m:r>
+                </m:e>
+                <m:sub>
+                  <m:r>
+                    <m:t>d</m:t>
+                  </m:r>
+                </m:sub>
+                <m:sup>
+                  <m:r>
+                    <m:t>d</m:t>
+                  </m:r>
+                  <m:r>
+                    <m:t>e</m:t>
+                  </m:r>
+                  <m:r>
+                    <m:t>f</m:t>
+                  </m:r>
+                </m:sup>
+              </m:sSubSup>
+            </m:oMath>
+          </w:p>
+        </w:tc>
+        <w:tc>
+          <w:tcPr/>
+          <w:p>
+            <w:pPr>
+              <w:pStyle w:val="Compact"/>
+            </w:pPr>
+            <w:r>
+              <w:t xml:space="preserve">Déficit de entrega de H₂ no dia</w:t>
+            </w:r>
+            <w:r>
+              <w:t xml:space="preserve"> </w:t>
+            </w:r>
+            <m:oMath>
+              <m:r>
+                <m:t>d</m:t>
+              </m:r>
+            </m:oMath>
+          </w:p>
+        </w:tc>
+        <w:tc>
+          <w:tcPr/>
+          <w:p>
+            <w:pPr>
+              <w:pStyle w:val="Compact"/>
+            </w:pPr>
+            <m:oMath>
+              <m:sSub>
+                <m:e>
+                  <m:r>
+                    <m:rPr>
+                      <m:scr m:val="double-struck"/>
+                      <m:sty m:val="p"/>
+                    </m:rPr>
+                    <m:t>R</m:t>
+                  </m:r>
+                </m:e>
+                <m:sub>
+                  <m:r>
+                    <m:rPr>
+                      <m:sty m:val="p"/>
+                    </m:rPr>
+                    <m:t>≥</m:t>
+                  </m:r>
+                  <m:r>
+                    <m:t>0</m:t>
+                  </m:r>
+                </m:sub>
+              </m:sSub>
             </m:oMath>
             <w:r>
               <w:t xml:space="preserve">, kg</w:t>
@@ -4112,6 +4351,86 @@
                   <m:rPr>
                     <m:sty m:val="p"/>
                   </m:rPr>
+                  <m:t>−</m:t>
+                </m:r>
+                <m:nary>
+                  <m:naryPr>
+                    <m:chr m:val="∑"/>
+                    <m:limLoc m:val="undOvr"/>
+                    <m:subHide m:val="off"/>
+                    <m:supHide m:val="on"/>
+                  </m:naryPr>
+                  <m:sub>
+                    <m:r>
+                      <m:t>d</m:t>
+                    </m:r>
+                    <m:r>
+                      <m:rPr>
+                        <m:sty m:val="p"/>
+                      </m:rPr>
+                      <m:t>∈</m:t>
+                    </m:r>
+                    <m:r>
+                      <m:rPr>
+                        <m:scr m:val="script"/>
+                        <m:sty m:val="p"/>
+                      </m:rPr>
+                      <m:t>D</m:t>
+                    </m:r>
+                  </m:sub>
+                  <m:sup>
+                    <m:r>
+                      <m:t>​</m:t>
+                    </m:r>
+                  </m:sup>
+                  <m:e>
+                    <m:sSup>
+                      <m:e>
+                        <m:r>
+                          <m:t>π</m:t>
+                        </m:r>
+                      </m:e>
+                      <m:sup>
+                        <m:r>
+                          <m:t>d</m:t>
+                        </m:r>
+                        <m:r>
+                          <m:t>e</m:t>
+                        </m:r>
+                        <m:r>
+                          <m:t>f</m:t>
+                        </m:r>
+                      </m:sup>
+                    </m:sSup>
+                  </m:e>
+                </m:nary>
+                <m:sSubSup>
+                  <m:e>
+                    <m:r>
+                      <m:t>q</m:t>
+                    </m:r>
+                  </m:e>
+                  <m:sub>
+                    <m:r>
+                      <m:t>d</m:t>
+                    </m:r>
+                  </m:sub>
+                  <m:sup>
+                    <m:r>
+                      <m:t>d</m:t>
+                    </m:r>
+                    <m:r>
+                      <m:t>e</m:t>
+                    </m:r>
+                    <m:r>
+                      <m:t>f</m:t>
+                    </m:r>
+                  </m:sup>
+                </m:sSubSup>
+                <m:r>
+                  <m:rPr>
+                    <m:sty m:val="p"/>
+                  </m:rPr>
                   <m:t>+</m:t>
                 </m:r>
                 <m:sSup>
@@ -4370,7 +4689,7 @@
         <w:pStyle w:val="FirstParagraph"/>
       </w:pPr>
       <w:r>
-        <w:t xml:space="preserve">Os termos correspondem, respectivamente, à receita da energia exportada ao MCP, ao custo da energia importada, à margem da comercialização do hidrogênio, à receita fixa do LRCAP rateada no horizonte, ao custo da recarga excedente do módulo LRCAP e ao custo de degradação do BESS, aplicado à energia descarregada por ambos os módulos. Ressalta-se que a energia injetada pelo módulo LRCAP não compõe a receita do MCP do empreendedor, em conformidade com o art. 9º, § 6º, da Portaria.</w:t>
+        <w:t xml:space="preserve">Os termos correspondem, respectivamente, à receita da energia exportada ao MCP, ao custo da energia importada, à margem da comercialização do hidrogênio, à multa por déficit de entrega de hidrogênio, à receita fixa do LRCAP rateada no horizonte, ao custo da recarga excedente do módulo LRCAP e ao custo de degradação do BESS, aplicado à energia descarregada por ambos os módulos. Ressalta-se que a energia injetada pelo módulo LRCAP não compõe a receita do MCP do empreendedor, em conformidade com o art. 9º, § 6º, da Portaria.</w:t>
       </w:r>
     </w:p>
     <w:p>
@@ -8669,7 +8988,7 @@
         <w:pStyle w:val="FirstParagraph"/>
       </w:pPr>
       <w:r>
-        <w:t xml:space="preserve">O balanço do tanque de hidrogênio, com condição de contorno análoga à do BESS, e a entrega mínima diária são expressos pelas Equações (3.17) e (3.18):</w:t>
+        <w:t xml:space="preserve">O balanço do tanque de hidrogênio, com condição de contorno análoga à do BESS, é expresso pela Equação (3.17):</w:t>
       </w:r>
     </w:p>
     <w:tbl>
@@ -8910,6 +9229,372 @@
             </w:pPr>
             <w:r>
               <w:t>(3.17)</w:t>
+            </w:r>
+          </w:p>
+        </w:tc>
+      </w:tr>
+    </w:tbl>
+    <w:p>
+      <w:pPr>
+        <w:pStyle w:val="FirstParagraph"/>
+      </w:pPr>
+      <w:r>
+        <w:rPr>
+          <w:b/>
+          <w:bCs/>
+        </w:rPr>
+        <w:t xml:space="preserve">Contrato de fornecimento de hidrogênio.</w:t>
+      </w:r>
+      <w:r>
+        <w:t xml:space="preserve"> </w:t>
+      </w:r>
+      <w:r>
+        <w:t xml:space="preserve">Sem limite de volume, o hidrogênio funciona como um consumidor de energia de capacidade ilimitada a preço fixo. Com os valores da Tabela 3.1, cada MWh entregue ao eletrolisador vale</w:t>
+      </w:r>
+      <w:r>
+        <w:t xml:space="preserve"> </w:t>
+      </w:r>
+      <m:oMath>
+        <m:r>
+          <m:rPr>
+            <m:sty m:val="p"/>
+          </m:rPr>
+          <m:t>(</m:t>
+        </m:r>
+        <m:sSup>
+          <m:e>
+            <m:r>
+              <m:t>π</m:t>
+            </m:r>
+          </m:e>
+          <m:sup>
+            <m:r>
+              <m:t>h</m:t>
+            </m:r>
+            <m:r>
+              <m:t>2</m:t>
+            </m:r>
+          </m:sup>
+        </m:sSup>
+        <m:r>
+          <m:rPr>
+            <m:sty m:val="p"/>
+          </m:rPr>
+          <m:t>−</m:t>
+        </m:r>
+        <m:sSup>
+          <m:e>
+            <m:r>
+              <m:t>c</m:t>
+            </m:r>
+          </m:e>
+          <m:sup>
+            <m:r>
+              <m:t>h</m:t>
+            </m:r>
+            <m:r>
+              <m:t>2</m:t>
+            </m:r>
+          </m:sup>
+        </m:sSup>
+        <m:r>
+          <m:rPr>
+            <m:sty m:val="p"/>
+          </m:rPr>
+          <m:t>)</m:t>
+        </m:r>
+        <m:r>
+          <m:rPr>
+            <m:sty m:val="p"/>
+          </m:rPr>
+          <m:t>⋅</m:t>
+        </m:r>
+        <m:r>
+          <m:t>1000</m:t>
+        </m:r>
+        <m:r>
+          <m:rPr>
+            <m:sty m:val="p"/>
+          </m:rPr>
+          <m:t>/</m:t>
+        </m:r>
+        <m:sSup>
+          <m:e>
+            <m:r>
+              <m:t>k</m:t>
+            </m:r>
+          </m:e>
+          <m:sup>
+            <m:r>
+              <m:t>e</m:t>
+            </m:r>
+            <m:r>
+              <m:t>l</m:t>
+            </m:r>
+          </m:sup>
+        </m:sSup>
+        <m:r>
+          <m:rPr>
+            <m:sty m:val="p"/>
+          </m:rPr>
+          <m:t>≈</m:t>
+        </m:r>
+      </m:oMath>
+      <w:r>
+        <w:t xml:space="preserve"> </w:t>
+      </w:r>
+      <w:r>
+        <w:t xml:space="preserve">R$ 609/MWh, valor muito superior ao PLD médio, de modo que o eletrolisador absorve quase toda a energia disponível e o MCP perde relevância. Na prática, a comercialização de hidrogênio em escala depende de contratos bilaterais com um comprador industrial, cuja demanda é limitada e cuja entrega deve ser regular. Para representar essa situação, o modelo admite um contrato de fornecimento com entrega diária entre</w:t>
+      </w:r>
+      <w:r>
+        <w:t xml:space="preserve"> </w:t>
+      </w:r>
+      <m:oMath>
+        <m:sSup>
+          <m:e>
+            <m:r>
+              <m:t>D</m:t>
+            </m:r>
+          </m:e>
+          <m:sup>
+            <m:r>
+              <m:t>h</m:t>
+            </m:r>
+            <m:r>
+              <m:t>2</m:t>
+            </m:r>
+          </m:sup>
+        </m:sSup>
+      </m:oMath>
+      <w:r>
+        <w:t xml:space="preserve"> </w:t>
+      </w:r>
+      <w:r>
+        <w:t xml:space="preserve">e</w:t>
+      </w:r>
+      <w:r>
+        <w:t xml:space="preserve"> </w:t>
+      </w:r>
+      <m:oMath>
+        <m:sSup>
+          <m:e>
+            <m:acc>
+              <m:accPr>
+                <m:chr m:val="‾"/>
+              </m:accPr>
+              <m:e>
+                <m:r>
+                  <m:t>D</m:t>
+                </m:r>
+              </m:e>
+            </m:acc>
+          </m:e>
+          <m:sup>
+            <m:r>
+              <m:t>h</m:t>
+            </m:r>
+            <m:r>
+              <m:t>2</m:t>
+            </m:r>
+          </m:sup>
+        </m:sSup>
+      </m:oMath>
+      <w:r>
+        <w:t xml:space="preserve">, conforme as Equações (3.18) e (3.19):</w:t>
+      </w:r>
+    </w:p>
+    <w:tbl>
+      <w:tblPr>
+        <w:tblW w:w="9071" w:type="dxa"/>
+        <w:tblBorders>
+          <w:top w:val="nil"/>
+          <w:left w:val="nil"/>
+          <w:bottom w:val="nil"/>
+          <w:right w:val="nil"/>
+          <w:insideH w:val="nil"/>
+          <w:insideV w:val="nil"/>
+        </w:tblBorders>
+        <w:tblLayout w:type="fixed"/>
+        <w:tblCellMar>
+          <w:left w:w="0" w:type="dxa"/>
+          <w:right w:w="0" w:type="dxa"/>
+        </w:tblCellMar>
+      </w:tblPr>
+      <w:tblGrid>
+        <w:gridCol w:w="8071"/>
+        <w:gridCol w:w="1000"/>
+      </w:tblGrid>
+      <w:tr>
+        <w:tc>
+          <w:tcPr>
+            <w:tcW w:w="8071" w:type="dxa"/>
+            <w:vAlign w:val="center"/>
+          </w:tcPr>
+          <w:p>
+            <w:pPr>
+              <w:pStyle w:val="BodyText"/>
+            </w:pPr>
+            <m:oMathPara>
+              <m:oMathParaPr>
+                <m:jc m:val="center"/>
+              </m:oMathParaPr>
+              <m:oMath>
+                <m:nary>
+                  <m:naryPr>
+                    <m:chr m:val="∑"/>
+                    <m:limLoc m:val="undOvr"/>
+                    <m:subHide m:val="off"/>
+                    <m:supHide m:val="on"/>
+                  </m:naryPr>
+                  <m:sub>
+                    <m:r>
+                      <m:t>t</m:t>
+                    </m:r>
+                    <m:r>
+                      <m:rPr>
+                        <m:sty m:val="p"/>
+                      </m:rPr>
+                      <m:t>∈</m:t>
+                    </m:r>
+                    <m:sSub>
+                      <m:e>
+                        <m:r>
+                          <m:rPr>
+                            <m:scr m:val="script"/>
+                            <m:sty m:val="p"/>
+                          </m:rPr>
+                          <m:t>T</m:t>
+                        </m:r>
+                      </m:e>
+                      <m:sub>
+                        <m:r>
+                          <m:t>d</m:t>
+                        </m:r>
+                      </m:sub>
+                    </m:sSub>
+                  </m:sub>
+                  <m:sup>
+                    <m:r>
+                      <m:t>​</m:t>
+                    </m:r>
+                  </m:sup>
+                  <m:e>
+                    <m:sSub>
+                      <m:e>
+                        <m:r>
+                          <m:t>v</m:t>
+                        </m:r>
+                      </m:e>
+                      <m:sub>
+                        <m:r>
+                          <m:t>t</m:t>
+                        </m:r>
+                      </m:sub>
+                    </m:sSub>
+                  </m:e>
+                </m:nary>
+                <m:r>
+                  <m:t> </m:t>
+                </m:r>
+                <m:r>
+                  <m:rPr>
+                    <m:sty m:val="p"/>
+                  </m:rPr>
+                  <m:t>Δ</m:t>
+                </m:r>
+                <m:r>
+                  <m:t>t</m:t>
+                </m:r>
+                <m:r>
+                  <m:rPr>
+                    <m:sty m:val="p"/>
+                  </m:rPr>
+                  <m:t>+</m:t>
+                </m:r>
+                <m:sSubSup>
+                  <m:e>
+                    <m:r>
+                      <m:t>q</m:t>
+                    </m:r>
+                  </m:e>
+                  <m:sub>
+                    <m:r>
+                      <m:t>d</m:t>
+                    </m:r>
+                  </m:sub>
+                  <m:sup>
+                    <m:r>
+                      <m:t>d</m:t>
+                    </m:r>
+                    <m:r>
+                      <m:t>e</m:t>
+                    </m:r>
+                    <m:r>
+                      <m:t>f</m:t>
+                    </m:r>
+                  </m:sup>
+                </m:sSubSup>
+                <m:r>
+                  <m:rPr>
+                    <m:sty m:val="p"/>
+                  </m:rPr>
+                  <m:t>≥</m:t>
+                </m:r>
+                <m:sSup>
+                  <m:e>
+                    <m:r>
+                      <m:t>D</m:t>
+                    </m:r>
+                  </m:e>
+                  <m:sup>
+                    <m:r>
+                      <m:t>h</m:t>
+                    </m:r>
+                    <m:r>
+                      <m:t>2</m:t>
+                    </m:r>
+                  </m:sup>
+                </m:sSup>
+                <m:r>
+                  <m:t>  </m:t>
+                </m:r>
+                <m:r>
+                  <m:rPr>
+                    <m:sty m:val="p"/>
+                  </m:rPr>
+                  <m:t>∀</m:t>
+                </m:r>
+                <m:r>
+                  <m:t>d</m:t>
+                </m:r>
+                <m:r>
+                  <m:rPr>
+                    <m:sty m:val="p"/>
+                  </m:rPr>
+                  <m:t>∈</m:t>
+                </m:r>
+                <m:r>
+                  <m:rPr>
+                    <m:scr m:val="script"/>
+                    <m:sty m:val="p"/>
+                  </m:rPr>
+                  <m:t>D</m:t>
+                </m:r>
+              </m:oMath>
+            </m:oMathPara>
+          </w:p>
+        </w:tc>
+        <w:tc>
+          <w:tcPr>
+            <w:tcW w:w="1000" w:type="dxa"/>
+            <w:vAlign w:val="center"/>
+          </w:tcPr>
+          <w:p>
+            <w:pPr>
+              <w:pStyle w:val="NumeroEquacao"/>
+            </w:pPr>
+            <w:r>
+              <w:t>(3.18)</w:t>
             </w:r>
           </w:p>
         </w:tc>
@@ -9021,13 +9706,20 @@
                   <m:rPr>
                     <m:sty m:val="p"/>
                   </m:rPr>
-                  <m:t>≥</m:t>
+                  <m:t>≤</m:t>
                 </m:r>
                 <m:sSup>
                   <m:e>
-                    <m:r>
-                      <m:t>D</m:t>
-                    </m:r>
+                    <m:acc>
+                      <m:accPr>
+                        <m:chr m:val="‾"/>
+                      </m:accPr>
+                      <m:e>
+                        <m:r>
+                          <m:t>D</m:t>
+                        </m:r>
+                      </m:e>
+                    </m:acc>
                   </m:e>
                   <m:sup>
                     <m:r>
@@ -9077,7 +9769,7 @@
               <w:pStyle w:val="NumeroEquacao"/>
             </w:pPr>
             <w:r>
-              <w:t>(3.18)</w:t>
+              <w:t>(3.19)</w:t>
             </w:r>
           </w:p>
         </w:tc>
@@ -9088,7 +9780,298 @@
         <w:pStyle w:val="FirstParagraph"/>
       </w:pPr>
       <w:r>
-        <w:t xml:space="preserve">O modelo resultante, composto pela função objetivo da Equação (3.1) e pelas restrições das Equações (3.3) a (3.18), é um MILP. Para um horizonte de uma semana (168 h), o problema possui 1.681 variáveis contínuas, 505 variáveis binárias e 2.692 restrições; para um ano (8.760 h), 87.601 variáveis contínuas, 26.281 binárias e 140.164 restrições.</w:t>
+        <w:t xml:space="preserve">A variável</w:t>
+      </w:r>
+      <w:r>
+        <w:t xml:space="preserve"> </w:t>
+      </w:r>
+      <m:oMath>
+        <m:sSubSup>
+          <m:e>
+            <m:r>
+              <m:t>q</m:t>
+            </m:r>
+          </m:e>
+          <m:sub>
+            <m:r>
+              <m:t>d</m:t>
+            </m:r>
+          </m:sub>
+          <m:sup>
+            <m:r>
+              <m:t>d</m:t>
+            </m:r>
+            <m:r>
+              <m:t>e</m:t>
+            </m:r>
+            <m:r>
+              <m:t>f</m:t>
+            </m:r>
+          </m:sup>
+        </m:sSubSup>
+      </m:oMath>
+      <w:r>
+        <w:t xml:space="preserve"> </w:t>
+      </w:r>
+      <w:r>
+        <w:t xml:space="preserve">representa a parcela da entrega mínima não cumprida no dia</w:t>
+      </w:r>
+      <w:r>
+        <w:t xml:space="preserve"> </w:t>
+      </w:r>
+      <m:oMath>
+        <m:r>
+          <m:t>d</m:t>
+        </m:r>
+      </m:oMath>
+      <w:r>
+        <w:t xml:space="preserve">, sujeita à multa</w:t>
+      </w:r>
+      <w:r>
+        <w:t xml:space="preserve"> </w:t>
+      </w:r>
+      <m:oMath>
+        <m:sSup>
+          <m:e>
+            <m:r>
+              <m:t>π</m:t>
+            </m:r>
+          </m:e>
+          <m:sup>
+            <m:r>
+              <m:t>d</m:t>
+            </m:r>
+            <m:r>
+              <m:t>e</m:t>
+            </m:r>
+            <m:r>
+              <m:t>f</m:t>
+            </m:r>
+          </m:sup>
+        </m:sSup>
+      </m:oMath>
+      <w:r>
+        <w:t xml:space="preserve"> </w:t>
+      </w:r>
+      <w:r>
+        <w:t xml:space="preserve">na função objetivo. Sem ela, um dia de baixa irradiância tornaria o problema inviável, já que a importação de energia é vedada no caso de referência; com ela, o modelo decide entre produzir o hidrogênio, inclusive com energia previamente armazenada no BESS, e pagar a multa. Quando não há multa definida, adota-se</w:t>
+      </w:r>
+      <w:r>
+        <w:t xml:space="preserve"> </w:t>
+      </w:r>
+      <m:oMath>
+        <m:sSubSup>
+          <m:e>
+            <m:r>
+              <m:t>q</m:t>
+            </m:r>
+          </m:e>
+          <m:sub>
+            <m:r>
+              <m:t>d</m:t>
+            </m:r>
+          </m:sub>
+          <m:sup>
+            <m:r>
+              <m:t>d</m:t>
+            </m:r>
+            <m:r>
+              <m:t>e</m:t>
+            </m:r>
+            <m:r>
+              <m:t>f</m:t>
+            </m:r>
+          </m:sup>
+        </m:sSubSup>
+        <m:r>
+          <m:rPr>
+            <m:sty m:val="p"/>
+          </m:rPr>
+          <m:t>=</m:t>
+        </m:r>
+        <m:r>
+          <m:t>0</m:t>
+        </m:r>
+      </m:oMath>
+      <w:r>
+        <w:t xml:space="preserve"> </w:t>
+      </w:r>
+      <w:r>
+        <w:t xml:space="preserve">e a entrega mínima é obrigatória. Nos casos com contrato, adota-se</w:t>
+      </w:r>
+      <w:r>
+        <w:t xml:space="preserve"> </w:t>
+      </w:r>
+      <m:oMath>
+        <m:sSup>
+          <m:e>
+            <m:r>
+              <m:t>D</m:t>
+            </m:r>
+          </m:e>
+          <m:sup>
+            <m:r>
+              <m:t>h</m:t>
+            </m:r>
+            <m:r>
+              <m:t>2</m:t>
+            </m:r>
+          </m:sup>
+        </m:sSup>
+        <m:r>
+          <m:rPr>
+            <m:sty m:val="p"/>
+          </m:rPr>
+          <m:t>=</m:t>
+        </m:r>
+        <m:sSup>
+          <m:e>
+            <m:acc>
+              <m:accPr>
+                <m:chr m:val="‾"/>
+              </m:accPr>
+              <m:e>
+                <m:r>
+                  <m:t>D</m:t>
+                </m:r>
+              </m:e>
+            </m:acc>
+          </m:e>
+          <m:sup>
+            <m:r>
+              <m:t>h</m:t>
+            </m:r>
+            <m:r>
+              <m:t>2</m:t>
+            </m:r>
+          </m:sup>
+        </m:sSup>
+      </m:oMath>
+      <w:r>
+        <w:t xml:space="preserve">, isto é, um volume diário firme, e</w:t>
+      </w:r>
+      <w:r>
+        <w:t xml:space="preserve"> </w:t>
+      </w:r>
+      <m:oMath>
+        <m:sSup>
+          <m:e>
+            <m:r>
+              <m:t>π</m:t>
+            </m:r>
+          </m:e>
+          <m:sup>
+            <m:r>
+              <m:t>d</m:t>
+            </m:r>
+            <m:r>
+              <m:t>e</m:t>
+            </m:r>
+            <m:r>
+              <m:t>f</m:t>
+            </m:r>
+          </m:sup>
+        </m:sSup>
+        <m:r>
+          <m:rPr>
+            <m:sty m:val="p"/>
+          </m:rPr>
+          <m:t>=</m:t>
+        </m:r>
+        <m:sSup>
+          <m:e>
+            <m:r>
+              <m:t>π</m:t>
+            </m:r>
+          </m:e>
+          <m:sup>
+            <m:r>
+              <m:t>h</m:t>
+            </m:r>
+            <m:r>
+              <m:t>2</m:t>
+            </m:r>
+          </m:sup>
+        </m:sSup>
+      </m:oMath>
+      <w:r>
+        <w:t xml:space="preserve">, valor que corresponde a ressarcir o comprador pelo produto que ele precisará adquirir de outro fornecedor. Os volumes de 2.000 e 3.000 kg/dia correspondem, respectivamente, a cerca de 65% e 98% da produção média do caso sem contrato (3.060 kg/dia). Nessa configuração, o hidrogênio produzido além do volume contratado não pode ser vendido, e a energia excedente passa a ser exportada ao MCP ou vertida, o que restabelece o papel do mercado de curto prazo na arbitragem. O caso sem contrato corresponde a</w:t>
+      </w:r>
+      <w:r>
+        <w:t xml:space="preserve"> </w:t>
+      </w:r>
+      <m:oMath>
+        <m:sSup>
+          <m:e>
+            <m:r>
+              <m:t>D</m:t>
+            </m:r>
+          </m:e>
+          <m:sup>
+            <m:r>
+              <m:t>h</m:t>
+            </m:r>
+            <m:r>
+              <m:t>2</m:t>
+            </m:r>
+          </m:sup>
+        </m:sSup>
+        <m:r>
+          <m:rPr>
+            <m:sty m:val="p"/>
+          </m:rPr>
+          <m:t>=</m:t>
+        </m:r>
+        <m:r>
+          <m:t>0</m:t>
+        </m:r>
+      </m:oMath>
+      <w:r>
+        <w:t xml:space="preserve"> </w:t>
+      </w:r>
+      <w:r>
+        <w:t xml:space="preserve">e</w:t>
+      </w:r>
+      <w:r>
+        <w:t xml:space="preserve"> </w:t>
+      </w:r>
+      <m:oMath>
+        <m:sSup>
+          <m:e>
+            <m:acc>
+              <m:accPr>
+                <m:chr m:val="‾"/>
+              </m:accPr>
+              <m:e>
+                <m:r>
+                  <m:t>D</m:t>
+                </m:r>
+              </m:e>
+            </m:acc>
+          </m:e>
+          <m:sup>
+            <m:r>
+              <m:t>h</m:t>
+            </m:r>
+            <m:r>
+              <m:t>2</m:t>
+            </m:r>
+          </m:sup>
+        </m:sSup>
+      </m:oMath>
+      <w:r>
+        <w:t xml:space="preserve"> </w:t>
+      </w:r>
+      <w:r>
+        <w:t xml:space="preserve">ilimitado.</w:t>
+      </w:r>
+    </w:p>
+    <w:p>
+      <w:pPr>
+        <w:pStyle w:val="BodyText"/>
+      </w:pPr>
+      <w:r>
+        <w:t xml:space="preserve">O modelo resultante, composto pela função objetivo da Equação (3.1) e pelas restrições das Equações (3.3) a (3.19), é um MILP. Sem contrato de hidrogênio, para um horizonte de uma semana (168 h), o problema possui 1.688 variáveis contínuas, 505 variáveis binárias e 2.692 restrições; para um ano (8.760 h), 87.966 variáveis contínuas, 26.281 binárias e 140.164 restrições. O contrato acrescenta duas restrições por dia.</w:t>
       </w:r>
     </w:p>
     <w:bookmarkEnd w:id="19"/>
@@ -9298,7 +10281,7 @@
         <w:t xml:space="preserve"> </w:t>
       </w:r>
       <w:r>
-        <w:t xml:space="preserve">Os parâmetros do eletrolisador foram definidos a partir da faixa típica da tecnologia PEM, cujo consumo específico de energia situa-se entre 4,3 e 5,2 kWh/Nm³, ou aproximadamente 48 a 58 kWh/kg, até que os dados do fabricante do equipamento da UNIFEI sejam incorporados. A receita fixa do LRCAP e o preço do hidrogênio não possuem, até o momento, referências de mercado consolidadas no Brasil e são, por isso, objeto de análise de sensibilidade.</w:t>
+        <w:t xml:space="preserve">Os parâmetros do eletrolisador foram definidos a partir da faixa típica da tecnologia PEM, cujo consumo específico de energia situa-se entre 4,3 e 5,2 kWh/Nm³, ou aproximadamente 48 a 58 kWh/kg, até que os dados do fabricante do equipamento da UNIFEI sejam incorporados. A receita fixa do LRCAP e o preço do hidrogênio não possuem, até o momento, referências de mercado consolidadas no Brasil e são, por isso, objeto de análise de sensibilidade. O mesmo se aplica aos termos do contrato de fornecimento de hidrogênio — volume diário e multa por déficit —, avaliados em cenários alternativos ao caso sem contrato.</w:t>
       </w:r>
     </w:p>
     <w:bookmarkEnd w:id="24"/>
@@ -9441,7 +10424,7 @@
         <w:t xml:space="preserve"> </w:t>
       </w:r>
       <w:r>
-        <w:t xml:space="preserve">e impondo-se condições de contorno cíclicas em cada bloco, o problema anual pode ser reescrito conforme a Equação (3.19):</w:t>
+        <w:t xml:space="preserve">e impondo-se condições de contorno cíclicas em cada bloco, o problema anual pode ser reescrito conforme a Equação (3.20):</w:t>
       </w:r>
     </w:p>
     <w:tbl>
@@ -9764,7 +10747,7 @@
               <w:pStyle w:val="NumeroEquacao"/>
             </w:pPr>
             <w:r>
-              <w:t>(3.19)</w:t>
+              <w:t>(3.20)</w:t>
             </w:r>
           </w:p>
         </w:tc>
@@ -10139,7 +11122,7 @@
         <w:t xml:space="preserve"> </w:t>
       </w:r>
       <w:r>
-        <w:t xml:space="preserve">o multiplicador dual dessa restrição na relaxação linear do subproblema, calcula-se o valor da relaxação lagrangiana da Equação (3.20):</w:t>
+        <w:t xml:space="preserve">o multiplicador dual dessa restrição na relaxação linear do subproblema, calcula-se o valor da relaxação lagrangiana da Equação (3.21):</w:t>
       </w:r>
     </w:p>
     <w:tbl>
@@ -10382,7 +11365,7 @@
               <w:pStyle w:val="NumeroEquacao"/>
             </w:pPr>
             <w:r>
-              <w:t>(3.20)</w:t>
+              <w:t>(3.21)</w:t>
             </w:r>
           </w:p>
         </w:tc>
@@ -10574,7 +11557,7 @@
         </m:r>
       </m:oMath>
       <w:r>
-        <w:t xml:space="preserve">, o que fornece o corte válido da Equação (3.21):</w:t>
+        <w:t xml:space="preserve">, o que fornece o corte válido da Equação (3.22):</w:t>
       </w:r>
     </w:p>
     <w:tbl>
@@ -10721,7 +11704,7 @@
               <w:pStyle w:val="NumeroEquacao"/>
             </w:pPr>
             <w:r>
-              <w:t>(3.21)</w:t>
+              <w:t>(3.22)</w:t>
             </w:r>
           </w:p>
         </w:tc>
@@ -10776,7 +11759,7 @@
         <w:pStyle w:val="BodyText"/>
       </w:pPr>
       <w:r>
-        <w:t xml:space="preserve">O problema mestre, apresentado na Equação (3.22), é um MILP de pequeno porte, com uma variável contínua para a potência, uma binária para a participação e uma variável</w:t>
+        <w:t xml:space="preserve">O problema mestre, apresentado na Equação (3.23), é um MILP de pequeno porte, com uma variável contínua para a potência, uma binária para a participação e uma variável</w:t>
       </w:r>
       <w:r>
         <w:t xml:space="preserve"> </w:t>
@@ -11134,7 +12117,7 @@
               <w:pStyle w:val="NumeroEquacao"/>
             </w:pPr>
             <w:r>
-              <w:t>(3.22)</w:t>
+              <w:t>(3.23)</w:t>
             </w:r>
           </w:p>
         </w:tc>
@@ -12035,7 +13018,7 @@
         <w:t xml:space="preserve"> </w:t>
       </w:r>
       <w:r>
-        <w:t xml:space="preserve">é dado pela Equação (3.23):</w:t>
+        <w:t xml:space="preserve">é dado pela Equação (3.24):</w:t>
       </w:r>
     </w:p>
     <w:tbl>
@@ -12279,7 +13262,7 @@
               <w:pStyle w:val="NumeroEquacao"/>
             </w:pPr>
             <w:r>
-              <w:t>(3.23)</w:t>
+              <w:t>(3.24)</w:t>
             </w:r>
           </w:p>
         </w:tc>
@@ -12381,7 +13364,7 @@
         <w:t xml:space="preserve">Conditional Value-at-Risk</w:t>
       </w:r>
       <w:r>
-        <w:t xml:space="preserve">, CVaR), conforme a Equação (3.24):</w:t>
+        <w:t xml:space="preserve">, CVaR), conforme a Equação (3.25):</w:t>
       </w:r>
     </w:p>
     <w:tbl>
@@ -12669,7 +13652,7 @@
               <w:pStyle w:val="NumeroEquacao"/>
             </w:pPr>
             <w:r>
-              <w:t>(3.24)</w:t>
+              <w:t>(3.25)</w:t>
             </w:r>
           </w:p>
         </w:tc>
@@ -12873,7 +13856,7 @@
         <w:t xml:space="preserve"> </w:t>
       </w:r>
       <w:r>
-        <w:t xml:space="preserve">e pode ser escrito na forma linear de Rockafellar e Uryasev (2000), apresentada na Equação (3.25):</w:t>
+        <w:t xml:space="preserve">e pode ser escrito na forma linear de Rockafellar e Uryasev (2000), apresentada na Equação (3.26):</w:t>
       </w:r>
     </w:p>
     <w:tbl>
@@ -13210,7 +14193,7 @@
               <w:pStyle w:val="NumeroEquacao"/>
             </w:pPr>
             <w:r>
-              <w:t>(3.25)</w:t>
+              <w:t>(3.26)</w:t>
             </w:r>
           </w:p>
         </w:tc>
@@ -13787,7 +14770,7 @@
         <w:t xml:space="preserve"> </w:t>
       </w:r>
       <w:r>
-        <w:t xml:space="preserve">por subproblema, além das variáveis do CVaR, conforme as Equações (3.26) a (3.28):</w:t>
+        <w:t xml:space="preserve">por subproblema, além das variáveis do CVaR, conforme as Equações (3.27) a (3.29):</w:t>
       </w:r>
     </w:p>
     <w:tbl>
@@ -14024,7 +15007,7 @@
               <w:pStyle w:val="NumeroEquacao"/>
             </w:pPr>
             <w:r>
-              <w:t>(3.26)</w:t>
+              <w:t>(3.27)</w:t>
             </w:r>
           </w:p>
         </w:tc>
@@ -14341,7 +15324,7 @@
               <w:pStyle w:val="NumeroEquacao"/>
             </w:pPr>
             <w:r>
-              <w:t>(3.27)</w:t>
+              <w:t>(3.28)</w:t>
             </w:r>
           </w:p>
         </w:tc>
@@ -14561,7 +15544,7 @@
               <w:pStyle w:val="NumeroEquacao"/>
             </w:pPr>
             <w:r>
-              <w:t>(3.28)</w:t>
+              <w:t>(3.29)</w:t>
             </w:r>
           </w:p>
         </w:tc>
@@ -14928,7 +15911,7 @@
         <w:t xml:space="preserve">recourse problem</w:t>
       </w:r>
       <w:r>
-        <w:t xml:space="preserve">, RP) é o lucro esperado ótimo da Equação (3.24) com</w:t>
+        <w:t xml:space="preserve">, RP) é o lucro esperado ótimo da Equação (3.25) com</w:t>
       </w:r>
       <w:r>
         <w:t xml:space="preserve"> </w:t>
@@ -14948,7 +15931,7 @@
         </m:r>
       </m:oMath>
       <w:r>
-        <w:t xml:space="preserve">, dado pela Equação (3.29):</w:t>
+        <w:t xml:space="preserve">, dado pela Equação (3.30):</w:t>
       </w:r>
     </w:p>
     <w:tbl>
@@ -15159,7 +16142,7 @@
               <w:pStyle w:val="NumeroEquacao"/>
             </w:pPr>
             <w:r>
-              <w:t>(3.29)</w:t>
+              <w:t>(3.30)</w:t>
             </w:r>
           </w:p>
         </w:tc>
@@ -15196,7 +16179,7 @@
         <w:t xml:space="preserve">wait-and-see</w:t>
       </w:r>
       <w:r>
-        <w:t xml:space="preserve">, WS) corresponde a um agente que conhece o cenário antes de decidir a potência e escolhe, em cada um, a contratação ótima, conforme a Equação (3.30):</w:t>
+        <w:t xml:space="preserve">, WS) corresponde a um agente que conhece o cenário antes de decidir a potência e escolhe, em cada um, a contratação ótima, conforme a Equação (3.31):</w:t>
       </w:r>
     </w:p>
     <w:tbl>
@@ -15401,7 +16384,7 @@
               <w:pStyle w:val="NumeroEquacao"/>
             </w:pPr>
             <w:r>
-              <w:t>(3.30)</w:t>
+              <w:t>(3.31)</w:t>
             </w:r>
           </w:p>
         </w:tc>
@@ -15486,7 +16469,7 @@
         </m:sSup>
       </m:oMath>
       <w:r>
-        <w:t xml:space="preserve">, segundo a Equação (3.31):</w:t>
+        <w:t xml:space="preserve">, segundo a Equação (3.32):</w:t>
       </w:r>
     </w:p>
     <w:tbl>
@@ -15672,7 +16655,7 @@
               <w:pStyle w:val="NumeroEquacao"/>
             </w:pPr>
             <w:r>
-              <w:t>(3.31)</w:t>
+              <w:t>(3.32)</w:t>
             </w:r>
           </w:p>
         </w:tc>
@@ -15732,7 +16715,7 @@
         <w:t xml:space="preserve"> </w:t>
       </w:r>
       <w:r>
-        <w:t xml:space="preserve">é aplicada aos cenários originais, dado pela Equação (3.32):</w:t>
+        <w:t xml:space="preserve">é aplicada aos cenários originais, dado pela Equação (3.33):</w:t>
       </w:r>
     </w:p>
     <w:tbl>
@@ -15907,7 +16890,7 @@
               <w:pStyle w:val="NumeroEquacao"/>
             </w:pPr>
             <w:r>
-              <w:t>(3.32)</w:t>
+              <w:t>(3.33)</w:t>
             </w:r>
           </w:p>
         </w:tc>
@@ -15918,7 +16901,7 @@
         <w:pStyle w:val="FirstParagraph"/>
       </w:pPr>
       <w:r>
-        <w:t xml:space="preserve">A partir dessas quantidades, os indicadores são dados pelas Equações (3.33) e (3.34):</w:t>
+        <w:t xml:space="preserve">A partir dessas quantidades, os indicadores são dados pelas Equações (3.34) e (3.35):</w:t>
       </w:r>
     </w:p>
     <w:tbl>
@@ -16031,7 +17014,7 @@
               <w:pStyle w:val="NumeroEquacao"/>
             </w:pPr>
             <w:r>
-              <w:t>(3.33)</w:t>
+              <w:t>(3.34)</w:t>
             </w:r>
           </w:p>
         </w:tc>
@@ -16147,7 +17130,7 @@
               <w:pStyle w:val="NumeroEquacao"/>
             </w:pPr>
             <w:r>
-              <w:t>(3.34)</w:t>
+              <w:t>(3.35)</w:t>
             </w:r>
           </w:p>
         </w:tc>
@@ -16714,7 +17697,7 @@
         <w:t xml:space="preserve"> </w:t>
       </w:r>
       <w:r>
-        <w:t xml:space="preserve">e, pela Equação (3.32), o EEV.</w:t>
+        <w:t xml:space="preserve">e, pela Equação (3.33), o EEV.</w:t>
       </w:r>
     </w:p>
     <w:p>
@@ -17404,6 +18387,43 @@
       </w:r>
       <w:r>
         <w:t xml:space="preserve">no caso determinístico, a série de irradiância (2023) e a de preços (2025) referem-se a anos diferentes; no caso estocástico, o mesmo ocorre nos cenários de 2024 e 2025, que utilizam a irradiância de 2023. Para uma usina de pequeno porte em relação ao SIN, a correlação horária entre a geração local e o PLD tende a ser fraca, mas a hipótese deve ser considerada na interpretação dos resultados;</w:t>
+      </w:r>
+    </w:p>
+    <w:p>
+      <w:pPr>
+        <w:numPr>
+          <w:ilvl w:val="0"/>
+          <w:numId w:val="1005"/>
+        </w:numPr>
+      </w:pPr>
+      <w:r>
+        <w:rPr>
+          <w:b/>
+          <w:bCs/>
+        </w:rPr>
+        <w:t xml:space="preserve">contrato de hidrogênio simplificado:</w:t>
+      </w:r>
+      <w:r>
+        <w:t xml:space="preserve"> </w:t>
+      </w:r>
+      <w:r>
+        <w:t xml:space="preserve">o contrato é representado por um volume diário fixo, a preço fixo e com multa linear por déficit. Não se consideram cláusulas de</w:t>
+      </w:r>
+      <w:r>
+        <w:t xml:space="preserve"> </w:t>
+      </w:r>
+      <w:r>
+        <w:rPr>
+          <w:i/>
+          <w:iCs/>
+        </w:rPr>
+        <w:t xml:space="preserve">take-or-pay</w:t>
+      </w:r>
+      <w:r>
+        <w:t xml:space="preserve"> </w:t>
+      </w:r>
+      <w:r>
+        <w:t xml:space="preserve">sobre volumes anuais, flexibilidade de entrega entre dias, reajuste de preço ou a venda do excedente a outros compradores, e a multa adotada é um valor de referência ainda não calibrado com contratos reais;</w:t>
       </w:r>
     </w:p>
     <w:p>

</xml_diff>

<commit_message>
Capítulo 3: curva de oferta no leilão e frequência do despacho do ONS
Nova Seção 3.8 (custo de oportunidade Q(P), custo marginal, curva de oferta,
receitas de entrada e de oferta integral; seleção dos N dias de despacho por
ano e custo linear de degradação; Quadro 3.2 com os casos avaliados).
Parâmetro N^ons na Tabela 3.1; seções seguintes renumeradas (3.9, 3.10);
hipóteses a), k) e l) atualizadas.

Co-Authored-By: Claude Opus 5.5 <noreply@anthropic.com>
Claude-Session: https://claude.ai/code/session_01YFtn9hiQUHbNLSX7rUNYuK
</commit_message>
<xml_diff>
--- a/docs/dissertacao/cap3_metodologia.docx
+++ b/docs/dissertacao/cap3_metodologia.docx
@@ -2,7 +2,7 @@
 <file path=word/document.xml><?xml version="1.0" encoding="utf-8"?>
 <w:document xmlns:w="http://schemas.openxmlformats.org/wordprocessingml/2006/main" xmlns:m="http://schemas.openxmlformats.org/officeDocument/2006/math" xmlns:r="http://schemas.openxmlformats.org/officeDocument/2006/relationships" xmlns:o="urn:schemas-microsoft-com:office:office" xmlns:v="urn:schemas-microsoft-com:vml" xmlns:w10="urn:schemas-microsoft-com:office:word" xmlns:a="http://schemas.openxmlformats.org/drawingml/2006/main" xmlns:pic="http://schemas.openxmlformats.org/drawingml/2006/picture" xmlns:wp="http://schemas.openxmlformats.org/drawingml/2006/wordprocessingDrawing">
   <w:body>
-    <w:bookmarkStart w:id="40" w:name="metodologia"/>
+    <w:bookmarkStart w:id="44" w:name="metodologia"/>
     <w:p>
       <w:pPr>
         <w:pStyle w:val="Heading1"/>
@@ -26,7 +26,7 @@
         <w:t xml:space="preserve">Battery Energy Storage System</w:t>
       </w:r>
       <w:r>
-        <w:t xml:space="preserve">, BESS) e eletrolisador para produção de hidrogênio verde, diante da possibilidade de comercializar parte da capacidade de armazenamento no Leilão de Reserva de Capacidade na forma de Potência (LRCAP) e o restante no Mercado de Curto Prazo (MCP). A Seção 3.1 apresenta o problema e o escopo do estudo; a Seção 3.2 discute o enquadramento regulatório que orienta a modelagem; a Seção 3.3 descreve o sistema; a Seção 3.4 apresenta a formulação matemática; a Seção 3.5 trata dos dados de entrada; a Seção 3.6 descreve o método de solução; a Seção 3.7 apresenta a extensão estocástica do modelo e os indicadores de valor da informação; a Seção 3.8 resume a implementação computacional; e a Seção 3.9 consolida as hipóteses e limitações.</w:t>
+        <w:t xml:space="preserve">, BESS) e eletrolisador para produção de hidrogênio verde, diante da possibilidade de comercializar parte da capacidade de armazenamento no Leilão de Reserva de Capacidade na forma de Potência (LRCAP) e o restante no Mercado de Curto Prazo (MCP). A Seção 3.1 apresenta o problema e o escopo do estudo; a Seção 3.2 discute o enquadramento regulatório que orienta a modelagem; a Seção 3.3 descreve o sistema; a Seção 3.4 apresenta a formulação matemática; a Seção 3.5 trata dos dados de entrada; a Seção 3.6 descreve o método de solução; a Seção 3.7 apresenta a extensão estocástica do modelo e os indicadores de valor da informação; a Seção 3.8 descreve a construção da curva de oferta no leilão e as análises de sensibilidade; a Seção 3.9 resume a implementação computacional; e a Seção 3.10 consolida as hipóteses e limitações.</w:t>
       </w:r>
     </w:p>
     <w:bookmarkStart w:id="9" w:name="definição-do-problema-e-escopo"/>
@@ -2722,6 +2722,69 @@
             </w:pPr>
             <w:r>
               <w:t xml:space="preserve">perfil (Seção 3.5)</w:t>
+            </w:r>
+          </w:p>
+        </w:tc>
+      </w:tr>
+      <w:tr>
+        <w:tc>
+          <w:tcPr/>
+          <w:p>
+            <w:pPr>
+              <w:pStyle w:val="Compact"/>
+            </w:pPr>
+            <m:oMath>
+              <m:sSup>
+                <m:e>
+                  <m:r>
+                    <m:t>N</m:t>
+                  </m:r>
+                </m:e>
+                <m:sup>
+                  <m:r>
+                    <m:t>o</m:t>
+                  </m:r>
+                  <m:r>
+                    <m:t>n</m:t>
+                  </m:r>
+                  <m:r>
+                    <m:t>s</m:t>
+                  </m:r>
+                </m:sup>
+              </m:sSup>
+            </m:oMath>
+          </w:p>
+        </w:tc>
+        <w:tc>
+          <w:tcPr/>
+          <w:p>
+            <w:pPr>
+              <w:pStyle w:val="Compact"/>
+            </w:pPr>
+            <w:r>
+              <w:t xml:space="preserve">Número de despachos do ONS por ano</w:t>
+            </w:r>
+          </w:p>
+        </w:tc>
+        <w:tc>
+          <w:tcPr/>
+          <w:p>
+            <w:pPr>
+              <w:pStyle w:val="Compact"/>
+            </w:pPr>
+            <w:r>
+              <w:t xml:space="preserve">–</w:t>
+            </w:r>
+          </w:p>
+        </w:tc>
+        <w:tc>
+          <w:tcPr/>
+          <w:p>
+            <w:pPr>
+              <w:pStyle w:val="Compact"/>
+            </w:pPr>
+            <w:r>
+              <w:t xml:space="preserve">365 (sensibilidade: 50; 150)</w:t>
             </w:r>
           </w:p>
         </w:tc>
@@ -10263,7 +10326,7 @@
         <w:t xml:space="preserve"> </w:t>
       </w:r>
       <w:r>
-        <w:t xml:space="preserve">Na ausência de histórico de despacho de sistemas de armazenamento contratados no LRCAP, adota-se um perfil diário sintético: descarga na potência contratada entre 18 h e 22 h, horário de maior demanda líquida, e recarga entre 10 h e 15 h, até a restauração completa do estado de carga, limitada à potência nominal. O perfil é coerente com a diretriz de que a programação da recarga busque minimizar o custo total de operação do SIN (BRASIL, 2026, art. 4º, § 14), o que tende a deslocá-la para as horas de excedente de geração solar. O perfil resulta em um ciclo completo por dia (365 no ano), dentro dos limites regulatórios.</w:t>
+        <w:t xml:space="preserve">Na ausência de histórico de despacho de sistemas de armazenamento contratados no LRCAP, adota-se um perfil diário sintético: descarga na potência contratada entre 18 h e 22 h, horário de maior demanda líquida, e recarga entre 10 h e 15 h, até a restauração completa do estado de carga, limitada à potência nominal. O perfil é coerente com a diretriz de que a programação da recarga busque minimizar o custo total de operação do SIN (BRASIL, 2026, art. 4º, § 14), o que tende a deslocá-la para as horas de excedente de geração solar. O perfil resulta em um ciclo completo por dia (365 no ano), dentro dos limites regulatórios. Trata-se da hipótese mais intensa de uso do módulo LRCAP; o efeito de despachos menos frequentes é avaliado na Seção 3.8.2.</w:t>
       </w:r>
     </w:p>
     <w:p>
@@ -18113,13 +18176,13 @@
     </w:p>
     <w:bookmarkEnd w:id="35"/>
     <w:bookmarkEnd w:id="36"/>
-    <w:bookmarkStart w:id="37" w:name="implementação-computacional"/>
+    <w:bookmarkStart w:id="40" w:name="X1be5cdf3d160ac75d13eea8d7b66bea13b76fa0"/>
     <w:p>
       <w:pPr>
         <w:pStyle w:val="Heading2"/>
       </w:pPr>
       <w:r>
-        <w:t xml:space="preserve">3.8 Implementação computacional</w:t>
+        <w:t xml:space="preserve">3.8 Curva de oferta e análises de sensibilidade</w:t>
       </w:r>
     </w:p>
     <w:p>
@@ -18127,6 +18190,2951 @@
         <w:pStyle w:val="FirstParagraph"/>
       </w:pPr>
       <w:r>
+        <w:t xml:space="preserve">As Seções 3.4 a 3.7 tratam a receita fixa</w:t>
+      </w:r>
+      <w:r>
+        <w:t xml:space="preserve"> </w:t>
+      </w:r>
+      <m:oMath>
+        <m:sSup>
+          <m:e>
+            <m:r>
+              <m:t>R</m:t>
+            </m:r>
+          </m:e>
+          <m:sup>
+            <m:r>
+              <m:t>c</m:t>
+            </m:r>
+            <m:r>
+              <m:t>a</m:t>
+            </m:r>
+            <m:r>
+              <m:t>p</m:t>
+            </m:r>
+          </m:sup>
+        </m:sSup>
+      </m:oMath>
+      <w:r>
+        <w:t xml:space="preserve"> </w:t>
+      </w:r>
+      <w:r>
+        <w:t xml:space="preserve">como parâmetro e determinam a potência ótima correspondente. No leilão, contudo,</w:t>
+      </w:r>
+      <w:r>
+        <w:t xml:space="preserve"> </w:t>
+      </w:r>
+      <m:oMath>
+        <m:sSup>
+          <m:e>
+            <m:r>
+              <m:t>R</m:t>
+            </m:r>
+          </m:e>
+          <m:sup>
+            <m:r>
+              <m:t>c</m:t>
+            </m:r>
+            <m:r>
+              <m:t>a</m:t>
+            </m:r>
+            <m:r>
+              <m:t>p</m:t>
+            </m:r>
+          </m:sup>
+        </m:sSup>
+      </m:oMath>
+      <w:r>
+        <w:t xml:space="preserve"> </w:t>
+      </w:r>
+      <w:r>
+        <w:t xml:space="preserve">não é um dado: é o preço ofertado pelo próprio empreendedor, e a informação de que ele necessita é a relação entre esse preço e a potência que vale a pena comprometer. Esta seção apresenta o procedimento utilizado para obter essa relação — a curva de oferta — e os casos de sensibilidade avaliados com ele.</w:t>
+      </w:r>
+    </w:p>
+    <w:bookmarkStart w:id="37" w:name="custo-de-oportunidade-e-curva-de-oferta"/>
+    <w:p>
+      <w:pPr>
+        <w:pStyle w:val="Heading3"/>
+      </w:pPr>
+      <w:r>
+        <w:t xml:space="preserve">3.8.1 Custo de oportunidade e curva de oferta</w:t>
+      </w:r>
+    </w:p>
+    <w:p>
+      <w:pPr>
+        <w:pStyle w:val="FirstParagraph"/>
+      </w:pPr>
+      <w:r>
+        <w:t xml:space="preserve">Seja</w:t>
+      </w:r>
+      <w:r>
+        <w:t xml:space="preserve"> </w:t>
+      </w:r>
+      <m:oMath>
+        <m:r>
+          <m:t>Q</m:t>
+        </m:r>
+        <m:r>
+          <m:rPr>
+            <m:sty m:val="p"/>
+          </m:rPr>
+          <m:t>(</m:t>
+        </m:r>
+        <m:r>
+          <m:t>P</m:t>
+        </m:r>
+        <m:r>
+          <m:rPr>
+            <m:sty m:val="p"/>
+          </m:rPr>
+          <m:t>)</m:t>
+        </m:r>
+      </m:oMath>
+      <w:r>
+        <w:t xml:space="preserve"> </w:t>
+      </w:r>
+      <w:r>
+        <w:t xml:space="preserve">o lucro operacional esperado do empreendimento, sem a receita fixa do LRCAP, quando a potência contratada é</w:t>
+      </w:r>
+      <w:r>
+        <w:t xml:space="preserve"> </w:t>
+      </w:r>
+      <m:oMath>
+        <m:r>
+          <m:t>P</m:t>
+        </m:r>
+      </m:oMath>
+      <w:r>
+        <w:t xml:space="preserve">, dado pela Equação (3.36) (na prática, calculado com</w:t>
+      </w:r>
+      <w:r>
+        <w:t xml:space="preserve"> </w:t>
+      </w:r>
+      <m:oMath>
+        <m:sSup>
+          <m:e>
+            <m:r>
+              <m:t>R</m:t>
+            </m:r>
+          </m:e>
+          <m:sup>
+            <m:r>
+              <m:t>c</m:t>
+            </m:r>
+            <m:r>
+              <m:t>a</m:t>
+            </m:r>
+            <m:r>
+              <m:t>p</m:t>
+            </m:r>
+          </m:sup>
+        </m:sSup>
+        <m:r>
+          <m:rPr>
+            <m:sty m:val="p"/>
+          </m:rPr>
+          <m:t>=</m:t>
+        </m:r>
+        <m:r>
+          <m:t>0</m:t>
+        </m:r>
+      </m:oMath>
+      <w:r>
+        <w:t xml:space="preserve">):</w:t>
+      </w:r>
+    </w:p>
+    <w:tbl>
+      <w:tblPr>
+        <w:tblW w:w="9071" w:type="dxa"/>
+        <w:tblBorders>
+          <w:top w:val="nil"/>
+          <w:left w:val="nil"/>
+          <w:bottom w:val="nil"/>
+          <w:right w:val="nil"/>
+          <w:insideH w:val="nil"/>
+          <w:insideV w:val="nil"/>
+        </w:tblBorders>
+        <w:tblLayout w:type="fixed"/>
+        <w:tblCellMar>
+          <w:left w:w="0" w:type="dxa"/>
+          <w:right w:w="0" w:type="dxa"/>
+        </w:tblCellMar>
+      </w:tblPr>
+      <w:tblGrid>
+        <w:gridCol w:w="8071"/>
+        <w:gridCol w:w="1000"/>
+      </w:tblGrid>
+      <w:tr>
+        <w:tc>
+          <w:tcPr>
+            <w:tcW w:w="8071" w:type="dxa"/>
+            <w:vAlign w:val="center"/>
+          </w:tcPr>
+          <w:p>
+            <w:pPr>
+              <w:pStyle w:val="BodyText"/>
+            </w:pPr>
+            <m:oMathPara>
+              <m:oMathParaPr>
+                <m:jc m:val="center"/>
+              </m:oMathParaPr>
+              <m:oMath>
+                <m:r>
+                  <m:t>Q</m:t>
+                </m:r>
+                <m:r>
+                  <m:rPr>
+                    <m:sty m:val="p"/>
+                  </m:rPr>
+                  <m:t>(</m:t>
+                </m:r>
+                <m:r>
+                  <m:t>P</m:t>
+                </m:r>
+                <m:r>
+                  <m:rPr>
+                    <m:sty m:val="p"/>
+                  </m:rPr>
+                  <m:t>)</m:t>
+                </m:r>
+                <m:r>
+                  <m:rPr>
+                    <m:sty m:val="p"/>
+                  </m:rPr>
+                  <m:t>=</m:t>
+                </m:r>
+                <m:nary>
+                  <m:naryPr>
+                    <m:chr m:val="∑"/>
+                    <m:limLoc m:val="undOvr"/>
+                    <m:subHide m:val="off"/>
+                    <m:supHide m:val="on"/>
+                  </m:naryPr>
+                  <m:sub>
+                    <m:r>
+                      <m:t>s</m:t>
+                    </m:r>
+                    <m:r>
+                      <m:rPr>
+                        <m:sty m:val="p"/>
+                      </m:rPr>
+                      <m:t>∈</m:t>
+                    </m:r>
+                    <m:r>
+                      <m:rPr>
+                        <m:scr m:val="script"/>
+                        <m:sty m:val="p"/>
+                      </m:rPr>
+                      <m:t>S</m:t>
+                    </m:r>
+                  </m:sub>
+                  <m:sup>
+                    <m:r>
+                      <m:t>​</m:t>
+                    </m:r>
+                  </m:sup>
+                  <m:e>
+                    <m:sSub>
+                      <m:e>
+                        <m:r>
+                          <m:t>π</m:t>
+                        </m:r>
+                      </m:e>
+                      <m:sub>
+                        <m:r>
+                          <m:t>s</m:t>
+                        </m:r>
+                      </m:sub>
+                    </m:sSub>
+                  </m:e>
+                </m:nary>
+                <m:r>
+                  <m:t> </m:t>
+                </m:r>
+                <m:sSub>
+                  <m:e>
+                    <m:r>
+                      <m:rPr>
+                        <m:sty m:val="p"/>
+                      </m:rPr>
+                      <m:t>Π</m:t>
+                    </m:r>
+                  </m:e>
+                  <m:sub>
+                    <m:r>
+                      <m:t>s</m:t>
+                    </m:r>
+                  </m:sub>
+                </m:sSub>
+                <m:r>
+                  <m:rPr>
+                    <m:sty m:val="p"/>
+                  </m:rPr>
+                  <m:t>(</m:t>
+                </m:r>
+                <m:r>
+                  <m:t>P</m:t>
+                </m:r>
+                <m:r>
+                  <m:rPr>
+                    <m:sty m:val="p"/>
+                  </m:rPr>
+                  <m:t>)</m:t>
+                </m:r>
+                <m:r>
+                  <m:rPr>
+                    <m:sty m:val="p"/>
+                  </m:rPr>
+                  <m:t>−</m:t>
+                </m:r>
+                <m:sSup>
+                  <m:e>
+                    <m:r>
+                      <m:t>R</m:t>
+                    </m:r>
+                  </m:e>
+                  <m:sup>
+                    <m:r>
+                      <m:t>c</m:t>
+                    </m:r>
+                    <m:r>
+                      <m:t>a</m:t>
+                    </m:r>
+                    <m:r>
+                      <m:t>p</m:t>
+                    </m:r>
+                  </m:sup>
+                </m:sSup>
+                <m:r>
+                  <m:t>P</m:t>
+                </m:r>
+              </m:oMath>
+            </m:oMathPara>
+          </w:p>
+        </w:tc>
+        <w:tc>
+          <w:tcPr>
+            <w:tcW w:w="1000" w:type="dxa"/>
+            <w:vAlign w:val="center"/>
+          </w:tcPr>
+          <w:p>
+            <w:pPr>
+              <w:pStyle w:val="NumeroEquacao"/>
+            </w:pPr>
+            <w:r>
+              <w:t>(3.36)</w:t>
+            </w:r>
+          </w:p>
+        </w:tc>
+      </w:tr>
+    </w:tbl>
+    <w:p>
+      <w:pPr>
+        <w:pStyle w:val="FirstParagraph"/>
+      </w:pPr>
+      <w:r>
+        <w:t xml:space="preserve">A diferença</w:t>
+      </w:r>
+      <w:r>
+        <w:t xml:space="preserve"> </w:t>
+      </w:r>
+      <m:oMath>
+        <m:r>
+          <m:t>Q</m:t>
+        </m:r>
+        <m:r>
+          <m:rPr>
+            <m:sty m:val="p"/>
+          </m:rPr>
+          <m:t>(</m:t>
+        </m:r>
+        <m:r>
+          <m:t>0</m:t>
+        </m:r>
+        <m:r>
+          <m:rPr>
+            <m:sty m:val="p"/>
+          </m:rPr>
+          <m:t>)</m:t>
+        </m:r>
+        <m:r>
+          <m:rPr>
+            <m:sty m:val="p"/>
+          </m:rPr>
+          <m:t>−</m:t>
+        </m:r>
+        <m:r>
+          <m:t>Q</m:t>
+        </m:r>
+        <m:r>
+          <m:rPr>
+            <m:sty m:val="p"/>
+          </m:rPr>
+          <m:t>(</m:t>
+        </m:r>
+        <m:r>
+          <m:t>P</m:t>
+        </m:r>
+        <m:r>
+          <m:rPr>
+            <m:sty m:val="p"/>
+          </m:rPr>
+          <m:t>)</m:t>
+        </m:r>
+      </m:oMath>
+      <w:r>
+        <w:t xml:space="preserve"> </w:t>
+      </w:r>
+      <w:r>
+        <w:t xml:space="preserve">mede quanto lucro operacional o empreendedor deixa de obter — no MCP e na venda de hidrogênio — por comprometer</w:t>
+      </w:r>
+      <w:r>
+        <w:t xml:space="preserve"> </w:t>
+      </w:r>
+      <m:oMath>
+        <m:r>
+          <m:t>P</m:t>
+        </m:r>
+      </m:oMath>
+      <w:r>
+        <w:t xml:space="preserve"> </w:t>
+      </w:r>
+      <w:r>
+        <w:t xml:space="preserve">MW com o leilão, isto é, o custo de oportunidade da contratação. Seu valor por MW adicional,</w:t>
+      </w:r>
+      <w:r>
+        <w:t xml:space="preserve"> </w:t>
+      </w:r>
+      <m:oMath>
+        <m:sSup>
+          <m:e>
+            <m:r>
+              <m:t>c</m:t>
+            </m:r>
+          </m:e>
+          <m:sup>
+            <m:r>
+              <m:t>o</m:t>
+            </m:r>
+            <m:r>
+              <m:t>p</m:t>
+            </m:r>
+          </m:sup>
+        </m:sSup>
+        <m:r>
+          <m:rPr>
+            <m:sty m:val="p"/>
+          </m:rPr>
+          <m:t>(</m:t>
+        </m:r>
+        <m:r>
+          <m:t>P</m:t>
+        </m:r>
+        <m:r>
+          <m:rPr>
+            <m:sty m:val="p"/>
+          </m:rPr>
+          <m:t>)</m:t>
+        </m:r>
+        <m:r>
+          <m:rPr>
+            <m:sty m:val="p"/>
+          </m:rPr>
+          <m:t>=</m:t>
+        </m:r>
+        <m:r>
+          <m:rPr>
+            <m:sty m:val="p"/>
+          </m:rPr>
+          <m:t>−</m:t>
+        </m:r>
+        <m:r>
+          <m:rPr>
+            <m:sty m:val="p"/>
+          </m:rPr>
+          <m:t>d</m:t>
+        </m:r>
+        <m:r>
+          <m:t>Q</m:t>
+        </m:r>
+        <m:r>
+          <m:rPr>
+            <m:sty m:val="p"/>
+          </m:rPr>
+          <m:t>/</m:t>
+        </m:r>
+        <m:r>
+          <m:rPr>
+            <m:sty m:val="p"/>
+          </m:rPr>
+          <m:t>d</m:t>
+        </m:r>
+        <m:r>
+          <m:t>P</m:t>
+        </m:r>
+      </m:oMath>
+      <w:r>
+        <w:t xml:space="preserve">, é o custo de oportunidade marginal. Como a decisão envolve uma única variável e o interesse está na curva inteira, e não apenas no seu máximo,</w:t>
+      </w:r>
+      <w:r>
+        <w:t xml:space="preserve"> </w:t>
+      </w:r>
+      <m:oMath>
+        <m:r>
+          <m:t>Q</m:t>
+        </m:r>
+      </m:oMath>
+      <w:r>
+        <w:t xml:space="preserve"> </w:t>
+      </w:r>
+      <w:r>
+        <w:t xml:space="preserve">é avaliada numa grade</w:t>
+      </w:r>
+      <w:r>
+        <w:t xml:space="preserve"> </w:t>
+      </w:r>
+      <m:oMath>
+        <m:sSub>
+          <m:e>
+            <m:r>
+              <m:rPr>
+                <m:scr m:val="script"/>
+                <m:sty m:val="p"/>
+              </m:rPr>
+              <m:t>X</m:t>
+            </m:r>
+          </m:e>
+          <m:sub>
+            <m:r>
+              <m:t>h</m:t>
+            </m:r>
+          </m:sub>
+        </m:sSub>
+        <m:r>
+          <m:rPr>
+            <m:sty m:val="p"/>
+          </m:rPr>
+          <m:t>=</m:t>
+        </m:r>
+        <m:r>
+          <m:rPr>
+            <m:sty m:val="p"/>
+          </m:rPr>
+          <m:t>{</m:t>
+        </m:r>
+        <m:r>
+          <m:t>0</m:t>
+        </m:r>
+        <m:r>
+          <m:rPr>
+            <m:sty m:val="p"/>
+          </m:rPr>
+          <m:t>}</m:t>
+        </m:r>
+        <m:r>
+          <m:rPr>
+            <m:sty m:val="p"/>
+          </m:rPr>
+          <m:t>∪</m:t>
+        </m:r>
+        <m:r>
+          <m:rPr>
+            <m:sty m:val="p"/>
+          </m:rPr>
+          <m:t>{</m:t>
+        </m:r>
+        <m:sSup>
+          <m:e>
+            <m:bar>
+              <m:barPr>
+                <m:pos m:val="bot"/>
+              </m:barPr>
+              <m:e>
+                <m:r>
+                  <m:t>P</m:t>
+                </m:r>
+              </m:e>
+            </m:bar>
+          </m:e>
+          <m:sup>
+            <m:r>
+              <m:t>c</m:t>
+            </m:r>
+            <m:r>
+              <m:t>a</m:t>
+            </m:r>
+            <m:r>
+              <m:t>p</m:t>
+            </m:r>
+          </m:sup>
+        </m:sSup>
+        <m:r>
+          <m:rPr>
+            <m:sty m:val="p"/>
+          </m:rPr>
+          <m:t>,</m:t>
+        </m:r>
+        <m:sSup>
+          <m:e>
+            <m:bar>
+              <m:barPr>
+                <m:pos m:val="bot"/>
+              </m:barPr>
+              <m:e>
+                <m:r>
+                  <m:t>P</m:t>
+                </m:r>
+              </m:e>
+            </m:bar>
+          </m:e>
+          <m:sup>
+            <m:r>
+              <m:t>c</m:t>
+            </m:r>
+            <m:r>
+              <m:t>a</m:t>
+            </m:r>
+            <m:r>
+              <m:t>p</m:t>
+            </m:r>
+          </m:sup>
+        </m:sSup>
+        <m:r>
+          <m:rPr>
+            <m:sty m:val="p"/>
+          </m:rPr>
+          <m:t>+</m:t>
+        </m:r>
+        <m:r>
+          <m:t>h</m:t>
+        </m:r>
+        <m:r>
+          <m:rPr>
+            <m:sty m:val="p"/>
+          </m:rPr>
+          <m:t>,</m:t>
+        </m:r>
+        <m:r>
+          <m:rPr>
+            <m:sty m:val="p"/>
+          </m:rPr>
+          <m:t>…</m:t>
+        </m:r>
+        <m:r>
+          <m:rPr>
+            <m:sty m:val="p"/>
+          </m:rPr>
+          <m:t>,</m:t>
+        </m:r>
+        <m:sSup>
+          <m:e>
+            <m:acc>
+              <m:accPr>
+                <m:chr m:val="‾"/>
+              </m:accPr>
+              <m:e>
+                <m:r>
+                  <m:t>P</m:t>
+                </m:r>
+              </m:e>
+            </m:acc>
+          </m:e>
+          <m:sup>
+            <m:r>
+              <m:t>c</m:t>
+            </m:r>
+            <m:r>
+              <m:t>a</m:t>
+            </m:r>
+            <m:r>
+              <m:t>p</m:t>
+            </m:r>
+          </m:sup>
+        </m:sSup>
+        <m:r>
+          <m:rPr>
+            <m:sty m:val="p"/>
+          </m:rPr>
+          <m:t>}</m:t>
+        </m:r>
+      </m:oMath>
+      <w:r>
+        <w:t xml:space="preserve">, com</w:t>
+      </w:r>
+      <w:r>
+        <w:t xml:space="preserve"> </w:t>
+      </w:r>
+      <m:oMath>
+        <m:r>
+          <m:t>h</m:t>
+        </m:r>
+        <m:r>
+          <m:rPr>
+            <m:sty m:val="p"/>
+          </m:rPr>
+          <m:t>=</m:t>
+        </m:r>
+        <m:r>
+          <m:t>2</m:t>
+        </m:r>
+        <m:r>
+          <m:rPr>
+            <m:sty m:val="p"/>
+          </m:rPr>
+          <m:t>,</m:t>
+        </m:r>
+        <m:r>
+          <m:t>5</m:t>
+        </m:r>
+      </m:oMath>
+      <w:r>
+        <w:t xml:space="preserve"> </w:t>
+      </w:r>
+      <w:r>
+        <w:t xml:space="preserve">MW, resolvendo-se para cada ponto os subproblemas de todos os pares (cenário, bloco) com</w:t>
+      </w:r>
+      <w:r>
+        <w:t xml:space="preserve"> </w:t>
+      </w:r>
+      <m:oMath>
+        <m:sSup>
+          <m:e>
+            <m:r>
+              <m:t>P</m:t>
+            </m:r>
+          </m:e>
+          <m:sup>
+            <m:r>
+              <m:t>c</m:t>
+            </m:r>
+            <m:r>
+              <m:t>a</m:t>
+            </m:r>
+            <m:r>
+              <m:t>p</m:t>
+            </m:r>
+          </m:sup>
+        </m:sSup>
+      </m:oMath>
+      <w:r>
+        <w:t xml:space="preserve"> </w:t>
+      </w:r>
+      <w:r>
+        <w:t xml:space="preserve">fixo. O custo de oportunidade marginal é aproximado pelas diferenças finitas da Equação (3.37):</w:t>
+      </w:r>
+    </w:p>
+    <w:tbl>
+      <w:tblPr>
+        <w:tblW w:w="9071" w:type="dxa"/>
+        <w:tblBorders>
+          <w:top w:val="nil"/>
+          <w:left w:val="nil"/>
+          <w:bottom w:val="nil"/>
+          <w:right w:val="nil"/>
+          <w:insideH w:val="nil"/>
+          <w:insideV w:val="nil"/>
+        </w:tblBorders>
+        <w:tblLayout w:type="fixed"/>
+        <w:tblCellMar>
+          <w:left w:w="0" w:type="dxa"/>
+          <w:right w:w="0" w:type="dxa"/>
+        </w:tblCellMar>
+      </w:tblPr>
+      <w:tblGrid>
+        <w:gridCol w:w="8071"/>
+        <w:gridCol w:w="1000"/>
+      </w:tblGrid>
+      <w:tr>
+        <w:tc>
+          <w:tcPr>
+            <w:tcW w:w="8071" w:type="dxa"/>
+            <w:vAlign w:val="center"/>
+          </w:tcPr>
+          <w:p>
+            <w:pPr>
+              <w:pStyle w:val="BodyText"/>
+            </w:pPr>
+            <m:oMathPara>
+              <m:oMathParaPr>
+                <m:jc m:val="center"/>
+              </m:oMathParaPr>
+              <m:oMath>
+                <m:sSubSup>
+                  <m:e>
+                    <m:r>
+                      <m:t>c</m:t>
+                    </m:r>
+                  </m:e>
+                  <m:sub>
+                    <m:r>
+                      <m:t>j</m:t>
+                    </m:r>
+                  </m:sub>
+                  <m:sup>
+                    <m:r>
+                      <m:t>o</m:t>
+                    </m:r>
+                    <m:r>
+                      <m:t>p</m:t>
+                    </m:r>
+                  </m:sup>
+                </m:sSubSup>
+                <m:r>
+                  <m:rPr>
+                    <m:sty m:val="p"/>
+                  </m:rPr>
+                  <m:t>=</m:t>
+                </m:r>
+                <m:r>
+                  <m:rPr>
+                    <m:sty m:val="p"/>
+                  </m:rPr>
+                  <m:t>−</m:t>
+                </m:r>
+                <m:r>
+                  <m:t> </m:t>
+                </m:r>
+                <m:f>
+                  <m:fPr>
+                    <m:type m:val="bar"/>
+                  </m:fPr>
+                  <m:num>
+                    <m:r>
+                      <m:t>Q</m:t>
+                    </m:r>
+                    <m:r>
+                      <m:rPr>
+                        <m:sty m:val="p"/>
+                      </m:rPr>
+                      <m:t>(</m:t>
+                    </m:r>
+                    <m:sSub>
+                      <m:e>
+                        <m:r>
+                          <m:t>P</m:t>
+                        </m:r>
+                      </m:e>
+                      <m:sub>
+                        <m:r>
+                          <m:t>j</m:t>
+                        </m:r>
+                        <m:r>
+                          <m:rPr>
+                            <m:sty m:val="p"/>
+                          </m:rPr>
+                          <m:t>+</m:t>
+                        </m:r>
+                        <m:r>
+                          <m:t>1</m:t>
+                        </m:r>
+                      </m:sub>
+                    </m:sSub>
+                    <m:r>
+                      <m:rPr>
+                        <m:sty m:val="p"/>
+                      </m:rPr>
+                      <m:t>)</m:t>
+                    </m:r>
+                    <m:r>
+                      <m:rPr>
+                        <m:sty m:val="p"/>
+                      </m:rPr>
+                      <m:t>−</m:t>
+                    </m:r>
+                    <m:r>
+                      <m:t>Q</m:t>
+                    </m:r>
+                    <m:r>
+                      <m:rPr>
+                        <m:sty m:val="p"/>
+                      </m:rPr>
+                      <m:t>(</m:t>
+                    </m:r>
+                    <m:sSub>
+                      <m:e>
+                        <m:r>
+                          <m:t>P</m:t>
+                        </m:r>
+                      </m:e>
+                      <m:sub>
+                        <m:r>
+                          <m:t>j</m:t>
+                        </m:r>
+                      </m:sub>
+                    </m:sSub>
+                    <m:r>
+                      <m:rPr>
+                        <m:sty m:val="p"/>
+                      </m:rPr>
+                      <m:t>)</m:t>
+                    </m:r>
+                  </m:num>
+                  <m:den>
+                    <m:sSub>
+                      <m:e>
+                        <m:r>
+                          <m:t>P</m:t>
+                        </m:r>
+                      </m:e>
+                      <m:sub>
+                        <m:r>
+                          <m:t>j</m:t>
+                        </m:r>
+                        <m:r>
+                          <m:rPr>
+                            <m:sty m:val="p"/>
+                          </m:rPr>
+                          <m:t>+</m:t>
+                        </m:r>
+                        <m:r>
+                          <m:t>1</m:t>
+                        </m:r>
+                      </m:sub>
+                    </m:sSub>
+                    <m:r>
+                      <m:rPr>
+                        <m:sty m:val="p"/>
+                      </m:rPr>
+                      <m:t>−</m:t>
+                    </m:r>
+                    <m:sSub>
+                      <m:e>
+                        <m:r>
+                          <m:t>P</m:t>
+                        </m:r>
+                      </m:e>
+                      <m:sub>
+                        <m:r>
+                          <m:t>j</m:t>
+                        </m:r>
+                      </m:sub>
+                    </m:sSub>
+                  </m:den>
+                </m:f>
+                <m:r>
+                  <m:rPr>
+                    <m:sty m:val="p"/>
+                  </m:rPr>
+                  <m:t>,</m:t>
+                </m:r>
+                <m:r>
+                  <m:t>  </m:t>
+                </m:r>
+                <m:sSub>
+                  <m:e>
+                    <m:r>
+                      <m:t>P</m:t>
+                    </m:r>
+                  </m:e>
+                  <m:sub>
+                    <m:r>
+                      <m:t>j</m:t>
+                    </m:r>
+                  </m:sub>
+                </m:sSub>
+                <m:r>
+                  <m:rPr>
+                    <m:sty m:val="p"/>
+                  </m:rPr>
+                  <m:t>,</m:t>
+                </m:r>
+                <m:r>
+                  <m:t> </m:t>
+                </m:r>
+                <m:sSub>
+                  <m:e>
+                    <m:r>
+                      <m:t>P</m:t>
+                    </m:r>
+                  </m:e>
+                  <m:sub>
+                    <m:r>
+                      <m:t>j</m:t>
+                    </m:r>
+                    <m:r>
+                      <m:rPr>
+                        <m:sty m:val="p"/>
+                      </m:rPr>
+                      <m:t>+</m:t>
+                    </m:r>
+                    <m:r>
+                      <m:t>1</m:t>
+                    </m:r>
+                  </m:sub>
+                </m:sSub>
+                <m:r>
+                  <m:rPr>
+                    <m:sty m:val="p"/>
+                  </m:rPr>
+                  <m:t>∈</m:t>
+                </m:r>
+                <m:sSub>
+                  <m:e>
+                    <m:r>
+                      <m:rPr>
+                        <m:scr m:val="script"/>
+                        <m:sty m:val="p"/>
+                      </m:rPr>
+                      <m:t>X</m:t>
+                    </m:r>
+                  </m:e>
+                  <m:sub>
+                    <m:r>
+                      <m:t>h</m:t>
+                    </m:r>
+                  </m:sub>
+                </m:sSub>
+                <m:r>
+                  <m:rPr>
+                    <m:sty m:val="p"/>
+                  </m:rPr>
+                  <m:t>,</m:t>
+                </m:r>
+                <m:r>
+                  <m:t> </m:t>
+                </m:r>
+                <m:r>
+                  <m:t> </m:t>
+                </m:r>
+                <m:sSub>
+                  <m:e>
+                    <m:r>
+                      <m:t>P</m:t>
+                    </m:r>
+                  </m:e>
+                  <m:sub>
+                    <m:r>
+                      <m:t>j</m:t>
+                    </m:r>
+                  </m:sub>
+                </m:sSub>
+                <m:r>
+                  <m:rPr>
+                    <m:sty m:val="p"/>
+                  </m:rPr>
+                  <m:t>≥</m:t>
+                </m:r>
+                <m:sSup>
+                  <m:e>
+                    <m:bar>
+                      <m:barPr>
+                        <m:pos m:val="bot"/>
+                      </m:barPr>
+                      <m:e>
+                        <m:r>
+                          <m:t>P</m:t>
+                        </m:r>
+                      </m:e>
+                    </m:bar>
+                  </m:e>
+                  <m:sup>
+                    <m:r>
+                      <m:t>c</m:t>
+                    </m:r>
+                    <m:r>
+                      <m:t>a</m:t>
+                    </m:r>
+                    <m:r>
+                      <m:t>p</m:t>
+                    </m:r>
+                  </m:sup>
+                </m:sSup>
+              </m:oMath>
+            </m:oMathPara>
+          </w:p>
+        </w:tc>
+        <w:tc>
+          <w:tcPr>
+            <w:tcW w:w="1000" w:type="dxa"/>
+            <w:vAlign w:val="center"/>
+          </w:tcPr>
+          <w:p>
+            <w:pPr>
+              <w:pStyle w:val="NumeroEquacao"/>
+            </w:pPr>
+            <w:r>
+              <w:t>(3.37)</w:t>
+            </w:r>
+          </w:p>
+        </w:tc>
+      </w:tr>
+    </w:tbl>
+    <w:p>
+      <w:pPr>
+        <w:pStyle w:val="FirstParagraph"/>
+      </w:pPr>
+      <w:r>
+        <w:t xml:space="preserve">Para uma receita fixa</w:t>
+      </w:r>
+      <w:r>
+        <w:t xml:space="preserve"> </w:t>
+      </w:r>
+      <m:oMath>
+        <m:r>
+          <m:t>R</m:t>
+        </m:r>
+      </m:oMath>
+      <w:r>
+        <w:t xml:space="preserve">, a potência ótima a ofertar é dada pela Equação (3.38), e o conjunto de pares</w:t>
+      </w:r>
+      <w:r>
+        <w:t xml:space="preserve"> </w:t>
+      </w:r>
+      <m:oMath>
+        <m:r>
+          <m:rPr>
+            <m:sty m:val="p"/>
+          </m:rPr>
+          <m:t>(</m:t>
+        </m:r>
+        <m:r>
+          <m:t>R</m:t>
+        </m:r>
+        <m:r>
+          <m:rPr>
+            <m:sty m:val="p"/>
+          </m:rPr>
+          <m:t>,</m:t>
+        </m:r>
+        <m:sSup>
+          <m:e>
+            <m:r>
+              <m:t>P</m:t>
+            </m:r>
+          </m:e>
+          <m:sup>
+            <m:r>
+              <m:rPr>
+                <m:sty m:val="p"/>
+              </m:rPr>
+              <m:t>*</m:t>
+            </m:r>
+          </m:sup>
+        </m:sSup>
+        <m:r>
+          <m:rPr>
+            <m:sty m:val="p"/>
+          </m:rPr>
+          <m:t>(</m:t>
+        </m:r>
+        <m:r>
+          <m:t>R</m:t>
+        </m:r>
+        <m:r>
+          <m:rPr>
+            <m:sty m:val="p"/>
+          </m:rPr>
+          <m:t>)</m:t>
+        </m:r>
+        <m:r>
+          <m:rPr>
+            <m:sty m:val="p"/>
+          </m:rPr>
+          <m:t>)</m:t>
+        </m:r>
+      </m:oMath>
+      <w:r>
+        <w:t xml:space="preserve"> </w:t>
+      </w:r>
+      <w:r>
+        <w:t xml:space="preserve">constitui a curva de oferta do empreendedor:</w:t>
+      </w:r>
+    </w:p>
+    <w:tbl>
+      <w:tblPr>
+        <w:tblW w:w="9071" w:type="dxa"/>
+        <w:tblBorders>
+          <w:top w:val="nil"/>
+          <w:left w:val="nil"/>
+          <w:bottom w:val="nil"/>
+          <w:right w:val="nil"/>
+          <w:insideH w:val="nil"/>
+          <w:insideV w:val="nil"/>
+        </w:tblBorders>
+        <w:tblLayout w:type="fixed"/>
+        <w:tblCellMar>
+          <w:left w:w="0" w:type="dxa"/>
+          <w:right w:w="0" w:type="dxa"/>
+        </w:tblCellMar>
+      </w:tblPr>
+      <w:tblGrid>
+        <w:gridCol w:w="8071"/>
+        <w:gridCol w:w="1000"/>
+      </w:tblGrid>
+      <w:tr>
+        <w:tc>
+          <w:tcPr>
+            <w:tcW w:w="8071" w:type="dxa"/>
+            <w:vAlign w:val="center"/>
+          </w:tcPr>
+          <w:p>
+            <w:pPr>
+              <w:pStyle w:val="BodyText"/>
+            </w:pPr>
+            <m:oMathPara>
+              <m:oMathParaPr>
+                <m:jc m:val="center"/>
+              </m:oMathParaPr>
+              <m:oMath>
+                <m:sSup>
+                  <m:e>
+                    <m:r>
+                      <m:t>P</m:t>
+                    </m:r>
+                  </m:e>
+                  <m:sup>
+                    <m:r>
+                      <m:rPr>
+                        <m:sty m:val="p"/>
+                      </m:rPr>
+                      <m:t>*</m:t>
+                    </m:r>
+                  </m:sup>
+                </m:sSup>
+                <m:r>
+                  <m:rPr>
+                    <m:sty m:val="p"/>
+                  </m:rPr>
+                  <m:t>(</m:t>
+                </m:r>
+                <m:r>
+                  <m:t>R</m:t>
+                </m:r>
+                <m:r>
+                  <m:rPr>
+                    <m:sty m:val="p"/>
+                  </m:rPr>
+                  <m:t>)</m:t>
+                </m:r>
+                <m:r>
+                  <m:rPr>
+                    <m:sty m:val="p"/>
+                  </m:rPr>
+                  <m:t>∈</m:t>
+                </m:r>
+                <m:r>
+                  <m:rPr>
+                    <m:sty m:val="p"/>
+                  </m:rPr>
+                  <m:t>arg</m:t>
+                </m:r>
+                <m:limLow>
+                  <m:e>
+                    <m:r>
+                      <m:rPr>
+                        <m:sty m:val="p"/>
+                      </m:rPr>
+                      <m:t>max</m:t>
+                    </m:r>
+                  </m:e>
+                  <m:lim>
+                    <m:r>
+                      <m:t>P</m:t>
+                    </m:r>
+                    <m:r>
+                      <m:rPr>
+                        <m:sty m:val="p"/>
+                      </m:rPr>
+                      <m:t>∈</m:t>
+                    </m:r>
+                    <m:sSub>
+                      <m:e>
+                        <m:r>
+                          <m:rPr>
+                            <m:scr m:val="script"/>
+                            <m:sty m:val="p"/>
+                          </m:rPr>
+                          <m:t>X</m:t>
+                        </m:r>
+                      </m:e>
+                      <m:sub>
+                        <m:r>
+                          <m:t>h</m:t>
+                        </m:r>
+                      </m:sub>
+                    </m:sSub>
+                  </m:lim>
+                </m:limLow>
+                <m:r>
+                  <m:t> </m:t>
+                </m:r>
+                <m:r>
+                  <m:t>R</m:t>
+                </m:r>
+                <m:r>
+                  <m:t> </m:t>
+                </m:r>
+                <m:r>
+                  <m:t>P</m:t>
+                </m:r>
+                <m:r>
+                  <m:rPr>
+                    <m:sty m:val="p"/>
+                  </m:rPr>
+                  <m:t>+</m:t>
+                </m:r>
+                <m:r>
+                  <m:t>Q</m:t>
+                </m:r>
+                <m:r>
+                  <m:rPr>
+                    <m:sty m:val="p"/>
+                  </m:rPr>
+                  <m:t>(</m:t>
+                </m:r>
+                <m:r>
+                  <m:t>P</m:t>
+                </m:r>
+                <m:r>
+                  <m:rPr>
+                    <m:sty m:val="p"/>
+                  </m:rPr>
+                  <m:t>)</m:t>
+                </m:r>
+              </m:oMath>
+            </m:oMathPara>
+          </w:p>
+        </w:tc>
+        <w:tc>
+          <w:tcPr>
+            <w:tcW w:w="1000" w:type="dxa"/>
+            <w:vAlign w:val="center"/>
+          </w:tcPr>
+          <w:p>
+            <w:pPr>
+              <w:pStyle w:val="NumeroEquacao"/>
+            </w:pPr>
+            <w:r>
+              <w:t>(3.38)</w:t>
+            </w:r>
+          </w:p>
+        </w:tc>
+      </w:tr>
+    </w:tbl>
+    <w:p>
+      <w:pPr>
+        <w:pStyle w:val="FirstParagraph"/>
+      </w:pPr>
+      <w:r>
+        <w:t xml:space="preserve">Dois valores resumem a curva. A receita mínima de entrada,</w:t>
+      </w:r>
+      <w:r>
+        <w:t xml:space="preserve"> </w:t>
+      </w:r>
+      <m:oMath>
+        <m:sSup>
+          <m:e>
+            <m:r>
+              <m:t>R</m:t>
+            </m:r>
+          </m:e>
+          <m:sup>
+            <m:r>
+              <m:t>e</m:t>
+            </m:r>
+            <m:r>
+              <m:t>n</m:t>
+            </m:r>
+            <m:r>
+              <m:t>t</m:t>
+            </m:r>
+          </m:sup>
+        </m:sSup>
+      </m:oMath>
+      <w:r>
+        <w:t xml:space="preserve">, é a menor receita fixa para a qual participar do leilão é preferível a não participar, conforme a Equação (3.39); a receita de oferta integral,</w:t>
+      </w:r>
+      <w:r>
+        <w:t xml:space="preserve"> </w:t>
+      </w:r>
+      <m:oMath>
+        <m:sSup>
+          <m:e>
+            <m:r>
+              <m:t>R</m:t>
+            </m:r>
+          </m:e>
+          <m:sup>
+            <m:r>
+              <m:t>i</m:t>
+            </m:r>
+            <m:r>
+              <m:t>n</m:t>
+            </m:r>
+            <m:r>
+              <m:t>t</m:t>
+            </m:r>
+          </m:sup>
+        </m:sSup>
+      </m:oMath>
+      <w:r>
+        <w:t xml:space="preserve">, é a menor receita para a qual ofertar a potência máxima supera qualquer alternativa, conforme a Equação (3.40):</w:t>
+      </w:r>
+    </w:p>
+    <w:tbl>
+      <w:tblPr>
+        <w:tblW w:w="9071" w:type="dxa"/>
+        <w:tblBorders>
+          <w:top w:val="nil"/>
+          <w:left w:val="nil"/>
+          <w:bottom w:val="nil"/>
+          <w:right w:val="nil"/>
+          <w:insideH w:val="nil"/>
+          <w:insideV w:val="nil"/>
+        </w:tblBorders>
+        <w:tblLayout w:type="fixed"/>
+        <w:tblCellMar>
+          <w:left w:w="0" w:type="dxa"/>
+          <w:right w:w="0" w:type="dxa"/>
+        </w:tblCellMar>
+      </w:tblPr>
+      <w:tblGrid>
+        <w:gridCol w:w="8071"/>
+        <w:gridCol w:w="1000"/>
+      </w:tblGrid>
+      <w:tr>
+        <w:tc>
+          <w:tcPr>
+            <w:tcW w:w="8071" w:type="dxa"/>
+            <w:vAlign w:val="center"/>
+          </w:tcPr>
+          <w:p>
+            <w:pPr>
+              <w:pStyle w:val="BodyText"/>
+            </w:pPr>
+            <m:oMathPara>
+              <m:oMathParaPr>
+                <m:jc m:val="center"/>
+              </m:oMathParaPr>
+              <m:oMath>
+                <m:sSup>
+                  <m:e>
+                    <m:r>
+                      <m:t>R</m:t>
+                    </m:r>
+                  </m:e>
+                  <m:sup>
+                    <m:r>
+                      <m:t>e</m:t>
+                    </m:r>
+                    <m:r>
+                      <m:t>n</m:t>
+                    </m:r>
+                    <m:r>
+                      <m:t>t</m:t>
+                    </m:r>
+                  </m:sup>
+                </m:sSup>
+                <m:r>
+                  <m:rPr>
+                    <m:sty m:val="p"/>
+                  </m:rPr>
+                  <m:t>=</m:t>
+                </m:r>
+                <m:limLow>
+                  <m:e>
+                    <m:r>
+                      <m:rPr>
+                        <m:sty m:val="p"/>
+                      </m:rPr>
+                      <m:t>min</m:t>
+                    </m:r>
+                  </m:e>
+                  <m:lim>
+                    <m:r>
+                      <m:t>P</m:t>
+                    </m:r>
+                    <m:r>
+                      <m:rPr>
+                        <m:sty m:val="p"/>
+                      </m:rPr>
+                      <m:t>∈</m:t>
+                    </m:r>
+                    <m:sSub>
+                      <m:e>
+                        <m:r>
+                          <m:rPr>
+                            <m:scr m:val="script"/>
+                            <m:sty m:val="p"/>
+                          </m:rPr>
+                          <m:t>X</m:t>
+                        </m:r>
+                      </m:e>
+                      <m:sub>
+                        <m:r>
+                          <m:t>h</m:t>
+                        </m:r>
+                      </m:sub>
+                    </m:sSub>
+                    <m:r>
+                      <m:rPr>
+                        <m:sty m:val="p"/>
+                      </m:rPr>
+                      <m:t>,</m:t>
+                    </m:r>
+                    <m:r>
+                      <m:t> </m:t>
+                    </m:r>
+                    <m:r>
+                      <m:t>P</m:t>
+                    </m:r>
+                    <m:r>
+                      <m:rPr>
+                        <m:sty m:val="p"/>
+                      </m:rPr>
+                      <m:t>&gt;</m:t>
+                    </m:r>
+                    <m:r>
+                      <m:t>0</m:t>
+                    </m:r>
+                  </m:lim>
+                </m:limLow>
+                <m:r>
+                  <m:t> </m:t>
+                </m:r>
+                <m:f>
+                  <m:fPr>
+                    <m:type m:val="bar"/>
+                  </m:fPr>
+                  <m:num>
+                    <m:r>
+                      <m:t>Q</m:t>
+                    </m:r>
+                    <m:r>
+                      <m:rPr>
+                        <m:sty m:val="p"/>
+                      </m:rPr>
+                      <m:t>(</m:t>
+                    </m:r>
+                    <m:r>
+                      <m:t>0</m:t>
+                    </m:r>
+                    <m:r>
+                      <m:rPr>
+                        <m:sty m:val="p"/>
+                      </m:rPr>
+                      <m:t>)</m:t>
+                    </m:r>
+                    <m:r>
+                      <m:rPr>
+                        <m:sty m:val="p"/>
+                      </m:rPr>
+                      <m:t>−</m:t>
+                    </m:r>
+                    <m:r>
+                      <m:t>Q</m:t>
+                    </m:r>
+                    <m:r>
+                      <m:rPr>
+                        <m:sty m:val="p"/>
+                      </m:rPr>
+                      <m:t>(</m:t>
+                    </m:r>
+                    <m:r>
+                      <m:t>P</m:t>
+                    </m:r>
+                    <m:r>
+                      <m:rPr>
+                        <m:sty m:val="p"/>
+                      </m:rPr>
+                      <m:t>)</m:t>
+                    </m:r>
+                  </m:num>
+                  <m:den>
+                    <m:r>
+                      <m:t>P</m:t>
+                    </m:r>
+                  </m:den>
+                </m:f>
+              </m:oMath>
+            </m:oMathPara>
+          </w:p>
+        </w:tc>
+        <w:tc>
+          <w:tcPr>
+            <w:tcW w:w="1000" w:type="dxa"/>
+            <w:vAlign w:val="center"/>
+          </w:tcPr>
+          <w:p>
+            <w:pPr>
+              <w:pStyle w:val="NumeroEquacao"/>
+            </w:pPr>
+            <w:r>
+              <w:t>(3.39)</w:t>
+            </w:r>
+          </w:p>
+        </w:tc>
+      </w:tr>
+    </w:tbl>
+    <w:tbl>
+      <w:tblPr>
+        <w:tblW w:w="9071" w:type="dxa"/>
+        <w:tblBorders>
+          <w:top w:val="nil"/>
+          <w:left w:val="nil"/>
+          <w:bottom w:val="nil"/>
+          <w:right w:val="nil"/>
+          <w:insideH w:val="nil"/>
+          <w:insideV w:val="nil"/>
+        </w:tblBorders>
+        <w:tblLayout w:type="fixed"/>
+        <w:tblCellMar>
+          <w:left w:w="0" w:type="dxa"/>
+          <w:right w:w="0" w:type="dxa"/>
+        </w:tblCellMar>
+      </w:tblPr>
+      <w:tblGrid>
+        <w:gridCol w:w="8071"/>
+        <w:gridCol w:w="1000"/>
+      </w:tblGrid>
+      <w:tr>
+        <w:tc>
+          <w:tcPr>
+            <w:tcW w:w="8071" w:type="dxa"/>
+            <w:vAlign w:val="center"/>
+          </w:tcPr>
+          <w:p>
+            <w:pPr>
+              <w:pStyle w:val="FirstParagraph"/>
+            </w:pPr>
+            <m:oMathPara>
+              <m:oMathParaPr>
+                <m:jc m:val="center"/>
+              </m:oMathParaPr>
+              <m:oMath>
+                <m:sSup>
+                  <m:e>
+                    <m:r>
+                      <m:t>R</m:t>
+                    </m:r>
+                  </m:e>
+                  <m:sup>
+                    <m:r>
+                      <m:t>i</m:t>
+                    </m:r>
+                    <m:r>
+                      <m:t>n</m:t>
+                    </m:r>
+                    <m:r>
+                      <m:t>t</m:t>
+                    </m:r>
+                  </m:sup>
+                </m:sSup>
+                <m:r>
+                  <m:rPr>
+                    <m:sty m:val="p"/>
+                  </m:rPr>
+                  <m:t>=</m:t>
+                </m:r>
+                <m:limLow>
+                  <m:e>
+                    <m:r>
+                      <m:rPr>
+                        <m:sty m:val="p"/>
+                      </m:rPr>
+                      <m:t>max</m:t>
+                    </m:r>
+                  </m:e>
+                  <m:lim>
+                    <m:r>
+                      <m:t>P</m:t>
+                    </m:r>
+                    <m:r>
+                      <m:rPr>
+                        <m:sty m:val="p"/>
+                      </m:rPr>
+                      <m:t>∈</m:t>
+                    </m:r>
+                    <m:sSub>
+                      <m:e>
+                        <m:r>
+                          <m:rPr>
+                            <m:scr m:val="script"/>
+                            <m:sty m:val="p"/>
+                          </m:rPr>
+                          <m:t>X</m:t>
+                        </m:r>
+                      </m:e>
+                      <m:sub>
+                        <m:r>
+                          <m:t>h</m:t>
+                        </m:r>
+                      </m:sub>
+                    </m:sSub>
+                    <m:r>
+                      <m:rPr>
+                        <m:sty m:val="p"/>
+                      </m:rPr>
+                      <m:t>,</m:t>
+                    </m:r>
+                    <m:r>
+                      <m:t> </m:t>
+                    </m:r>
+                    <m:r>
+                      <m:t>P</m:t>
+                    </m:r>
+                    <m:r>
+                      <m:rPr>
+                        <m:sty m:val="p"/>
+                      </m:rPr>
+                      <m:t>&lt;</m:t>
+                    </m:r>
+                    <m:sSup>
+                      <m:e>
+                        <m:acc>
+                          <m:accPr>
+                            <m:chr m:val="‾"/>
+                          </m:accPr>
+                          <m:e>
+                            <m:r>
+                              <m:t>P</m:t>
+                            </m:r>
+                          </m:e>
+                        </m:acc>
+                      </m:e>
+                      <m:sup>
+                        <m:r>
+                          <m:t>c</m:t>
+                        </m:r>
+                        <m:r>
+                          <m:t>a</m:t>
+                        </m:r>
+                        <m:r>
+                          <m:t>p</m:t>
+                        </m:r>
+                      </m:sup>
+                    </m:sSup>
+                  </m:lim>
+                </m:limLow>
+                <m:r>
+                  <m:t> </m:t>
+                </m:r>
+                <m:f>
+                  <m:fPr>
+                    <m:type m:val="bar"/>
+                  </m:fPr>
+                  <m:num>
+                    <m:r>
+                      <m:t>Q</m:t>
+                    </m:r>
+                    <m:r>
+                      <m:rPr>
+                        <m:sty m:val="p"/>
+                      </m:rPr>
+                      <m:t>(</m:t>
+                    </m:r>
+                    <m:r>
+                      <m:t>P</m:t>
+                    </m:r>
+                    <m:r>
+                      <m:rPr>
+                        <m:sty m:val="p"/>
+                      </m:rPr>
+                      <m:t>)</m:t>
+                    </m:r>
+                    <m:r>
+                      <m:rPr>
+                        <m:sty m:val="p"/>
+                      </m:rPr>
+                      <m:t>−</m:t>
+                    </m:r>
+                    <m:r>
+                      <m:t>Q</m:t>
+                    </m:r>
+                    <m:r>
+                      <m:rPr>
+                        <m:sty m:val="p"/>
+                      </m:rPr>
+                      <m:t>(</m:t>
+                    </m:r>
+                    <m:sSup>
+                      <m:e>
+                        <m:acc>
+                          <m:accPr>
+                            <m:chr m:val="‾"/>
+                          </m:accPr>
+                          <m:e>
+                            <m:r>
+                              <m:t>P</m:t>
+                            </m:r>
+                          </m:e>
+                        </m:acc>
+                      </m:e>
+                      <m:sup>
+                        <m:r>
+                          <m:t>c</m:t>
+                        </m:r>
+                        <m:r>
+                          <m:t>a</m:t>
+                        </m:r>
+                        <m:r>
+                          <m:t>p</m:t>
+                        </m:r>
+                      </m:sup>
+                    </m:sSup>
+                    <m:r>
+                      <m:rPr>
+                        <m:sty m:val="p"/>
+                      </m:rPr>
+                      <m:t>)</m:t>
+                    </m:r>
+                  </m:num>
+                  <m:den>
+                    <m:sSup>
+                      <m:e>
+                        <m:acc>
+                          <m:accPr>
+                            <m:chr m:val="‾"/>
+                          </m:accPr>
+                          <m:e>
+                            <m:r>
+                              <m:t>P</m:t>
+                            </m:r>
+                          </m:e>
+                        </m:acc>
+                      </m:e>
+                      <m:sup>
+                        <m:r>
+                          <m:t>c</m:t>
+                        </m:r>
+                        <m:r>
+                          <m:t>a</m:t>
+                        </m:r>
+                        <m:r>
+                          <m:t>p</m:t>
+                        </m:r>
+                      </m:sup>
+                    </m:sSup>
+                    <m:r>
+                      <m:rPr>
+                        <m:sty m:val="p"/>
+                      </m:rPr>
+                      <m:t>−</m:t>
+                    </m:r>
+                    <m:r>
+                      <m:t>P</m:t>
+                    </m:r>
+                  </m:den>
+                </m:f>
+              </m:oMath>
+            </m:oMathPara>
+          </w:p>
+        </w:tc>
+        <w:tc>
+          <w:tcPr>
+            <w:tcW w:w="1000" w:type="dxa"/>
+            <w:vAlign w:val="center"/>
+          </w:tcPr>
+          <w:p>
+            <w:pPr>
+              <w:pStyle w:val="NumeroEquacao"/>
+            </w:pPr>
+            <w:r>
+              <w:t>(3.40)</w:t>
+            </w:r>
+          </w:p>
+        </w:tc>
+      </w:tr>
+    </w:tbl>
+    <w:p>
+      <w:pPr>
+        <w:pStyle w:val="FirstParagraph"/>
+      </w:pPr>
+      <w:r>
+        <w:t xml:space="preserve">A curva de oferta não depende do formato do leilão nem do comportamento dos demais proponentes: ela indica, para cada preço, quanta potência o empreendedor estaria disposto a comprometer. Ressalta-se que o investimento no BESS não entra em</w:t>
+      </w:r>
+      <w:r>
+        <w:t xml:space="preserve"> </w:t>
+      </w:r>
+      <m:oMath>
+        <m:r>
+          <m:t>Q</m:t>
+        </m:r>
+        <m:r>
+          <m:rPr>
+            <m:sty m:val="p"/>
+          </m:rPr>
+          <m:t>(</m:t>
+        </m:r>
+        <m:r>
+          <m:t>P</m:t>
+        </m:r>
+        <m:r>
+          <m:rPr>
+            <m:sty m:val="p"/>
+          </m:rPr>
+          <m:t>)</m:t>
+        </m:r>
+      </m:oMath>
+      <w:r>
+        <w:t xml:space="preserve">, pois as capacidades instaladas são fixas. Esse custo não altera</w:t>
+      </w:r>
+      <w:r>
+        <w:t xml:space="preserve"> </w:t>
+      </w:r>
+      <m:oMath>
+        <m:sSup>
+          <m:e>
+            <m:r>
+              <m:t>P</m:t>
+            </m:r>
+          </m:e>
+          <m:sup>
+            <m:r>
+              <m:rPr>
+                <m:sty m:val="p"/>
+              </m:rPr>
+              <m:t>*</m:t>
+            </m:r>
+          </m:sup>
+        </m:sSup>
+        <m:r>
+          <m:rPr>
+            <m:sty m:val="p"/>
+          </m:rPr>
+          <m:t>(</m:t>
+        </m:r>
+        <m:r>
+          <m:t>R</m:t>
+        </m:r>
+        <m:r>
+          <m:rPr>
+            <m:sty m:val="p"/>
+          </m:rPr>
+          <m:t>)</m:t>
+        </m:r>
+      </m:oMath>
+      <w:r>
+        <w:t xml:space="preserve">, mas deve ser coberto pela receita total para que o empreendimento seja viável; a análise de viabilidade econômica está fora do escopo desta etapa.</w:t>
+      </w:r>
+    </w:p>
+    <w:bookmarkEnd w:id="37"/>
+    <w:bookmarkStart w:id="38" w:name="frequência-do-despacho-do-ons"/>
+    <w:p>
+      <w:pPr>
+        <w:pStyle w:val="Heading3"/>
+      </w:pPr>
+      <w:r>
+        <w:t xml:space="preserve">3.8.2 Frequência do despacho do ONS</w:t>
+      </w:r>
+    </w:p>
+    <w:p>
+      <w:pPr>
+        <w:pStyle w:val="FirstParagraph"/>
+      </w:pPr>
+      <w:r>
+        <w:t xml:space="preserve">A frequência com que o ONS acionará os sistemas de armazenamento contratados no LRCAP é desconhecida, e o perfil das Seções 3.5 e 3.7.2 adota a hipótese mais intensa, com um ciclo completo por dia. Para avaliar essa hipótese, o modelo admite um número</w:t>
+      </w:r>
+      <w:r>
+        <w:t xml:space="preserve"> </w:t>
+      </w:r>
+      <m:oMath>
+        <m:sSup>
+          <m:e>
+            <m:r>
+              <m:t>N</m:t>
+            </m:r>
+          </m:e>
+          <m:sup>
+            <m:r>
+              <m:t>o</m:t>
+            </m:r>
+            <m:r>
+              <m:t>n</m:t>
+            </m:r>
+            <m:r>
+              <m:t>s</m:t>
+            </m:r>
+          </m:sup>
+        </m:sSup>
+      </m:oMath>
+      <w:r>
+        <w:t xml:space="preserve"> </w:t>
+      </w:r>
+      <w:r>
+        <w:t xml:space="preserve">de despachos por ano. Na ausência de informação sobre o critério do ONS, adota-se como critério o próprio PLD, indicador de quão apertado está o sistema: em cada ano civil, são despachados apenas os</w:t>
+      </w:r>
+      <w:r>
+        <w:t xml:space="preserve"> </w:t>
+      </w:r>
+      <m:oMath>
+        <m:sSup>
+          <m:e>
+            <m:r>
+              <m:t>N</m:t>
+            </m:r>
+          </m:e>
+          <m:sup>
+            <m:r>
+              <m:t>o</m:t>
+            </m:r>
+            <m:r>
+              <m:t>n</m:t>
+            </m:r>
+            <m:r>
+              <m:t>s</m:t>
+            </m:r>
+          </m:sup>
+        </m:sSup>
+      </m:oMath>
+      <w:r>
+        <w:t xml:space="preserve"> </w:t>
+      </w:r>
+      <w:r>
+        <w:t xml:space="preserve">dias com maior PLD médio no período de descarga — o bloco de</w:t>
+      </w:r>
+      <w:r>
+        <w:t xml:space="preserve"> </w:t>
+      </w:r>
+      <m:oMath>
+        <m:sSup>
+          <m:e>
+            <m:r>
+              <m:t>H</m:t>
+            </m:r>
+          </m:e>
+          <m:sup>
+            <m:r>
+              <m:t>c</m:t>
+            </m:r>
+            <m:r>
+              <m:t>a</m:t>
+            </m:r>
+            <m:r>
+              <m:t>p</m:t>
+            </m:r>
+          </m:sup>
+        </m:sSup>
+      </m:oMath>
+      <w:r>
+        <w:t xml:space="preserve"> </w:t>
+      </w:r>
+      <w:r>
+        <w:t xml:space="preserve">horas de maior preço após o período solar, no perfil baseado em preço, ou as horas de descarga fixas, no perfil fixo. A seleção é feita sobre o ano inteiro, de modo que a decomposição em blocos semanais não a altera. Dias com PLD igual, situação frequente em anos com o PLD no piso, são selecionados por uma sequência de baixa discrepância sobre o dia do ano, o que os distribui uniformemente ao longo do ano em vez de concentrá-los nos primeiros dias. Nos dias sem despacho, o módulo LRCAP permanece carregado e não há recarga.</w:t>
+      </w:r>
+    </w:p>
+    <w:p>
+      <w:pPr>
+        <w:pStyle w:val="BodyText"/>
+      </w:pPr>
+      <w:r>
+        <w:t xml:space="preserve">Como a receita fixa independe da energia despachada e, com os parâmetros da Tabela 3.1,</w:t>
+      </w:r>
+      <w:r>
+        <w:t xml:space="preserve"> </w:t>
+      </w:r>
+      <m:oMath>
+        <m:r>
+          <m:t>κ</m:t>
+        </m:r>
+        <m:r>
+          <m:rPr>
+            <m:sty m:val="p"/>
+          </m:rPr>
+          <m:t>=</m:t>
+        </m:r>
+        <m:r>
+          <m:t>0</m:t>
+        </m:r>
+      </m:oMath>
+      <w:r>
+        <w:t xml:space="preserve">, o despacho afeta o lucro do empreendedor apenas por meio do custo de degradação do módulo LRCAP e do limite do ponto de conexão compartilhado. Se o efeito sobre a conexão for desprezível, o custo associado ao despacho é linear em</w:t>
+      </w:r>
+      <w:r>
+        <w:t xml:space="preserve"> </w:t>
+      </w:r>
+      <m:oMath>
+        <m:sSup>
+          <m:e>
+            <m:r>
+              <m:t>P</m:t>
+            </m:r>
+          </m:e>
+          <m:sup>
+            <m:r>
+              <m:t>c</m:t>
+            </m:r>
+            <m:r>
+              <m:t>a</m:t>
+            </m:r>
+            <m:r>
+              <m:t>p</m:t>
+            </m:r>
+          </m:sup>
+        </m:sSup>
+      </m:oMath>
+      <w:r>
+        <w:t xml:space="preserve">, conforme a Equação (3.41):</w:t>
+      </w:r>
+    </w:p>
+    <w:tbl>
+      <w:tblPr>
+        <w:tblW w:w="9071" w:type="dxa"/>
+        <w:tblBorders>
+          <w:top w:val="nil"/>
+          <w:left w:val="nil"/>
+          <w:bottom w:val="nil"/>
+          <w:right w:val="nil"/>
+          <w:insideH w:val="nil"/>
+          <w:insideV w:val="nil"/>
+        </w:tblBorders>
+        <w:tblLayout w:type="fixed"/>
+        <w:tblCellMar>
+          <w:left w:w="0" w:type="dxa"/>
+          <w:right w:w="0" w:type="dxa"/>
+        </w:tblCellMar>
+      </w:tblPr>
+      <w:tblGrid>
+        <w:gridCol w:w="8071"/>
+        <w:gridCol w:w="1000"/>
+      </w:tblGrid>
+      <w:tr>
+        <w:tc>
+          <w:tcPr>
+            <w:tcW w:w="8071" w:type="dxa"/>
+            <w:vAlign w:val="center"/>
+          </w:tcPr>
+          <w:p>
+            <w:pPr>
+              <w:pStyle w:val="BodyText"/>
+            </w:pPr>
+            <m:oMathPara>
+              <m:oMathParaPr>
+                <m:jc m:val="center"/>
+              </m:oMathParaPr>
+              <m:oMath>
+                <m:sSup>
+                  <m:e>
+                    <m:r>
+                      <m:t>C</m:t>
+                    </m:r>
+                  </m:e>
+                  <m:sup>
+                    <m:r>
+                      <m:t>o</m:t>
+                    </m:r>
+                    <m:r>
+                      <m:t>n</m:t>
+                    </m:r>
+                    <m:r>
+                      <m:t>s</m:t>
+                    </m:r>
+                  </m:sup>
+                </m:sSup>
+                <m:r>
+                  <m:rPr>
+                    <m:sty m:val="p"/>
+                  </m:rPr>
+                  <m:t>(</m:t>
+                </m:r>
+                <m:sSup>
+                  <m:e>
+                    <m:r>
+                      <m:t>P</m:t>
+                    </m:r>
+                  </m:e>
+                  <m:sup>
+                    <m:r>
+                      <m:t>c</m:t>
+                    </m:r>
+                    <m:r>
+                      <m:t>a</m:t>
+                    </m:r>
+                    <m:r>
+                      <m:t>p</m:t>
+                    </m:r>
+                  </m:sup>
+                </m:sSup>
+                <m:r>
+                  <m:rPr>
+                    <m:sty m:val="p"/>
+                  </m:rPr>
+                  <m:t>)</m:t>
+                </m:r>
+                <m:r>
+                  <m:rPr>
+                    <m:sty m:val="p"/>
+                  </m:rPr>
+                  <m:t>≈</m:t>
+                </m:r>
+                <m:sSup>
+                  <m:e>
+                    <m:r>
+                      <m:t>c</m:t>
+                    </m:r>
+                  </m:e>
+                  <m:sup>
+                    <m:r>
+                      <m:t>d</m:t>
+                    </m:r>
+                    <m:r>
+                      <m:t>e</m:t>
+                    </m:r>
+                    <m:r>
+                      <m:t>g</m:t>
+                    </m:r>
+                  </m:sup>
+                </m:sSup>
+                <m:r>
+                  <m:t> </m:t>
+                </m:r>
+                <m:sSup>
+                  <m:e>
+                    <m:r>
+                      <m:t>H</m:t>
+                    </m:r>
+                  </m:e>
+                  <m:sup>
+                    <m:r>
+                      <m:t>c</m:t>
+                    </m:r>
+                    <m:r>
+                      <m:t>a</m:t>
+                    </m:r>
+                    <m:r>
+                      <m:t>p</m:t>
+                    </m:r>
+                  </m:sup>
+                </m:sSup>
+                <m:r>
+                  <m:t> </m:t>
+                </m:r>
+                <m:sSup>
+                  <m:e>
+                    <m:r>
+                      <m:t>N</m:t>
+                    </m:r>
+                  </m:e>
+                  <m:sup>
+                    <m:r>
+                      <m:t>o</m:t>
+                    </m:r>
+                    <m:r>
+                      <m:t>n</m:t>
+                    </m:r>
+                    <m:r>
+                      <m:t>s</m:t>
+                    </m:r>
+                  </m:sup>
+                </m:sSup>
+                <m:r>
+                  <m:t> </m:t>
+                </m:r>
+                <m:sSup>
+                  <m:e>
+                    <m:r>
+                      <m:t>P</m:t>
+                    </m:r>
+                  </m:e>
+                  <m:sup>
+                    <m:r>
+                      <m:t>c</m:t>
+                    </m:r>
+                    <m:r>
+                      <m:t>a</m:t>
+                    </m:r>
+                    <m:r>
+                      <m:t>p</m:t>
+                    </m:r>
+                  </m:sup>
+                </m:sSup>
+              </m:oMath>
+            </m:oMathPara>
+          </w:p>
+        </w:tc>
+        <w:tc>
+          <w:tcPr>
+            <w:tcW w:w="1000" w:type="dxa"/>
+            <w:vAlign w:val="center"/>
+          </w:tcPr>
+          <w:p>
+            <w:pPr>
+              <w:pStyle w:val="NumeroEquacao"/>
+            </w:pPr>
+            <w:r>
+              <w:t>(3.41)</w:t>
+            </w:r>
+          </w:p>
+        </w:tc>
+      </w:tr>
+    </w:tbl>
+    <w:p>
+      <w:pPr>
+        <w:pStyle w:val="FirstParagraph"/>
+      </w:pPr>
+      <w:r>
+        <w:t xml:space="preserve">e uma variação de</w:t>
+      </w:r>
+      <w:r>
+        <w:t xml:space="preserve"> </w:t>
+      </w:r>
+      <m:oMath>
+        <m:sSup>
+          <m:e>
+            <m:r>
+              <m:t>N</m:t>
+            </m:r>
+          </m:e>
+          <m:sup>
+            <m:r>
+              <m:t>o</m:t>
+            </m:r>
+            <m:r>
+              <m:t>n</m:t>
+            </m:r>
+            <m:r>
+              <m:t>s</m:t>
+            </m:r>
+          </m:sup>
+        </m:sSup>
+      </m:oMath>
+      <w:r>
+        <w:t xml:space="preserve"> </w:t>
+      </w:r>
+      <w:r>
+        <w:t xml:space="preserve">desloca o custo de oportunidade marginal de um valor constante, sem alterar a operação do lado mercantil. As simulações com diferentes valores de</w:t>
+      </w:r>
+      <w:r>
+        <w:t xml:space="preserve"> </w:t>
+      </w:r>
+      <m:oMath>
+        <m:sSup>
+          <m:e>
+            <m:r>
+              <m:t>N</m:t>
+            </m:r>
+          </m:e>
+          <m:sup>
+            <m:r>
+              <m:t>o</m:t>
+            </m:r>
+            <m:r>
+              <m:t>n</m:t>
+            </m:r>
+            <m:r>
+              <m:t>s</m:t>
+            </m:r>
+          </m:sup>
+        </m:sSup>
+      </m:oMath>
+      <w:r>
+        <w:t xml:space="preserve"> </w:t>
+      </w:r>
+      <w:r>
+        <w:t xml:space="preserve">permitem verificar essa aproximação.</w:t>
+      </w:r>
+    </w:p>
+    <w:bookmarkEnd w:id="38"/>
+    <w:bookmarkStart w:id="39" w:name="casos-avaliados"/>
+    <w:p>
+      <w:pPr>
+        <w:pStyle w:val="Heading3"/>
+      </w:pPr>
+      <w:r>
+        <w:t xml:space="preserve">3.8.3 Casos avaliados</w:t>
+      </w:r>
+    </w:p>
+    <w:p>
+      <w:pPr>
+        <w:pStyle w:val="FirstParagraph"/>
+      </w:pPr>
+      <w:r>
+        <w:t xml:space="preserve">A curva de oferta é construída para os cenários anuais da Seção 3.7.2, com o lucro esperado (</w:t>
+      </w:r>
+      <m:oMath>
+        <m:r>
+          <m:t>β</m:t>
+        </m:r>
+        <m:r>
+          <m:rPr>
+            <m:sty m:val="p"/>
+          </m:rPr>
+          <m:t>=</m:t>
+        </m:r>
+        <m:r>
+          <m:t>0</m:t>
+        </m:r>
+      </m:oMath>
+      <w:r>
+        <w:t xml:space="preserve">), nos casos do Quadro 3.2. Os casos variam as três hipóteses que a análise do caso de referência indicou como determinantes para o custo de oportunidade: a existência de um limite de demanda de hidrogênio (Seção 3.4.5), a vedação à importação de energia da rede e a frequência do despacho do ONS.</w:t>
+      </w:r>
+    </w:p>
+    <w:p>
+      <w:pPr>
+        <w:pStyle w:val="Legenda"/>
+      </w:pPr>
+      <w:r>
+        <w:t xml:space="preserve">Quadro 3.2 – Casos avaliados na construção da curva de oferta</w:t>
+      </w:r>
+    </w:p>
+    <w:tbl>
+      <w:tblPr>
+        <w:tblStyle w:val="Table"/>
+        <w:tblW w:type="pct" w:w="5000"/>
+        <w:tblLayout w:type="fixed"/>
+        <w:tblLook w:firstRow="1" w:lastRow="0" w:firstColumn="0" w:lastColumn="0" w:noHBand="0" w:noVBand="0" w:val="0020"/>
+      </w:tblPr>
+      <w:tblGrid>
+        <w:gridCol w:w="1900"/>
+        <w:gridCol w:w="2376"/>
+        <w:gridCol w:w="1742"/>
+        <w:gridCol w:w="1900"/>
+      </w:tblGrid>
+      <w:tr>
+        <w:trPr>
+          <w:tblHeader w:val="on"/>
+        </w:trPr>
+        <w:tc>
+          <w:tcPr/>
+          <w:p>
+            <w:pPr>
+              <w:pStyle w:val="Compact"/>
+            </w:pPr>
+            <w:r>
+              <w:t xml:space="preserve">Caso</w:t>
+            </w:r>
+          </w:p>
+        </w:tc>
+        <w:tc>
+          <w:tcPr/>
+          <w:p>
+            <w:pPr>
+              <w:pStyle w:val="Compact"/>
+            </w:pPr>
+            <w:r>
+              <w:t xml:space="preserve">Contrato de H₂</w:t>
+            </w:r>
+          </w:p>
+        </w:tc>
+        <w:tc>
+          <w:tcPr/>
+          <w:p>
+            <w:pPr>
+              <w:pStyle w:val="Compact"/>
+            </w:pPr>
+            <w:r>
+              <w:t xml:space="preserve">Importação da rede</w:t>
+            </w:r>
+          </w:p>
+        </w:tc>
+        <w:tc>
+          <w:tcPr/>
+          <w:p>
+            <w:pPr>
+              <w:pStyle w:val="Compact"/>
+            </w:pPr>
+            <w:r>
+              <w:t xml:space="preserve">Despachos do ONS por ano</w:t>
+            </w:r>
+          </w:p>
+        </w:tc>
+      </w:tr>
+      <w:tr>
+        <w:tc>
+          <w:tcPr/>
+          <w:p>
+            <w:pPr>
+              <w:pStyle w:val="Compact"/>
+            </w:pPr>
+            <w:r>
+              <w:t xml:space="preserve">Referência</w:t>
+            </w:r>
+          </w:p>
+        </w:tc>
+        <w:tc>
+          <w:tcPr/>
+          <w:p>
+            <w:pPr>
+              <w:pStyle w:val="Compact"/>
+            </w:pPr>
+            <w:r>
+              <w:t xml:space="preserve">Sem limite de volume</w:t>
+            </w:r>
+          </w:p>
+        </w:tc>
+        <w:tc>
+          <w:tcPr/>
+          <w:p>
+            <w:pPr>
+              <w:pStyle w:val="Compact"/>
+            </w:pPr>
+            <w:r>
+              <w:t xml:space="preserve">Vedada</w:t>
+            </w:r>
+          </w:p>
+        </w:tc>
+        <w:tc>
+          <w:tcPr/>
+          <w:p>
+            <w:pPr>
+              <w:pStyle w:val="Compact"/>
+            </w:pPr>
+            <w:r>
+              <w:t xml:space="preserve">365</w:t>
+            </w:r>
+          </w:p>
+        </w:tc>
+      </w:tr>
+      <w:tr>
+        <w:tc>
+          <w:tcPr/>
+          <w:p>
+            <w:pPr>
+              <w:pStyle w:val="Compact"/>
+            </w:pPr>
+            <w:r>
+              <w:t xml:space="preserve">Contrato 2 t/dia</w:t>
+            </w:r>
+          </w:p>
+        </w:tc>
+        <w:tc>
+          <w:tcPr/>
+          <w:p>
+            <w:pPr>
+              <w:pStyle w:val="Compact"/>
+            </w:pPr>
+            <m:oMath>
+              <m:sSup>
+                <m:e>
+                  <m:r>
+                    <m:t>D</m:t>
+                  </m:r>
+                </m:e>
+                <m:sup>
+                  <m:r>
+                    <m:t>h</m:t>
+                  </m:r>
+                  <m:r>
+                    <m:t>2</m:t>
+                  </m:r>
+                </m:sup>
+              </m:sSup>
+              <m:r>
+                <m:rPr>
+                  <m:sty m:val="p"/>
+                </m:rPr>
+                <m:t>=</m:t>
+              </m:r>
+              <m:sSup>
+                <m:e>
+                  <m:acc>
+                    <m:accPr>
+                      <m:chr m:val="‾"/>
+                    </m:accPr>
+                    <m:e>
+                      <m:r>
+                        <m:t>D</m:t>
+                      </m:r>
+                    </m:e>
+                  </m:acc>
+                </m:e>
+                <m:sup>
+                  <m:r>
+                    <m:t>h</m:t>
+                  </m:r>
+                  <m:r>
+                    <m:t>2</m:t>
+                  </m:r>
+                </m:sup>
+              </m:sSup>
+              <m:r>
+                <m:rPr>
+                  <m:sty m:val="p"/>
+                </m:rPr>
+                <m:t>=</m:t>
+              </m:r>
+              <m:r>
+                <m:t>2.000</m:t>
+              </m:r>
+            </m:oMath>
+            <w:r>
+              <w:t xml:space="preserve"> </w:t>
+            </w:r>
+            <w:r>
+              <w:t xml:space="preserve">kg/dia</w:t>
+            </w:r>
+          </w:p>
+        </w:tc>
+        <w:tc>
+          <w:tcPr/>
+          <w:p>
+            <w:pPr>
+              <w:pStyle w:val="Compact"/>
+            </w:pPr>
+            <w:r>
+              <w:t xml:space="preserve">Vedada</w:t>
+            </w:r>
+          </w:p>
+        </w:tc>
+        <w:tc>
+          <w:tcPr/>
+          <w:p>
+            <w:pPr>
+              <w:pStyle w:val="Compact"/>
+            </w:pPr>
+            <w:r>
+              <w:t xml:space="preserve">365</w:t>
+            </w:r>
+          </w:p>
+        </w:tc>
+      </w:tr>
+      <w:tr>
+        <w:tc>
+          <w:tcPr/>
+          <w:p>
+            <w:pPr>
+              <w:pStyle w:val="Compact"/>
+            </w:pPr>
+            <w:r>
+              <w:t xml:space="preserve">Contrato 3 t/dia</w:t>
+            </w:r>
+          </w:p>
+        </w:tc>
+        <w:tc>
+          <w:tcPr/>
+          <w:p>
+            <w:pPr>
+              <w:pStyle w:val="Compact"/>
+            </w:pPr>
+            <m:oMath>
+              <m:sSup>
+                <m:e>
+                  <m:r>
+                    <m:t>D</m:t>
+                  </m:r>
+                </m:e>
+                <m:sup>
+                  <m:r>
+                    <m:t>h</m:t>
+                  </m:r>
+                  <m:r>
+                    <m:t>2</m:t>
+                  </m:r>
+                </m:sup>
+              </m:sSup>
+              <m:r>
+                <m:rPr>
+                  <m:sty m:val="p"/>
+                </m:rPr>
+                <m:t>=</m:t>
+              </m:r>
+              <m:sSup>
+                <m:e>
+                  <m:acc>
+                    <m:accPr>
+                      <m:chr m:val="‾"/>
+                    </m:accPr>
+                    <m:e>
+                      <m:r>
+                        <m:t>D</m:t>
+                      </m:r>
+                    </m:e>
+                  </m:acc>
+                </m:e>
+                <m:sup>
+                  <m:r>
+                    <m:t>h</m:t>
+                  </m:r>
+                  <m:r>
+                    <m:t>2</m:t>
+                  </m:r>
+                </m:sup>
+              </m:sSup>
+              <m:r>
+                <m:rPr>
+                  <m:sty m:val="p"/>
+                </m:rPr>
+                <m:t>=</m:t>
+              </m:r>
+              <m:r>
+                <m:t>3.000</m:t>
+              </m:r>
+            </m:oMath>
+            <w:r>
+              <w:t xml:space="preserve"> </w:t>
+            </w:r>
+            <w:r>
+              <w:t xml:space="preserve">kg/dia</w:t>
+            </w:r>
+          </w:p>
+        </w:tc>
+        <w:tc>
+          <w:tcPr/>
+          <w:p>
+            <w:pPr>
+              <w:pStyle w:val="Compact"/>
+            </w:pPr>
+            <w:r>
+              <w:t xml:space="preserve">Vedada</w:t>
+            </w:r>
+          </w:p>
+        </w:tc>
+        <w:tc>
+          <w:tcPr/>
+          <w:p>
+            <w:pPr>
+              <w:pStyle w:val="Compact"/>
+            </w:pPr>
+            <w:r>
+              <w:t xml:space="preserve">365</w:t>
+            </w:r>
+          </w:p>
+        </w:tc>
+      </w:tr>
+      <w:tr>
+        <w:tc>
+          <w:tcPr/>
+          <w:p>
+            <w:pPr>
+              <w:pStyle w:val="Compact"/>
+            </w:pPr>
+            <w:r>
+              <w:t xml:space="preserve">Importação</w:t>
+            </w:r>
+          </w:p>
+        </w:tc>
+        <w:tc>
+          <w:tcPr/>
+          <w:p>
+            <w:pPr>
+              <w:pStyle w:val="Compact"/>
+            </w:pPr>
+            <w:r>
+              <w:t xml:space="preserve">Sem limite de volume</w:t>
+            </w:r>
+          </w:p>
+        </w:tc>
+        <w:tc>
+          <w:tcPr/>
+          <w:p>
+            <w:pPr>
+              <w:pStyle w:val="Compact"/>
+            </w:pPr>
+            <w:r>
+              <w:t xml:space="preserve">Permitida</w:t>
+            </w:r>
+          </w:p>
+        </w:tc>
+        <w:tc>
+          <w:tcPr/>
+          <w:p>
+            <w:pPr>
+              <w:pStyle w:val="Compact"/>
+            </w:pPr>
+            <w:r>
+              <w:t xml:space="preserve">365</w:t>
+            </w:r>
+          </w:p>
+        </w:tc>
+      </w:tr>
+      <w:tr>
+        <w:tc>
+          <w:tcPr/>
+          <w:p>
+            <w:pPr>
+              <w:pStyle w:val="Compact"/>
+            </w:pPr>
+            <w:r>
+              <w:t xml:space="preserve">Importação e contrato 3 t/dia</w:t>
+            </w:r>
+          </w:p>
+        </w:tc>
+        <w:tc>
+          <w:tcPr/>
+          <w:p>
+            <w:pPr>
+              <w:pStyle w:val="Compact"/>
+            </w:pPr>
+            <m:oMath>
+              <m:sSup>
+                <m:e>
+                  <m:r>
+                    <m:t>D</m:t>
+                  </m:r>
+                </m:e>
+                <m:sup>
+                  <m:r>
+                    <m:t>h</m:t>
+                  </m:r>
+                  <m:r>
+                    <m:t>2</m:t>
+                  </m:r>
+                </m:sup>
+              </m:sSup>
+              <m:r>
+                <m:rPr>
+                  <m:sty m:val="p"/>
+                </m:rPr>
+                <m:t>=</m:t>
+              </m:r>
+              <m:sSup>
+                <m:e>
+                  <m:acc>
+                    <m:accPr>
+                      <m:chr m:val="‾"/>
+                    </m:accPr>
+                    <m:e>
+                      <m:r>
+                        <m:t>D</m:t>
+                      </m:r>
+                    </m:e>
+                  </m:acc>
+                </m:e>
+                <m:sup>
+                  <m:r>
+                    <m:t>h</m:t>
+                  </m:r>
+                  <m:r>
+                    <m:t>2</m:t>
+                  </m:r>
+                </m:sup>
+              </m:sSup>
+              <m:r>
+                <m:rPr>
+                  <m:sty m:val="p"/>
+                </m:rPr>
+                <m:t>=</m:t>
+              </m:r>
+              <m:r>
+                <m:t>3.000</m:t>
+              </m:r>
+            </m:oMath>
+            <w:r>
+              <w:t xml:space="preserve"> </w:t>
+            </w:r>
+            <w:r>
+              <w:t xml:space="preserve">kg/dia</w:t>
+            </w:r>
+          </w:p>
+        </w:tc>
+        <w:tc>
+          <w:tcPr/>
+          <w:p>
+            <w:pPr>
+              <w:pStyle w:val="Compact"/>
+            </w:pPr>
+            <w:r>
+              <w:t xml:space="preserve">Permitida</w:t>
+            </w:r>
+          </w:p>
+        </w:tc>
+        <w:tc>
+          <w:tcPr/>
+          <w:p>
+            <w:pPr>
+              <w:pStyle w:val="Compact"/>
+            </w:pPr>
+            <w:r>
+              <w:t xml:space="preserve">365</w:t>
+            </w:r>
+          </w:p>
+        </w:tc>
+      </w:tr>
+      <w:tr>
+        <w:tc>
+          <w:tcPr/>
+          <w:p>
+            <w:pPr>
+              <w:pStyle w:val="Compact"/>
+            </w:pPr>
+            <w:r>
+              <w:t xml:space="preserve">Frequência do despacho</w:t>
+            </w:r>
+          </w:p>
+        </w:tc>
+        <w:tc>
+          <w:tcPr/>
+          <w:p>
+            <w:pPr>
+              <w:pStyle w:val="Compact"/>
+            </w:pPr>
+            <w:r>
+              <w:t xml:space="preserve">Sem limite de volume</w:t>
+            </w:r>
+          </w:p>
+        </w:tc>
+        <w:tc>
+          <w:tcPr/>
+          <w:p>
+            <w:pPr>
+              <w:pStyle w:val="Compact"/>
+            </w:pPr>
+            <w:r>
+              <w:t xml:space="preserve">Vedada</w:t>
+            </w:r>
+          </w:p>
+        </w:tc>
+        <w:tc>
+          <w:tcPr/>
+          <w:p>
+            <w:pPr>
+              <w:pStyle w:val="Compact"/>
+            </w:pPr>
+            <w:r>
+              <w:t xml:space="preserve">50; 150; 365</w:t>
+            </w:r>
+          </w:p>
+        </w:tc>
+      </w:tr>
+    </w:tbl>
+    <w:p>
+      <w:pPr>
+        <w:pStyle w:val="Fonte"/>
+      </w:pPr>
+      <w:r>
+        <w:t xml:space="preserve">Fonte: elaborado pelo autor.</w:t>
+      </w:r>
+    </w:p>
+    <w:p>
+      <w:pPr>
+        <w:pStyle w:val="BodyText"/>
+      </w:pPr>
+      <w:r>
+        <w:t xml:space="preserve">Nos casos com importação, o eletrolisador e o BESS mercantil podem ser supridos pela rede ao PLD acrescido de</w:t>
+      </w:r>
+      <w:r>
+        <w:t xml:space="preserve"> </w:t>
+      </w:r>
+      <m:oMath>
+        <m:sSup>
+          <m:e>
+            <m:r>
+              <m:t>c</m:t>
+            </m:r>
+          </m:e>
+          <m:sup>
+            <m:r>
+              <m:t>i</m:t>
+            </m:r>
+            <m:r>
+              <m:t>m</m:t>
+            </m:r>
+            <m:r>
+              <m:t>p</m:t>
+            </m:r>
+          </m:sup>
+        </m:sSup>
+      </m:oMath>
+      <w:r>
+        <w:t xml:space="preserve">. Essa configuração corresponde a um critério de qualificação do hidrogênio baseado na intensidade de emissões, e não na origem física da energia, e é avaliada como alternativa à hipótese de suprimento exclusivamente fotovoltaico. Para cada caso, além da curva de oferta, registram-se a potência ótima e a operação média nos cenários para a receita fixa de referência, de R$ 600 mil/(MW·ano).</w:t>
+      </w:r>
+    </w:p>
+    <w:bookmarkEnd w:id="39"/>
+    <w:bookmarkEnd w:id="40"/>
+    <w:bookmarkStart w:id="41" w:name="implementação-computacional"/>
+    <w:p>
+      <w:pPr>
+        <w:pStyle w:val="Heading2"/>
+      </w:pPr>
+      <w:r>
+        <w:t xml:space="preserve">3.9 Implementação computacional</w:t>
+      </w:r>
+    </w:p>
+    <w:p>
+      <w:pPr>
+        <w:pStyle w:val="FirstParagraph"/>
+      </w:pPr>
+      <w:r>
         <w:t xml:space="preserve">O modelo foi implementado na linguagem Python, com o uso da biblioteca de modelagem algébrica Pyomo (BYNUM</w:t>
       </w:r>
       <w:r>
@@ -18156,7 +21164,7 @@
         <w:t xml:space="preserve"> </w:t>
       </w:r>
       <w:r>
-        <w:t xml:space="preserve">HiGHS (HUANGFU; HALL, 2018). A estrutura do código separa: (i) a leitura e validação dos parâmetros, organizados em arquivos de configuração em formato YAML, com verificação automática dos requisitos regulatórios; (ii) a importação e o tratamento das séries de dados; (iii) a construção do modelo de otimização; (iv) a decomposição de Benders, nas versões determinística e estocástica; (v) o cálculo do VSS e do EVPI; e (vi) o pós-processamento dos resultados. Os subproblemas semanais são resolvidos em paralelo em processos independentes, cada qual restrito a uma linha de execução do</w:t>
+        <w:t xml:space="preserve">HiGHS (HUANGFU; HALL, 2018). A estrutura do código separa: (i) a leitura e validação dos parâmetros, organizados em arquivos de configuração em formato YAML, com verificação automática dos requisitos regulatórios; (ii) a importação e o tratamento das séries de dados; (iii) a construção do modelo de otimização; (iv) a decomposição de Benders, nas versões determinística e estocástica; (v) o cálculo do VSS e do EVPI; (vi) a construção da curva de oferta; e (vii) o pós-processamento dos resultados. Os subproblemas semanais são resolvidos em paralelo em processos independentes, cada qual restrito a uma linha de execução do</w:t>
       </w:r>
       <w:r>
         <w:t xml:space="preserve"> </w:t>
@@ -18169,17 +21177,17 @@
         <w:t xml:space="preserve">solver</w:t>
       </w:r>
       <w:r>
-        <w:t xml:space="preserve">, a fim de evitar a concorrência por núcleos de processamento. A consistência do modelo é verificada por um conjunto de testes automatizados que conferem, entre outros aspectos, o balanço de potência, os limites dos estados de carga, a exclusividade entre carga e descarga, o cumprimento do despacho do ONS, o limite do ponto de conexão e a validade dos cortes de Benders. O código e os dados são mantidos sob controle de versão, o que assegura a reprodutibilidade dos resultados.</w:t>
+        <w:t xml:space="preserve">, a fim de evitar a concorrência por núcleos de processamento. A consistência do modelo é verificada por um conjunto de testes automatizados que conferem, entre outros aspectos, o balanço de potência, os limites dos estados de carga, a exclusividade entre carga e descarga, o cumprimento do despacho do ONS e a seleção dos dias de despacho, o limite do ponto de conexão, as entregas do contrato de hidrogênio e a validade dos cortes de Benders. O código e os dados são mantidos sob controle de versão, o que assegura a reprodutibilidade dos resultados.</w:t>
       </w:r>
     </w:p>
-    <w:bookmarkEnd w:id="37"/>
-    <w:bookmarkStart w:id="38" w:name="hipóteses-e-limitações"/>
+    <w:bookmarkEnd w:id="41"/>
+    <w:bookmarkStart w:id="42" w:name="hipóteses-e-limitações"/>
     <w:p>
       <w:pPr>
         <w:pStyle w:val="Heading2"/>
       </w:pPr>
       <w:r>
-        <w:t xml:space="preserve">3.9 Hipóteses e limitações</w:t>
+        <w:t xml:space="preserve">3.10 Hipóteses e limitações</w:t>
       </w:r>
     </w:p>
     <w:p>
@@ -18208,7 +21216,36 @@
         <w:t xml:space="preserve"> </w:t>
       </w:r>
       <w:r>
-        <w:t xml:space="preserve">mesmo na extensão estocástica, a operação de cada cenário é otimizada com conhecimento antecipado das séries daquele ano, o que tende a superestimar o lucro alcançável na operação real. A incerteza tratada pela Seção 3.7 é apenas a variação entre anos; a incerteza do despacho do ONS, cujo risco é alocado ao empreendedor pela Portaria, é representada somente pela regra de despacho baseada no PLD;</w:t>
+        <w:t xml:space="preserve">mesmo na extensão estocástica, a operação de cada cenário é otimizada com conhecimento antecipado das séries daquele ano, o que tende a superestimar o lucro alcançável na operação real. A incerteza tratada pela Seção 3.7 é apenas a variação entre anos; a incerteza do despacho do ONS, cujo risco é alocado ao empreendedor pela Portaria, é representada somente pela regra de despacho baseada no PLD e pela sensibilidade ao número de despachos por ano (Seção 3.8.2), que supõe despachos completos, de</w:t>
+      </w:r>
+      <w:r>
+        <w:t xml:space="preserve"> </w:t>
+      </w:r>
+      <m:oMath>
+        <m:sSup>
+          <m:e>
+            <m:r>
+              <m:t>H</m:t>
+            </m:r>
+          </m:e>
+          <m:sup>
+            <m:r>
+              <m:t>c</m:t>
+            </m:r>
+            <m:r>
+              <m:t>a</m:t>
+            </m:r>
+            <m:r>
+              <m:t>p</m:t>
+            </m:r>
+          </m:sup>
+        </m:sSup>
+      </m:oMath>
+      <w:r>
+        <w:t xml:space="preserve"> </w:t>
+      </w:r>
+      <w:r>
+        <w:t xml:space="preserve">horas na potência contratada, nos dias de maior PLD;</w:t>
       </w:r>
     </w:p>
     <w:p>
@@ -18438,6 +21475,27 @@
           <w:b/>
           <w:bCs/>
         </w:rPr>
+        <w:t xml:space="preserve">curva de oferta discreta:</w:t>
+      </w:r>
+      <w:r>
+        <w:t xml:space="preserve"> </w:t>
+      </w:r>
+      <w:r>
+        <w:t xml:space="preserve">a curva é obtida numa grade de 2,5 MW, de modo que a potência ótima e os custos marginais são conhecidos com essa resolução, e não inclui o investimento no BESS;</w:t>
+      </w:r>
+    </w:p>
+    <w:p>
+      <w:pPr>
+        <w:numPr>
+          <w:ilvl w:val="0"/>
+          <w:numId w:val="1005"/>
+        </w:numPr>
+      </w:pPr>
+      <w:r>
+        <w:rPr>
+          <w:b/>
+          <w:bCs/>
+        </w:rPr>
         <w:t xml:space="preserve">amostra de cenários:</w:t>
       </w:r>
       <w:r>
@@ -18447,8 +21505,8 @@
         <w:t xml:space="preserve">os cinco anos históricos são tratados como equiprováveis e constituem uma amostra pequena; o VSS e o EVPI são, portanto, medidos dentro da amostra, e a avaliação da decisão fora da amostra é deixada para trabalhos futuros.</w:t>
       </w:r>
     </w:p>
-    <w:bookmarkEnd w:id="38"/>
-    <w:bookmarkStart w:id="39" w:name="referências"/>
+    <w:bookmarkEnd w:id="42"/>
+    <w:bookmarkStart w:id="43" w:name="referências"/>
     <w:p>
       <w:pPr>
         <w:pStyle w:val="Heading2"/>
@@ -18824,8 +21882,8 @@
         <w:t xml:space="preserve">, v. 175, n. 1–2, p. 461–502, 2019.</w:t>
       </w:r>
     </w:p>
-    <w:bookmarkEnd w:id="39"/>
-    <w:bookmarkEnd w:id="40"/>
+    <w:bookmarkEnd w:id="43"/>
+    <w:bookmarkEnd w:id="44"/>
     <w:sectPr>
       <w:pgSz w:w="11906" w:h="16838"/>
       <w:pgMar w:top="1701" w:right="1134" w:bottom="1134" w:left="1701" w:header="709" w:footer="709" w:gutter="0"/>

</xml_diff>

<commit_message>
Capítulo 3: fontes da faixa de receita fixa do LRCAP (Seção 3.5)
Parágrafo com MACSE, Leilões nº 2 e 3/2026-ANEEL e CAPEX de BESS da EPE;
faixa de sensibilidade na Tabela 3.1; referências novas; citações da CCEE
alinhadas entre capítulos (2026a = PLD, 2026b = Leilão 2/2026, 2026c =
Leilão 3/2026).

Co-Authored-By: Claude Opus 5.5 <noreply@anthropic.com>
Claude-Session: https://claude.ai/code/session_01YFtn9hiQUHbNLSX7rUNYuK
</commit_message>
<xml_diff>
--- a/docs/dissertacao/cap3_metodologia.docx
+++ b/docs/dissertacao/cap3_metodologia.docx
@@ -2361,7 +2361,7 @@
               <w:pStyle w:val="Compact"/>
             </w:pPr>
             <w:r>
-              <w:t xml:space="preserve">600.000</w:t>
+              <w:t xml:space="preserve">600.000 (sensibilidade: 330.000 a 2.334.000)</w:t>
             </w:r>
           </w:p>
         </w:tc>
@@ -10163,7 +10163,7 @@
         <w:t xml:space="preserve"> </w:t>
       </w:r>
       <w:r>
-        <w:t xml:space="preserve">Utiliza-se a série horária do PLD de 2025 para o submercado Sudeste/Centro-Oeste, no qual se localiza o município de Itajubá (MG), obtida no portal de dados abertos da Câmara de Comercialização de Energia Elétrica (CCEE, 2026). A série apresenta média de R$ 224,31/MWh, com mínimo de R$ 58,60/MWh — valor do PLD mínimo, observado em 2.030 horas, concentradas no período úmido — e máximo de R$ 1.421,87/MWh. A Figura 3.2(a) evidencia o perfil diário característico do período recente: preços reduzidos nas horas de maior geração solar e elevados na rampa noturna, com maior amplitude no período seco.</w:t>
+        <w:t xml:space="preserve">Utiliza-se a série horária do PLD de 2025 para o submercado Sudeste/Centro-Oeste, no qual se localiza o município de Itajubá (MG), obtida no portal de dados abertos da Câmara de Comercialização de Energia Elétrica (CCEE, 2026a). A série apresenta média de R$ 224,31/MWh, com mínimo de R$ 58,60/MWh — valor do PLD mínimo, observado em 2.030 horas, concentradas no período úmido — e máximo de R$ 1.421,87/MWh. A Figura 3.2(a) evidencia o perfil diário característico do período recente: preços reduzidos nas horas de maior geração solar e elevados na rampa noturna, com maior amplitude no período seco.</w:t>
       </w:r>
     </w:p>
     <w:p>
@@ -10308,7 +10308,7 @@
         <w:pStyle w:val="Fonte"/>
       </w:pPr>
       <w:r>
-        <w:t xml:space="preserve">Fonte: elaborado pelo autor com dados de CCEE (2026) e do PVGIS.</w:t>
+        <w:t xml:space="preserve">Fonte: elaborado pelo autor com dados de CCEE (2026a) e do PVGIS.</w:t>
       </w:r>
     </w:p>
     <w:p>
@@ -10344,7 +10344,25 @@
         <w:t xml:space="preserve"> </w:t>
       </w:r>
       <w:r>
-        <w:t xml:space="preserve">Os parâmetros do eletrolisador foram definidos a partir da faixa típica da tecnologia PEM, cujo consumo específico de energia situa-se entre 4,3 e 5,2 kWh/Nm³, ou aproximadamente 48 a 58 kWh/kg, até que os dados do fabricante do equipamento da UNIFEI sejam incorporados. A receita fixa do LRCAP e o preço do hidrogênio não possuem, até o momento, referências de mercado consolidadas no Brasil e são, por isso, objeto de análise de sensibilidade. O mesmo se aplica aos termos do contrato de fornecimento de hidrogênio — volume diário e multa por déficit —, avaliados em cenários alternativos ao caso sem contrato.</w:t>
+        <w:t xml:space="preserve">Os parâmetros do eletrolisador foram definidos a partir da faixa típica da tecnologia PEM, cujo consumo específico de energia situa-se entre 4,3 e 5,2 kWh/Nm³, ou aproximadamente 48 a 58 kWh/kg, até que os dados do fabricante do equipamento da UNIFEI sejam incorporados. O preço do hidrogênio não possui, até o momento, referência de mercado consolidada no Brasil e é, por isso, objeto de análise de sensibilidade. O mesmo se aplica aos termos do contrato de fornecimento de hidrogênio — volume diário e multa por déficit —, avaliados em cenários alternativos ao caso sem contrato.</w:t>
+      </w:r>
+    </w:p>
+    <w:p>
+      <w:pPr>
+        <w:pStyle w:val="BodyText"/>
+      </w:pPr>
+      <w:r>
+        <w:rPr>
+          <w:b/>
+          <w:bCs/>
+        </w:rPr>
+        <w:t xml:space="preserve">Receita fixa do LRCAP.</w:t>
+      </w:r>
+      <w:r>
+        <w:t xml:space="preserve"> </w:t>
+      </w:r>
+      <w:r>
+        <w:t xml:space="preserve">Como ainda não houve leilão de armazenamento em baterias no Brasil, a receita fixa foi delimitada por quatro referências. A inferior é o primeiro leilão do mecanismo italiano de contratação de capacidade de armazenamento (MACSE), realizado em setembro de 2025 com contratos de 15 anos e desenho semelhante ao do LRCAP, cujo preço médio de € 12.959/(MWh·ano) (TERNA, 2025) corresponde, para um sistema de 4 h e com a taxa de câmbio PTAX de 30/09/2025 (R$ 6,2396/€), a cerca de R$ 323 mil/(MW·ano). No LRCAP de março de 2026, que contratou o mesmo produto — potência disponível ao ONS —, termelétricas existentes a óleo e biodiesel obtiveram preço médio de R$ 831 mil/(MW·ano) (CCEE, 2026c), e o conjunto de termelétricas a gás natural, biometano e carvão e de ampliações de hidrelétricas, novas e existentes, R$ 2,334 milhões/(MW·ano) (CCEE, 2026b). Por fim, o custo de investimento de referência de sistemas de baterias, de R$ 5.000 a R$ 6.000/kW (BRASIL; EPE, 2025), corresponde, anualizado a 10% ao ano em 15 anos, a R$ 657 mil a R$ 789 mil/(MW·ano), sem considerar operação e manutenção, encargos e reposição de módulos. Com base nessas referências, a análise de sensibilidade abrange receitas fixas de R$ 330 mil a R$ 2,33 milhões/(MW·ano). O valor de R$ 600 mil/(MW·ano) adotado no caso de referência situa-se no extremo inferior dessa faixa, abaixo do preço obtido por usinas existentes e do custo anualizado de investimento em baterias, e constitui, portanto, uma hipótese conservadora quanto à atratividade do leilão.</w:t>
       </w:r>
     </w:p>
     <w:bookmarkEnd w:id="24"/>
@@ -14393,7 +14411,7 @@
         </w:numPr>
       </w:pPr>
       <w:r>
-        <w:t xml:space="preserve">a série horária do PLD do submercado SE/CO do respectivo ano (CCEE, 2026), corrigida para valores de dezembro de 2025 pelo IPCA (IBGE, 2026), por meio do fator</w:t>
+        <w:t xml:space="preserve">a série horária do PLD do submercado SE/CO do respectivo ano (CCEE, 2026a), corrigida para valores de dezembro de 2025 pelo IPCA (IBGE, 2026), por meio do fator</w:t>
       </w:r>
       <w:r>
         <w:t xml:space="preserve"> </w:t>
@@ -21604,6 +21622,27 @@
         <w:pStyle w:val="Referencia"/>
       </w:pPr>
       <w:r>
+        <w:t xml:space="preserve">BRASIL. Ministério de Minas e Energia; EPE – EMPRESA DE PESQUISA ENERGÉTICA.</w:t>
+      </w:r>
+      <w:r>
+        <w:t xml:space="preserve"> </w:t>
+      </w:r>
+      <w:r>
+        <w:rPr>
+          <w:b/>
+          <w:bCs/>
+        </w:rPr>
+        <w:t xml:space="preserve">Caderno de parâmetros de custos</w:t>
+      </w:r>
+      <w:r>
+        <w:t xml:space="preserve">: geração e transmissão – PDE 2035. Brasília: MME/EPE, nov. 2025.</w:t>
+      </w:r>
+    </w:p>
+    <w:p>
+      <w:pPr>
+        <w:pStyle w:val="Referencia"/>
+      </w:pPr>
+      <w:r>
         <w:t xml:space="preserve">BYNUM, M. L.</w:t>
       </w:r>
       <w:r>
@@ -21648,7 +21687,7 @@
         <w:t xml:space="preserve">PLD horário</w:t>
       </w:r>
       <w:r>
-        <w:t xml:space="preserve">. Portal de Dados Abertos da CCEE. Disponível em: https://dadosabertos.ccee.org.br. Acesso em: 27 set. 2026.</w:t>
+        <w:t xml:space="preserve">. Portal de Dados Abertos da CCEE. 2026a. Disponível em: https://dadosabertos.ccee.org.br. Acesso em: 27 set. 2026.</w:t>
       </w:r>
     </w:p>
     <w:p>
@@ -21656,6 +21695,48 @@
         <w:pStyle w:val="Referencia"/>
       </w:pPr>
       <w:r>
+        <w:t xml:space="preserve">CCEE – CÂMARA DE COMERCIALIZAÇÃO DE ENERGIA ELÉTRICA.</w:t>
+      </w:r>
+      <w:r>
+        <w:t xml:space="preserve"> </w:t>
+      </w:r>
+      <w:r>
+        <w:rPr>
+          <w:b/>
+          <w:bCs/>
+        </w:rPr>
+        <w:t xml:space="preserve">InfoLeilão Expresso</w:t>
+      </w:r>
+      <w:r>
+        <w:t xml:space="preserve">: 04º LRCAP 2026 – Leilão nº 2/2026-ANEEL. São Paulo: CCEE, mar. 2026b. Disponível em: https://www.ccee.org.br. Acesso em: 3 out. 2026.</w:t>
+      </w:r>
+    </w:p>
+    <w:p>
+      <w:pPr>
+        <w:pStyle w:val="Referencia"/>
+      </w:pPr>
+      <w:r>
+        <w:t xml:space="preserve">CCEE – CÂMARA DE COMERCIALIZAÇÃO DE ENERGIA ELÉTRICA.</w:t>
+      </w:r>
+      <w:r>
+        <w:t xml:space="preserve"> </w:t>
+      </w:r>
+      <w:r>
+        <w:rPr>
+          <w:b/>
+          <w:bCs/>
+        </w:rPr>
+        <w:t xml:space="preserve">InfoLeilão Expresso</w:t>
+      </w:r>
+      <w:r>
+        <w:t xml:space="preserve">: 05º LRCAP 2026 – Leilão nº 3/2026-ANEEL. São Paulo: CCEE, mar. 2026c. Disponível em: https://www.ccee.org.br. Acesso em: 3 out. 2026.</w:t>
+      </w:r>
+    </w:p>
+    <w:p>
+      <w:pPr>
+        <w:pStyle w:val="Referencia"/>
+      </w:pPr>
+      <w:r>
         <w:t xml:space="preserve">CONEJO, A. J.</w:t>
       </w:r>
       <w:r>
@@ -21859,6 +21940,27 @@
       </w:r>
       <w:r>
         <w:t xml:space="preserve">, v. 2, n. 3, p. 21–41, 2000.</w:t>
+      </w:r>
+    </w:p>
+    <w:p>
+      <w:pPr>
+        <w:pStyle w:val="Referencia"/>
+      </w:pPr>
+      <w:r>
+        <w:t xml:space="preserve">TERNA.</w:t>
+      </w:r>
+      <w:r>
+        <w:t xml:space="preserve"> </w:t>
+      </w:r>
+      <w:r>
+        <w:rPr>
+          <w:b/>
+          <w:bCs/>
+        </w:rPr>
+        <w:t xml:space="preserve">Terna completes first MACSE auction</w:t>
+      </w:r>
+      <w:r>
+        <w:t xml:space="preserve">: 10 GWh of energy storage capacity awarded. Roma: Terna S.p.A., 1 out. 2025. Comunicado de imprensa. Disponível em: https://www.terna.it. Acesso em: 3 out. 2026.</w:t>
       </w:r>
     </w:p>
     <w:p>

</xml_diff>

<commit_message>
Capítulos 3 e 4: robustez a degradação, dimensionamento e decomposição
Cap. 3: estimativa do custo de degradação (BNEF 2025, EPE), procedimento de
verificação da decomposição (blocos de 7, 14, 28 dias), novos casos no
Quadro 3.2 e hipóteses a), f) e h) atualizadas.
Cap. 4: nova Seção 4.8 (Figuras 4.7 e 4.8, Tabelas 4.6 e 4.7) e síntese
(agora 4.9) ampliada.

Co-Authored-By: Claude Opus 5.5 <noreply@anthropic.com>
Claude-Session: https://claude.ai/code/session_01YFtn9hiQUHbNLSX7rUNYuK
</commit_message>
<xml_diff>
--- a/docs/dissertacao/cap3_metodologia.docx
+++ b/docs/dissertacao/cap3_metodologia.docx
@@ -72,7 +72,7 @@
         </w:numPr>
       </w:pPr>
       <w:r>
-        <w:t xml:space="preserve">as capacidades instaladas da usina FV, do BESS e do eletrolisador são dados de entrada, e não variáveis de decisão — o dimensionamento ótimo dos equipamentos está fora do escopo desta etapa;</w:t>
+        <w:t xml:space="preserve">as capacidades instaladas da usina FV, do BESS e do eletrolisador são dados de entrada, e não variáveis de decisão — o dimensionamento ótimo dos equipamentos está fora do escopo desta etapa, e o efeito do tamanho do eletrolisador e do tanque de hidrogênio é avaliado por análise de sensibilidade (Seção 3.8.3);</w:t>
       </w:r>
     </w:p>
     <w:p>
@@ -1514,7 +1514,7 @@
               <w:pStyle w:val="Compact"/>
             </w:pPr>
             <w:r>
-              <w:t xml:space="preserve">50</w:t>
+              <w:t xml:space="preserve">50 (sensibilidade: 100; 200)</w:t>
             </w:r>
           </w:p>
         </w:tc>
@@ -10356,6 +10356,40 @@
           <w:b/>
           <w:bCs/>
         </w:rPr>
+        <w:t xml:space="preserve">Custo de degradação do BESS.</w:t>
+      </w:r>
+      <w:r>
+        <w:t xml:space="preserve"> </w:t>
+      </w:r>
+      <w:r>
+        <w:t xml:space="preserve">O custo de degradação pode ser estimado como o custo de reposição dos módulos de bateria dividido pela energia que eles descarregam ao longo da vida útil. Com o preço médio de</w:t>
+      </w:r>
+      <w:r>
+        <w:t xml:space="preserve"> </w:t>
+      </w:r>
+      <w:r>
+        <w:rPr>
+          <w:i/>
+          <w:iCs/>
+        </w:rPr>
+        <w:t xml:space="preserve">packs</w:t>
+      </w:r>
+      <w:r>
+        <w:t xml:space="preserve"> </w:t>
+      </w:r>
+      <w:r>
+        <w:t xml:space="preserve">de baterias de íons de lítio para armazenamento estacionário de US$ 70/kWh em 2025 (BNEF, 2025), convertido pela taxa PTAX de 09/12/2025 (R$ 5,4025/US$) e acrescido de 74% de tributos incidentes no Brasil (EPE, 2024), e com vida útil de 4.000 a 6.000 ciclos a 90% de profundidade de descarga, obtém-se entre R$ 120 e R$ 185 por MWh descarregado. O valor de R$ 50/MWh adotado no caso de referência situa-se abaixo dessa faixa; por isso, o efeito de valores de R$ 100 e R$ 200/MWh é avaliado na Seção 3.8.3.</w:t>
+      </w:r>
+    </w:p>
+    <w:p>
+      <w:pPr>
+        <w:pStyle w:val="BodyText"/>
+      </w:pPr>
+      <w:r>
+        <w:rPr>
+          <w:b/>
+          <w:bCs/>
+        </w:rPr>
         <w:t xml:space="preserve">Receita fixa do LRCAP.</w:t>
       </w:r>
       <w:r>
@@ -10505,7 +10539,7 @@
         <w:t xml:space="preserve"> </w:t>
       </w:r>
       <w:r>
-        <w:t xml:space="preserve">e impondo-se condições de contorno cíclicas em cada bloco, o problema anual pode ser reescrito conforme a Equação (3.20):</w:t>
+        <w:t xml:space="preserve">e impondo-se condições de contorno cíclicas em cada bloco — aproximação cujo efeito é avaliado ao final desta seção —, o problema anual pode ser reescrito conforme a Equação (3.20):</w:t>
       </w:r>
     </w:p>
     <w:tbl>
@@ -12224,6 +12258,14 @@
       </w:r>
       <w:r>
         <w:t xml:space="preserve">indexa os cortes acumulados ao longo das iterações.</w:t>
+      </w:r>
+    </w:p>
+    <w:p>
+      <w:pPr>
+        <w:pStyle w:val="BodyText"/>
+      </w:pPr>
+      <w:r>
+        <w:t xml:space="preserve">As condições de contorno cíclicas restringem o problema anual, pois impedem transferências de energia e de hidrogênio entre blocos; o valor obtido com blocos semanais é, portanto, um limite inferior do valor do problema anual. Como a solução direta do problema anual não foi obtida, o efeito dessa restrição é estimado comparando-se o lucro anual, para uma mesma potência contratada, com blocos de 7, 14 e 28 dias, e refazendo-se a decomposição com blocos de 14 dias. Se o lucro não aumentar com o tamanho do bloco, a restrição pode ser considerada inativa.</w:t>
       </w:r>
     </w:p>
     <w:bookmarkEnd w:id="26"/>
@@ -20574,7 +20616,7 @@
         </m:r>
       </m:oMath>
       <w:r>
-        <w:t xml:space="preserve">), nos casos do Quadro 3.2. Os casos variam as três hipóteses que a análise do caso de referência indicou como determinantes para o custo de oportunidade: a existência de um limite de demanda de hidrogênio (Seção 3.4.5), a vedação à importação de energia da rede e a frequência do despacho do ONS.</w:t>
+        <w:t xml:space="preserve">), nos casos do Quadro 3.2. Os casos variam as hipóteses que a análise do caso de referência indicou como determinantes para o custo de oportunidade: a existência de um limite de demanda de hidrogênio (Seção 3.4.5), a vedação à importação de energia da rede, a frequência do despacho do ONS, o custo de degradação do BESS e o dimensionamento do eletrolisador e do tanque de hidrogênio.</w:t>
       </w:r>
     </w:p>
     <w:p>
@@ -20642,7 +20684,7 @@
               <w:pStyle w:val="Compact"/>
             </w:pPr>
             <w:r>
-              <w:t xml:space="preserve">Despachos do ONS por ano</w:t>
+              <w:t xml:space="preserve">Outras alterações em relação à referência</w:t>
             </w:r>
           </w:p>
         </w:tc>
@@ -20688,7 +20730,36 @@
               <w:pStyle w:val="Compact"/>
             </w:pPr>
             <w:r>
-              <w:t xml:space="preserve">365</w:t>
+              <w:t xml:space="preserve">– (365 despachos/ano;</w:t>
+            </w:r>
+            <w:r>
+              <w:t xml:space="preserve"> </w:t>
+            </w:r>
+            <m:oMath>
+              <m:sSup>
+                <m:e>
+                  <m:r>
+                    <m:t>c</m:t>
+                  </m:r>
+                </m:e>
+                <m:sup>
+                  <m:r>
+                    <m:t>d</m:t>
+                  </m:r>
+                  <m:r>
+                    <m:t>e</m:t>
+                  </m:r>
+                  <m:r>
+                    <m:t>g</m:t>
+                  </m:r>
+                </m:sup>
+              </m:sSup>
+            </m:oMath>
+            <w:r>
+              <w:t xml:space="preserve"> </w:t>
+            </w:r>
+            <w:r>
+              <w:t xml:space="preserve">de R$ 50/MWh; eletrolisador de 17,5 MW; tanque de 2 t)</w:t>
             </w:r>
           </w:p>
         </w:tc>
@@ -20791,7 +20862,7 @@
               <w:pStyle w:val="Compact"/>
             </w:pPr>
             <w:r>
-              <w:t xml:space="preserve">365</w:t>
+              <w:t xml:space="preserve">–</w:t>
             </w:r>
           </w:p>
         </w:tc>
@@ -20894,7 +20965,7 @@
               <w:pStyle w:val="Compact"/>
             </w:pPr>
             <w:r>
-              <w:t xml:space="preserve">365</w:t>
+              <w:t xml:space="preserve">–</w:t>
             </w:r>
           </w:p>
         </w:tc>
@@ -20940,7 +21011,7 @@
               <w:pStyle w:val="Compact"/>
             </w:pPr>
             <w:r>
-              <w:t xml:space="preserve">365</w:t>
+              <w:t xml:space="preserve">–</w:t>
             </w:r>
           </w:p>
         </w:tc>
@@ -21043,7 +21114,7 @@
               <w:pStyle w:val="Compact"/>
             </w:pPr>
             <w:r>
-              <w:t xml:space="preserve">365</w:t>
+              <w:t xml:space="preserve">–</w:t>
             </w:r>
           </w:p>
         </w:tc>
@@ -21089,7 +21160,225 @@
               <w:pStyle w:val="Compact"/>
             </w:pPr>
             <w:r>
-              <w:t xml:space="preserve">50; 150; 365</w:t>
+              <w:t xml:space="preserve">50; 150 ou 365 despachos/ano</w:t>
+            </w:r>
+          </w:p>
+        </w:tc>
+      </w:tr>
+      <w:tr>
+        <w:tc>
+          <w:tcPr/>
+          <w:p>
+            <w:pPr>
+              <w:pStyle w:val="Compact"/>
+            </w:pPr>
+            <w:r>
+              <w:t xml:space="preserve">Degradação</w:t>
+            </w:r>
+          </w:p>
+        </w:tc>
+        <w:tc>
+          <w:tcPr/>
+          <w:p>
+            <w:pPr>
+              <w:pStyle w:val="Compact"/>
+            </w:pPr>
+            <w:r>
+              <w:t xml:space="preserve">Sem limite de volume</w:t>
+            </w:r>
+          </w:p>
+        </w:tc>
+        <w:tc>
+          <w:tcPr/>
+          <w:p>
+            <w:pPr>
+              <w:pStyle w:val="Compact"/>
+            </w:pPr>
+            <w:r>
+              <w:t xml:space="preserve">Vedada</w:t>
+            </w:r>
+          </w:p>
+        </w:tc>
+        <w:tc>
+          <w:tcPr/>
+          <w:p>
+            <w:pPr>
+              <w:pStyle w:val="Compact"/>
+            </w:pPr>
+            <m:oMath>
+              <m:sSup>
+                <m:e>
+                  <m:r>
+                    <m:t>c</m:t>
+                  </m:r>
+                </m:e>
+                <m:sup>
+                  <m:r>
+                    <m:t>d</m:t>
+                  </m:r>
+                  <m:r>
+                    <m:t>e</m:t>
+                  </m:r>
+                  <m:r>
+                    <m:t>g</m:t>
+                  </m:r>
+                </m:sup>
+              </m:sSup>
+            </m:oMath>
+            <w:r>
+              <w:t xml:space="preserve"> </w:t>
+            </w:r>
+            <w:r>
+              <w:t xml:space="preserve">de R$ 100 ou 200/MWh</w:t>
+            </w:r>
+          </w:p>
+        </w:tc>
+      </w:tr>
+      <w:tr>
+        <w:tc>
+          <w:tcPr/>
+          <w:p>
+            <w:pPr>
+              <w:pStyle w:val="Compact"/>
+            </w:pPr>
+            <w:r>
+              <w:t xml:space="preserve">Eletrolisador</w:t>
+            </w:r>
+          </w:p>
+        </w:tc>
+        <w:tc>
+          <w:tcPr/>
+          <w:p>
+            <w:pPr>
+              <w:pStyle w:val="Compact"/>
+            </w:pPr>
+            <w:r>
+              <w:t xml:space="preserve">Sem limite de volume</w:t>
+            </w:r>
+          </w:p>
+        </w:tc>
+        <w:tc>
+          <w:tcPr/>
+          <w:p>
+            <w:pPr>
+              <w:pStyle w:val="Compact"/>
+            </w:pPr>
+            <w:r>
+              <w:t xml:space="preserve">Vedada</w:t>
+            </w:r>
+          </w:p>
+        </w:tc>
+        <w:tc>
+          <w:tcPr/>
+          <w:p>
+            <w:pPr>
+              <w:pStyle w:val="Compact"/>
+            </w:pPr>
+            <w:r>
+              <w:t xml:space="preserve">Eletrolisador de 10 ou 25 MW</w:t>
+            </w:r>
+          </w:p>
+        </w:tc>
+      </w:tr>
+      <w:tr>
+        <w:tc>
+          <w:tcPr/>
+          <w:p>
+            <w:pPr>
+              <w:pStyle w:val="Compact"/>
+            </w:pPr>
+            <w:r>
+              <w:t xml:space="preserve">Tanque</w:t>
+            </w:r>
+          </w:p>
+        </w:tc>
+        <w:tc>
+          <w:tcPr/>
+          <w:p>
+            <w:pPr>
+              <w:pStyle w:val="Compact"/>
+            </w:pPr>
+            <m:oMath>
+              <m:sSup>
+                <m:e>
+                  <m:r>
+                    <m:t>D</m:t>
+                  </m:r>
+                </m:e>
+                <m:sup>
+                  <m:r>
+                    <m:t>h</m:t>
+                  </m:r>
+                  <m:r>
+                    <m:t>2</m:t>
+                  </m:r>
+                </m:sup>
+              </m:sSup>
+              <m:r>
+                <m:rPr>
+                  <m:sty m:val="p"/>
+                </m:rPr>
+                <m:t>=</m:t>
+              </m:r>
+              <m:sSup>
+                <m:e>
+                  <m:acc>
+                    <m:accPr>
+                      <m:chr m:val="‾"/>
+                    </m:accPr>
+                    <m:e>
+                      <m:r>
+                        <m:t>D</m:t>
+                      </m:r>
+                    </m:e>
+                  </m:acc>
+                </m:e>
+                <m:sup>
+                  <m:r>
+                    <m:t>h</m:t>
+                  </m:r>
+                  <m:r>
+                    <m:t>2</m:t>
+                  </m:r>
+                </m:sup>
+              </m:sSup>
+              <m:r>
+                <m:rPr>
+                  <m:sty m:val="p"/>
+                </m:rPr>
+                <m:t>=</m:t>
+              </m:r>
+              <m:r>
+                <m:t>3.000</m:t>
+              </m:r>
+            </m:oMath>
+            <w:r>
+              <w:t xml:space="preserve"> </w:t>
+            </w:r>
+            <w:r>
+              <w:t xml:space="preserve">kg/dia</w:t>
+            </w:r>
+          </w:p>
+        </w:tc>
+        <w:tc>
+          <w:tcPr/>
+          <w:p>
+            <w:pPr>
+              <w:pStyle w:val="Compact"/>
+            </w:pPr>
+            <w:r>
+              <w:t xml:space="preserve">Vedada</w:t>
+            </w:r>
+          </w:p>
+        </w:tc>
+        <w:tc>
+          <w:tcPr/>
+          <w:p>
+            <w:pPr>
+              <w:pStyle w:val="Compact"/>
+            </w:pPr>
+            <w:r>
+              <w:t xml:space="preserve">Tanque de 10 t</w:t>
             </w:r>
           </w:p>
         </w:tc>
@@ -21378,7 +21667,7 @@
         <w:t xml:space="preserve"> </w:t>
       </w:r>
       <w:r>
-        <w:t xml:space="preserve">o custo de degradação do BESS é proporcional à energia descarregada, sem dependência da profundidade de descarga;</w:t>
+        <w:t xml:space="preserve">o custo de degradação do BESS é proporcional à energia descarregada, sem dependência da profundidade de descarga, e seu valor de referência (R$ 50/MWh) é inferior à estimativa baseada no custo de reposição dos módulos, o que é tratado por análise de sensibilidade;</w:t>
       </w:r>
     </w:p>
     <w:p>
@@ -21420,7 +21709,7 @@
         <w:t xml:space="preserve"> </w:t>
       </w:r>
       <w:r>
-        <w:t xml:space="preserve">a decomposição impõe que os estados de armazenamento retornem ao valor inicial ao final de cada semana, impedindo transferências de energia ou de hidrogênio entre semanas;</w:t>
+        <w:t xml:space="preserve">a decomposição impõe que os estados de armazenamento retornem ao valor inicial ao final de cada semana, impedindo transferências de energia ou de hidrogênio entre semanas; o efeito dessa restrição é verificado com blocos de até 28 dias (Seção 3.6.2);</w:t>
       </w:r>
     </w:p>
     <w:p>
@@ -21601,6 +21890,27 @@
         <w:pStyle w:val="Referencia"/>
       </w:pPr>
       <w:r>
+        <w:t xml:space="preserve">BNEF – BLOOMBERGNEF.</w:t>
+      </w:r>
+      <w:r>
+        <w:t xml:space="preserve"> </w:t>
+      </w:r>
+      <w:r>
+        <w:rPr>
+          <w:b/>
+          <w:bCs/>
+        </w:rPr>
+        <w:t xml:space="preserve">Lithium-ion battery pack prices fall to $108 per kilowatt-hour, despite rising metal prices</w:t>
+      </w:r>
+      <w:r>
+        <w:t xml:space="preserve">. Londres: BloombergNEF, 9 dez. 2025. Disponível em: https://about.bnef.com. Acesso em: 3 out. 2026.</w:t>
+      </w:r>
+    </w:p>
+    <w:p>
+      <w:pPr>
+        <w:pStyle w:val="Referencia"/>
+      </w:pPr>
+      <w:r>
         <w:t xml:space="preserve">BRASIL. Ministério de Minas e Energia. Portaria Normativa MME nº 136, de 1º de junho de 2026. Estabelece as Diretrizes e a Sistemática para a realização dos Leilões para Contratação de Potência Elétrica, a partir de novos sistemas de armazenamento de energia em baterias.</w:t>
       </w:r>
       <w:r>
@@ -21782,6 +22092,27 @@
       </w:r>
       <w:r>
         <w:t xml:space="preserve">. New York: Springer, 2010.</w:t>
+      </w:r>
+    </w:p>
+    <w:p>
+      <w:pPr>
+        <w:pStyle w:val="Referencia"/>
+      </w:pPr>
+      <w:r>
+        <w:t xml:space="preserve">EPE – EMPRESA DE PESQUISA ENERGÉTICA.</w:t>
+      </w:r>
+      <w:r>
+        <w:t xml:space="preserve"> </w:t>
+      </w:r>
+      <w:r>
+        <w:rPr>
+          <w:b/>
+          <w:bCs/>
+        </w:rPr>
+        <w:t xml:space="preserve">Plano Decenal de Expansão de Energia 2034</w:t>
+      </w:r>
+      <w:r>
+        <w:t xml:space="preserve">: caderno de micro e minigeração distribuída e baterias. Rio de Janeiro: EPE, 2024.</w:t>
       </w:r>
     </w:p>
     <w:p>

</xml_diff>

<commit_message>
Capítulos 3 e 4: viabilidade econômica e lance mínimo
Cap. 3: Seção 3.8.4 (VPL, TIR, preço de equilíbrio do H2, caso sem BESS,
curva de oferta com investimento e lance mínimo; Quadro 3.3), escopo d),
hipótese l) e referências (ANEEL 2026, IEA 2025).
Cap. 4: Seção 4.9 (Tabelas 4.8 e 4.9, Figuras 4.9 e 4.10) e síntese (4.10)
com as duas situações: BESS existente e BESS a construir.

Co-Authored-By: Claude Opus 5.5 <noreply@anthropic.com>
Claude-Session: https://claude.ai/code/session_01YFtn9hiQUHbNLSX7rUNYuK
</commit_message>
<xml_diff>
--- a/docs/dissertacao/cap3_metodologia.docx
+++ b/docs/dissertacao/cap3_metodologia.docx
@@ -2,7 +2,7 @@
 <file path=word/document.xml><?xml version="1.0" encoding="utf-8"?>
 <w:document xmlns:w="http://schemas.openxmlformats.org/wordprocessingml/2006/main" xmlns:m="http://schemas.openxmlformats.org/officeDocument/2006/math" xmlns:r="http://schemas.openxmlformats.org/officeDocument/2006/relationships" xmlns:o="urn:schemas-microsoft-com:office:office" xmlns:v="urn:schemas-microsoft-com:vml" xmlns:w10="urn:schemas-microsoft-com:office:word" xmlns:a="http://schemas.openxmlformats.org/drawingml/2006/main" xmlns:pic="http://schemas.openxmlformats.org/drawingml/2006/picture" xmlns:wp="http://schemas.openxmlformats.org/drawingml/2006/wordprocessingDrawing">
   <w:body>
-    <w:bookmarkStart w:id="44" w:name="metodologia"/>
+    <w:bookmarkStart w:id="45" w:name="metodologia"/>
     <w:p>
       <w:pPr>
         <w:pStyle w:val="Heading1"/>
@@ -105,7 +105,7 @@
         </w:numPr>
       </w:pPr>
       <w:r>
-        <w:t xml:space="preserve">a função objetivo considera receitas e custos operacionais; custos de investimento não são incluídos, uma vez que as capacidades são fixas.</w:t>
+        <w:t xml:space="preserve">a função objetivo considera receitas e custos operacionais; os custos de investimento não entram na otimização, uma vez que as capacidades são fixas, e são considerados a posteriori na análise de viabilidade econômica e do lance mínimo (Seção 3.8.4).</w:t>
       </w:r>
     </w:p>
     <w:bookmarkEnd w:id="9"/>
@@ -18236,7 +18236,7 @@
     </w:p>
     <w:bookmarkEnd w:id="35"/>
     <w:bookmarkEnd w:id="36"/>
-    <w:bookmarkStart w:id="40" w:name="X1be5cdf3d160ac75d13eea8d7b66bea13b76fa0"/>
+    <w:bookmarkStart w:id="41" w:name="X1be5cdf3d160ac75d13eea8d7b66bea13b76fa0"/>
     <w:p>
       <w:pPr>
         <w:pStyle w:val="Heading2"/>
@@ -20165,7 +20165,10 @@
         </m:r>
       </m:oMath>
       <w:r>
-        <w:t xml:space="preserve">, mas deve ser coberto pela receita total para que o empreendimento seja viável; a análise de viabilidade econômica está fora do escopo desta etapa.</w:t>
+        <w:t xml:space="preserve"> </w:t>
+      </w:r>
+      <w:r>
+        <w:t xml:space="preserve">quando o BESS já existe, mas altera a decisão quando ele ainda será construído, situação tratada na Seção 3.8.4.</w:t>
       </w:r>
     </w:p>
     <w:bookmarkEnd w:id="37"/>
@@ -21427,14 +21430,13 @@
       </w:r>
     </w:p>
     <w:bookmarkEnd w:id="39"/>
-    <w:bookmarkEnd w:id="40"/>
-    <w:bookmarkStart w:id="41" w:name="implementação-computacional"/>
+    <w:bookmarkStart w:id="40" w:name="viabilidade-econômica-e-lance-mínimo"/>
     <w:p>
       <w:pPr>
-        <w:pStyle w:val="Heading2"/>
+        <w:pStyle w:val="Heading3"/>
       </w:pPr>
       <w:r>
-        <w:t xml:space="preserve">3.9 Implementação computacional</w:t>
+        <w:t xml:space="preserve">3.8.4 Viabilidade econômica e lance mínimo</w:t>
       </w:r>
     </w:p>
     <w:p>
@@ -21442,6 +21444,1512 @@
         <w:pStyle w:val="FirstParagraph"/>
       </w:pPr>
       <w:r>
+        <w:t xml:space="preserve">A viabilidade do empreendimento é avaliada pelo valor presente líquido (VPL) de um fluxo de caixa anual constante, em termos reais, ao longo do prazo do contrato do LRCAP (</w:t>
+      </w:r>
+      <m:oMath>
+        <m:r>
+          <m:t>n</m:t>
+        </m:r>
+        <m:r>
+          <m:rPr>
+            <m:sty m:val="p"/>
+          </m:rPr>
+          <m:t>=</m:t>
+        </m:r>
+        <m:r>
+          <m:t>15</m:t>
+        </m:r>
+      </m:oMath>
+      <w:r>
+        <w:t xml:space="preserve"> </w:t>
+      </w:r>
+      <w:r>
+        <w:t xml:space="preserve">anos), sem valor residual, conforme a Equação (3.42):</w:t>
+      </w:r>
+    </w:p>
+    <w:tbl>
+      <w:tblPr>
+        <w:tblW w:w="9071" w:type="dxa"/>
+        <w:tblBorders>
+          <w:top w:val="nil"/>
+          <w:left w:val="nil"/>
+          <w:bottom w:val="nil"/>
+          <w:right w:val="nil"/>
+          <w:insideH w:val="nil"/>
+          <w:insideV w:val="nil"/>
+        </w:tblBorders>
+        <w:tblLayout w:type="fixed"/>
+        <w:tblCellMar>
+          <w:left w:w="0" w:type="dxa"/>
+          <w:right w:w="0" w:type="dxa"/>
+        </w:tblCellMar>
+      </w:tblPr>
+      <w:tblGrid>
+        <w:gridCol w:w="8071"/>
+        <w:gridCol w:w="1000"/>
+      </w:tblGrid>
+      <w:tr>
+        <w:tc>
+          <w:tcPr>
+            <w:tcW w:w="8071" w:type="dxa"/>
+            <w:vAlign w:val="center"/>
+          </w:tcPr>
+          <w:p>
+            <w:pPr>
+              <w:pStyle w:val="BodyText"/>
+            </w:pPr>
+            <m:oMathPara>
+              <m:oMathParaPr>
+                <m:jc m:val="center"/>
+              </m:oMathParaPr>
+              <m:oMath>
+                <m:r>
+                  <m:rPr>
+                    <m:sty m:val="p"/>
+                  </m:rPr>
+                  <m:t>V</m:t>
+                </m:r>
+                <m:r>
+                  <m:rPr>
+                    <m:sty m:val="p"/>
+                  </m:rPr>
+                  <m:t>P</m:t>
+                </m:r>
+                <m:r>
+                  <m:rPr>
+                    <m:sty m:val="p"/>
+                  </m:rPr>
+                  <m:t>L</m:t>
+                </m:r>
+                <m:r>
+                  <m:rPr>
+                    <m:sty m:val="p"/>
+                  </m:rPr>
+                  <m:t>=</m:t>
+                </m:r>
+                <m:r>
+                  <m:rPr>
+                    <m:sty m:val="p"/>
+                  </m:rPr>
+                  <m:t>−</m:t>
+                </m:r>
+                <m:r>
+                  <m:t>I</m:t>
+                </m:r>
+                <m:r>
+                  <m:rPr>
+                    <m:sty m:val="p"/>
+                  </m:rPr>
+                  <m:t>+</m:t>
+                </m:r>
+                <m:r>
+                  <m:t>F</m:t>
+                </m:r>
+                <m:r>
+                  <m:rPr>
+                    <m:sty m:val="p"/>
+                  </m:rPr>
+                  <m:t>(</m:t>
+                </m:r>
+                <m:r>
+                  <m:t>i</m:t>
+                </m:r>
+                <m:r>
+                  <m:rPr>
+                    <m:sty m:val="p"/>
+                  </m:rPr>
+                  <m:t>,</m:t>
+                </m:r>
+                <m:r>
+                  <m:t>n</m:t>
+                </m:r>
+                <m:r>
+                  <m:rPr>
+                    <m:sty m:val="p"/>
+                  </m:rPr>
+                  <m:t>)</m:t>
+                </m:r>
+                <m:r>
+                  <m:t> </m:t>
+                </m:r>
+                <m:d>
+                  <m:dPr>
+                    <m:begChr m:val="("/>
+                    <m:sepChr m:val=""/>
+                    <m:endChr m:val=")"/>
+                    <m:grow/>
+                  </m:dPr>
+                  <m:e>
+                    <m:r>
+                      <m:rPr>
+                        <m:sty m:val="p"/>
+                      </m:rPr>
+                      <m:t>Π</m:t>
+                    </m:r>
+                    <m:r>
+                      <m:rPr>
+                        <m:sty m:val="p"/>
+                      </m:rPr>
+                      <m:t>−</m:t>
+                    </m:r>
+                    <m:sSup>
+                      <m:e>
+                        <m:r>
+                          <m:t>C</m:t>
+                        </m:r>
+                      </m:e>
+                      <m:sup>
+                        <m:r>
+                          <m:t>o</m:t>
+                        </m:r>
+                        <m:r>
+                          <m:t>m</m:t>
+                        </m:r>
+                      </m:sup>
+                    </m:sSup>
+                  </m:e>
+                </m:d>
+                <m:r>
+                  <m:rPr>
+                    <m:sty m:val="p"/>
+                  </m:rPr>
+                  <m:t>,</m:t>
+                </m:r>
+                <m:r>
+                  <m:t>  </m:t>
+                </m:r>
+                <m:r>
+                  <m:t>F</m:t>
+                </m:r>
+                <m:r>
+                  <m:rPr>
+                    <m:sty m:val="p"/>
+                  </m:rPr>
+                  <m:t>(</m:t>
+                </m:r>
+                <m:r>
+                  <m:t>i</m:t>
+                </m:r>
+                <m:r>
+                  <m:rPr>
+                    <m:sty m:val="p"/>
+                  </m:rPr>
+                  <m:t>,</m:t>
+                </m:r>
+                <m:r>
+                  <m:t>n</m:t>
+                </m:r>
+                <m:r>
+                  <m:rPr>
+                    <m:sty m:val="p"/>
+                  </m:rPr>
+                  <m:t>)</m:t>
+                </m:r>
+                <m:r>
+                  <m:rPr>
+                    <m:sty m:val="p"/>
+                  </m:rPr>
+                  <m:t>=</m:t>
+                </m:r>
+                <m:f>
+                  <m:fPr>
+                    <m:type m:val="bar"/>
+                  </m:fPr>
+                  <m:num>
+                    <m:r>
+                      <m:t>1</m:t>
+                    </m:r>
+                    <m:r>
+                      <m:rPr>
+                        <m:sty m:val="p"/>
+                      </m:rPr>
+                      <m:t>−</m:t>
+                    </m:r>
+                    <m:r>
+                      <m:rPr>
+                        <m:sty m:val="p"/>
+                      </m:rPr>
+                      <m:t>(</m:t>
+                    </m:r>
+                    <m:r>
+                      <m:t>1</m:t>
+                    </m:r>
+                    <m:r>
+                      <m:rPr>
+                        <m:sty m:val="p"/>
+                      </m:rPr>
+                      <m:t>+</m:t>
+                    </m:r>
+                    <m:r>
+                      <m:t>i</m:t>
+                    </m:r>
+                    <m:sSup>
+                      <m:e>
+                        <m:r>
+                          <m:rPr>
+                            <m:sty m:val="p"/>
+                          </m:rPr>
+                          <m:t>)</m:t>
+                        </m:r>
+                      </m:e>
+                      <m:sup>
+                        <m:r>
+                          <m:rPr>
+                            <m:sty m:val="p"/>
+                          </m:rPr>
+                          <m:t>−</m:t>
+                        </m:r>
+                        <m:r>
+                          <m:t>n</m:t>
+                        </m:r>
+                      </m:sup>
+                    </m:sSup>
+                  </m:num>
+                  <m:den>
+                    <m:r>
+                      <m:t>i</m:t>
+                    </m:r>
+                  </m:den>
+                </m:f>
+              </m:oMath>
+            </m:oMathPara>
+          </w:p>
+        </w:tc>
+        <w:tc>
+          <w:tcPr>
+            <w:tcW w:w="1000" w:type="dxa"/>
+            <w:vAlign w:val="center"/>
+          </w:tcPr>
+          <w:p>
+            <w:pPr>
+              <w:pStyle w:val="NumeroEquacao"/>
+            </w:pPr>
+            <w:r>
+              <w:t>(3.42)</w:t>
+            </w:r>
+          </w:p>
+        </w:tc>
+      </w:tr>
+    </w:tbl>
+    <w:p>
+      <w:pPr>
+        <w:pStyle w:val="FirstParagraph"/>
+      </w:pPr>
+      <w:r>
+        <w:t xml:space="preserve">em que</w:t>
+      </w:r>
+      <w:r>
+        <w:t xml:space="preserve"> </w:t>
+      </w:r>
+      <m:oMath>
+        <m:r>
+          <m:t>I</m:t>
+        </m:r>
+      </m:oMath>
+      <w:r>
+        <w:t xml:space="preserve"> </w:t>
+      </w:r>
+      <w:r>
+        <w:t xml:space="preserve">é o investimento total na usina FV, no BESS e no eletrolisador,</w:t>
+      </w:r>
+      <w:r>
+        <w:t xml:space="preserve"> </w:t>
+      </w:r>
+      <m:oMath>
+        <m:r>
+          <m:rPr>
+            <m:sty m:val="p"/>
+          </m:rPr>
+          <m:t>Π</m:t>
+        </m:r>
+      </m:oMath>
+      <w:r>
+        <w:t xml:space="preserve"> </w:t>
+      </w:r>
+      <w:r>
+        <w:t xml:space="preserve">é o lucro operacional esperado na potência ótima para a receita fixa considerada (Seção 3.8.1),</w:t>
+      </w:r>
+      <w:r>
+        <w:t xml:space="preserve"> </w:t>
+      </w:r>
+      <m:oMath>
+        <m:sSup>
+          <m:e>
+            <m:r>
+              <m:t>C</m:t>
+            </m:r>
+          </m:e>
+          <m:sup>
+            <m:r>
+              <m:t>o</m:t>
+            </m:r>
+            <m:r>
+              <m:t>m</m:t>
+            </m:r>
+          </m:sup>
+        </m:sSup>
+      </m:oMath>
+      <w:r>
+        <w:t xml:space="preserve"> </w:t>
+      </w:r>
+      <w:r>
+        <w:t xml:space="preserve">é o custo anual de operação e manutenção fixo e</w:t>
+      </w:r>
+      <w:r>
+        <w:t xml:space="preserve"> </w:t>
+      </w:r>
+      <m:oMath>
+        <m:r>
+          <m:t>F</m:t>
+        </m:r>
+        <m:r>
+          <m:rPr>
+            <m:sty m:val="p"/>
+          </m:rPr>
+          <m:t>(</m:t>
+        </m:r>
+        <m:r>
+          <m:t>i</m:t>
+        </m:r>
+        <m:r>
+          <m:rPr>
+            <m:sty m:val="p"/>
+          </m:rPr>
+          <m:t>,</m:t>
+        </m:r>
+        <m:r>
+          <m:t>n</m:t>
+        </m:r>
+        <m:r>
+          <m:rPr>
+            <m:sty m:val="p"/>
+          </m:rPr>
+          <m:t>)</m:t>
+        </m:r>
+      </m:oMath>
+      <w:r>
+        <w:t xml:space="preserve"> </w:t>
+      </w:r>
+      <w:r>
+        <w:t xml:space="preserve">é o fator de valor presente de uma série uniforme à taxa real</w:t>
+      </w:r>
+      <w:r>
+        <w:t xml:space="preserve"> </w:t>
+      </w:r>
+      <m:oMath>
+        <m:r>
+          <m:t>i</m:t>
+        </m:r>
+      </m:oMath>
+      <w:r>
+        <w:t xml:space="preserve">. A taxa interna de retorno (TIR) é a taxa para a qual o VPL é nulo. Os parâmetros adotados são apresentados no Quadro 3.3.</w:t>
+      </w:r>
+    </w:p>
+    <w:p>
+      <w:pPr>
+        <w:pStyle w:val="Legenda"/>
+      </w:pPr>
+      <w:r>
+        <w:t xml:space="preserve">Quadro 3.3 – Parâmetros da análise de viabilidade econômica</w:t>
+      </w:r>
+    </w:p>
+    <w:tbl>
+      <w:tblPr>
+        <w:tblStyle w:val="Table"/>
+        <w:tblW w:type="pct" w:w="5000"/>
+        <w:tblLayout w:type="fixed"/>
+        <w:tblLook w:firstRow="1" w:lastRow="0" w:firstColumn="0" w:lastColumn="0" w:noHBand="0" w:noVBand="0" w:val="0020"/>
+      </w:tblPr>
+      <w:tblGrid>
+        <w:gridCol w:w="2112"/>
+        <w:gridCol w:w="2640"/>
+        <w:gridCol w:w="3168"/>
+      </w:tblGrid>
+      <w:tr>
+        <w:trPr>
+          <w:tblHeader w:val="on"/>
+        </w:trPr>
+        <w:tc>
+          <w:tcPr/>
+          <w:p>
+            <w:pPr>
+              <w:pStyle w:val="Compact"/>
+            </w:pPr>
+            <w:r>
+              <w:t xml:space="preserve">Parâmetro</w:t>
+            </w:r>
+          </w:p>
+        </w:tc>
+        <w:tc>
+          <w:tcPr/>
+          <w:p>
+            <w:pPr>
+              <w:pStyle w:val="Compact"/>
+            </w:pPr>
+            <w:r>
+              <w:t xml:space="preserve">Valores (baixo; central; alto)</w:t>
+            </w:r>
+          </w:p>
+        </w:tc>
+        <w:tc>
+          <w:tcPr/>
+          <w:p>
+            <w:pPr>
+              <w:pStyle w:val="Compact"/>
+            </w:pPr>
+            <w:r>
+              <w:t xml:space="preserve">Referência</w:t>
+            </w:r>
+          </w:p>
+        </w:tc>
+      </w:tr>
+      <w:tr>
+        <w:tc>
+          <w:tcPr/>
+          <w:p>
+            <w:pPr>
+              <w:pStyle w:val="Compact"/>
+            </w:pPr>
+            <w:r>
+              <w:t xml:space="preserve">Investimento na usina FV</w:t>
+            </w:r>
+          </w:p>
+        </w:tc>
+        <w:tc>
+          <w:tcPr/>
+          <w:p>
+            <w:pPr>
+              <w:pStyle w:val="Compact"/>
+            </w:pPr>
+            <w:r>
+              <w:t xml:space="preserve">R$ 3.000; 4.250; 5.500/kW</w:t>
+            </w:r>
+          </w:p>
+        </w:tc>
+        <w:tc>
+          <w:tcPr/>
+          <w:p>
+            <w:pPr>
+              <w:pStyle w:val="Compact"/>
+            </w:pPr>
+            <w:r>
+              <w:t xml:space="preserve">BRASIL; EPE (2025)</w:t>
+            </w:r>
+          </w:p>
+        </w:tc>
+      </w:tr>
+      <w:tr>
+        <w:tc>
+          <w:tcPr/>
+          <w:p>
+            <w:pPr>
+              <w:pStyle w:val="Compact"/>
+            </w:pPr>
+            <w:r>
+              <w:t xml:space="preserve">Investimento no BESS</w:t>
+            </w:r>
+          </w:p>
+        </w:tc>
+        <w:tc>
+          <w:tcPr/>
+          <w:p>
+            <w:pPr>
+              <w:pStyle w:val="Compact"/>
+            </w:pPr>
+            <w:r>
+              <w:t xml:space="preserve">R$ 5.000; 5.500; 6.000/kW</w:t>
+            </w:r>
+          </w:p>
+        </w:tc>
+        <w:tc>
+          <w:tcPr/>
+          <w:p>
+            <w:pPr>
+              <w:pStyle w:val="Compact"/>
+            </w:pPr>
+            <w:r>
+              <w:t xml:space="preserve">BRASIL; EPE (2025)</w:t>
+            </w:r>
+          </w:p>
+        </w:tc>
+      </w:tr>
+      <w:tr>
+        <w:tc>
+          <w:tcPr/>
+          <w:p>
+            <w:pPr>
+              <w:pStyle w:val="Compact"/>
+            </w:pPr>
+            <w:r>
+              <w:t xml:space="preserve">Investimento no eletrolisador</w:t>
+            </w:r>
+          </w:p>
+        </w:tc>
+        <w:tc>
+          <w:tcPr/>
+          <w:p>
+            <w:pPr>
+              <w:pStyle w:val="Compact"/>
+            </w:pPr>
+            <w:r>
+              <w:t xml:space="preserve">US$ 1.100; 2.000; 2.500/kW</w:t>
+            </w:r>
+          </w:p>
+        </w:tc>
+        <w:tc>
+          <w:tcPr/>
+          <w:p>
+            <w:pPr>
+              <w:pStyle w:val="Compact"/>
+            </w:pPr>
+            <w:r>
+              <w:t xml:space="preserve">IEA (2025): sistemas chineses de US$ 500 a 1.100/kW e demais de US$ 1.900 a 2.500/kW; convertidos pela PTAX de 09/12/2025 (R$ 5,4025/US$)</w:t>
+            </w:r>
+          </w:p>
+        </w:tc>
+      </w:tr>
+      <w:tr>
+        <w:tc>
+          <w:tcPr/>
+          <w:p>
+            <w:pPr>
+              <w:pStyle w:val="Compact"/>
+            </w:pPr>
+            <w:r>
+              <w:t xml:space="preserve">O&amp;M fixo anual</w:t>
+            </w:r>
+          </w:p>
+        </w:tc>
+        <w:tc>
+          <w:tcPr/>
+          <w:p>
+            <w:pPr>
+              <w:pStyle w:val="Compact"/>
+            </w:pPr>
+            <w:r>
+              <w:t xml:space="preserve">1,5% (FV), 2,5% (BESS) e 3% (eletrolisador) do investimento</w:t>
+            </w:r>
+          </w:p>
+        </w:tc>
+        <w:tc>
+          <w:tcPr/>
+          <w:p>
+            <w:pPr>
+              <w:pStyle w:val="Compact"/>
+            </w:pPr>
+            <w:r>
+              <w:t xml:space="preserve">Hipótese do autor; o O&amp;M variável do eletrolisador e a degradação do BESS já estão no modelo de operação</w:t>
+            </w:r>
+          </w:p>
+        </w:tc>
+      </w:tr>
+      <w:tr>
+        <w:tc>
+          <w:tcPr/>
+          <w:p>
+            <w:pPr>
+              <w:pStyle w:val="Compact"/>
+            </w:pPr>
+            <w:r>
+              <w:t xml:space="preserve">Taxa de desconto real</w:t>
+            </w:r>
+          </w:p>
+        </w:tc>
+        <w:tc>
+          <w:tcPr/>
+          <w:p>
+            <w:pPr>
+              <w:pStyle w:val="Compact"/>
+            </w:pPr>
+            <w:r>
+              <w:t xml:space="preserve">8,0% e 12,1% ao ano</w:t>
+            </w:r>
+          </w:p>
+        </w:tc>
+        <w:tc>
+          <w:tcPr/>
+          <w:p>
+            <w:pPr>
+              <w:pStyle w:val="Compact"/>
+            </w:pPr>
+            <w:r>
+              <w:t xml:space="preserve">ANEEL (2026): custo de capital regulatório da geração, após e antes de impostos</w:t>
+            </w:r>
+          </w:p>
+        </w:tc>
+      </w:tr>
+      <w:tr>
+        <w:tc>
+          <w:tcPr/>
+          <w:p>
+            <w:pPr>
+              <w:pStyle w:val="Compact"/>
+            </w:pPr>
+            <w:r>
+              <w:t xml:space="preserve">Horizonte</w:t>
+            </w:r>
+          </w:p>
+        </w:tc>
+        <w:tc>
+          <w:tcPr/>
+          <w:p>
+            <w:pPr>
+              <w:pStyle w:val="Compact"/>
+            </w:pPr>
+            <w:r>
+              <w:t xml:space="preserve">15 anos, sem valor residual</w:t>
+            </w:r>
+          </w:p>
+        </w:tc>
+        <w:tc>
+          <w:tcPr/>
+          <w:p>
+            <w:pPr>
+              <w:pStyle w:val="Compact"/>
+            </w:pPr>
+            <w:r>
+              <w:t xml:space="preserve">Prazo do contrato do LRCAP</w:t>
+            </w:r>
+          </w:p>
+        </w:tc>
+      </w:tr>
+    </w:tbl>
+    <w:p>
+      <w:pPr>
+        <w:pStyle w:val="Fonte"/>
+      </w:pPr>
+      <w:r>
+        <w:t xml:space="preserve">Fonte: elaborado pelo autor.</w:t>
+      </w:r>
+    </w:p>
+    <w:p>
+      <w:pPr>
+        <w:pStyle w:val="BodyText"/>
+      </w:pPr>
+      <w:r>
+        <w:t xml:space="preserve">Como o lucro operacional não considera tributos sobre a renda, o VPL calculado com a taxa após impostos é otimista; a taxa antes de impostos fornece uma avaliação mais conservadora. A partir do VPL, calcula-se ainda o preço de equilíbrio do hidrogênio,</w:t>
+      </w:r>
+      <w:r>
+        <w:t xml:space="preserve"> </w:t>
+      </w:r>
+      <m:oMath>
+        <m:sSup>
+          <m:e>
+            <m:r>
+              <m:t>π</m:t>
+            </m:r>
+          </m:e>
+          <m:sup>
+            <m:r>
+              <m:t>h</m:t>
+            </m:r>
+            <m:r>
+              <m:t>2</m:t>
+            </m:r>
+            <m:r>
+              <m:rPr>
+                <m:sty m:val="p"/>
+              </m:rPr>
+              <m:t>,</m:t>
+            </m:r>
+            <m:r>
+              <m:t>e</m:t>
+            </m:r>
+            <m:r>
+              <m:t>q</m:t>
+            </m:r>
+          </m:sup>
+        </m:sSup>
+        <m:r>
+          <m:rPr>
+            <m:sty m:val="p"/>
+          </m:rPr>
+          <m:t>=</m:t>
+        </m:r>
+        <m:sSup>
+          <m:e>
+            <m:r>
+              <m:t>π</m:t>
+            </m:r>
+          </m:e>
+          <m:sup>
+            <m:r>
+              <m:t>h</m:t>
+            </m:r>
+            <m:r>
+              <m:t>2</m:t>
+            </m:r>
+          </m:sup>
+        </m:sSup>
+        <m:r>
+          <m:rPr>
+            <m:sty m:val="p"/>
+          </m:rPr>
+          <m:t>−</m:t>
+        </m:r>
+        <m:r>
+          <m:rPr>
+            <m:sty m:val="p"/>
+          </m:rPr>
+          <m:t>V</m:t>
+        </m:r>
+        <m:r>
+          <m:rPr>
+            <m:sty m:val="p"/>
+          </m:rPr>
+          <m:t>P</m:t>
+        </m:r>
+        <m:r>
+          <m:rPr>
+            <m:sty m:val="p"/>
+          </m:rPr>
+          <m:t>L</m:t>
+        </m:r>
+        <m:r>
+          <m:rPr>
+            <m:sty m:val="p"/>
+          </m:rPr>
+          <m:t>/</m:t>
+        </m:r>
+        <m:r>
+          <m:rPr>
+            <m:sty m:val="p"/>
+          </m:rPr>
+          <m:t>(</m:t>
+        </m:r>
+        <m:r>
+          <m:t>F</m:t>
+        </m:r>
+        <m:r>
+          <m:rPr>
+            <m:sty m:val="p"/>
+          </m:rPr>
+          <m:t>(</m:t>
+        </m:r>
+        <m:r>
+          <m:t>i</m:t>
+        </m:r>
+        <m:r>
+          <m:rPr>
+            <m:sty m:val="p"/>
+          </m:rPr>
+          <m:t>,</m:t>
+        </m:r>
+        <m:r>
+          <m:t>n</m:t>
+        </m:r>
+        <m:r>
+          <m:rPr>
+            <m:sty m:val="p"/>
+          </m:rPr>
+          <m:t>)</m:t>
+        </m:r>
+        <m:r>
+          <m:t> </m:t>
+        </m:r>
+        <m:r>
+          <m:t>V</m:t>
+        </m:r>
+        <m:r>
+          <m:rPr>
+            <m:sty m:val="p"/>
+          </m:rPr>
+          <m:t>)</m:t>
+        </m:r>
+      </m:oMath>
+      <w:r>
+        <w:t xml:space="preserve">, em que</w:t>
+      </w:r>
+      <w:r>
+        <w:t xml:space="preserve"> </w:t>
+      </w:r>
+      <m:oMath>
+        <m:r>
+          <m:t>V</m:t>
+        </m:r>
+      </m:oMath>
+      <w:r>
+        <w:t xml:space="preserve"> </w:t>
+      </w:r>
+      <w:r>
+        <w:t xml:space="preserve">é a quantidade anual de hidrogênio vendida. Essa expressão mantém a operação fixa e, portanto, superestima ligeiramente o preço de equilíbrio, pois um preço maior levaria a uma produção maior.</w:t>
+      </w:r>
+    </w:p>
+    <w:p>
+      <w:pPr>
+        <w:pStyle w:val="BodyText"/>
+      </w:pPr>
+      <w:r>
+        <w:t xml:space="preserve">Para isolar a contribuição da bateria, o modelo é resolvido também sem o BESS e, consequentemente, sem participação no leilão, o que fornece o lucro operacional</w:t>
+      </w:r>
+      <w:r>
+        <w:t xml:space="preserve"> </w:t>
+      </w:r>
+      <m:oMath>
+        <m:sSup>
+          <m:e>
+            <m:r>
+              <m:rPr>
+                <m:sty m:val="p"/>
+              </m:rPr>
+              <m:t>Π</m:t>
+            </m:r>
+          </m:e>
+          <m:sup>
+            <m:r>
+              <m:t>0</m:t>
+            </m:r>
+          </m:sup>
+        </m:sSup>
+      </m:oMath>
+      <w:r>
+        <w:t xml:space="preserve"> </w:t>
+      </w:r>
+      <w:r>
+        <w:t xml:space="preserve">da usina FV com o eletrolisador. Quando o BESS ainda será construído, o proponente compara, para cada receita fixa</w:t>
+      </w:r>
+      <w:r>
+        <w:t xml:space="preserve"> </w:t>
+      </w:r>
+      <m:oMath>
+        <m:r>
+          <m:t>R</m:t>
+        </m:r>
+      </m:oMath>
+      <w:r>
+        <w:t xml:space="preserve">, a alternativa de não construí-lo com a de construí-lo e contratar a melhor potência, deduzido o custo anual equivalente do BESS,</w:t>
+      </w:r>
+      <w:r>
+        <w:t xml:space="preserve"> </w:t>
+      </w:r>
+      <m:oMath>
+        <m:sSup>
+          <m:e>
+            <m:r>
+              <m:t>C</m:t>
+            </m:r>
+          </m:e>
+          <m:sup>
+            <m:r>
+              <m:t>b</m:t>
+            </m:r>
+            <m:r>
+              <m:t>e</m:t>
+            </m:r>
+            <m:r>
+              <m:t>s</m:t>
+            </m:r>
+            <m:r>
+              <m:t>s</m:t>
+            </m:r>
+          </m:sup>
+        </m:sSup>
+        <m:r>
+          <m:rPr>
+            <m:sty m:val="p"/>
+          </m:rPr>
+          <m:t>=</m:t>
+        </m:r>
+        <m:sSup>
+          <m:e>
+            <m:r>
+              <m:t>I</m:t>
+            </m:r>
+          </m:e>
+          <m:sup>
+            <m:r>
+              <m:t>b</m:t>
+            </m:r>
+            <m:r>
+              <m:t>e</m:t>
+            </m:r>
+            <m:r>
+              <m:t>s</m:t>
+            </m:r>
+            <m:r>
+              <m:t>s</m:t>
+            </m:r>
+          </m:sup>
+        </m:sSup>
+        <m:r>
+          <m:rPr>
+            <m:sty m:val="p"/>
+          </m:rPr>
+          <m:t>/</m:t>
+        </m:r>
+        <m:r>
+          <m:t>F</m:t>
+        </m:r>
+        <m:r>
+          <m:rPr>
+            <m:sty m:val="p"/>
+          </m:rPr>
+          <m:t>(</m:t>
+        </m:r>
+        <m:r>
+          <m:t>i</m:t>
+        </m:r>
+        <m:r>
+          <m:rPr>
+            <m:sty m:val="p"/>
+          </m:rPr>
+          <m:t>,</m:t>
+        </m:r>
+        <m:r>
+          <m:t>n</m:t>
+        </m:r>
+        <m:r>
+          <m:rPr>
+            <m:sty m:val="p"/>
+          </m:rPr>
+          <m:t>)</m:t>
+        </m:r>
+        <m:r>
+          <m:rPr>
+            <m:sty m:val="p"/>
+          </m:rPr>
+          <m:t>+</m:t>
+        </m:r>
+        <m:sSup>
+          <m:e>
+            <m:r>
+              <m:t>C</m:t>
+            </m:r>
+          </m:e>
+          <m:sup>
+            <m:r>
+              <m:t>o</m:t>
+            </m:r>
+            <m:r>
+              <m:t>m</m:t>
+            </m:r>
+            <m:r>
+              <m:rPr>
+                <m:sty m:val="p"/>
+              </m:rPr>
+              <m:t>,</m:t>
+            </m:r>
+            <m:r>
+              <m:t>b</m:t>
+            </m:r>
+            <m:r>
+              <m:t>e</m:t>
+            </m:r>
+            <m:r>
+              <m:t>s</m:t>
+            </m:r>
+            <m:r>
+              <m:t>s</m:t>
+            </m:r>
+          </m:sup>
+        </m:sSup>
+      </m:oMath>
+      <w:r>
+        <w:t xml:space="preserve">. A potência ofertada passa a ser dada pela Equação (3.43):</w:t>
+      </w:r>
+    </w:p>
+    <w:tbl>
+      <w:tblPr>
+        <w:tblW w:w="9071" w:type="dxa"/>
+        <w:tblBorders>
+          <w:top w:val="nil"/>
+          <w:left w:val="nil"/>
+          <w:bottom w:val="nil"/>
+          <w:right w:val="nil"/>
+          <w:insideH w:val="nil"/>
+          <w:insideV w:val="nil"/>
+        </w:tblBorders>
+        <w:tblLayout w:type="fixed"/>
+        <w:tblCellMar>
+          <w:left w:w="0" w:type="dxa"/>
+          <w:right w:w="0" w:type="dxa"/>
+        </w:tblCellMar>
+      </w:tblPr>
+      <w:tblGrid>
+        <w:gridCol w:w="8071"/>
+        <w:gridCol w:w="1000"/>
+      </w:tblGrid>
+      <w:tr>
+        <w:tc>
+          <w:tcPr>
+            <w:tcW w:w="8071" w:type="dxa"/>
+            <w:vAlign w:val="center"/>
+          </w:tcPr>
+          <w:p>
+            <w:pPr>
+              <w:pStyle w:val="BodyText"/>
+            </w:pPr>
+            <m:oMathPara>
+              <m:oMathParaPr>
+                <m:jc m:val="center"/>
+              </m:oMathParaPr>
+              <m:oMath>
+                <m:sSubSup>
+                  <m:e>
+                    <m:r>
+                      <m:t>P</m:t>
+                    </m:r>
+                  </m:e>
+                  <m:sub>
+                    <m:r>
+                      <m:t>i</m:t>
+                    </m:r>
+                    <m:r>
+                      <m:t>n</m:t>
+                    </m:r>
+                    <m:r>
+                      <m:t>v</m:t>
+                    </m:r>
+                  </m:sub>
+                  <m:sup>
+                    <m:r>
+                      <m:rPr>
+                        <m:sty m:val="p"/>
+                      </m:rPr>
+                      <m:t>*</m:t>
+                    </m:r>
+                  </m:sup>
+                </m:sSubSup>
+                <m:r>
+                  <m:rPr>
+                    <m:sty m:val="p"/>
+                  </m:rPr>
+                  <m:t>(</m:t>
+                </m:r>
+                <m:r>
+                  <m:t>R</m:t>
+                </m:r>
+                <m:r>
+                  <m:rPr>
+                    <m:sty m:val="p"/>
+                  </m:rPr>
+                  <m:t>)</m:t>
+                </m:r>
+                <m:r>
+                  <m:rPr>
+                    <m:sty m:val="p"/>
+                  </m:rPr>
+                  <m:t>=</m:t>
+                </m:r>
+                <m:d>
+                  <m:dPr>
+                    <m:begChr m:val="{"/>
+                    <m:sepChr m:val=""/>
+                    <m:endChr m:val=""/>
+                    <m:grow/>
+                  </m:dPr>
+                  <m:e>
+                    <m:m>
+                      <m:mPr>
+                        <m:baseJc m:val="center"/>
+                        <m:plcHide m:val="on"/>
+                        <m:mcs>
+                          <m:mc>
+                            <m:mcPr>
+                              <m:mcJc m:val="left"/>
+                              <m:count m:val="1"/>
+                            </m:mcPr>
+                          </m:mc>
+                          <m:mc>
+                            <m:mcPr>
+                              <m:mcJc m:val="left"/>
+                              <m:count m:val="1"/>
+                            </m:mcPr>
+                          </m:mc>
+                        </m:mcs>
+                      </m:mPr>
+                      <m:mr>
+                        <m:e>
+                          <m:r>
+                            <m:rPr>
+                              <m:sty m:val="p"/>
+                            </m:rPr>
+                            <m:t>arg</m:t>
+                          </m:r>
+                          <m:limLow>
+                            <m:e>
+                              <m:r>
+                                <m:rPr>
+                                  <m:sty m:val="p"/>
+                                </m:rPr>
+                                <m:t>max</m:t>
+                              </m:r>
+                            </m:e>
+                            <m:lim>
+                              <m:r>
+                                <m:t>P</m:t>
+                              </m:r>
+                              <m:r>
+                                <m:rPr>
+                                  <m:sty m:val="p"/>
+                                </m:rPr>
+                                <m:t>∈</m:t>
+                              </m:r>
+                              <m:sSub>
+                                <m:e>
+                                  <m:r>
+                                    <m:rPr>
+                                      <m:scr m:val="script"/>
+                                      <m:sty m:val="p"/>
+                                    </m:rPr>
+                                    <m:t>X</m:t>
+                                  </m:r>
+                                </m:e>
+                                <m:sub>
+                                  <m:r>
+                                    <m:t>h</m:t>
+                                  </m:r>
+                                </m:sub>
+                              </m:sSub>
+                            </m:lim>
+                          </m:limLow>
+                          <m:d>
+                            <m:dPr>
+                              <m:begChr m:val="{"/>
+                              <m:sepChr m:val=""/>
+                              <m:endChr m:val="}"/>
+                              <m:grow/>
+                            </m:dPr>
+                            <m:e>
+                              <m:r>
+                                <m:t>R</m:t>
+                              </m:r>
+                              <m:r>
+                                <m:t>P</m:t>
+                              </m:r>
+                              <m:r>
+                                <m:rPr>
+                                  <m:sty m:val="p"/>
+                                </m:rPr>
+                                <m:t>+</m:t>
+                              </m:r>
+                              <m:r>
+                                <m:t>Q</m:t>
+                              </m:r>
+                              <m:r>
+                                <m:rPr>
+                                  <m:sty m:val="p"/>
+                                </m:rPr>
+                                <m:t>(</m:t>
+                              </m:r>
+                              <m:r>
+                                <m:t>P</m:t>
+                              </m:r>
+                              <m:r>
+                                <m:rPr>
+                                  <m:sty m:val="p"/>
+                                </m:rPr>
+                                <m:t>)</m:t>
+                              </m:r>
+                            </m:e>
+                          </m:d>
+                          <m:r>
+                            <m:rPr>
+                              <m:sty m:val="p"/>
+                            </m:rPr>
+                            <m:t>,</m:t>
+                          </m:r>
+                        </m:e>
+                        <m:e>
+                          <m:r>
+                            <m:rPr>
+                              <m:nor/>
+                            </m:rPr>
+                            <m:t>se </m:t>
+                          </m:r>
+                          <m:limLow>
+                            <m:e>
+                              <m:r>
+                                <m:rPr>
+                                  <m:sty m:val="p"/>
+                                </m:rPr>
+                                <m:t>max</m:t>
+                              </m:r>
+                            </m:e>
+                            <m:lim>
+                              <m:r>
+                                <m:t>P</m:t>
+                              </m:r>
+                              <m:r>
+                                <m:rPr>
+                                  <m:sty m:val="p"/>
+                                </m:rPr>
+                                <m:t>∈</m:t>
+                              </m:r>
+                              <m:sSub>
+                                <m:e>
+                                  <m:r>
+                                    <m:rPr>
+                                      <m:scr m:val="script"/>
+                                      <m:sty m:val="p"/>
+                                    </m:rPr>
+                                    <m:t>X</m:t>
+                                  </m:r>
+                                </m:e>
+                                <m:sub>
+                                  <m:r>
+                                    <m:t>h</m:t>
+                                  </m:r>
+                                </m:sub>
+                              </m:sSub>
+                            </m:lim>
+                          </m:limLow>
+                          <m:d>
+                            <m:dPr>
+                              <m:begChr m:val="{"/>
+                              <m:sepChr m:val=""/>
+                              <m:endChr m:val="}"/>
+                              <m:grow/>
+                            </m:dPr>
+                            <m:e>
+                              <m:r>
+                                <m:t>R</m:t>
+                              </m:r>
+                              <m:r>
+                                <m:t>P</m:t>
+                              </m:r>
+                              <m:r>
+                                <m:rPr>
+                                  <m:sty m:val="p"/>
+                                </m:rPr>
+                                <m:t>+</m:t>
+                              </m:r>
+                              <m:r>
+                                <m:t>Q</m:t>
+                              </m:r>
+                              <m:r>
+                                <m:rPr>
+                                  <m:sty m:val="p"/>
+                                </m:rPr>
+                                <m:t>(</m:t>
+                              </m:r>
+                              <m:r>
+                                <m:t>P</m:t>
+                              </m:r>
+                              <m:r>
+                                <m:rPr>
+                                  <m:sty m:val="p"/>
+                                </m:rPr>
+                                <m:t>)</m:t>
+                              </m:r>
+                            </m:e>
+                          </m:d>
+                          <m:r>
+                            <m:rPr>
+                              <m:sty m:val="p"/>
+                            </m:rPr>
+                            <m:t>−</m:t>
+                          </m:r>
+                          <m:sSup>
+                            <m:e>
+                              <m:r>
+                                <m:t>C</m:t>
+                              </m:r>
+                            </m:e>
+                            <m:sup>
+                              <m:r>
+                                <m:t>b</m:t>
+                              </m:r>
+                              <m:r>
+                                <m:t>e</m:t>
+                              </m:r>
+                              <m:r>
+                                <m:t>s</m:t>
+                              </m:r>
+                              <m:r>
+                                <m:t>s</m:t>
+                              </m:r>
+                            </m:sup>
+                          </m:sSup>
+                          <m:r>
+                            <m:rPr>
+                              <m:sty m:val="p"/>
+                            </m:rPr>
+                            <m:t>&gt;</m:t>
+                          </m:r>
+                          <m:sSup>
+                            <m:e>
+                              <m:r>
+                                <m:rPr>
+                                  <m:sty m:val="p"/>
+                                </m:rPr>
+                                <m:t>Π</m:t>
+                              </m:r>
+                            </m:e>
+                            <m:sup>
+                              <m:r>
+                                <m:t>0</m:t>
+                              </m:r>
+                            </m:sup>
+                          </m:sSup>
+                        </m:e>
+                      </m:mr>
+                      <m:mr>
+                        <m:e>
+                          <m:r>
+                            <m:t>0</m:t>
+                          </m:r>
+                          <m:r>
+                            <m:rPr>
+                              <m:sty m:val="p"/>
+                            </m:rPr>
+                            <m:t>,</m:t>
+                          </m:r>
+                        </m:e>
+                        <m:e>
+                          <m:r>
+                            <m:rPr>
+                              <m:nor/>
+                            </m:rPr>
+                            <m:t>caso contrário</m:t>
+                          </m:r>
+                        </m:e>
+                      </m:mr>
+                    </m:m>
+                  </m:e>
+                </m:d>
+              </m:oMath>
+            </m:oMathPara>
+          </w:p>
+        </w:tc>
+        <w:tc>
+          <w:tcPr>
+            <w:tcW w:w="1000" w:type="dxa"/>
+            <w:vAlign w:val="center"/>
+          </w:tcPr>
+          <w:p>
+            <w:pPr>
+              <w:pStyle w:val="NumeroEquacao"/>
+            </w:pPr>
+            <w:r>
+              <w:t>(3.43)</w:t>
+            </w:r>
+          </w:p>
+        </w:tc>
+      </w:tr>
+    </w:tbl>
+    <w:p>
+      <w:pPr>
+        <w:pStyle w:val="FirstParagraph"/>
+      </w:pPr>
+      <w:r>
+        <w:t xml:space="preserve">O lance mínimo,</w:t>
+      </w:r>
+      <w:r>
+        <w:t xml:space="preserve"> </w:t>
+      </w:r>
+      <m:oMath>
+        <m:sSup>
+          <m:e>
+            <m:r>
+              <m:t>R</m:t>
+            </m:r>
+          </m:e>
+          <m:sup>
+            <m:r>
+              <m:t>m</m:t>
+            </m:r>
+            <m:r>
+              <m:t>i</m:t>
+            </m:r>
+            <m:r>
+              <m:t>n</m:t>
+            </m:r>
+          </m:sup>
+        </m:sSup>
+      </m:oMath>
+      <w:r>
+        <w:t xml:space="preserve">, é a menor receita fixa para a qual a construção do BESS é vantajosa, isto é, o menor</w:t>
+      </w:r>
+      <w:r>
+        <w:t xml:space="preserve"> </w:t>
+      </w:r>
+      <m:oMath>
+        <m:r>
+          <m:t>R</m:t>
+        </m:r>
+      </m:oMath>
+      <w:r>
+        <w:t xml:space="preserve"> </w:t>
+      </w:r>
+      <w:r>
+        <w:t xml:space="preserve">para o qual</w:t>
+      </w:r>
+      <w:r>
+        <w:t xml:space="preserve"> </w:t>
+      </w:r>
+      <m:oMath>
+        <m:sSubSup>
+          <m:e>
+            <m:r>
+              <m:t>P</m:t>
+            </m:r>
+          </m:e>
+          <m:sub>
+            <m:r>
+              <m:t>i</m:t>
+            </m:r>
+            <m:r>
+              <m:t>n</m:t>
+            </m:r>
+            <m:r>
+              <m:t>v</m:t>
+            </m:r>
+          </m:sub>
+          <m:sup>
+            <m:r>
+              <m:rPr>
+                <m:sty m:val="p"/>
+              </m:rPr>
+              <m:t>*</m:t>
+            </m:r>
+          </m:sup>
+        </m:sSubSup>
+        <m:r>
+          <m:rPr>
+            <m:sty m:val="p"/>
+          </m:rPr>
+          <m:t>(</m:t>
+        </m:r>
+        <m:r>
+          <m:t>R</m:t>
+        </m:r>
+        <m:r>
+          <m:rPr>
+            <m:sty m:val="p"/>
+          </m:rPr>
+          <m:t>)</m:t>
+        </m:r>
+        <m:r>
+          <m:rPr>
+            <m:sty m:val="p"/>
+          </m:rPr>
+          <m:t>&gt;</m:t>
+        </m:r>
+        <m:r>
+          <m:t>0</m:t>
+        </m:r>
+      </m:oMath>
+      <w:r>
+        <w:t xml:space="preserve">. Ele é calculado para as três faixas de investimento e para as duas taxas de desconto do Quadro 3.3.</w:t>
+      </w:r>
+    </w:p>
+    <w:bookmarkEnd w:id="40"/>
+    <w:bookmarkEnd w:id="41"/>
+    <w:bookmarkStart w:id="42" w:name="implementação-computacional"/>
+    <w:p>
+      <w:pPr>
+        <w:pStyle w:val="Heading2"/>
+      </w:pPr>
+      <w:r>
+        <w:t xml:space="preserve">3.9 Implementação computacional</w:t>
+      </w:r>
+    </w:p>
+    <w:p>
+      <w:pPr>
+        <w:pStyle w:val="FirstParagraph"/>
+      </w:pPr>
+      <w:r>
         <w:t xml:space="preserve">O modelo foi implementado na linguagem Python, com o uso da biblioteca de modelagem algébrica Pyomo (BYNUM</w:t>
       </w:r>
       <w:r>
@@ -21471,7 +22979,7 @@
         <w:t xml:space="preserve"> </w:t>
       </w:r>
       <w:r>
-        <w:t xml:space="preserve">HiGHS (HUANGFU; HALL, 2018). A estrutura do código separa: (i) a leitura e validação dos parâmetros, organizados em arquivos de configuração em formato YAML, com verificação automática dos requisitos regulatórios; (ii) a importação e o tratamento das séries de dados; (iii) a construção do modelo de otimização; (iv) a decomposição de Benders, nas versões determinística e estocástica; (v) o cálculo do VSS e do EVPI; (vi) a construção da curva de oferta; e (vii) o pós-processamento dos resultados. Os subproblemas semanais são resolvidos em paralelo em processos independentes, cada qual restrito a uma linha de execução do</w:t>
+        <w:t xml:space="preserve">HiGHS (HUANGFU; HALL, 2018). A estrutura do código separa: (i) a leitura e validação dos parâmetros, organizados em arquivos de configuração em formato YAML, com verificação automática dos requisitos regulatórios; (ii) a importação e o tratamento das séries de dados; (iii) a construção do modelo de otimização; (iv) a decomposição de Benders, nas versões determinística e estocástica; (v) o cálculo do VSS e do EVPI; (vi) a construção da curva de oferta; (vii) a análise de viabilidade econômica e do lance mínimo; e (viii) o pós-processamento dos resultados. Os subproblemas semanais são resolvidos em paralelo em processos independentes, cada qual restrito a uma linha de execução do</w:t>
       </w:r>
       <w:r>
         <w:t xml:space="preserve"> </w:t>
@@ -21487,8 +22995,8 @@
         <w:t xml:space="preserve">, a fim de evitar a concorrência por núcleos de processamento. A consistência do modelo é verificada por um conjunto de testes automatizados que conferem, entre outros aspectos, o balanço de potência, os limites dos estados de carga, a exclusividade entre carga e descarga, o cumprimento do despacho do ONS e a seleção dos dias de despacho, o limite do ponto de conexão, as entregas do contrato de hidrogênio e a validade dos cortes de Benders. O código e os dados são mantidos sob controle de versão, o que assegura a reprodutibilidade dos resultados.</w:t>
       </w:r>
     </w:p>
-    <w:bookmarkEnd w:id="41"/>
-    <w:bookmarkStart w:id="42" w:name="hipóteses-e-limitações"/>
+    <w:bookmarkEnd w:id="42"/>
+    <w:bookmarkStart w:id="43" w:name="hipóteses-e-limitações"/>
     <w:p>
       <w:pPr>
         <w:pStyle w:val="Heading2"/>
@@ -21803,6 +23311,27 @@
           <w:b/>
           <w:bCs/>
         </w:rPr>
+        <w:t xml:space="preserve">viabilidade simplificada:</w:t>
+      </w:r>
+      <w:r>
+        <w:t xml:space="preserve"> </w:t>
+      </w:r>
+      <w:r>
+        <w:t xml:space="preserve">a análise de viabilidade considera fluxo de caixa constante em termos reais, sem tributos sobre a renda, sem financiamento, sem valor residual e com custo de O&amp;M fixo hipotético, e utiliza o lucro operacional calculado com os parâmetros provisórios de operação;</w:t>
+      </w:r>
+    </w:p>
+    <w:p>
+      <w:pPr>
+        <w:numPr>
+          <w:ilvl w:val="0"/>
+          <w:numId w:val="1005"/>
+        </w:numPr>
+      </w:pPr>
+      <w:r>
+        <w:rPr>
+          <w:b/>
+          <w:bCs/>
+        </w:rPr>
         <w:t xml:space="preserve">amostra de cenários:</w:t>
       </w:r>
       <w:r>
@@ -21812,8 +23341,8 @@
         <w:t xml:space="preserve">os cinco anos históricos são tratados como equiprováveis e constituem uma amostra pequena; o VSS e o EVPI são, portanto, medidos dentro da amostra, e a avaliação da decisão fora da amostra é deixada para trabalhos futuros.</w:t>
       </w:r>
     </w:p>
-    <w:bookmarkEnd w:id="42"/>
-    <w:bookmarkStart w:id="43" w:name="referências"/>
+    <w:bookmarkEnd w:id="43"/>
+    <w:bookmarkStart w:id="44" w:name="referências"/>
     <w:p>
       <w:pPr>
         <w:pStyle w:val="Heading2"/>
@@ -21827,6 +23356,27 @@
         <w:pStyle w:val="Referencia"/>
       </w:pPr>
       <w:r>
+        <w:t xml:space="preserve">ANEEL – AGÊNCIA NACIONAL DE ENERGIA ELÉTRICA.</w:t>
+      </w:r>
+      <w:r>
+        <w:t xml:space="preserve"> </w:t>
+      </w:r>
+      <w:r>
+        <w:rPr>
+          <w:b/>
+          <w:bCs/>
+        </w:rPr>
+        <w:t xml:space="preserve">Atualização das taxas regulatórias de remuneração do capital (WACC) dos segmentos de geração, transmissão e distribuição</w:t>
+      </w:r>
+      <w:r>
+        <w:t xml:space="preserve">. Brasília: ANEEL, mar. 2026.</w:t>
+      </w:r>
+    </w:p>
+    <w:p>
+      <w:pPr>
+        <w:pStyle w:val="Referencia"/>
+      </w:pPr>
+      <w:r>
         <w:t xml:space="preserve">BENDERS, J. F. Partitioning procedures for solving mixed-variables programming problems.</w:t>
       </w:r>
       <w:r>
@@ -22194,6 +23744,27 @@
         <w:pStyle w:val="Referencia"/>
       </w:pPr>
       <w:r>
+        <w:t xml:space="preserve">IEA – INTERNATIONAL ENERGY AGENCY.</w:t>
+      </w:r>
+      <w:r>
+        <w:t xml:space="preserve"> </w:t>
+      </w:r>
+      <w:r>
+        <w:rPr>
+          <w:b/>
+          <w:bCs/>
+        </w:rPr>
+        <w:t xml:space="preserve">Global Hydrogen Review 2025</w:t>
+      </w:r>
+      <w:r>
+        <w:t xml:space="preserve">. Paris: IEA, out. 2025.</w:t>
+      </w:r>
+    </w:p>
+    <w:p>
+      <w:pPr>
+        <w:pStyle w:val="Referencia"/>
+      </w:pPr>
+      <w:r>
         <w:t xml:space="preserve">IBGE – INSTITUTO BRASILEIRO DE GEOGRAFIA E ESTATÍSTICA.</w:t>
       </w:r>
       <w:r>
@@ -22315,8 +23886,8 @@
         <w:t xml:space="preserve">, v. 175, n. 1–2, p. 461–502, 2019.</w:t>
       </w:r>
     </w:p>
-    <w:bookmarkEnd w:id="43"/>
     <w:bookmarkEnd w:id="44"/>
+    <w:bookmarkEnd w:id="45"/>
     <w:sectPr>
       <w:pgSz w:w="11906" w:h="16838"/>
       <w:pgMar w:top="1701" w:right="1134" w:bottom="1134" w:left="1701" w:header="709" w:footer="709" w:gutter="0"/>

</xml_diff>

<commit_message>
Capítulo 3 alinhado ao novo enquadramento (BESS a construir)
Seção 3.1 com a decisão de investimento; Seção 3.8 reordenada (curva de
oferta, viabilidade e lance mínimo, despacho, casos) e dedução da
aproximação do lance mínimo (Eq. 3.44). Capítulo 4 passa a citar as
Equações 3.43 e 3.44 e as novas numerações da Seção 3.8.

Co-Authored-By: Claude Opus 5.5 <noreply@anthropic.com>
Claude-Session: https://claude.ai/code/session_01YFtn9hiQUHbNLSX7rUNYuK
</commit_message>
<xml_diff>
--- a/docs/dissertacao/cap3_metodologia.docx
+++ b/docs/dissertacao/cap3_metodologia.docx
@@ -26,7 +26,7 @@
         <w:t xml:space="preserve">Battery Energy Storage System</w:t>
       </w:r>
       <w:r>
-        <w:t xml:space="preserve">, BESS) e eletrolisador para produção de hidrogênio verde, diante da possibilidade de comercializar parte da capacidade de armazenamento no Leilão de Reserva de Capacidade na forma de Potência (LRCAP) e o restante no Mercado de Curto Prazo (MCP). A Seção 3.1 apresenta o problema e o escopo do estudo; a Seção 3.2 discute o enquadramento regulatório que orienta a modelagem; a Seção 3.3 descreve o sistema; a Seção 3.4 apresenta a formulação matemática; a Seção 3.5 trata dos dados de entrada; a Seção 3.6 descreve o método de solução; a Seção 3.7 apresenta a extensão estocástica do modelo e os indicadores de valor da informação; a Seção 3.8 descreve a construção da curva de oferta no leilão e as análises de sensibilidade; a Seção 3.9 resume a implementação computacional; e a Seção 3.10 consolida as hipóteses e limitações.</w:t>
+        <w:t xml:space="preserve">, BESS) e eletrolisador para produção de hidrogênio verde, diante da possibilidade de comercializar parte da capacidade de armazenamento no Leilão de Reserva de Capacidade na forma de Potência (LRCAP) e o restante no Mercado de Curto Prazo (MCP). A Seção 3.1 apresenta o problema e o escopo do estudo; a Seção 3.2 discute o enquadramento regulatório que orienta a modelagem; a Seção 3.3 descreve o sistema; a Seção 3.4 apresenta a formulação matemática; a Seção 3.5 trata dos dados de entrada; a Seção 3.6 descreve o método de solução; a Seção 3.7 apresenta a extensão estocástica do modelo e os indicadores de valor da informação; a Seção 3.8 descreve a decisão de oferta no leilão — a curva de oferta, a viabilidade econômica e o lance mínimo — e as análises de sensibilidade; a Seção 3.9 resume a implementação computacional; e a Seção 3.10 consolida as hipóteses e limitações.</w:t>
       </w:r>
     </w:p>
     <w:bookmarkStart w:id="9" w:name="definição-do-problema-e-escopo"/>
@@ -54,6 +54,14 @@
       </w:r>
       <w:r>
         <w:t xml:space="preserve">), a potência a ser contratada no LRCAP e a operação horária ótima do sistema híbrido ao longo de um horizonte anual, de modo a maximizar o lucro operacional do empreendimento. As duas decisões são interdependentes: a potência comprometida com o leilão reduz a capacidade de armazenamento disponível para a operação mercantil, que por sua vez determina quanto da energia fotovoltaica pode ser deslocada no tempo para abastecer o eletrolisador ou para ser comercializada nas horas de maior preço.</w:t>
+      </w:r>
+    </w:p>
+    <w:p>
+      <w:pPr>
+        <w:pStyle w:val="BodyText"/>
+      </w:pPr>
+      <w:r>
+        <w:t xml:space="preserve">Quando o BESS ainda será construído — situação prevista na Portaria, que trata da contratação de novos sistemas de armazenamento —, essas decisões são precedidas pela decisão de investimento: construir ou não a bateria e, portanto, qual a menor receita fixa, ou lance mínimo, que justifica a construção. O trabalho considera as duas situações: a de um proponente que precisa construir o BESS, foco principal da análise, e a de um proponente que já dispõe dele, para o qual se determina quanto da capacidade contratar no leilão.</w:t>
       </w:r>
     </w:p>
     <w:p>
@@ -72,7 +80,7 @@
         </w:numPr>
       </w:pPr>
       <w:r>
-        <w:t xml:space="preserve">as capacidades instaladas da usina FV, do BESS e do eletrolisador são dados de entrada, e não variáveis de decisão — o dimensionamento ótimo dos equipamentos está fora do escopo desta etapa, e o efeito do tamanho do eletrolisador e do tanque de hidrogênio é avaliado por análise de sensibilidade (Seção 3.8.3);</w:t>
+        <w:t xml:space="preserve">as capacidades instaladas da usina FV, do BESS e do eletrolisador são dados de entrada, e não variáveis de decisão — o dimensionamento ótimo dos equipamentos está fora do escopo desta etapa, e o efeito do tamanho do eletrolisador e do tanque de hidrogênio é avaliado por análise de sensibilidade (Seção 3.8.4);</w:t>
       </w:r>
     </w:p>
     <w:p>
@@ -105,7 +113,7 @@
         </w:numPr>
       </w:pPr>
       <w:r>
-        <w:t xml:space="preserve">a função objetivo considera receitas e custos operacionais; os custos de investimento não entram na otimização, uma vez que as capacidades são fixas, e são considerados a posteriori na análise de viabilidade econômica e do lance mínimo (Seção 3.8.4).</w:t>
+        <w:t xml:space="preserve">a função objetivo considera receitas e custos operacionais; os custos de investimento não entram na otimização, uma vez que as capacidades são fixas, e são considerados a posteriori na análise de viabilidade econômica e do lance mínimo (Seção 3.8.2).</w:t>
       </w:r>
     </w:p>
     <w:bookmarkEnd w:id="9"/>
@@ -10326,7 +10334,7 @@
         <w:t xml:space="preserve"> </w:t>
       </w:r>
       <w:r>
-        <w:t xml:space="preserve">Na ausência de histórico de despacho de sistemas de armazenamento contratados no LRCAP, adota-se um perfil diário sintético: descarga na potência contratada entre 18 h e 22 h, horário de maior demanda líquida, e recarga entre 10 h e 15 h, até a restauração completa do estado de carga, limitada à potência nominal. O perfil é coerente com a diretriz de que a programação da recarga busque minimizar o custo total de operação do SIN (BRASIL, 2026, art. 4º, § 14), o que tende a deslocá-la para as horas de excedente de geração solar. O perfil resulta em um ciclo completo por dia (365 no ano), dentro dos limites regulatórios. Trata-se da hipótese mais intensa de uso do módulo LRCAP; o efeito de despachos menos frequentes é avaliado na Seção 3.8.2.</w:t>
+        <w:t xml:space="preserve">Na ausência de histórico de despacho de sistemas de armazenamento contratados no LRCAP, adota-se um perfil diário sintético: descarga na potência contratada entre 18 h e 22 h, horário de maior demanda líquida, e recarga entre 10 h e 15 h, até a restauração completa do estado de carga, limitada à potência nominal. O perfil é coerente com a diretriz de que a programação da recarga busque minimizar o custo total de operação do SIN (BRASIL, 2026, art. 4º, § 14), o que tende a deslocá-la para as horas de excedente de geração solar. O perfil resulta em um ciclo completo por dia (365 no ano), dentro dos limites regulatórios. Trata-se da hipótese mais intensa de uso do módulo LRCAP; o efeito de despachos menos frequentes é avaliado na Seção 3.8.3.</w:t>
       </w:r>
     </w:p>
     <w:p>
@@ -10378,7 +10386,7 @@
         <w:t xml:space="preserve"> </w:t>
       </w:r>
       <w:r>
-        <w:t xml:space="preserve">de baterias de íons de lítio para armazenamento estacionário de US$ 70/kWh em 2025 (BNEF, 2025), convertido pela taxa PTAX de 09/12/2025 (R$ 5,4025/US$) e acrescido de 74% de tributos incidentes no Brasil (EPE, 2024), e com vida útil de 4.000 a 6.000 ciclos a 90% de profundidade de descarga, obtém-se entre R$ 120 e R$ 185 por MWh descarregado. O valor de R$ 50/MWh adotado no caso de referência situa-se abaixo dessa faixa; por isso, o efeito de valores de R$ 100 e R$ 200/MWh é avaliado na Seção 3.8.3.</w:t>
+        <w:t xml:space="preserve">de baterias de íons de lítio para armazenamento estacionário de US$ 70/kWh em 2025 (BNEF, 2025), convertido pela taxa PTAX de 09/12/2025 (R$ 5,4025/US$) e acrescido de 74% de tributos incidentes no Brasil (EPE, 2024), e com vida útil de 4.000 a 6.000 ciclos a 90% de profundidade de descarga, obtém-se entre R$ 120 e R$ 185 por MWh descarregado. O valor de R$ 50/MWh adotado no caso de referência situa-se abaixo dessa faixa; por isso, o efeito de valores de R$ 100 e R$ 200/MWh é avaliado na Seção 3.8.4.</w:t>
       </w:r>
     </w:p>
     <w:p>
@@ -18236,13 +18244,13 @@
     </w:p>
     <w:bookmarkEnd w:id="35"/>
     <w:bookmarkEnd w:id="36"/>
-    <w:bookmarkStart w:id="41" w:name="X1be5cdf3d160ac75d13eea8d7b66bea13b76fa0"/>
+    <w:bookmarkStart w:id="41" w:name="Xf0e3fbab76bc3f5e0142e349b83ef2d4bc14838"/>
     <w:p>
       <w:pPr>
         <w:pStyle w:val="Heading2"/>
       </w:pPr>
       <w:r>
-        <w:t xml:space="preserve">3.8 Curva de oferta e análises de sensibilidade</w:t>
+        <w:t xml:space="preserve">3.8 Decisão de oferta no leilão e análises de sensibilidade</w:t>
       </w:r>
     </w:p>
     <w:p>
@@ -18308,7 +18316,7 @@
         <w:t xml:space="preserve"> </w:t>
       </w:r>
       <w:r>
-        <w:t xml:space="preserve">não é um dado: é o preço ofertado pelo próprio empreendedor, e a informação de que ele necessita é a relação entre esse preço e a potência que vale a pena comprometer. Esta seção apresenta o procedimento utilizado para obter essa relação — a curva de oferta — e os casos de sensibilidade avaliados com ele.</w:t>
+        <w:t xml:space="preserve">não é um dado: é o preço ofertado pelo próprio empreendedor, e a informação de que ele necessita é a relação entre esse preço e a potência que vale a pena comprometer. Esta seção apresenta os procedimentos utilizados para obter essa relação nas duas situações consideradas: a curva de oferta de um BESS disponível (Seção 3.8.1) e, para um BESS a construir, a análise de viabilidade e o lance mínimo (Seção 3.8.2), que constitui o resultado principal do trabalho. Em seguida, trata-se do efeito da frequência do despacho do ONS (Seção 3.8.3) e dos casos de sensibilidade avaliados (Seção 3.8.4).</w:t>
       </w:r>
     </w:p>
     <w:bookmarkStart w:id="37" w:name="custo-de-oportunidade-e-curva-de-oferta"/>
@@ -20168,17 +20176,17 @@
         <w:t xml:space="preserve"> </w:t>
       </w:r>
       <w:r>
-        <w:t xml:space="preserve">quando o BESS já existe, mas altera a decisão quando ele ainda será construído, situação tratada na Seção 3.8.4.</w:t>
+        <w:t xml:space="preserve">quando o BESS já existe, mas altera a decisão quando ele ainda será construído, situação tratada na Seção 3.8.2.</w:t>
       </w:r>
     </w:p>
     <w:bookmarkEnd w:id="37"/>
-    <w:bookmarkStart w:id="38" w:name="frequência-do-despacho-do-ons"/>
+    <w:bookmarkStart w:id="38" w:name="viabilidade-econômica-e-lance-mínimo"/>
     <w:p>
       <w:pPr>
         <w:pStyle w:val="Heading3"/>
       </w:pPr>
       <w:r>
-        <w:t xml:space="preserve">3.8.2 Frequência do despacho do ONS</w:t>
+        <w:t xml:space="preserve">3.8.2 Viabilidade econômica e lance mínimo</w:t>
       </w:r>
     </w:p>
     <w:p>
@@ -20186,109 +20194,11 @@
         <w:pStyle w:val="FirstParagraph"/>
       </w:pPr>
       <w:r>
-        <w:t xml:space="preserve">A frequência com que o ONS acionará os sistemas de armazenamento contratados no LRCAP é desconhecida, e o perfil das Seções 3.5 e 3.7.2 adota a hipótese mais intensa, com um ciclo completo por dia. Para avaliar essa hipótese, o modelo admite um número</w:t>
-      </w:r>
-      <w:r>
-        <w:t xml:space="preserve"> </w:t>
+        <w:t xml:space="preserve">A viabilidade do empreendimento é avaliada pelo valor presente líquido (VPL) de um fluxo de caixa anual constante, em termos reais, ao longo do prazo do contrato do LRCAP (</w:t>
       </w:r>
       <m:oMath>
-        <m:sSup>
-          <m:e>
-            <m:r>
-              <m:t>N</m:t>
-            </m:r>
-          </m:e>
-          <m:sup>
-            <m:r>
-              <m:t>o</m:t>
-            </m:r>
-            <m:r>
-              <m:t>n</m:t>
-            </m:r>
-            <m:r>
-              <m:t>s</m:t>
-            </m:r>
-          </m:sup>
-        </m:sSup>
-      </m:oMath>
-      <w:r>
-        <w:t xml:space="preserve"> </w:t>
-      </w:r>
-      <w:r>
-        <w:t xml:space="preserve">de despachos por ano. Na ausência de informação sobre o critério do ONS, adota-se como critério o próprio PLD, indicador de quão apertado está o sistema: em cada ano civil, são despachados apenas os</w:t>
-      </w:r>
-      <w:r>
-        <w:t xml:space="preserve"> </w:t>
-      </w:r>
-      <m:oMath>
-        <m:sSup>
-          <m:e>
-            <m:r>
-              <m:t>N</m:t>
-            </m:r>
-          </m:e>
-          <m:sup>
-            <m:r>
-              <m:t>o</m:t>
-            </m:r>
-            <m:r>
-              <m:t>n</m:t>
-            </m:r>
-            <m:r>
-              <m:t>s</m:t>
-            </m:r>
-          </m:sup>
-        </m:sSup>
-      </m:oMath>
-      <w:r>
-        <w:t xml:space="preserve"> </w:t>
-      </w:r>
-      <w:r>
-        <w:t xml:space="preserve">dias com maior PLD médio no período de descarga — o bloco de</w:t>
-      </w:r>
-      <w:r>
-        <w:t xml:space="preserve"> </w:t>
-      </w:r>
-      <m:oMath>
-        <m:sSup>
-          <m:e>
-            <m:r>
-              <m:t>H</m:t>
-            </m:r>
-          </m:e>
-          <m:sup>
-            <m:r>
-              <m:t>c</m:t>
-            </m:r>
-            <m:r>
-              <m:t>a</m:t>
-            </m:r>
-            <m:r>
-              <m:t>p</m:t>
-            </m:r>
-          </m:sup>
-        </m:sSup>
-      </m:oMath>
-      <w:r>
-        <w:t xml:space="preserve"> </w:t>
-      </w:r>
-      <w:r>
-        <w:t xml:space="preserve">horas de maior preço após o período solar, no perfil baseado em preço, ou as horas de descarga fixas, no perfil fixo. A seleção é feita sobre o ano inteiro, de modo que a decomposição em blocos semanais não a altera. Dias com PLD igual, situação frequente em anos com o PLD no piso, são selecionados por uma sequência de baixa discrepância sobre o dia do ano, o que os distribui uniformemente ao longo do ano em vez de concentrá-los nos primeiros dias. Nos dias sem despacho, o módulo LRCAP permanece carregado e não há recarga.</w:t>
-      </w:r>
-    </w:p>
-    <w:p>
-      <w:pPr>
-        <w:pStyle w:val="BodyText"/>
-      </w:pPr>
-      <w:r>
-        <w:t xml:space="preserve">Como a receita fixa independe da energia despachada e, com os parâmetros da Tabela 3.1,</w:t>
-      </w:r>
-      <w:r>
-        <w:t xml:space="preserve"> </w:t>
-      </w:r>
-      <m:oMath>
-        <m:r>
-          <m:t>κ</m:t>
+        <m:r>
+          <m:t>n</m:t>
         </m:r>
         <m:r>
           <m:rPr>
@@ -20297,37 +20207,14 @@
           <m:t>=</m:t>
         </m:r>
         <m:r>
-          <m:t>0</m:t>
+          <m:t>15</m:t>
         </m:r>
       </m:oMath>
       <w:r>
-        <w:t xml:space="preserve">, o despacho afeta o lucro do empreendedor apenas por meio do custo de degradação do módulo LRCAP e do limite do ponto de conexão compartilhado. Se o efeito sobre a conexão for desprezível, o custo associado ao despacho é linear em</w:t>
-      </w:r>
-      <w:r>
-        <w:t xml:space="preserve"> </w:t>
-      </w:r>
-      <m:oMath>
-        <m:sSup>
-          <m:e>
-            <m:r>
-              <m:t>P</m:t>
-            </m:r>
-          </m:e>
-          <m:sup>
-            <m:r>
-              <m:t>c</m:t>
-            </m:r>
-            <m:r>
-              <m:t>a</m:t>
-            </m:r>
-            <m:r>
-              <m:t>p</m:t>
-            </m:r>
-          </m:sup>
-        </m:sSup>
-      </m:oMath>
-      <w:r>
-        <w:t xml:space="preserve">, conforme a Equação (3.41):</w:t>
+        <w:t xml:space="preserve"> </w:t>
+      </w:r>
+      <w:r>
+        <w:t xml:space="preserve">anos), sem valor residual, conforme a Equação (3.41):</w:t>
       </w:r>
     </w:p>
     <w:tbl>
@@ -20366,1143 +20253,6 @@
                 <m:jc m:val="center"/>
               </m:oMathParaPr>
               <m:oMath>
-                <m:sSup>
-                  <m:e>
-                    <m:r>
-                      <m:t>C</m:t>
-                    </m:r>
-                  </m:e>
-                  <m:sup>
-                    <m:r>
-                      <m:t>o</m:t>
-                    </m:r>
-                    <m:r>
-                      <m:t>n</m:t>
-                    </m:r>
-                    <m:r>
-                      <m:t>s</m:t>
-                    </m:r>
-                  </m:sup>
-                </m:sSup>
-                <m:r>
-                  <m:rPr>
-                    <m:sty m:val="p"/>
-                  </m:rPr>
-                  <m:t>(</m:t>
-                </m:r>
-                <m:sSup>
-                  <m:e>
-                    <m:r>
-                      <m:t>P</m:t>
-                    </m:r>
-                  </m:e>
-                  <m:sup>
-                    <m:r>
-                      <m:t>c</m:t>
-                    </m:r>
-                    <m:r>
-                      <m:t>a</m:t>
-                    </m:r>
-                    <m:r>
-                      <m:t>p</m:t>
-                    </m:r>
-                  </m:sup>
-                </m:sSup>
-                <m:r>
-                  <m:rPr>
-                    <m:sty m:val="p"/>
-                  </m:rPr>
-                  <m:t>)</m:t>
-                </m:r>
-                <m:r>
-                  <m:rPr>
-                    <m:sty m:val="p"/>
-                  </m:rPr>
-                  <m:t>≈</m:t>
-                </m:r>
-                <m:sSup>
-                  <m:e>
-                    <m:r>
-                      <m:t>c</m:t>
-                    </m:r>
-                  </m:e>
-                  <m:sup>
-                    <m:r>
-                      <m:t>d</m:t>
-                    </m:r>
-                    <m:r>
-                      <m:t>e</m:t>
-                    </m:r>
-                    <m:r>
-                      <m:t>g</m:t>
-                    </m:r>
-                  </m:sup>
-                </m:sSup>
-                <m:r>
-                  <m:t> </m:t>
-                </m:r>
-                <m:sSup>
-                  <m:e>
-                    <m:r>
-                      <m:t>H</m:t>
-                    </m:r>
-                  </m:e>
-                  <m:sup>
-                    <m:r>
-                      <m:t>c</m:t>
-                    </m:r>
-                    <m:r>
-                      <m:t>a</m:t>
-                    </m:r>
-                    <m:r>
-                      <m:t>p</m:t>
-                    </m:r>
-                  </m:sup>
-                </m:sSup>
-                <m:r>
-                  <m:t> </m:t>
-                </m:r>
-                <m:sSup>
-                  <m:e>
-                    <m:r>
-                      <m:t>N</m:t>
-                    </m:r>
-                  </m:e>
-                  <m:sup>
-                    <m:r>
-                      <m:t>o</m:t>
-                    </m:r>
-                    <m:r>
-                      <m:t>n</m:t>
-                    </m:r>
-                    <m:r>
-                      <m:t>s</m:t>
-                    </m:r>
-                  </m:sup>
-                </m:sSup>
-                <m:r>
-                  <m:t> </m:t>
-                </m:r>
-                <m:sSup>
-                  <m:e>
-                    <m:r>
-                      <m:t>P</m:t>
-                    </m:r>
-                  </m:e>
-                  <m:sup>
-                    <m:r>
-                      <m:t>c</m:t>
-                    </m:r>
-                    <m:r>
-                      <m:t>a</m:t>
-                    </m:r>
-                    <m:r>
-                      <m:t>p</m:t>
-                    </m:r>
-                  </m:sup>
-                </m:sSup>
-              </m:oMath>
-            </m:oMathPara>
-          </w:p>
-        </w:tc>
-        <w:tc>
-          <w:tcPr>
-            <w:tcW w:w="1000" w:type="dxa"/>
-            <w:vAlign w:val="center"/>
-          </w:tcPr>
-          <w:p>
-            <w:pPr>
-              <w:pStyle w:val="NumeroEquacao"/>
-            </w:pPr>
-            <w:r>
-              <w:t>(3.41)</w:t>
-            </w:r>
-          </w:p>
-        </w:tc>
-      </w:tr>
-    </w:tbl>
-    <w:p>
-      <w:pPr>
-        <w:pStyle w:val="FirstParagraph"/>
-      </w:pPr>
-      <w:r>
-        <w:t xml:space="preserve">e uma variação de</w:t>
-      </w:r>
-      <w:r>
-        <w:t xml:space="preserve"> </w:t>
-      </w:r>
-      <m:oMath>
-        <m:sSup>
-          <m:e>
-            <m:r>
-              <m:t>N</m:t>
-            </m:r>
-          </m:e>
-          <m:sup>
-            <m:r>
-              <m:t>o</m:t>
-            </m:r>
-            <m:r>
-              <m:t>n</m:t>
-            </m:r>
-            <m:r>
-              <m:t>s</m:t>
-            </m:r>
-          </m:sup>
-        </m:sSup>
-      </m:oMath>
-      <w:r>
-        <w:t xml:space="preserve"> </w:t>
-      </w:r>
-      <w:r>
-        <w:t xml:space="preserve">desloca o custo de oportunidade marginal de um valor constante, sem alterar a operação do lado mercantil. As simulações com diferentes valores de</w:t>
-      </w:r>
-      <w:r>
-        <w:t xml:space="preserve"> </w:t>
-      </w:r>
-      <m:oMath>
-        <m:sSup>
-          <m:e>
-            <m:r>
-              <m:t>N</m:t>
-            </m:r>
-          </m:e>
-          <m:sup>
-            <m:r>
-              <m:t>o</m:t>
-            </m:r>
-            <m:r>
-              <m:t>n</m:t>
-            </m:r>
-            <m:r>
-              <m:t>s</m:t>
-            </m:r>
-          </m:sup>
-        </m:sSup>
-      </m:oMath>
-      <w:r>
-        <w:t xml:space="preserve"> </w:t>
-      </w:r>
-      <w:r>
-        <w:t xml:space="preserve">permitem verificar essa aproximação.</w:t>
-      </w:r>
-    </w:p>
-    <w:bookmarkEnd w:id="38"/>
-    <w:bookmarkStart w:id="39" w:name="casos-avaliados"/>
-    <w:p>
-      <w:pPr>
-        <w:pStyle w:val="Heading3"/>
-      </w:pPr>
-      <w:r>
-        <w:t xml:space="preserve">3.8.3 Casos avaliados</w:t>
-      </w:r>
-    </w:p>
-    <w:p>
-      <w:pPr>
-        <w:pStyle w:val="FirstParagraph"/>
-      </w:pPr>
-      <w:r>
-        <w:t xml:space="preserve">A curva de oferta é construída para os cenários anuais da Seção 3.7.2, com o lucro esperado (</w:t>
-      </w:r>
-      <m:oMath>
-        <m:r>
-          <m:t>β</m:t>
-        </m:r>
-        <m:r>
-          <m:rPr>
-            <m:sty m:val="p"/>
-          </m:rPr>
-          <m:t>=</m:t>
-        </m:r>
-        <m:r>
-          <m:t>0</m:t>
-        </m:r>
-      </m:oMath>
-      <w:r>
-        <w:t xml:space="preserve">), nos casos do Quadro 3.2. Os casos variam as hipóteses que a análise do caso de referência indicou como determinantes para o custo de oportunidade: a existência de um limite de demanda de hidrogênio (Seção 3.4.5), a vedação à importação de energia da rede, a frequência do despacho do ONS, o custo de degradação do BESS e o dimensionamento do eletrolisador e do tanque de hidrogênio.</w:t>
-      </w:r>
-    </w:p>
-    <w:p>
-      <w:pPr>
-        <w:pStyle w:val="Legenda"/>
-      </w:pPr>
-      <w:r>
-        <w:t xml:space="preserve">Quadro 3.2 – Casos avaliados na construção da curva de oferta</w:t>
-      </w:r>
-    </w:p>
-    <w:tbl>
-      <w:tblPr>
-        <w:tblStyle w:val="Table"/>
-        <w:tblW w:type="pct" w:w="5000"/>
-        <w:tblLayout w:type="fixed"/>
-        <w:tblLook w:firstRow="1" w:lastRow="0" w:firstColumn="0" w:lastColumn="0" w:noHBand="0" w:noVBand="0" w:val="0020"/>
-      </w:tblPr>
-      <w:tblGrid>
-        <w:gridCol w:w="1900"/>
-        <w:gridCol w:w="2376"/>
-        <w:gridCol w:w="1742"/>
-        <w:gridCol w:w="1900"/>
-      </w:tblGrid>
-      <w:tr>
-        <w:trPr>
-          <w:tblHeader w:val="on"/>
-        </w:trPr>
-        <w:tc>
-          <w:tcPr/>
-          <w:p>
-            <w:pPr>
-              <w:pStyle w:val="Compact"/>
-            </w:pPr>
-            <w:r>
-              <w:t xml:space="preserve">Caso</w:t>
-            </w:r>
-          </w:p>
-        </w:tc>
-        <w:tc>
-          <w:tcPr/>
-          <w:p>
-            <w:pPr>
-              <w:pStyle w:val="Compact"/>
-            </w:pPr>
-            <w:r>
-              <w:t xml:space="preserve">Contrato de H₂</w:t>
-            </w:r>
-          </w:p>
-        </w:tc>
-        <w:tc>
-          <w:tcPr/>
-          <w:p>
-            <w:pPr>
-              <w:pStyle w:val="Compact"/>
-            </w:pPr>
-            <w:r>
-              <w:t xml:space="preserve">Importação da rede</w:t>
-            </w:r>
-          </w:p>
-        </w:tc>
-        <w:tc>
-          <w:tcPr/>
-          <w:p>
-            <w:pPr>
-              <w:pStyle w:val="Compact"/>
-            </w:pPr>
-            <w:r>
-              <w:t xml:space="preserve">Outras alterações em relação à referência</w:t>
-            </w:r>
-          </w:p>
-        </w:tc>
-      </w:tr>
-      <w:tr>
-        <w:tc>
-          <w:tcPr/>
-          <w:p>
-            <w:pPr>
-              <w:pStyle w:val="Compact"/>
-            </w:pPr>
-            <w:r>
-              <w:t xml:space="preserve">Referência</w:t>
-            </w:r>
-          </w:p>
-        </w:tc>
-        <w:tc>
-          <w:tcPr/>
-          <w:p>
-            <w:pPr>
-              <w:pStyle w:val="Compact"/>
-            </w:pPr>
-            <w:r>
-              <w:t xml:space="preserve">Sem limite de volume</w:t>
-            </w:r>
-          </w:p>
-        </w:tc>
-        <w:tc>
-          <w:tcPr/>
-          <w:p>
-            <w:pPr>
-              <w:pStyle w:val="Compact"/>
-            </w:pPr>
-            <w:r>
-              <w:t xml:space="preserve">Vedada</w:t>
-            </w:r>
-          </w:p>
-        </w:tc>
-        <w:tc>
-          <w:tcPr/>
-          <w:p>
-            <w:pPr>
-              <w:pStyle w:val="Compact"/>
-            </w:pPr>
-            <w:r>
-              <w:t xml:space="preserve">– (365 despachos/ano;</w:t>
-            </w:r>
-            <w:r>
-              <w:t xml:space="preserve"> </w:t>
-            </w:r>
-            <m:oMath>
-              <m:sSup>
-                <m:e>
-                  <m:r>
-                    <m:t>c</m:t>
-                  </m:r>
-                </m:e>
-                <m:sup>
-                  <m:r>
-                    <m:t>d</m:t>
-                  </m:r>
-                  <m:r>
-                    <m:t>e</m:t>
-                  </m:r>
-                  <m:r>
-                    <m:t>g</m:t>
-                  </m:r>
-                </m:sup>
-              </m:sSup>
-            </m:oMath>
-            <w:r>
-              <w:t xml:space="preserve"> </w:t>
-            </w:r>
-            <w:r>
-              <w:t xml:space="preserve">de R$ 50/MWh; eletrolisador de 17,5 MW; tanque de 2 t)</w:t>
-            </w:r>
-          </w:p>
-        </w:tc>
-      </w:tr>
-      <w:tr>
-        <w:tc>
-          <w:tcPr/>
-          <w:p>
-            <w:pPr>
-              <w:pStyle w:val="Compact"/>
-            </w:pPr>
-            <w:r>
-              <w:t xml:space="preserve">Contrato 2 t/dia</w:t>
-            </w:r>
-          </w:p>
-        </w:tc>
-        <w:tc>
-          <w:tcPr/>
-          <w:p>
-            <w:pPr>
-              <w:pStyle w:val="Compact"/>
-            </w:pPr>
-            <m:oMath>
-              <m:sSup>
-                <m:e>
-                  <m:r>
-                    <m:t>D</m:t>
-                  </m:r>
-                </m:e>
-                <m:sup>
-                  <m:r>
-                    <m:t>h</m:t>
-                  </m:r>
-                  <m:r>
-                    <m:t>2</m:t>
-                  </m:r>
-                </m:sup>
-              </m:sSup>
-              <m:r>
-                <m:rPr>
-                  <m:sty m:val="p"/>
-                </m:rPr>
-                <m:t>=</m:t>
-              </m:r>
-              <m:sSup>
-                <m:e>
-                  <m:acc>
-                    <m:accPr>
-                      <m:chr m:val="‾"/>
-                    </m:accPr>
-                    <m:e>
-                      <m:r>
-                        <m:t>D</m:t>
-                      </m:r>
-                    </m:e>
-                  </m:acc>
-                </m:e>
-                <m:sup>
-                  <m:r>
-                    <m:t>h</m:t>
-                  </m:r>
-                  <m:r>
-                    <m:t>2</m:t>
-                  </m:r>
-                </m:sup>
-              </m:sSup>
-              <m:r>
-                <m:rPr>
-                  <m:sty m:val="p"/>
-                </m:rPr>
-                <m:t>=</m:t>
-              </m:r>
-              <m:r>
-                <m:t>2.000</m:t>
-              </m:r>
-            </m:oMath>
-            <w:r>
-              <w:t xml:space="preserve"> </w:t>
-            </w:r>
-            <w:r>
-              <w:t xml:space="preserve">kg/dia</w:t>
-            </w:r>
-          </w:p>
-        </w:tc>
-        <w:tc>
-          <w:tcPr/>
-          <w:p>
-            <w:pPr>
-              <w:pStyle w:val="Compact"/>
-            </w:pPr>
-            <w:r>
-              <w:t xml:space="preserve">Vedada</w:t>
-            </w:r>
-          </w:p>
-        </w:tc>
-        <w:tc>
-          <w:tcPr/>
-          <w:p>
-            <w:pPr>
-              <w:pStyle w:val="Compact"/>
-            </w:pPr>
-            <w:r>
-              <w:t xml:space="preserve">–</w:t>
-            </w:r>
-          </w:p>
-        </w:tc>
-      </w:tr>
-      <w:tr>
-        <w:tc>
-          <w:tcPr/>
-          <w:p>
-            <w:pPr>
-              <w:pStyle w:val="Compact"/>
-            </w:pPr>
-            <w:r>
-              <w:t xml:space="preserve">Contrato 3 t/dia</w:t>
-            </w:r>
-          </w:p>
-        </w:tc>
-        <w:tc>
-          <w:tcPr/>
-          <w:p>
-            <w:pPr>
-              <w:pStyle w:val="Compact"/>
-            </w:pPr>
-            <m:oMath>
-              <m:sSup>
-                <m:e>
-                  <m:r>
-                    <m:t>D</m:t>
-                  </m:r>
-                </m:e>
-                <m:sup>
-                  <m:r>
-                    <m:t>h</m:t>
-                  </m:r>
-                  <m:r>
-                    <m:t>2</m:t>
-                  </m:r>
-                </m:sup>
-              </m:sSup>
-              <m:r>
-                <m:rPr>
-                  <m:sty m:val="p"/>
-                </m:rPr>
-                <m:t>=</m:t>
-              </m:r>
-              <m:sSup>
-                <m:e>
-                  <m:acc>
-                    <m:accPr>
-                      <m:chr m:val="‾"/>
-                    </m:accPr>
-                    <m:e>
-                      <m:r>
-                        <m:t>D</m:t>
-                      </m:r>
-                    </m:e>
-                  </m:acc>
-                </m:e>
-                <m:sup>
-                  <m:r>
-                    <m:t>h</m:t>
-                  </m:r>
-                  <m:r>
-                    <m:t>2</m:t>
-                  </m:r>
-                </m:sup>
-              </m:sSup>
-              <m:r>
-                <m:rPr>
-                  <m:sty m:val="p"/>
-                </m:rPr>
-                <m:t>=</m:t>
-              </m:r>
-              <m:r>
-                <m:t>3.000</m:t>
-              </m:r>
-            </m:oMath>
-            <w:r>
-              <w:t xml:space="preserve"> </w:t>
-            </w:r>
-            <w:r>
-              <w:t xml:space="preserve">kg/dia</w:t>
-            </w:r>
-          </w:p>
-        </w:tc>
-        <w:tc>
-          <w:tcPr/>
-          <w:p>
-            <w:pPr>
-              <w:pStyle w:val="Compact"/>
-            </w:pPr>
-            <w:r>
-              <w:t xml:space="preserve">Vedada</w:t>
-            </w:r>
-          </w:p>
-        </w:tc>
-        <w:tc>
-          <w:tcPr/>
-          <w:p>
-            <w:pPr>
-              <w:pStyle w:val="Compact"/>
-            </w:pPr>
-            <w:r>
-              <w:t xml:space="preserve">–</w:t>
-            </w:r>
-          </w:p>
-        </w:tc>
-      </w:tr>
-      <w:tr>
-        <w:tc>
-          <w:tcPr/>
-          <w:p>
-            <w:pPr>
-              <w:pStyle w:val="Compact"/>
-            </w:pPr>
-            <w:r>
-              <w:t xml:space="preserve">Importação</w:t>
-            </w:r>
-          </w:p>
-        </w:tc>
-        <w:tc>
-          <w:tcPr/>
-          <w:p>
-            <w:pPr>
-              <w:pStyle w:val="Compact"/>
-            </w:pPr>
-            <w:r>
-              <w:t xml:space="preserve">Sem limite de volume</w:t>
-            </w:r>
-          </w:p>
-        </w:tc>
-        <w:tc>
-          <w:tcPr/>
-          <w:p>
-            <w:pPr>
-              <w:pStyle w:val="Compact"/>
-            </w:pPr>
-            <w:r>
-              <w:t xml:space="preserve">Permitida</w:t>
-            </w:r>
-          </w:p>
-        </w:tc>
-        <w:tc>
-          <w:tcPr/>
-          <w:p>
-            <w:pPr>
-              <w:pStyle w:val="Compact"/>
-            </w:pPr>
-            <w:r>
-              <w:t xml:space="preserve">–</w:t>
-            </w:r>
-          </w:p>
-        </w:tc>
-      </w:tr>
-      <w:tr>
-        <w:tc>
-          <w:tcPr/>
-          <w:p>
-            <w:pPr>
-              <w:pStyle w:val="Compact"/>
-            </w:pPr>
-            <w:r>
-              <w:t xml:space="preserve">Importação e contrato 3 t/dia</w:t>
-            </w:r>
-          </w:p>
-        </w:tc>
-        <w:tc>
-          <w:tcPr/>
-          <w:p>
-            <w:pPr>
-              <w:pStyle w:val="Compact"/>
-            </w:pPr>
-            <m:oMath>
-              <m:sSup>
-                <m:e>
-                  <m:r>
-                    <m:t>D</m:t>
-                  </m:r>
-                </m:e>
-                <m:sup>
-                  <m:r>
-                    <m:t>h</m:t>
-                  </m:r>
-                  <m:r>
-                    <m:t>2</m:t>
-                  </m:r>
-                </m:sup>
-              </m:sSup>
-              <m:r>
-                <m:rPr>
-                  <m:sty m:val="p"/>
-                </m:rPr>
-                <m:t>=</m:t>
-              </m:r>
-              <m:sSup>
-                <m:e>
-                  <m:acc>
-                    <m:accPr>
-                      <m:chr m:val="‾"/>
-                    </m:accPr>
-                    <m:e>
-                      <m:r>
-                        <m:t>D</m:t>
-                      </m:r>
-                    </m:e>
-                  </m:acc>
-                </m:e>
-                <m:sup>
-                  <m:r>
-                    <m:t>h</m:t>
-                  </m:r>
-                  <m:r>
-                    <m:t>2</m:t>
-                  </m:r>
-                </m:sup>
-              </m:sSup>
-              <m:r>
-                <m:rPr>
-                  <m:sty m:val="p"/>
-                </m:rPr>
-                <m:t>=</m:t>
-              </m:r>
-              <m:r>
-                <m:t>3.000</m:t>
-              </m:r>
-            </m:oMath>
-            <w:r>
-              <w:t xml:space="preserve"> </w:t>
-            </w:r>
-            <w:r>
-              <w:t xml:space="preserve">kg/dia</w:t>
-            </w:r>
-          </w:p>
-        </w:tc>
-        <w:tc>
-          <w:tcPr/>
-          <w:p>
-            <w:pPr>
-              <w:pStyle w:val="Compact"/>
-            </w:pPr>
-            <w:r>
-              <w:t xml:space="preserve">Permitida</w:t>
-            </w:r>
-          </w:p>
-        </w:tc>
-        <w:tc>
-          <w:tcPr/>
-          <w:p>
-            <w:pPr>
-              <w:pStyle w:val="Compact"/>
-            </w:pPr>
-            <w:r>
-              <w:t xml:space="preserve">–</w:t>
-            </w:r>
-          </w:p>
-        </w:tc>
-      </w:tr>
-      <w:tr>
-        <w:tc>
-          <w:tcPr/>
-          <w:p>
-            <w:pPr>
-              <w:pStyle w:val="Compact"/>
-            </w:pPr>
-            <w:r>
-              <w:t xml:space="preserve">Frequência do despacho</w:t>
-            </w:r>
-          </w:p>
-        </w:tc>
-        <w:tc>
-          <w:tcPr/>
-          <w:p>
-            <w:pPr>
-              <w:pStyle w:val="Compact"/>
-            </w:pPr>
-            <w:r>
-              <w:t xml:space="preserve">Sem limite de volume</w:t>
-            </w:r>
-          </w:p>
-        </w:tc>
-        <w:tc>
-          <w:tcPr/>
-          <w:p>
-            <w:pPr>
-              <w:pStyle w:val="Compact"/>
-            </w:pPr>
-            <w:r>
-              <w:t xml:space="preserve">Vedada</w:t>
-            </w:r>
-          </w:p>
-        </w:tc>
-        <w:tc>
-          <w:tcPr/>
-          <w:p>
-            <w:pPr>
-              <w:pStyle w:val="Compact"/>
-            </w:pPr>
-            <w:r>
-              <w:t xml:space="preserve">50; 150 ou 365 despachos/ano</w:t>
-            </w:r>
-          </w:p>
-        </w:tc>
-      </w:tr>
-      <w:tr>
-        <w:tc>
-          <w:tcPr/>
-          <w:p>
-            <w:pPr>
-              <w:pStyle w:val="Compact"/>
-            </w:pPr>
-            <w:r>
-              <w:t xml:space="preserve">Degradação</w:t>
-            </w:r>
-          </w:p>
-        </w:tc>
-        <w:tc>
-          <w:tcPr/>
-          <w:p>
-            <w:pPr>
-              <w:pStyle w:val="Compact"/>
-            </w:pPr>
-            <w:r>
-              <w:t xml:space="preserve">Sem limite de volume</w:t>
-            </w:r>
-          </w:p>
-        </w:tc>
-        <w:tc>
-          <w:tcPr/>
-          <w:p>
-            <w:pPr>
-              <w:pStyle w:val="Compact"/>
-            </w:pPr>
-            <w:r>
-              <w:t xml:space="preserve">Vedada</w:t>
-            </w:r>
-          </w:p>
-        </w:tc>
-        <w:tc>
-          <w:tcPr/>
-          <w:p>
-            <w:pPr>
-              <w:pStyle w:val="Compact"/>
-            </w:pPr>
-            <m:oMath>
-              <m:sSup>
-                <m:e>
-                  <m:r>
-                    <m:t>c</m:t>
-                  </m:r>
-                </m:e>
-                <m:sup>
-                  <m:r>
-                    <m:t>d</m:t>
-                  </m:r>
-                  <m:r>
-                    <m:t>e</m:t>
-                  </m:r>
-                  <m:r>
-                    <m:t>g</m:t>
-                  </m:r>
-                </m:sup>
-              </m:sSup>
-            </m:oMath>
-            <w:r>
-              <w:t xml:space="preserve"> </w:t>
-            </w:r>
-            <w:r>
-              <w:t xml:space="preserve">de R$ 100 ou 200/MWh</w:t>
-            </w:r>
-          </w:p>
-        </w:tc>
-      </w:tr>
-      <w:tr>
-        <w:tc>
-          <w:tcPr/>
-          <w:p>
-            <w:pPr>
-              <w:pStyle w:val="Compact"/>
-            </w:pPr>
-            <w:r>
-              <w:t xml:space="preserve">Eletrolisador</w:t>
-            </w:r>
-          </w:p>
-        </w:tc>
-        <w:tc>
-          <w:tcPr/>
-          <w:p>
-            <w:pPr>
-              <w:pStyle w:val="Compact"/>
-            </w:pPr>
-            <w:r>
-              <w:t xml:space="preserve">Sem limite de volume</w:t>
-            </w:r>
-          </w:p>
-        </w:tc>
-        <w:tc>
-          <w:tcPr/>
-          <w:p>
-            <w:pPr>
-              <w:pStyle w:val="Compact"/>
-            </w:pPr>
-            <w:r>
-              <w:t xml:space="preserve">Vedada</w:t>
-            </w:r>
-          </w:p>
-        </w:tc>
-        <w:tc>
-          <w:tcPr/>
-          <w:p>
-            <w:pPr>
-              <w:pStyle w:val="Compact"/>
-            </w:pPr>
-            <w:r>
-              <w:t xml:space="preserve">Eletrolisador de 10 ou 25 MW</w:t>
-            </w:r>
-          </w:p>
-        </w:tc>
-      </w:tr>
-      <w:tr>
-        <w:tc>
-          <w:tcPr/>
-          <w:p>
-            <w:pPr>
-              <w:pStyle w:val="Compact"/>
-            </w:pPr>
-            <w:r>
-              <w:t xml:space="preserve">Tanque</w:t>
-            </w:r>
-          </w:p>
-        </w:tc>
-        <w:tc>
-          <w:tcPr/>
-          <w:p>
-            <w:pPr>
-              <w:pStyle w:val="Compact"/>
-            </w:pPr>
-            <m:oMath>
-              <m:sSup>
-                <m:e>
-                  <m:r>
-                    <m:t>D</m:t>
-                  </m:r>
-                </m:e>
-                <m:sup>
-                  <m:r>
-                    <m:t>h</m:t>
-                  </m:r>
-                  <m:r>
-                    <m:t>2</m:t>
-                  </m:r>
-                </m:sup>
-              </m:sSup>
-              <m:r>
-                <m:rPr>
-                  <m:sty m:val="p"/>
-                </m:rPr>
-                <m:t>=</m:t>
-              </m:r>
-              <m:sSup>
-                <m:e>
-                  <m:acc>
-                    <m:accPr>
-                      <m:chr m:val="‾"/>
-                    </m:accPr>
-                    <m:e>
-                      <m:r>
-                        <m:t>D</m:t>
-                      </m:r>
-                    </m:e>
-                  </m:acc>
-                </m:e>
-                <m:sup>
-                  <m:r>
-                    <m:t>h</m:t>
-                  </m:r>
-                  <m:r>
-                    <m:t>2</m:t>
-                  </m:r>
-                </m:sup>
-              </m:sSup>
-              <m:r>
-                <m:rPr>
-                  <m:sty m:val="p"/>
-                </m:rPr>
-                <m:t>=</m:t>
-              </m:r>
-              <m:r>
-                <m:t>3.000</m:t>
-              </m:r>
-            </m:oMath>
-            <w:r>
-              <w:t xml:space="preserve"> </w:t>
-            </w:r>
-            <w:r>
-              <w:t xml:space="preserve">kg/dia</w:t>
-            </w:r>
-          </w:p>
-        </w:tc>
-        <w:tc>
-          <w:tcPr/>
-          <w:p>
-            <w:pPr>
-              <w:pStyle w:val="Compact"/>
-            </w:pPr>
-            <w:r>
-              <w:t xml:space="preserve">Vedada</w:t>
-            </w:r>
-          </w:p>
-        </w:tc>
-        <w:tc>
-          <w:tcPr/>
-          <w:p>
-            <w:pPr>
-              <w:pStyle w:val="Compact"/>
-            </w:pPr>
-            <w:r>
-              <w:t xml:space="preserve">Tanque de 10 t</w:t>
-            </w:r>
-          </w:p>
-        </w:tc>
-      </w:tr>
-    </w:tbl>
-    <w:p>
-      <w:pPr>
-        <w:pStyle w:val="Fonte"/>
-      </w:pPr>
-      <w:r>
-        <w:t xml:space="preserve">Fonte: elaborado pelo autor.</w:t>
-      </w:r>
-    </w:p>
-    <w:p>
-      <w:pPr>
-        <w:pStyle w:val="BodyText"/>
-      </w:pPr>
-      <w:r>
-        <w:t xml:space="preserve">Nos casos com importação, o eletrolisador e o BESS mercantil podem ser supridos pela rede ao PLD acrescido de</w:t>
-      </w:r>
-      <w:r>
-        <w:t xml:space="preserve"> </w:t>
-      </w:r>
-      <m:oMath>
-        <m:sSup>
-          <m:e>
-            <m:r>
-              <m:t>c</m:t>
-            </m:r>
-          </m:e>
-          <m:sup>
-            <m:r>
-              <m:t>i</m:t>
-            </m:r>
-            <m:r>
-              <m:t>m</m:t>
-            </m:r>
-            <m:r>
-              <m:t>p</m:t>
-            </m:r>
-          </m:sup>
-        </m:sSup>
-      </m:oMath>
-      <w:r>
-        <w:t xml:space="preserve">. Essa configuração corresponde a um critério de qualificação do hidrogênio baseado na intensidade de emissões, e não na origem física da energia, e é avaliada como alternativa à hipótese de suprimento exclusivamente fotovoltaico. Para cada caso, além da curva de oferta, registram-se a potência ótima e a operação média nos cenários para a receita fixa de referência, de R$ 600 mil/(MW·ano).</w:t>
-      </w:r>
-    </w:p>
-    <w:bookmarkEnd w:id="39"/>
-    <w:bookmarkStart w:id="40" w:name="viabilidade-econômica-e-lance-mínimo"/>
-    <w:p>
-      <w:pPr>
-        <w:pStyle w:val="Heading3"/>
-      </w:pPr>
-      <w:r>
-        <w:t xml:space="preserve">3.8.4 Viabilidade econômica e lance mínimo</w:t>
-      </w:r>
-    </w:p>
-    <w:p>
-      <w:pPr>
-        <w:pStyle w:val="FirstParagraph"/>
-      </w:pPr>
-      <w:r>
-        <w:t xml:space="preserve">A viabilidade do empreendimento é avaliada pelo valor presente líquido (VPL) de um fluxo de caixa anual constante, em termos reais, ao longo do prazo do contrato do LRCAP (</w:t>
-      </w:r>
-      <m:oMath>
-        <m:r>
-          <m:t>n</m:t>
-        </m:r>
-        <m:r>
-          <m:rPr>
-            <m:sty m:val="p"/>
-          </m:rPr>
-          <m:t>=</m:t>
-        </m:r>
-        <m:r>
-          <m:t>15</m:t>
-        </m:r>
-      </m:oMath>
-      <w:r>
-        <w:t xml:space="preserve"> </w:t>
-      </w:r>
-      <w:r>
-        <w:t xml:space="preserve">anos), sem valor residual, conforme a Equação (3.42):</w:t>
-      </w:r>
-    </w:p>
-    <w:tbl>
-      <w:tblPr>
-        <w:tblW w:w="9071" w:type="dxa"/>
-        <w:tblBorders>
-          <w:top w:val="nil"/>
-          <w:left w:val="nil"/>
-          <w:bottom w:val="nil"/>
-          <w:right w:val="nil"/>
-          <w:insideH w:val="nil"/>
-          <w:insideV w:val="nil"/>
-        </w:tblBorders>
-        <w:tblLayout w:type="fixed"/>
-        <w:tblCellMar>
-          <w:left w:w="0" w:type="dxa"/>
-          <w:right w:w="0" w:type="dxa"/>
-        </w:tblCellMar>
-      </w:tblPr>
-      <w:tblGrid>
-        <w:gridCol w:w="8071"/>
-        <w:gridCol w:w="1000"/>
-      </w:tblGrid>
-      <w:tr>
-        <w:tc>
-          <w:tcPr>
-            <w:tcW w:w="8071" w:type="dxa"/>
-            <w:vAlign w:val="center"/>
-          </w:tcPr>
-          <w:p>
-            <w:pPr>
-              <w:pStyle w:val="BodyText"/>
-            </w:pPr>
-            <m:oMathPara>
-              <m:oMathParaPr>
-                <m:jc m:val="center"/>
-              </m:oMathParaPr>
-              <m:oMath>
                 <m:r>
                   <m:rPr>
                     <m:sty m:val="p"/>
@@ -21725,7 +20475,7 @@
               <w:pStyle w:val="NumeroEquacao"/>
             </w:pPr>
             <w:r>
-              <w:t>(3.42)</w:t>
+              <w:t>(3.41)</w:t>
             </w:r>
           </w:p>
         </w:tc>
@@ -22445,7 +21195,7 @@
         </m:sSup>
       </m:oMath>
       <w:r>
-        <w:t xml:space="preserve">. A potência ofertada passa a ser dada pela Equação (3.43):</w:t>
+        <w:t xml:space="preserve">. A potência ofertada passa a ser dada pela Equação (3.42):</w:t>
       </w:r>
     </w:p>
     <w:tbl>
@@ -22822,7 +21572,7 @@
               <w:pStyle w:val="NumeroEquacao"/>
             </w:pPr>
             <w:r>
-              <w:t>(3.43)</w:t>
+              <w:t>(3.42)</w:t>
             </w:r>
           </w:p>
         </w:tc>
@@ -22932,6 +21682,1838 @@
       </m:oMath>
       <w:r>
         <w:t xml:space="preserve">. Ele é calculado para as três faixas de investimento e para as duas taxas de desconto do Quadro 3.3.</w:t>
+      </w:r>
+    </w:p>
+    <w:bookmarkEnd w:id="38"/>
+    <w:bookmarkStart w:id="39" w:name="frequência-do-despacho-do-ons"/>
+    <w:p>
+      <w:pPr>
+        <w:pStyle w:val="Heading3"/>
+      </w:pPr>
+      <w:r>
+        <w:t xml:space="preserve">3.8.3 Frequência do despacho do ONS</w:t>
+      </w:r>
+    </w:p>
+    <w:p>
+      <w:pPr>
+        <w:pStyle w:val="FirstParagraph"/>
+      </w:pPr>
+      <w:r>
+        <w:t xml:space="preserve">A frequência com que o ONS acionará os sistemas de armazenamento contratados no LRCAP é desconhecida, e o perfil das Seções 3.5 e 3.7.2 adota a hipótese mais intensa, com um ciclo completo por dia. Para avaliar essa hipótese, o modelo admite um número</w:t>
+      </w:r>
+      <w:r>
+        <w:t xml:space="preserve"> </w:t>
+      </w:r>
+      <m:oMath>
+        <m:sSup>
+          <m:e>
+            <m:r>
+              <m:t>N</m:t>
+            </m:r>
+          </m:e>
+          <m:sup>
+            <m:r>
+              <m:t>o</m:t>
+            </m:r>
+            <m:r>
+              <m:t>n</m:t>
+            </m:r>
+            <m:r>
+              <m:t>s</m:t>
+            </m:r>
+          </m:sup>
+        </m:sSup>
+      </m:oMath>
+      <w:r>
+        <w:t xml:space="preserve"> </w:t>
+      </w:r>
+      <w:r>
+        <w:t xml:space="preserve">de despachos por ano. Na ausência de informação sobre o critério do ONS, adota-se como critério o próprio PLD, indicador de quão apertado está o sistema: em cada ano civil, são despachados apenas os</w:t>
+      </w:r>
+      <w:r>
+        <w:t xml:space="preserve"> </w:t>
+      </w:r>
+      <m:oMath>
+        <m:sSup>
+          <m:e>
+            <m:r>
+              <m:t>N</m:t>
+            </m:r>
+          </m:e>
+          <m:sup>
+            <m:r>
+              <m:t>o</m:t>
+            </m:r>
+            <m:r>
+              <m:t>n</m:t>
+            </m:r>
+            <m:r>
+              <m:t>s</m:t>
+            </m:r>
+          </m:sup>
+        </m:sSup>
+      </m:oMath>
+      <w:r>
+        <w:t xml:space="preserve"> </w:t>
+      </w:r>
+      <w:r>
+        <w:t xml:space="preserve">dias com maior PLD médio no período de descarga — o bloco de</w:t>
+      </w:r>
+      <w:r>
+        <w:t xml:space="preserve"> </w:t>
+      </w:r>
+      <m:oMath>
+        <m:sSup>
+          <m:e>
+            <m:r>
+              <m:t>H</m:t>
+            </m:r>
+          </m:e>
+          <m:sup>
+            <m:r>
+              <m:t>c</m:t>
+            </m:r>
+            <m:r>
+              <m:t>a</m:t>
+            </m:r>
+            <m:r>
+              <m:t>p</m:t>
+            </m:r>
+          </m:sup>
+        </m:sSup>
+      </m:oMath>
+      <w:r>
+        <w:t xml:space="preserve"> </w:t>
+      </w:r>
+      <w:r>
+        <w:t xml:space="preserve">horas de maior preço após o período solar, no perfil baseado em preço, ou as horas de descarga fixas, no perfil fixo. A seleção é feita sobre o ano inteiro, de modo que a decomposição em blocos semanais não a altera. Dias com PLD igual, situação frequente em anos com o PLD no piso, são selecionados por uma sequência de baixa discrepância sobre o dia do ano, o que os distribui uniformemente ao longo do ano em vez de concentrá-los nos primeiros dias. Nos dias sem despacho, o módulo LRCAP permanece carregado e não há recarga.</w:t>
+      </w:r>
+    </w:p>
+    <w:p>
+      <w:pPr>
+        <w:pStyle w:val="BodyText"/>
+      </w:pPr>
+      <w:r>
+        <w:t xml:space="preserve">Como a receita fixa independe da energia despachada e, com os parâmetros da Tabela 3.1,</w:t>
+      </w:r>
+      <w:r>
+        <w:t xml:space="preserve"> </w:t>
+      </w:r>
+      <m:oMath>
+        <m:r>
+          <m:t>κ</m:t>
+        </m:r>
+        <m:r>
+          <m:rPr>
+            <m:sty m:val="p"/>
+          </m:rPr>
+          <m:t>=</m:t>
+        </m:r>
+        <m:r>
+          <m:t>0</m:t>
+        </m:r>
+      </m:oMath>
+      <w:r>
+        <w:t xml:space="preserve">, o despacho afeta o lucro do empreendedor apenas por meio do custo de degradação do módulo LRCAP e do limite do ponto de conexão compartilhado. Se o efeito sobre a conexão for desprezível, o custo associado ao despacho é linear em</w:t>
+      </w:r>
+      <w:r>
+        <w:t xml:space="preserve"> </w:t>
+      </w:r>
+      <m:oMath>
+        <m:sSup>
+          <m:e>
+            <m:r>
+              <m:t>P</m:t>
+            </m:r>
+          </m:e>
+          <m:sup>
+            <m:r>
+              <m:t>c</m:t>
+            </m:r>
+            <m:r>
+              <m:t>a</m:t>
+            </m:r>
+            <m:r>
+              <m:t>p</m:t>
+            </m:r>
+          </m:sup>
+        </m:sSup>
+      </m:oMath>
+      <w:r>
+        <w:t xml:space="preserve">, conforme a Equação (3.43):</w:t>
+      </w:r>
+    </w:p>
+    <w:tbl>
+      <w:tblPr>
+        <w:tblW w:w="9071" w:type="dxa"/>
+        <w:tblBorders>
+          <w:top w:val="nil"/>
+          <w:left w:val="nil"/>
+          <w:bottom w:val="nil"/>
+          <w:right w:val="nil"/>
+          <w:insideH w:val="nil"/>
+          <w:insideV w:val="nil"/>
+        </w:tblBorders>
+        <w:tblLayout w:type="fixed"/>
+        <w:tblCellMar>
+          <w:left w:w="0" w:type="dxa"/>
+          <w:right w:w="0" w:type="dxa"/>
+        </w:tblCellMar>
+      </w:tblPr>
+      <w:tblGrid>
+        <w:gridCol w:w="8071"/>
+        <w:gridCol w:w="1000"/>
+      </w:tblGrid>
+      <w:tr>
+        <w:tc>
+          <w:tcPr>
+            <w:tcW w:w="8071" w:type="dxa"/>
+            <w:vAlign w:val="center"/>
+          </w:tcPr>
+          <w:p>
+            <w:pPr>
+              <w:pStyle w:val="BodyText"/>
+            </w:pPr>
+            <m:oMathPara>
+              <m:oMathParaPr>
+                <m:jc m:val="center"/>
+              </m:oMathParaPr>
+              <m:oMath>
+                <m:sSup>
+                  <m:e>
+                    <m:r>
+                      <m:t>C</m:t>
+                    </m:r>
+                  </m:e>
+                  <m:sup>
+                    <m:r>
+                      <m:t>o</m:t>
+                    </m:r>
+                    <m:r>
+                      <m:t>n</m:t>
+                    </m:r>
+                    <m:r>
+                      <m:t>s</m:t>
+                    </m:r>
+                  </m:sup>
+                </m:sSup>
+                <m:r>
+                  <m:rPr>
+                    <m:sty m:val="p"/>
+                  </m:rPr>
+                  <m:t>(</m:t>
+                </m:r>
+                <m:sSup>
+                  <m:e>
+                    <m:r>
+                      <m:t>P</m:t>
+                    </m:r>
+                  </m:e>
+                  <m:sup>
+                    <m:r>
+                      <m:t>c</m:t>
+                    </m:r>
+                    <m:r>
+                      <m:t>a</m:t>
+                    </m:r>
+                    <m:r>
+                      <m:t>p</m:t>
+                    </m:r>
+                  </m:sup>
+                </m:sSup>
+                <m:r>
+                  <m:rPr>
+                    <m:sty m:val="p"/>
+                  </m:rPr>
+                  <m:t>)</m:t>
+                </m:r>
+                <m:r>
+                  <m:rPr>
+                    <m:sty m:val="p"/>
+                  </m:rPr>
+                  <m:t>≈</m:t>
+                </m:r>
+                <m:sSup>
+                  <m:e>
+                    <m:r>
+                      <m:t>c</m:t>
+                    </m:r>
+                  </m:e>
+                  <m:sup>
+                    <m:r>
+                      <m:t>d</m:t>
+                    </m:r>
+                    <m:r>
+                      <m:t>e</m:t>
+                    </m:r>
+                    <m:r>
+                      <m:t>g</m:t>
+                    </m:r>
+                  </m:sup>
+                </m:sSup>
+                <m:r>
+                  <m:t> </m:t>
+                </m:r>
+                <m:sSup>
+                  <m:e>
+                    <m:r>
+                      <m:t>H</m:t>
+                    </m:r>
+                  </m:e>
+                  <m:sup>
+                    <m:r>
+                      <m:t>c</m:t>
+                    </m:r>
+                    <m:r>
+                      <m:t>a</m:t>
+                    </m:r>
+                    <m:r>
+                      <m:t>p</m:t>
+                    </m:r>
+                  </m:sup>
+                </m:sSup>
+                <m:r>
+                  <m:t> </m:t>
+                </m:r>
+                <m:sSup>
+                  <m:e>
+                    <m:r>
+                      <m:t>N</m:t>
+                    </m:r>
+                  </m:e>
+                  <m:sup>
+                    <m:r>
+                      <m:t>o</m:t>
+                    </m:r>
+                    <m:r>
+                      <m:t>n</m:t>
+                    </m:r>
+                    <m:r>
+                      <m:t>s</m:t>
+                    </m:r>
+                  </m:sup>
+                </m:sSup>
+                <m:r>
+                  <m:t> </m:t>
+                </m:r>
+                <m:sSup>
+                  <m:e>
+                    <m:r>
+                      <m:t>P</m:t>
+                    </m:r>
+                  </m:e>
+                  <m:sup>
+                    <m:r>
+                      <m:t>c</m:t>
+                    </m:r>
+                    <m:r>
+                      <m:t>a</m:t>
+                    </m:r>
+                    <m:r>
+                      <m:t>p</m:t>
+                    </m:r>
+                  </m:sup>
+                </m:sSup>
+              </m:oMath>
+            </m:oMathPara>
+          </w:p>
+        </w:tc>
+        <w:tc>
+          <w:tcPr>
+            <w:tcW w:w="1000" w:type="dxa"/>
+            <w:vAlign w:val="center"/>
+          </w:tcPr>
+          <w:p>
+            <w:pPr>
+              <w:pStyle w:val="NumeroEquacao"/>
+            </w:pPr>
+            <w:r>
+              <w:t>(3.43)</w:t>
+            </w:r>
+          </w:p>
+        </w:tc>
+      </w:tr>
+    </w:tbl>
+    <w:p>
+      <w:pPr>
+        <w:pStyle w:val="FirstParagraph"/>
+      </w:pPr>
+      <w:r>
+        <w:t xml:space="preserve">e uma variação de</w:t>
+      </w:r>
+      <w:r>
+        <w:t xml:space="preserve"> </w:t>
+      </w:r>
+      <m:oMath>
+        <m:sSup>
+          <m:e>
+            <m:r>
+              <m:t>N</m:t>
+            </m:r>
+          </m:e>
+          <m:sup>
+            <m:r>
+              <m:t>o</m:t>
+            </m:r>
+            <m:r>
+              <m:t>n</m:t>
+            </m:r>
+            <m:r>
+              <m:t>s</m:t>
+            </m:r>
+          </m:sup>
+        </m:sSup>
+      </m:oMath>
+      <w:r>
+        <w:t xml:space="preserve"> </w:t>
+      </w:r>
+      <w:r>
+        <w:t xml:space="preserve">desloca o custo de oportunidade marginal de um valor constante, sem alterar a operação do lado mercantil. As simulações com diferentes valores de</w:t>
+      </w:r>
+      <w:r>
+        <w:t xml:space="preserve"> </w:t>
+      </w:r>
+      <m:oMath>
+        <m:sSup>
+          <m:e>
+            <m:r>
+              <m:t>N</m:t>
+            </m:r>
+          </m:e>
+          <m:sup>
+            <m:r>
+              <m:t>o</m:t>
+            </m:r>
+            <m:r>
+              <m:t>n</m:t>
+            </m:r>
+            <m:r>
+              <m:t>s</m:t>
+            </m:r>
+          </m:sup>
+        </m:sSup>
+      </m:oMath>
+      <w:r>
+        <w:t xml:space="preserve"> </w:t>
+      </w:r>
+      <w:r>
+        <w:t xml:space="preserve">permitem verificar essa aproximação.</w:t>
+      </w:r>
+    </w:p>
+    <w:p>
+      <w:pPr>
+        <w:pStyle w:val="BodyText"/>
+      </w:pPr>
+      <w:r>
+        <w:t xml:space="preserve">Essa relação permite também aproximar o lance mínimo da Seção 3.8.2. No lance mínimo, a potência ofertada tende à potência total do BESS (</w:t>
+      </w:r>
+      <m:oMath>
+        <m:r>
+          <m:t>P</m:t>
+        </m:r>
+        <m:r>
+          <m:rPr>
+            <m:sty m:val="p"/>
+          </m:rPr>
+          <m:t>≈</m:t>
+        </m:r>
+        <m:sSup>
+          <m:e>
+            <m:acc>
+              <m:accPr>
+                <m:chr m:val="‾"/>
+              </m:accPr>
+              <m:e>
+                <m:r>
+                  <m:t>P</m:t>
+                </m:r>
+              </m:e>
+            </m:acc>
+          </m:e>
+          <m:sup>
+            <m:r>
+              <m:t>d</m:t>
+            </m:r>
+            <m:r>
+              <m:t>i</m:t>
+            </m:r>
+            <m:r>
+              <m:t>s</m:t>
+            </m:r>
+          </m:sup>
+        </m:sSup>
+      </m:oMath>
+      <w:r>
+        <w:t xml:space="preserve">), de modo que o módulo mercantil se anula e a operação do lado mercantil se aproxima da operação sem BESS. Nessa condição,</w:t>
+      </w:r>
+      <w:r>
+        <w:t xml:space="preserve"> </w:t>
+      </w:r>
+      <m:oMath>
+        <m:r>
+          <m:t>Q</m:t>
+        </m:r>
+        <m:r>
+          <m:rPr>
+            <m:sty m:val="p"/>
+          </m:rPr>
+          <m:t>(</m:t>
+        </m:r>
+        <m:sSup>
+          <m:e>
+            <m:acc>
+              <m:accPr>
+                <m:chr m:val="‾"/>
+              </m:accPr>
+              <m:e>
+                <m:r>
+                  <m:t>P</m:t>
+                </m:r>
+              </m:e>
+            </m:acc>
+          </m:e>
+          <m:sup>
+            <m:r>
+              <m:t>d</m:t>
+            </m:r>
+            <m:r>
+              <m:t>i</m:t>
+            </m:r>
+            <m:r>
+              <m:t>s</m:t>
+            </m:r>
+          </m:sup>
+        </m:sSup>
+        <m:r>
+          <m:rPr>
+            <m:sty m:val="p"/>
+          </m:rPr>
+          <m:t>)</m:t>
+        </m:r>
+        <m:r>
+          <m:rPr>
+            <m:sty m:val="p"/>
+          </m:rPr>
+          <m:t>≈</m:t>
+        </m:r>
+        <m:sSup>
+          <m:e>
+            <m:r>
+              <m:rPr>
+                <m:sty m:val="p"/>
+              </m:rPr>
+              <m:t>Π</m:t>
+            </m:r>
+          </m:e>
+          <m:sup>
+            <m:r>
+              <m:t>0</m:t>
+            </m:r>
+          </m:sup>
+        </m:sSup>
+        <m:r>
+          <m:rPr>
+            <m:sty m:val="p"/>
+          </m:rPr>
+          <m:t>−</m:t>
+        </m:r>
+        <m:d>
+          <m:dPr>
+            <m:begChr m:val="("/>
+            <m:sepChr m:val=""/>
+            <m:endChr m:val=")"/>
+            <m:grow/>
+          </m:dPr>
+          <m:e>
+            <m:sSup>
+              <m:e>
+                <m:r>
+                  <m:t>c</m:t>
+                </m:r>
+              </m:e>
+              <m:sup>
+                <m:r>
+                  <m:t>d</m:t>
+                </m:r>
+                <m:r>
+                  <m:t>e</m:t>
+                </m:r>
+                <m:r>
+                  <m:t>g</m:t>
+                </m:r>
+              </m:sup>
+            </m:sSup>
+            <m:sSup>
+              <m:e>
+                <m:r>
+                  <m:t>H</m:t>
+                </m:r>
+              </m:e>
+              <m:sup>
+                <m:r>
+                  <m:t>c</m:t>
+                </m:r>
+                <m:r>
+                  <m:t>a</m:t>
+                </m:r>
+                <m:r>
+                  <m:t>p</m:t>
+                </m:r>
+              </m:sup>
+            </m:sSup>
+            <m:sSup>
+              <m:e>
+                <m:r>
+                  <m:t>N</m:t>
+                </m:r>
+              </m:e>
+              <m:sup>
+                <m:r>
+                  <m:t>o</m:t>
+                </m:r>
+                <m:r>
+                  <m:t>n</m:t>
+                </m:r>
+                <m:r>
+                  <m:t>s</m:t>
+                </m:r>
+              </m:sup>
+            </m:sSup>
+            <m:r>
+              <m:rPr>
+                <m:sty m:val="p"/>
+              </m:rPr>
+              <m:t>+</m:t>
+            </m:r>
+            <m:r>
+              <m:t>κ</m:t>
+            </m:r>
+          </m:e>
+        </m:d>
+        <m:sSup>
+          <m:e>
+            <m:acc>
+              <m:accPr>
+                <m:chr m:val="‾"/>
+              </m:accPr>
+              <m:e>
+                <m:r>
+                  <m:t>P</m:t>
+                </m:r>
+              </m:e>
+            </m:acc>
+          </m:e>
+          <m:sup>
+            <m:r>
+              <m:t>d</m:t>
+            </m:r>
+            <m:r>
+              <m:t>i</m:t>
+            </m:r>
+            <m:r>
+              <m:t>s</m:t>
+            </m:r>
+          </m:sup>
+        </m:sSup>
+      </m:oMath>
+      <w:r>
+        <w:t xml:space="preserve">, e a condição de indiferença</w:t>
+      </w:r>
+      <w:r>
+        <w:t xml:space="preserve"> </w:t>
+      </w:r>
+      <m:oMath>
+        <m:r>
+          <m:t>R</m:t>
+        </m:r>
+        <m:r>
+          <m:t> </m:t>
+        </m:r>
+        <m:sSup>
+          <m:e>
+            <m:acc>
+              <m:accPr>
+                <m:chr m:val="‾"/>
+              </m:accPr>
+              <m:e>
+                <m:r>
+                  <m:t>P</m:t>
+                </m:r>
+              </m:e>
+            </m:acc>
+          </m:e>
+          <m:sup>
+            <m:r>
+              <m:t>d</m:t>
+            </m:r>
+            <m:r>
+              <m:t>i</m:t>
+            </m:r>
+            <m:r>
+              <m:t>s</m:t>
+            </m:r>
+          </m:sup>
+        </m:sSup>
+        <m:r>
+          <m:rPr>
+            <m:sty m:val="p"/>
+          </m:rPr>
+          <m:t>+</m:t>
+        </m:r>
+        <m:r>
+          <m:t>Q</m:t>
+        </m:r>
+        <m:r>
+          <m:rPr>
+            <m:sty m:val="p"/>
+          </m:rPr>
+          <m:t>(</m:t>
+        </m:r>
+        <m:sSup>
+          <m:e>
+            <m:acc>
+              <m:accPr>
+                <m:chr m:val="‾"/>
+              </m:accPr>
+              <m:e>
+                <m:r>
+                  <m:t>P</m:t>
+                </m:r>
+              </m:e>
+            </m:acc>
+          </m:e>
+          <m:sup>
+            <m:r>
+              <m:t>d</m:t>
+            </m:r>
+            <m:r>
+              <m:t>i</m:t>
+            </m:r>
+            <m:r>
+              <m:t>s</m:t>
+            </m:r>
+          </m:sup>
+        </m:sSup>
+        <m:r>
+          <m:rPr>
+            <m:sty m:val="p"/>
+          </m:rPr>
+          <m:t>)</m:t>
+        </m:r>
+        <m:r>
+          <m:rPr>
+            <m:sty m:val="p"/>
+          </m:rPr>
+          <m:t>−</m:t>
+        </m:r>
+        <m:sSup>
+          <m:e>
+            <m:r>
+              <m:t>C</m:t>
+            </m:r>
+          </m:e>
+          <m:sup>
+            <m:r>
+              <m:t>b</m:t>
+            </m:r>
+            <m:r>
+              <m:t>e</m:t>
+            </m:r>
+            <m:r>
+              <m:t>s</m:t>
+            </m:r>
+            <m:r>
+              <m:t>s</m:t>
+            </m:r>
+          </m:sup>
+        </m:sSup>
+        <m:r>
+          <m:rPr>
+            <m:sty m:val="p"/>
+          </m:rPr>
+          <m:t>=</m:t>
+        </m:r>
+        <m:sSup>
+          <m:e>
+            <m:r>
+              <m:rPr>
+                <m:sty m:val="p"/>
+              </m:rPr>
+              <m:t>Π</m:t>
+            </m:r>
+          </m:e>
+          <m:sup>
+            <m:r>
+              <m:t>0</m:t>
+            </m:r>
+          </m:sup>
+        </m:sSup>
+      </m:oMath>
+      <w:r>
+        <w:t xml:space="preserve"> </w:t>
+      </w:r>
+      <w:r>
+        <w:t xml:space="preserve">resulta na Equação (3.44):</w:t>
+      </w:r>
+    </w:p>
+    <w:tbl>
+      <w:tblPr>
+        <w:tblW w:w="9071" w:type="dxa"/>
+        <w:tblBorders>
+          <w:top w:val="nil"/>
+          <w:left w:val="nil"/>
+          <w:bottom w:val="nil"/>
+          <w:right w:val="nil"/>
+          <w:insideH w:val="nil"/>
+          <w:insideV w:val="nil"/>
+        </w:tblBorders>
+        <w:tblLayout w:type="fixed"/>
+        <w:tblCellMar>
+          <w:left w:w="0" w:type="dxa"/>
+          <w:right w:w="0" w:type="dxa"/>
+        </w:tblCellMar>
+      </w:tblPr>
+      <w:tblGrid>
+        <w:gridCol w:w="8071"/>
+        <w:gridCol w:w="1000"/>
+      </w:tblGrid>
+      <w:tr>
+        <w:tc>
+          <w:tcPr>
+            <w:tcW w:w="8071" w:type="dxa"/>
+            <w:vAlign w:val="center"/>
+          </w:tcPr>
+          <w:p>
+            <w:pPr>
+              <w:pStyle w:val="BodyText"/>
+            </w:pPr>
+            <m:oMathPara>
+              <m:oMathParaPr>
+                <m:jc m:val="center"/>
+              </m:oMathParaPr>
+              <m:oMath>
+                <m:sSup>
+                  <m:e>
+                    <m:r>
+                      <m:t>R</m:t>
+                    </m:r>
+                  </m:e>
+                  <m:sup>
+                    <m:r>
+                      <m:t>m</m:t>
+                    </m:r>
+                    <m:r>
+                      <m:t>i</m:t>
+                    </m:r>
+                    <m:r>
+                      <m:t>n</m:t>
+                    </m:r>
+                  </m:sup>
+                </m:sSup>
+                <m:r>
+                  <m:rPr>
+                    <m:sty m:val="p"/>
+                  </m:rPr>
+                  <m:t>≈</m:t>
+                </m:r>
+                <m:f>
+                  <m:fPr>
+                    <m:type m:val="bar"/>
+                  </m:fPr>
+                  <m:num>
+                    <m:sSup>
+                      <m:e>
+                        <m:r>
+                          <m:t>C</m:t>
+                        </m:r>
+                      </m:e>
+                      <m:sup>
+                        <m:r>
+                          <m:t>b</m:t>
+                        </m:r>
+                        <m:r>
+                          <m:t>e</m:t>
+                        </m:r>
+                        <m:r>
+                          <m:t>s</m:t>
+                        </m:r>
+                        <m:r>
+                          <m:t>s</m:t>
+                        </m:r>
+                      </m:sup>
+                    </m:sSup>
+                  </m:num>
+                  <m:den>
+                    <m:sSup>
+                      <m:e>
+                        <m:acc>
+                          <m:accPr>
+                            <m:chr m:val="‾"/>
+                          </m:accPr>
+                          <m:e>
+                            <m:r>
+                              <m:t>P</m:t>
+                            </m:r>
+                          </m:e>
+                        </m:acc>
+                      </m:e>
+                      <m:sup>
+                        <m:r>
+                          <m:t>d</m:t>
+                        </m:r>
+                        <m:r>
+                          <m:t>i</m:t>
+                        </m:r>
+                        <m:r>
+                          <m:t>s</m:t>
+                        </m:r>
+                      </m:sup>
+                    </m:sSup>
+                  </m:den>
+                </m:f>
+                <m:r>
+                  <m:rPr>
+                    <m:sty m:val="p"/>
+                  </m:rPr>
+                  <m:t>+</m:t>
+                </m:r>
+                <m:sSup>
+                  <m:e>
+                    <m:r>
+                      <m:t>c</m:t>
+                    </m:r>
+                  </m:e>
+                  <m:sup>
+                    <m:r>
+                      <m:t>d</m:t>
+                    </m:r>
+                    <m:r>
+                      <m:t>e</m:t>
+                    </m:r>
+                    <m:r>
+                      <m:t>g</m:t>
+                    </m:r>
+                  </m:sup>
+                </m:sSup>
+                <m:r>
+                  <m:t> </m:t>
+                </m:r>
+                <m:sSup>
+                  <m:e>
+                    <m:r>
+                      <m:t>H</m:t>
+                    </m:r>
+                  </m:e>
+                  <m:sup>
+                    <m:r>
+                      <m:t>c</m:t>
+                    </m:r>
+                    <m:r>
+                      <m:t>a</m:t>
+                    </m:r>
+                    <m:r>
+                      <m:t>p</m:t>
+                    </m:r>
+                  </m:sup>
+                </m:sSup>
+                <m:r>
+                  <m:t> </m:t>
+                </m:r>
+                <m:sSup>
+                  <m:e>
+                    <m:r>
+                      <m:t>N</m:t>
+                    </m:r>
+                  </m:e>
+                  <m:sup>
+                    <m:r>
+                      <m:t>o</m:t>
+                    </m:r>
+                    <m:r>
+                      <m:t>n</m:t>
+                    </m:r>
+                    <m:r>
+                      <m:t>s</m:t>
+                    </m:r>
+                  </m:sup>
+                </m:sSup>
+                <m:r>
+                  <m:rPr>
+                    <m:sty m:val="p"/>
+                  </m:rPr>
+                  <m:t>+</m:t>
+                </m:r>
+                <m:r>
+                  <m:t>κ</m:t>
+                </m:r>
+              </m:oMath>
+            </m:oMathPara>
+          </w:p>
+        </w:tc>
+        <w:tc>
+          <w:tcPr>
+            <w:tcW w:w="1000" w:type="dxa"/>
+            <w:vAlign w:val="center"/>
+          </w:tcPr>
+          <w:p>
+            <w:pPr>
+              <w:pStyle w:val="NumeroEquacao"/>
+            </w:pPr>
+            <w:r>
+              <w:t>(3.44)</w:t>
+            </w:r>
+          </w:p>
+        </w:tc>
+      </w:tr>
+    </w:tbl>
+    <w:p>
+      <w:pPr>
+        <w:pStyle w:val="FirstParagraph"/>
+      </w:pPr>
+      <w:r>
+        <w:t xml:space="preserve">isto é, o lance mínimo de um BESS a construir corresponde aproximadamente ao seu custo anual equivalente por MW, acrescido do custo de degradação imposto pelo despacho do ONS e do custo da recarga excedente. A aproximação desconsidera o valor residual do uso mercantil da bateria e é verificada no Capítulo 4.</w:t>
+      </w:r>
+    </w:p>
+    <w:bookmarkEnd w:id="39"/>
+    <w:bookmarkStart w:id="40" w:name="casos-avaliados"/>
+    <w:p>
+      <w:pPr>
+        <w:pStyle w:val="Heading3"/>
+      </w:pPr>
+      <w:r>
+        <w:t xml:space="preserve">3.8.4 Casos avaliados</w:t>
+      </w:r>
+    </w:p>
+    <w:p>
+      <w:pPr>
+        <w:pStyle w:val="FirstParagraph"/>
+      </w:pPr>
+      <w:r>
+        <w:t xml:space="preserve">A curva de oferta é construída para os cenários anuais da Seção 3.7.2, com o lucro esperado (</w:t>
+      </w:r>
+      <m:oMath>
+        <m:r>
+          <m:t>β</m:t>
+        </m:r>
+        <m:r>
+          <m:rPr>
+            <m:sty m:val="p"/>
+          </m:rPr>
+          <m:t>=</m:t>
+        </m:r>
+        <m:r>
+          <m:t>0</m:t>
+        </m:r>
+      </m:oMath>
+      <w:r>
+        <w:t xml:space="preserve">), nos casos do Quadro 3.2. Os casos variam as hipóteses que a análise do caso de referência indicou como determinantes para o custo de oportunidade: a existência de um limite de demanda de hidrogênio (Seção 3.4.5), a vedação à importação de energia da rede, a frequência do despacho do ONS, o custo de degradação do BESS e o dimensionamento do eletrolisador e do tanque de hidrogênio.</w:t>
+      </w:r>
+    </w:p>
+    <w:p>
+      <w:pPr>
+        <w:pStyle w:val="Legenda"/>
+      </w:pPr>
+      <w:r>
+        <w:t xml:space="preserve">Quadro 3.2 – Casos avaliados na construção da curva de oferta</w:t>
+      </w:r>
+    </w:p>
+    <w:tbl>
+      <w:tblPr>
+        <w:tblStyle w:val="Table"/>
+        <w:tblW w:type="pct" w:w="5000"/>
+        <w:tblLayout w:type="fixed"/>
+        <w:tblLook w:firstRow="1" w:lastRow="0" w:firstColumn="0" w:lastColumn="0" w:noHBand="0" w:noVBand="0" w:val="0020"/>
+      </w:tblPr>
+      <w:tblGrid>
+        <w:gridCol w:w="1900"/>
+        <w:gridCol w:w="2376"/>
+        <w:gridCol w:w="1742"/>
+        <w:gridCol w:w="1900"/>
+      </w:tblGrid>
+      <w:tr>
+        <w:trPr>
+          <w:tblHeader w:val="on"/>
+        </w:trPr>
+        <w:tc>
+          <w:tcPr/>
+          <w:p>
+            <w:pPr>
+              <w:pStyle w:val="Compact"/>
+            </w:pPr>
+            <w:r>
+              <w:t xml:space="preserve">Caso</w:t>
+            </w:r>
+          </w:p>
+        </w:tc>
+        <w:tc>
+          <w:tcPr/>
+          <w:p>
+            <w:pPr>
+              <w:pStyle w:val="Compact"/>
+            </w:pPr>
+            <w:r>
+              <w:t xml:space="preserve">Contrato de H₂</w:t>
+            </w:r>
+          </w:p>
+        </w:tc>
+        <w:tc>
+          <w:tcPr/>
+          <w:p>
+            <w:pPr>
+              <w:pStyle w:val="Compact"/>
+            </w:pPr>
+            <w:r>
+              <w:t xml:space="preserve">Importação da rede</w:t>
+            </w:r>
+          </w:p>
+        </w:tc>
+        <w:tc>
+          <w:tcPr/>
+          <w:p>
+            <w:pPr>
+              <w:pStyle w:val="Compact"/>
+            </w:pPr>
+            <w:r>
+              <w:t xml:space="preserve">Outras alterações em relação à referência</w:t>
+            </w:r>
+          </w:p>
+        </w:tc>
+      </w:tr>
+      <w:tr>
+        <w:tc>
+          <w:tcPr/>
+          <w:p>
+            <w:pPr>
+              <w:pStyle w:val="Compact"/>
+            </w:pPr>
+            <w:r>
+              <w:t xml:space="preserve">Referência</w:t>
+            </w:r>
+          </w:p>
+        </w:tc>
+        <w:tc>
+          <w:tcPr/>
+          <w:p>
+            <w:pPr>
+              <w:pStyle w:val="Compact"/>
+            </w:pPr>
+            <w:r>
+              <w:t xml:space="preserve">Sem limite de volume</w:t>
+            </w:r>
+          </w:p>
+        </w:tc>
+        <w:tc>
+          <w:tcPr/>
+          <w:p>
+            <w:pPr>
+              <w:pStyle w:val="Compact"/>
+            </w:pPr>
+            <w:r>
+              <w:t xml:space="preserve">Vedada</w:t>
+            </w:r>
+          </w:p>
+        </w:tc>
+        <w:tc>
+          <w:tcPr/>
+          <w:p>
+            <w:pPr>
+              <w:pStyle w:val="Compact"/>
+            </w:pPr>
+            <w:r>
+              <w:t xml:space="preserve">– (365 despachos/ano;</w:t>
+            </w:r>
+            <w:r>
+              <w:t xml:space="preserve"> </w:t>
+            </w:r>
+            <m:oMath>
+              <m:sSup>
+                <m:e>
+                  <m:r>
+                    <m:t>c</m:t>
+                  </m:r>
+                </m:e>
+                <m:sup>
+                  <m:r>
+                    <m:t>d</m:t>
+                  </m:r>
+                  <m:r>
+                    <m:t>e</m:t>
+                  </m:r>
+                  <m:r>
+                    <m:t>g</m:t>
+                  </m:r>
+                </m:sup>
+              </m:sSup>
+            </m:oMath>
+            <w:r>
+              <w:t xml:space="preserve"> </w:t>
+            </w:r>
+            <w:r>
+              <w:t xml:space="preserve">de R$ 50/MWh; eletrolisador de 17,5 MW; tanque de 2 t)</w:t>
+            </w:r>
+          </w:p>
+        </w:tc>
+      </w:tr>
+      <w:tr>
+        <w:tc>
+          <w:tcPr/>
+          <w:p>
+            <w:pPr>
+              <w:pStyle w:val="Compact"/>
+            </w:pPr>
+            <w:r>
+              <w:t xml:space="preserve">Contrato 2 t/dia</w:t>
+            </w:r>
+          </w:p>
+        </w:tc>
+        <w:tc>
+          <w:tcPr/>
+          <w:p>
+            <w:pPr>
+              <w:pStyle w:val="Compact"/>
+            </w:pPr>
+            <m:oMath>
+              <m:sSup>
+                <m:e>
+                  <m:r>
+                    <m:t>D</m:t>
+                  </m:r>
+                </m:e>
+                <m:sup>
+                  <m:r>
+                    <m:t>h</m:t>
+                  </m:r>
+                  <m:r>
+                    <m:t>2</m:t>
+                  </m:r>
+                </m:sup>
+              </m:sSup>
+              <m:r>
+                <m:rPr>
+                  <m:sty m:val="p"/>
+                </m:rPr>
+                <m:t>=</m:t>
+              </m:r>
+              <m:sSup>
+                <m:e>
+                  <m:acc>
+                    <m:accPr>
+                      <m:chr m:val="‾"/>
+                    </m:accPr>
+                    <m:e>
+                      <m:r>
+                        <m:t>D</m:t>
+                      </m:r>
+                    </m:e>
+                  </m:acc>
+                </m:e>
+                <m:sup>
+                  <m:r>
+                    <m:t>h</m:t>
+                  </m:r>
+                  <m:r>
+                    <m:t>2</m:t>
+                  </m:r>
+                </m:sup>
+              </m:sSup>
+              <m:r>
+                <m:rPr>
+                  <m:sty m:val="p"/>
+                </m:rPr>
+                <m:t>=</m:t>
+              </m:r>
+              <m:r>
+                <m:t>2.000</m:t>
+              </m:r>
+            </m:oMath>
+            <w:r>
+              <w:t xml:space="preserve"> </w:t>
+            </w:r>
+            <w:r>
+              <w:t xml:space="preserve">kg/dia</w:t>
+            </w:r>
+          </w:p>
+        </w:tc>
+        <w:tc>
+          <w:tcPr/>
+          <w:p>
+            <w:pPr>
+              <w:pStyle w:val="Compact"/>
+            </w:pPr>
+            <w:r>
+              <w:t xml:space="preserve">Vedada</w:t>
+            </w:r>
+          </w:p>
+        </w:tc>
+        <w:tc>
+          <w:tcPr/>
+          <w:p>
+            <w:pPr>
+              <w:pStyle w:val="Compact"/>
+            </w:pPr>
+            <w:r>
+              <w:t xml:space="preserve">–</w:t>
+            </w:r>
+          </w:p>
+        </w:tc>
+      </w:tr>
+      <w:tr>
+        <w:tc>
+          <w:tcPr/>
+          <w:p>
+            <w:pPr>
+              <w:pStyle w:val="Compact"/>
+            </w:pPr>
+            <w:r>
+              <w:t xml:space="preserve">Contrato 3 t/dia</w:t>
+            </w:r>
+          </w:p>
+        </w:tc>
+        <w:tc>
+          <w:tcPr/>
+          <w:p>
+            <w:pPr>
+              <w:pStyle w:val="Compact"/>
+            </w:pPr>
+            <m:oMath>
+              <m:sSup>
+                <m:e>
+                  <m:r>
+                    <m:t>D</m:t>
+                  </m:r>
+                </m:e>
+                <m:sup>
+                  <m:r>
+                    <m:t>h</m:t>
+                  </m:r>
+                  <m:r>
+                    <m:t>2</m:t>
+                  </m:r>
+                </m:sup>
+              </m:sSup>
+              <m:r>
+                <m:rPr>
+                  <m:sty m:val="p"/>
+                </m:rPr>
+                <m:t>=</m:t>
+              </m:r>
+              <m:sSup>
+                <m:e>
+                  <m:acc>
+                    <m:accPr>
+                      <m:chr m:val="‾"/>
+                    </m:accPr>
+                    <m:e>
+                      <m:r>
+                        <m:t>D</m:t>
+                      </m:r>
+                    </m:e>
+                  </m:acc>
+                </m:e>
+                <m:sup>
+                  <m:r>
+                    <m:t>h</m:t>
+                  </m:r>
+                  <m:r>
+                    <m:t>2</m:t>
+                  </m:r>
+                </m:sup>
+              </m:sSup>
+              <m:r>
+                <m:rPr>
+                  <m:sty m:val="p"/>
+                </m:rPr>
+                <m:t>=</m:t>
+              </m:r>
+              <m:r>
+                <m:t>3.000</m:t>
+              </m:r>
+            </m:oMath>
+            <w:r>
+              <w:t xml:space="preserve"> </w:t>
+            </w:r>
+            <w:r>
+              <w:t xml:space="preserve">kg/dia</w:t>
+            </w:r>
+          </w:p>
+        </w:tc>
+        <w:tc>
+          <w:tcPr/>
+          <w:p>
+            <w:pPr>
+              <w:pStyle w:val="Compact"/>
+            </w:pPr>
+            <w:r>
+              <w:t xml:space="preserve">Vedada</w:t>
+            </w:r>
+          </w:p>
+        </w:tc>
+        <w:tc>
+          <w:tcPr/>
+          <w:p>
+            <w:pPr>
+              <w:pStyle w:val="Compact"/>
+            </w:pPr>
+            <w:r>
+              <w:t xml:space="preserve">–</w:t>
+            </w:r>
+          </w:p>
+        </w:tc>
+      </w:tr>
+      <w:tr>
+        <w:tc>
+          <w:tcPr/>
+          <w:p>
+            <w:pPr>
+              <w:pStyle w:val="Compact"/>
+            </w:pPr>
+            <w:r>
+              <w:t xml:space="preserve">Importação</w:t>
+            </w:r>
+          </w:p>
+        </w:tc>
+        <w:tc>
+          <w:tcPr/>
+          <w:p>
+            <w:pPr>
+              <w:pStyle w:val="Compact"/>
+            </w:pPr>
+            <w:r>
+              <w:t xml:space="preserve">Sem limite de volume</w:t>
+            </w:r>
+          </w:p>
+        </w:tc>
+        <w:tc>
+          <w:tcPr/>
+          <w:p>
+            <w:pPr>
+              <w:pStyle w:val="Compact"/>
+            </w:pPr>
+            <w:r>
+              <w:t xml:space="preserve">Permitida</w:t>
+            </w:r>
+          </w:p>
+        </w:tc>
+        <w:tc>
+          <w:tcPr/>
+          <w:p>
+            <w:pPr>
+              <w:pStyle w:val="Compact"/>
+            </w:pPr>
+            <w:r>
+              <w:t xml:space="preserve">–</w:t>
+            </w:r>
+          </w:p>
+        </w:tc>
+      </w:tr>
+      <w:tr>
+        <w:tc>
+          <w:tcPr/>
+          <w:p>
+            <w:pPr>
+              <w:pStyle w:val="Compact"/>
+            </w:pPr>
+            <w:r>
+              <w:t xml:space="preserve">Importação e contrato 3 t/dia</w:t>
+            </w:r>
+          </w:p>
+        </w:tc>
+        <w:tc>
+          <w:tcPr/>
+          <w:p>
+            <w:pPr>
+              <w:pStyle w:val="Compact"/>
+            </w:pPr>
+            <m:oMath>
+              <m:sSup>
+                <m:e>
+                  <m:r>
+                    <m:t>D</m:t>
+                  </m:r>
+                </m:e>
+                <m:sup>
+                  <m:r>
+                    <m:t>h</m:t>
+                  </m:r>
+                  <m:r>
+                    <m:t>2</m:t>
+                  </m:r>
+                </m:sup>
+              </m:sSup>
+              <m:r>
+                <m:rPr>
+                  <m:sty m:val="p"/>
+                </m:rPr>
+                <m:t>=</m:t>
+              </m:r>
+              <m:sSup>
+                <m:e>
+                  <m:acc>
+                    <m:accPr>
+                      <m:chr m:val="‾"/>
+                    </m:accPr>
+                    <m:e>
+                      <m:r>
+                        <m:t>D</m:t>
+                      </m:r>
+                    </m:e>
+                  </m:acc>
+                </m:e>
+                <m:sup>
+                  <m:r>
+                    <m:t>h</m:t>
+                  </m:r>
+                  <m:r>
+                    <m:t>2</m:t>
+                  </m:r>
+                </m:sup>
+              </m:sSup>
+              <m:r>
+                <m:rPr>
+                  <m:sty m:val="p"/>
+                </m:rPr>
+                <m:t>=</m:t>
+              </m:r>
+              <m:r>
+                <m:t>3.000</m:t>
+              </m:r>
+            </m:oMath>
+            <w:r>
+              <w:t xml:space="preserve"> </w:t>
+            </w:r>
+            <w:r>
+              <w:t xml:space="preserve">kg/dia</w:t>
+            </w:r>
+          </w:p>
+        </w:tc>
+        <w:tc>
+          <w:tcPr/>
+          <w:p>
+            <w:pPr>
+              <w:pStyle w:val="Compact"/>
+            </w:pPr>
+            <w:r>
+              <w:t xml:space="preserve">Permitida</w:t>
+            </w:r>
+          </w:p>
+        </w:tc>
+        <w:tc>
+          <w:tcPr/>
+          <w:p>
+            <w:pPr>
+              <w:pStyle w:val="Compact"/>
+            </w:pPr>
+            <w:r>
+              <w:t xml:space="preserve">–</w:t>
+            </w:r>
+          </w:p>
+        </w:tc>
+      </w:tr>
+      <w:tr>
+        <w:tc>
+          <w:tcPr/>
+          <w:p>
+            <w:pPr>
+              <w:pStyle w:val="Compact"/>
+            </w:pPr>
+            <w:r>
+              <w:t xml:space="preserve">Frequência do despacho</w:t>
+            </w:r>
+          </w:p>
+        </w:tc>
+        <w:tc>
+          <w:tcPr/>
+          <w:p>
+            <w:pPr>
+              <w:pStyle w:val="Compact"/>
+            </w:pPr>
+            <w:r>
+              <w:t xml:space="preserve">Sem limite de volume</w:t>
+            </w:r>
+          </w:p>
+        </w:tc>
+        <w:tc>
+          <w:tcPr/>
+          <w:p>
+            <w:pPr>
+              <w:pStyle w:val="Compact"/>
+            </w:pPr>
+            <w:r>
+              <w:t xml:space="preserve">Vedada</w:t>
+            </w:r>
+          </w:p>
+        </w:tc>
+        <w:tc>
+          <w:tcPr/>
+          <w:p>
+            <w:pPr>
+              <w:pStyle w:val="Compact"/>
+            </w:pPr>
+            <w:r>
+              <w:t xml:space="preserve">50; 150 ou 365 despachos/ano</w:t>
+            </w:r>
+          </w:p>
+        </w:tc>
+      </w:tr>
+      <w:tr>
+        <w:tc>
+          <w:tcPr/>
+          <w:p>
+            <w:pPr>
+              <w:pStyle w:val="Compact"/>
+            </w:pPr>
+            <w:r>
+              <w:t xml:space="preserve">Degradação</w:t>
+            </w:r>
+          </w:p>
+        </w:tc>
+        <w:tc>
+          <w:tcPr/>
+          <w:p>
+            <w:pPr>
+              <w:pStyle w:val="Compact"/>
+            </w:pPr>
+            <w:r>
+              <w:t xml:space="preserve">Sem limite de volume</w:t>
+            </w:r>
+          </w:p>
+        </w:tc>
+        <w:tc>
+          <w:tcPr/>
+          <w:p>
+            <w:pPr>
+              <w:pStyle w:val="Compact"/>
+            </w:pPr>
+            <w:r>
+              <w:t xml:space="preserve">Vedada</w:t>
+            </w:r>
+          </w:p>
+        </w:tc>
+        <w:tc>
+          <w:tcPr/>
+          <w:p>
+            <w:pPr>
+              <w:pStyle w:val="Compact"/>
+            </w:pPr>
+            <m:oMath>
+              <m:sSup>
+                <m:e>
+                  <m:r>
+                    <m:t>c</m:t>
+                  </m:r>
+                </m:e>
+                <m:sup>
+                  <m:r>
+                    <m:t>d</m:t>
+                  </m:r>
+                  <m:r>
+                    <m:t>e</m:t>
+                  </m:r>
+                  <m:r>
+                    <m:t>g</m:t>
+                  </m:r>
+                </m:sup>
+              </m:sSup>
+            </m:oMath>
+            <w:r>
+              <w:t xml:space="preserve"> </w:t>
+            </w:r>
+            <w:r>
+              <w:t xml:space="preserve">de R$ 100 ou 200/MWh</w:t>
+            </w:r>
+          </w:p>
+        </w:tc>
+      </w:tr>
+      <w:tr>
+        <w:tc>
+          <w:tcPr/>
+          <w:p>
+            <w:pPr>
+              <w:pStyle w:val="Compact"/>
+            </w:pPr>
+            <w:r>
+              <w:t xml:space="preserve">Eletrolisador</w:t>
+            </w:r>
+          </w:p>
+        </w:tc>
+        <w:tc>
+          <w:tcPr/>
+          <w:p>
+            <w:pPr>
+              <w:pStyle w:val="Compact"/>
+            </w:pPr>
+            <w:r>
+              <w:t xml:space="preserve">Sem limite de volume</w:t>
+            </w:r>
+          </w:p>
+        </w:tc>
+        <w:tc>
+          <w:tcPr/>
+          <w:p>
+            <w:pPr>
+              <w:pStyle w:val="Compact"/>
+            </w:pPr>
+            <w:r>
+              <w:t xml:space="preserve">Vedada</w:t>
+            </w:r>
+          </w:p>
+        </w:tc>
+        <w:tc>
+          <w:tcPr/>
+          <w:p>
+            <w:pPr>
+              <w:pStyle w:val="Compact"/>
+            </w:pPr>
+            <w:r>
+              <w:t xml:space="preserve">Eletrolisador de 10 ou 25 MW</w:t>
+            </w:r>
+          </w:p>
+        </w:tc>
+      </w:tr>
+      <w:tr>
+        <w:tc>
+          <w:tcPr/>
+          <w:p>
+            <w:pPr>
+              <w:pStyle w:val="Compact"/>
+            </w:pPr>
+            <w:r>
+              <w:t xml:space="preserve">Tanque</w:t>
+            </w:r>
+          </w:p>
+        </w:tc>
+        <w:tc>
+          <w:tcPr/>
+          <w:p>
+            <w:pPr>
+              <w:pStyle w:val="Compact"/>
+            </w:pPr>
+            <m:oMath>
+              <m:sSup>
+                <m:e>
+                  <m:r>
+                    <m:t>D</m:t>
+                  </m:r>
+                </m:e>
+                <m:sup>
+                  <m:r>
+                    <m:t>h</m:t>
+                  </m:r>
+                  <m:r>
+                    <m:t>2</m:t>
+                  </m:r>
+                </m:sup>
+              </m:sSup>
+              <m:r>
+                <m:rPr>
+                  <m:sty m:val="p"/>
+                </m:rPr>
+                <m:t>=</m:t>
+              </m:r>
+              <m:sSup>
+                <m:e>
+                  <m:acc>
+                    <m:accPr>
+                      <m:chr m:val="‾"/>
+                    </m:accPr>
+                    <m:e>
+                      <m:r>
+                        <m:t>D</m:t>
+                      </m:r>
+                    </m:e>
+                  </m:acc>
+                </m:e>
+                <m:sup>
+                  <m:r>
+                    <m:t>h</m:t>
+                  </m:r>
+                  <m:r>
+                    <m:t>2</m:t>
+                  </m:r>
+                </m:sup>
+              </m:sSup>
+              <m:r>
+                <m:rPr>
+                  <m:sty m:val="p"/>
+                </m:rPr>
+                <m:t>=</m:t>
+              </m:r>
+              <m:r>
+                <m:t>3.000</m:t>
+              </m:r>
+            </m:oMath>
+            <w:r>
+              <w:t xml:space="preserve"> </w:t>
+            </w:r>
+            <w:r>
+              <w:t xml:space="preserve">kg/dia</w:t>
+            </w:r>
+          </w:p>
+        </w:tc>
+        <w:tc>
+          <w:tcPr/>
+          <w:p>
+            <w:pPr>
+              <w:pStyle w:val="Compact"/>
+            </w:pPr>
+            <w:r>
+              <w:t xml:space="preserve">Vedada</w:t>
+            </w:r>
+          </w:p>
+        </w:tc>
+        <w:tc>
+          <w:tcPr/>
+          <w:p>
+            <w:pPr>
+              <w:pStyle w:val="Compact"/>
+            </w:pPr>
+            <w:r>
+              <w:t xml:space="preserve">Tanque de 10 t</w:t>
+            </w:r>
+          </w:p>
+        </w:tc>
+      </w:tr>
+    </w:tbl>
+    <w:p>
+      <w:pPr>
+        <w:pStyle w:val="Fonte"/>
+      </w:pPr>
+      <w:r>
+        <w:t xml:space="preserve">Fonte: elaborado pelo autor.</w:t>
+      </w:r>
+    </w:p>
+    <w:p>
+      <w:pPr>
+        <w:pStyle w:val="BodyText"/>
+      </w:pPr>
+      <w:r>
+        <w:t xml:space="preserve">Nos casos com importação, o eletrolisador e o BESS mercantil podem ser supridos pela rede ao PLD acrescido de</w:t>
+      </w:r>
+      <w:r>
+        <w:t xml:space="preserve"> </w:t>
+      </w:r>
+      <m:oMath>
+        <m:sSup>
+          <m:e>
+            <m:r>
+              <m:t>c</m:t>
+            </m:r>
+          </m:e>
+          <m:sup>
+            <m:r>
+              <m:t>i</m:t>
+            </m:r>
+            <m:r>
+              <m:t>m</m:t>
+            </m:r>
+            <m:r>
+              <m:t>p</m:t>
+            </m:r>
+          </m:sup>
+        </m:sSup>
+      </m:oMath>
+      <w:r>
+        <w:t xml:space="preserve">. Essa configuração corresponde a um critério de qualificação do hidrogênio baseado na intensidade de emissões, e não na origem física da energia, e é avaliada como alternativa à hipótese de suprimento exclusivamente fotovoltaico. Para cada caso, além da curva de oferta, registram-se a potência ótima e a operação média nos cenários para a receita fixa de referência, de R$ 600 mil/(MW·ano), e calcula-se o lance mínimo para a construção do BESS (Seção 3.8.2), com o lucro sem BESS recalculado nos casos que alteram o contrato de hidrogênio, a importação ou o eletrolisador.</w:t>
       </w:r>
     </w:p>
     <w:bookmarkEnd w:id="40"/>
@@ -23031,7 +23613,7 @@
         <w:t xml:space="preserve"> </w:t>
       </w:r>
       <w:r>
-        <w:t xml:space="preserve">mesmo na extensão estocástica, a operação de cada cenário é otimizada com conhecimento antecipado das séries daquele ano, o que tende a superestimar o lucro alcançável na operação real. A incerteza tratada pela Seção 3.7 é apenas a variação entre anos; a incerteza do despacho do ONS, cujo risco é alocado ao empreendedor pela Portaria, é representada somente pela regra de despacho baseada no PLD e pela sensibilidade ao número de despachos por ano (Seção 3.8.2), que supõe despachos completos, de</w:t>
+        <w:t xml:space="preserve">mesmo na extensão estocástica, a operação de cada cenário é otimizada com conhecimento antecipado das séries daquele ano, o que tende a superestimar o lucro alcançável na operação real. A incerteza tratada pela Seção 3.7 é apenas a variação entre anos; a incerteza do despacho do ONS, cujo risco é alocado ao empreendedor pela Portaria, é representada somente pela regra de despacho baseada no PLD e pela sensibilidade ao número de despachos por ano (Seção 3.8.3), que supõe despachos completos, de</w:t>
       </w:r>
       <w:r>
         <w:t xml:space="preserve"> </w:t>

</xml_diff>

<commit_message>
Capítulo 3: perfil do ONS cíclico no ano e fronteira dos blocos pela relaxação linear
- Eq. do estado de carga do módulo LRCAP: perfil calculado para o ano inteiro, com
  condição cíclica, e recortado por bloco.
- Seção 3.6.2: procedimento de fronteira pela relaxação linear do ano nas avaliações
  com potência fixa, com limites inferior e superior; Benders mantém a condição cíclica.
- Seção 3.8.1 e hipótese h) ajustadas.

Co-Authored-By: Claude Opus 5.5 <noreply@anthropic.com>
Claude-Session: https://claude.ai/code/session_01YFtn9hiQUHbNLSX7rUNYuK
</commit_message>
<xml_diff>
--- a/docs/dissertacao/cap3_metodologia.docx
+++ b/docs/dissertacao/cap3_metodologia.docx
@@ -5830,7 +5830,7 @@
         </m:sSub>
       </m:oMath>
       <w:r>
-        <w:t xml:space="preserve">, pela recursão da Equação (3.5), com</w:t>
+        <w:t xml:space="preserve">, pela recursão da Equação (3.5). O perfil é calculado uma única vez para o ano civil inteiro, com condição cíclica no ano —</w:t>
       </w:r>
       <w:r>
         <w:t xml:space="preserve"> </w:t>
@@ -5854,31 +5854,12 @@
             </m:r>
           </m:sub>
         </m:sSub>
-        <m:r>
-          <m:rPr>
-            <m:sty m:val="p"/>
-          </m:rPr>
-          <m:t>=</m:t>
-        </m:r>
-        <m:acc>
-          <m:accPr>
-            <m:chr m:val="‾"/>
-          </m:accPr>
-          <m:e>
-            <m:r>
-              <m:t>σ</m:t>
-            </m:r>
-          </m:e>
-        </m:acc>
-        <m:r>
-          <m:t>ρ</m:t>
-        </m:r>
       </m:oMath>
       <w:r>
         <w:t xml:space="preserve"> </w:t>
       </w:r>
       <w:r>
-        <w:t xml:space="preserve">(módulo inicialmente carregado):</w:t>
+        <w:t xml:space="preserve">igual ao estado ao fim do ano —, e cada bloco da decomposição da Seção 3.6 recebe o trecho correspondente. Desse modo, o módulo inicia cada bloco no estado deixado pelo dia anterior, e a energia de recarga repõe exatamente a energia descarregada dividida pela eficiência do ciclo:</w:t>
       </w:r>
     </w:p>
     <w:tbl>
@@ -12273,7 +12254,311 @@
         <w:pStyle w:val="BodyText"/>
       </w:pPr>
       <w:r>
-        <w:t xml:space="preserve">As condições de contorno cíclicas restringem o problema anual, pois impedem transferências de energia e de hidrogênio entre blocos; o valor obtido com blocos semanais é, portanto, um limite inferior do valor do problema anual. Como a solução direta do problema anual não foi obtida, o efeito dessa restrição é estimado comparando-se o lucro anual, para uma mesma potência contratada, com blocos de 7, 14 e 28 dias, e refazendo-se a decomposição com blocos de 14 dias. Se o lucro não aumentar com o tamanho do bloco, a restrição pode ser considerada inativa.</w:t>
+        <w:t xml:space="preserve">As condições de contorno cíclicas restringem o problema anual, pois impedem transferências de energia e de hidrogênio entre blocos: cada semana começa com o módulo mercantil em</w:t>
+      </w:r>
+      <w:r>
+        <w:t xml:space="preserve"> </w:t>
+      </w:r>
+      <m:oMath>
+        <m:sSub>
+          <m:e>
+            <m:r>
+              <m:t>σ</m:t>
+            </m:r>
+          </m:e>
+          <m:sub>
+            <m:r>
+              <m:t>0</m:t>
+            </m:r>
+          </m:sub>
+        </m:sSub>
+        <m:sSup>
+          <m:e>
+            <m:r>
+              <m:t>E</m:t>
+            </m:r>
+          </m:e>
+          <m:sup>
+            <m:r>
+              <m:t>m</m:t>
+            </m:r>
+          </m:sup>
+        </m:sSup>
+      </m:oMath>
+      <w:r>
+        <w:t xml:space="preserve"> </w:t>
+      </w:r>
+      <w:r>
+        <w:t xml:space="preserve">e o tanque em</w:t>
+      </w:r>
+      <w:r>
+        <w:t xml:space="preserve"> </w:t>
+      </w:r>
+      <m:oMath>
+        <m:sSub>
+          <m:e>
+            <m:r>
+              <m:t>S</m:t>
+            </m:r>
+          </m:e>
+          <m:sub>
+            <m:r>
+              <m:t>0</m:t>
+            </m:r>
+          </m:sub>
+        </m:sSub>
+      </m:oMath>
+      <w:r>
+        <w:t xml:space="preserve"> </w:t>
+      </w:r>
+      <w:r>
+        <w:t xml:space="preserve">e precisa terminar nesses níveis. O valor obtido com blocos semanais é, portanto, um limite inferior do valor do problema anual. Como a solução direta do problema anual não foi obtida, o efeito dessa restrição é estimado comparando-se o lucro anual, para uma mesma potência contratada, com blocos de 7, 14 e 28 dias, e refazendo-se a decomposição com blocos de 14 dias. Se o lucro não aumentar com o tamanho do bloco, a restrição pode ser considerada inativa.</w:t>
+      </w:r>
+    </w:p>
+    <w:p>
+      <w:pPr>
+        <w:pStyle w:val="BodyText"/>
+      </w:pPr>
+      <w:r>
+        <w:t xml:space="preserve">Quando a potência contratada é fixada — caso das avaliações da curva de oferta e da viabilidade econômica (Seção 3.8) —, a restrição pode ser removida quase integralmente por um procedimento em duas etapas. Primeiro, resolve-se a relaxação linear do problema do ano inteiro, isto é, com as variáveis binárias tratadas como contínuas, e com condição cíclica no ano e nível inicial livre. Sem variáveis binárias, esse problema é resolvido em menos de um minuto, e seu valor ótimo é um limite superior</w:t>
+      </w:r>
+      <w:r>
+        <w:t xml:space="preserve"> </w:t>
+      </w:r>
+      <m:oMath>
+        <m:acc>
+          <m:accPr>
+            <m:chr m:val="‾"/>
+          </m:accPr>
+          <m:e>
+            <m:r>
+              <m:t>Q</m:t>
+            </m:r>
+          </m:e>
+        </m:acc>
+      </m:oMath>
+      <w:r>
+        <w:t xml:space="preserve"> </w:t>
+      </w:r>
+      <w:r>
+        <w:t xml:space="preserve">do lucro operacional do ano. Em seguida, os estados de armazenamento da relaxação no início e no fim de cada semana — o estado de carga do módulo mercantil, em fração de</w:t>
+      </w:r>
+      <w:r>
+        <w:t xml:space="preserve"> </w:t>
+      </w:r>
+      <m:oMath>
+        <m:sSup>
+          <m:e>
+            <m:r>
+              <m:t>E</m:t>
+            </m:r>
+          </m:e>
+          <m:sup>
+            <m:r>
+              <m:t>m</m:t>
+            </m:r>
+          </m:sup>
+        </m:sSup>
+      </m:oMath>
+      <w:r>
+        <w:t xml:space="preserve">, e o estoque de hidrogênio — substituem</w:t>
+      </w:r>
+      <w:r>
+        <w:t xml:space="preserve"> </w:t>
+      </w:r>
+      <m:oMath>
+        <m:sSub>
+          <m:e>
+            <m:r>
+              <m:t>σ</m:t>
+            </m:r>
+          </m:e>
+          <m:sub>
+            <m:r>
+              <m:t>0</m:t>
+            </m:r>
+          </m:sub>
+        </m:sSub>
+      </m:oMath>
+      <w:r>
+        <w:t xml:space="preserve"> </w:t>
+      </w:r>
+      <w:r>
+        <w:t xml:space="preserve">e</w:t>
+      </w:r>
+      <w:r>
+        <w:t xml:space="preserve"> </w:t>
+      </w:r>
+      <m:oMath>
+        <m:sSub>
+          <m:e>
+            <m:r>
+              <m:t>S</m:t>
+            </m:r>
+          </m:e>
+          <m:sub>
+            <m:r>
+              <m:t>0</m:t>
+            </m:r>
+          </m:sub>
+        </m:sSub>
+      </m:oMath>
+      <w:r>
+        <w:t xml:space="preserve"> </w:t>
+      </w:r>
+      <w:r>
+        <w:t xml:space="preserve">como condições de contorno dos blocos MILP. Os blocos continuam independentes e são resolvidos em paralelo, e a concatenação de suas soluções é uma operação viável do ano inteiro, cujo lucro</w:t>
+      </w:r>
+      <w:r>
+        <w:t xml:space="preserve"> </w:t>
+      </w:r>
+      <m:oMath>
+        <m:bar>
+          <m:barPr>
+            <m:pos m:val="bot"/>
+          </m:barPr>
+          <m:e>
+            <m:r>
+              <m:t>Q</m:t>
+            </m:r>
+          </m:e>
+        </m:bar>
+      </m:oMath>
+      <w:r>
+        <w:t xml:space="preserve"> </w:t>
+      </w:r>
+      <w:r>
+        <w:t xml:space="preserve">é um limite inferior do ótimo anual. A diferença relativa</w:t>
+      </w:r>
+      <w:r>
+        <w:t xml:space="preserve"> </w:t>
+      </w:r>
+      <m:oMath>
+        <m:r>
+          <m:rPr>
+            <m:sty m:val="p"/>
+          </m:rPr>
+          <m:t>(</m:t>
+        </m:r>
+        <m:acc>
+          <m:accPr>
+            <m:chr m:val="‾"/>
+          </m:accPr>
+          <m:e>
+            <m:r>
+              <m:t>Q</m:t>
+            </m:r>
+          </m:e>
+        </m:acc>
+        <m:r>
+          <m:rPr>
+            <m:sty m:val="p"/>
+          </m:rPr>
+          <m:t>−</m:t>
+        </m:r>
+        <m:bar>
+          <m:barPr>
+            <m:pos m:val="bot"/>
+          </m:barPr>
+          <m:e>
+            <m:r>
+              <m:t>Q</m:t>
+            </m:r>
+          </m:e>
+        </m:bar>
+        <m:r>
+          <m:rPr>
+            <m:sty m:val="p"/>
+          </m:rPr>
+          <m:t>)</m:t>
+        </m:r>
+        <m:r>
+          <m:rPr>
+            <m:sty m:val="p"/>
+          </m:rPr>
+          <m:t>/</m:t>
+        </m:r>
+        <m:acc>
+          <m:accPr>
+            <m:chr m:val="‾"/>
+          </m:accPr>
+          <m:e>
+            <m:r>
+              <m:t>Q</m:t>
+            </m:r>
+          </m:e>
+        </m:acc>
+      </m:oMath>
+      <w:r>
+        <w:t xml:space="preserve"> </w:t>
+      </w:r>
+      <w:r>
+        <w:t xml:space="preserve">certifica, assim, a qualidade da aproximação. Para que</w:t>
+      </w:r>
+      <w:r>
+        <w:t xml:space="preserve"> </w:t>
+      </w:r>
+      <m:oMath>
+        <m:bar>
+          <m:barPr>
+            <m:pos m:val="bot"/>
+          </m:barPr>
+          <m:e>
+            <m:r>
+              <m:t>Q</m:t>
+            </m:r>
+          </m:e>
+        </m:bar>
+      </m:oMath>
+      <w:r>
+        <w:t xml:space="preserve"> </w:t>
+      </w:r>
+      <w:r>
+        <w:t xml:space="preserve">seja de fato viável, admite-se, nesses blocos, o eletrolisador desligado antes da primeira hora, o que pode acrescentar uma partida por semana. O procedimento não se aplica ao algoritmo de Benders, porque os estados de fronteira dependeriam do ponto</w:t>
+      </w:r>
+      <w:r>
+        <w:t xml:space="preserve"> </w:t>
+      </w:r>
+      <m:oMath>
+        <m:acc>
+          <m:accPr>
+            <m:chr m:val="̂"/>
+          </m:accPr>
+          <m:e>
+            <m:r>
+              <m:t>x</m:t>
+            </m:r>
+          </m:e>
+        </m:acc>
+      </m:oMath>
+      <w:r>
+        <w:t xml:space="preserve"> </w:t>
+      </w:r>
+      <w:r>
+        <w:t xml:space="preserve">em que a relaxação foi resolvida, e o conjunto viável</w:t>
+      </w:r>
+      <w:r>
+        <w:t xml:space="preserve"> </w:t>
+      </w:r>
+      <m:oMath>
+        <m:sSub>
+          <m:e>
+            <m:r>
+              <m:t>X</m:t>
+            </m:r>
+          </m:e>
+          <m:sub>
+            <m:r>
+              <m:t>w</m:t>
+            </m:r>
+          </m:sub>
+        </m:sSub>
+      </m:oMath>
+      <w:r>
+        <w:t xml:space="preserve"> </w:t>
+      </w:r>
+      <w:r>
+        <w:t xml:space="preserve">da Equação (3.21) deixaria de ser o mesmo entre iterações.</w:t>
       </w:r>
     </w:p>
     <w:bookmarkEnd w:id="26"/>
@@ -18988,7 +19273,7 @@
         <w:t xml:space="preserve"> </w:t>
       </w:r>
       <w:r>
-        <w:t xml:space="preserve">fixo. O custo de oportunidade marginal é aproximado pelas diferenças finitas da Equação (3.37):</w:t>
+        <w:t xml:space="preserve">fixo e com os estados de fronteira dos blocos dados pela relaxação linear de cada ano (Seção 3.6.2). O custo de oportunidade marginal é aproximado pelas diferenças finitas da Equação (3.37):</w:t>
       </w:r>
     </w:p>
     <w:tbl>
@@ -23793,13 +24078,13 @@
           <w:b/>
           <w:bCs/>
         </w:rPr>
-        <w:t xml:space="preserve">condições cíclicas semanais:</w:t>
-      </w:r>
-      <w:r>
-        <w:t xml:space="preserve"> </w:t>
-      </w:r>
-      <w:r>
-        <w:t xml:space="preserve">a decomposição impõe que os estados de armazenamento retornem ao valor inicial ao final de cada semana, impedindo transferências de energia ou de hidrogênio entre semanas; o efeito dessa restrição é verificado com blocos de até 28 dias (Seção 3.6.2);</w:t>
+        <w:t xml:space="preserve">fronteira entre blocos semanais:</w:t>
+      </w:r>
+      <w:r>
+        <w:t xml:space="preserve"> </w:t>
+      </w:r>
+      <w:r>
+        <w:t xml:space="preserve">no algoritmo de Benders, os estados de armazenamento retornam ao valor inicial ao final de cada semana, o que impede transferências de energia ou de hidrogênio entre semanas; nas avaliações com potência fixa (Seção 3.8), esses estados seguem a relaxação linear do ano inteiro, e a perda em relação ao ótimo anual é limitada pela diferença entre os limites inferior e superior (Seção 3.6.2);</w:t>
       </w:r>
     </w:p>
     <w:p>

</xml_diff>

<commit_message>
Multa do contrato de H2: justificativa corrigida e custo efetivo declarado
A multa de R$ 35/kg (igual ao preço) era justificada como ressarcimento do produto
que o comprador teria de adquirir de outro fornecedor, mas esse ressarcimento seria
apenas a diferença entre o preço de reposição e o do contrato. O texto passa a
tratá-la como cláusula de firmeza e a declarar que, somada à venda perdida, cada kg
não entregue custa R$ 70 ao empreendedor (cerca de R$ 1.245 por MWh do eletrolisador,
o dobro do valor sem contrato). Os resultados numéricos não mudam.

- Capítulo 3: Seção 3.4.5 (contrato de fornecimento) e hipótese j).
- Capítulo 4: contrato de 3 t/dia, sensibilidade do lance e síntese c) passam a
  dizer que esses valores dependem da multa adotada.
- README e comentário em scripts/curva_oferta.py.

Co-Authored-By: Claude Opus 5.5 <noreply@anthropic.com>
Claude-Session: https://claude.ai/code/session_01YFtn9hiQUHbNLSX7rUNYuK
</commit_message>
<xml_diff>
--- a/docs/dissertacao/cap3_metodologia.docx
+++ b/docs/dissertacao/cap3_metodologia.docx
@@ -10047,7 +10047,199 @@
         </m:sSup>
       </m:oMath>
       <w:r>
-        <w:t xml:space="preserve">, valor que corresponde a ressarcir o comprador pelo produto que ele precisará adquirir de outro fornecedor. Os volumes de 2.000 e 3.000 kg/dia correspondem, respectivamente, a cerca de 65% e 98% da produção média do caso sem contrato (3.060 kg/dia). Nessa configuração, o hidrogênio produzido além do volume contratado não pode ser vendido, e a energia excedente passa a ser exportada ao MCP ou vertida, o que restabelece o papel do mercado de curto prazo na arbitragem. O caso sem contrato corresponde a</w:t>
+        <w:t xml:space="preserve">, isto é, uma multa igual ao preço por kg não entregue. Esse valor não deve ser lido como ressarcimento do produto: se o comprador repuser o hidrogênio com outro fornecedor ao mesmo preço, seu prejuízo direto é nulo, pois ele deixa de pagar o empreendedor, e uma indenização desse tipo corresponderia apenas à diferença entre o preço de reposição e o do contrato. A multa adotada representa, antes, uma cláusula de firmeza, que remunera o custo da interrupção para um comprador que depende da entrega diária. Como o kg não entregue também deixa de ser vendido, seu custo efetivo para o empreendedor é a soma</w:t>
+      </w:r>
+      <w:r>
+        <w:t xml:space="preserve"> </w:t>
+      </w:r>
+      <m:oMath>
+        <m:sSup>
+          <m:e>
+            <m:r>
+              <m:t>π</m:t>
+            </m:r>
+          </m:e>
+          <m:sup>
+            <m:r>
+              <m:t>h</m:t>
+            </m:r>
+            <m:r>
+              <m:t>2</m:t>
+            </m:r>
+          </m:sup>
+        </m:sSup>
+        <m:r>
+          <m:rPr>
+            <m:sty m:val="p"/>
+          </m:rPr>
+          <m:t>+</m:t>
+        </m:r>
+        <m:sSup>
+          <m:e>
+            <m:r>
+              <m:t>π</m:t>
+            </m:r>
+          </m:e>
+          <m:sup>
+            <m:r>
+              <m:t>d</m:t>
+            </m:r>
+            <m:r>
+              <m:t>e</m:t>
+            </m:r>
+            <m:r>
+              <m:t>f</m:t>
+            </m:r>
+          </m:sup>
+        </m:sSup>
+      </m:oMath>
+      <w:r>
+        <w:t xml:space="preserve">, de R$ 70/kg, e cada MWh entregue ao eletrolisador para evitar o déficit passa a valer</w:t>
+      </w:r>
+      <w:r>
+        <w:t xml:space="preserve"> </w:t>
+      </w:r>
+      <m:oMath>
+        <m:r>
+          <m:rPr>
+            <m:sty m:val="p"/>
+          </m:rPr>
+          <m:t>(</m:t>
+        </m:r>
+        <m:sSup>
+          <m:e>
+            <m:r>
+              <m:t>π</m:t>
+            </m:r>
+          </m:e>
+          <m:sup>
+            <m:r>
+              <m:t>h</m:t>
+            </m:r>
+            <m:r>
+              <m:t>2</m:t>
+            </m:r>
+          </m:sup>
+        </m:sSup>
+        <m:r>
+          <m:rPr>
+            <m:sty m:val="p"/>
+          </m:rPr>
+          <m:t>+</m:t>
+        </m:r>
+        <m:sSup>
+          <m:e>
+            <m:r>
+              <m:t>π</m:t>
+            </m:r>
+          </m:e>
+          <m:sup>
+            <m:r>
+              <m:t>d</m:t>
+            </m:r>
+            <m:r>
+              <m:t>e</m:t>
+            </m:r>
+            <m:r>
+              <m:t>f</m:t>
+            </m:r>
+          </m:sup>
+        </m:sSup>
+        <m:r>
+          <m:rPr>
+            <m:sty m:val="p"/>
+          </m:rPr>
+          <m:t>−</m:t>
+        </m:r>
+        <m:sSup>
+          <m:e>
+            <m:r>
+              <m:t>c</m:t>
+            </m:r>
+          </m:e>
+          <m:sup>
+            <m:r>
+              <m:t>h</m:t>
+            </m:r>
+            <m:r>
+              <m:t>2</m:t>
+            </m:r>
+          </m:sup>
+        </m:sSup>
+        <m:r>
+          <m:rPr>
+            <m:sty m:val="p"/>
+          </m:rPr>
+          <m:t>)</m:t>
+        </m:r>
+        <m:r>
+          <m:rPr>
+            <m:sty m:val="p"/>
+          </m:rPr>
+          <m:t>⋅</m:t>
+        </m:r>
+        <m:r>
+          <m:t>1000</m:t>
+        </m:r>
+        <m:r>
+          <m:rPr>
+            <m:sty m:val="p"/>
+          </m:rPr>
+          <m:t>/</m:t>
+        </m:r>
+        <m:sSup>
+          <m:e>
+            <m:r>
+              <m:t>k</m:t>
+            </m:r>
+          </m:e>
+          <m:sup>
+            <m:r>
+              <m:t>e</m:t>
+            </m:r>
+            <m:r>
+              <m:t>l</m:t>
+            </m:r>
+          </m:sup>
+        </m:sSup>
+        <m:r>
+          <m:rPr>
+            <m:sty m:val="p"/>
+          </m:rPr>
+          <m:t>≈</m:t>
+        </m:r>
+      </m:oMath>
+      <w:r>
+        <w:t xml:space="preserve"> </w:t>
+      </w:r>
+      <w:r>
+        <w:t xml:space="preserve">R$ 1.245/MWh, o dobro do valor sem contrato. Os casos com contrato representam, portanto, um contrato praticamente firme, e o valor do BESS no seu cumprimento depende diretamente de</w:t>
+      </w:r>
+      <w:r>
+        <w:t xml:space="preserve"> </w:t>
+      </w:r>
+      <m:oMath>
+        <m:sSup>
+          <m:e>
+            <m:r>
+              <m:t>π</m:t>
+            </m:r>
+          </m:e>
+          <m:sup>
+            <m:r>
+              <m:t>d</m:t>
+            </m:r>
+            <m:r>
+              <m:t>e</m:t>
+            </m:r>
+            <m:r>
+              <m:t>f</m:t>
+            </m:r>
+          </m:sup>
+        </m:sSup>
+      </m:oMath>
+      <w:r>
+        <w:t xml:space="preserve">. Os volumes de 2.000 e 3.000 kg/dia correspondem, respectivamente, a cerca de 65% e 98% da produção média do caso sem contrato (3.060 kg/dia). Nessa configuração, o hidrogênio produzido além do volume contratado não pode ser vendido, e a energia excedente passa a ser exportada ao MCP ou vertida, o que restabelece o papel do mercado de curto prazo na arbitragem. O caso sem contrato corresponde a</w:t>
       </w:r>
       <w:r>
         <w:t xml:space="preserve"> </w:t>
@@ -24142,7 +24334,7 @@
         <w:t xml:space="preserve"> </w:t>
       </w:r>
       <w:r>
-        <w:t xml:space="preserve">sobre volumes anuais, flexibilidade de entrega entre dias, reajuste de preço ou a venda do excedente a outros compradores, e a multa adotada é um valor de referência ainda não calibrado com contratos reais;</w:t>
+        <w:t xml:space="preserve">sobre volumes anuais, flexibilidade de entrega entre dias, reajuste de preço ou a venda do excedente a outros compradores, e a multa adotada, igual ao preço do hidrogênio, é um valor de referência ainda não calibrado com contratos reais. Somada à receita perdida, ela custa ao empreendedor R$ 70 por kg não entregue, o que torna o contrato praticamente firme e eleva o valor atribuído ao BESS no seu cumprimento (Seção 3.4.5);</w:t>
       </w:r>
     </w:p>
     <w:p>

</xml_diff>

<commit_message>
Capítulos 3 e 4 e README: viabilidade e lance mínimo com as correções de custo
- Cap. 3: Seção 3.5 (degradação: custo marginal do BESS existente; no investimento, o
  desgaste contratado vai para o O&M com augmentation, NREL ATB 2024); Quadro 3.3 com
  fontes do O&M, taxa central de 12,1%, TUST, consumo auxiliar e disponibilidade;
  Eq. do VPL com o uso da rede; nova Eq. 3.42 (Q_inv); Eq. 3.45 do lance aproximado
  sem o termo de degradação; hipóteses c), f) e l); novas referências.
- Cap. 4: Tabelas 4.2, 4.3 e 4.4 (sensibilidade uma premissa por vez), Figura 4.3 com
  as parcelas do lance, texto da Seção 4.2 e síntese a)–d). Lance central de
  R$ 1,081 mi/MW·ano (capital 812 + O&M 138 + TUST 131).
- README: seção de viabilidade e lance mínimo reescrita.

Co-Authored-By: Claude Opus 5.5 <noreply@anthropic.com>
Claude-Session: https://claude.ai/code/session_01YFtn9hiQUHbNLSX7rUNYuK
</commit_message>
<xml_diff>
--- a/docs/dissertacao/cap3_metodologia.docx
+++ b/docs/dissertacao/cap3_metodologia.docx
@@ -10543,7 +10543,33 @@
         <w:t xml:space="preserve"> </w:t>
       </w:r>
       <w:r>
-        <w:t xml:space="preserve">O custo de degradação pode ser estimado como o custo de reposição dos módulos de bateria dividido pela energia que eles descarregam ao longo da vida útil. Com o preço médio de</w:t>
+        <w:t xml:space="preserve">No modelo de operação, o desgaste da bateria é representado por um custo por MWh descarregado,</w:t>
+      </w:r>
+      <w:r>
+        <w:t xml:space="preserve"> </w:t>
+      </w:r>
+      <m:oMath>
+        <m:sSup>
+          <m:e>
+            <m:r>
+              <m:t>c</m:t>
+            </m:r>
+          </m:e>
+          <m:sup>
+            <m:r>
+              <m:t>d</m:t>
+            </m:r>
+            <m:r>
+              <m:t>e</m:t>
+            </m:r>
+            <m:r>
+              <m:t>g</m:t>
+            </m:r>
+          </m:sup>
+        </m:sSup>
+      </m:oMath>
+      <w:r>
+        <w:t xml:space="preserve">, que mede o custo marginal de usar uma bateria existente: cada ciclo adicional antecipa a perda de capacidade e a reposição dos módulos. O custo integral de reposição dividido pela energia descarregada ao longo da vida útil é um limite superior desse custo marginal. Com o preço médio de</w:t>
       </w:r>
       <w:r>
         <w:t xml:space="preserve"> </w:t>
@@ -10559,7 +10585,17 @@
         <w:t xml:space="preserve"> </w:t>
       </w:r>
       <w:r>
-        <w:t xml:space="preserve">de baterias de íons de lítio para armazenamento estacionário de US$ 70/kWh em 2025 (BNEF, 2025), convertido pela taxa PTAX de 09/12/2025 (R$ 5,4025/US$) e acrescido de 74% de tributos incidentes no Brasil (EPE, 2024), e com vida útil de 4.000 a 6.000 ciclos a 90% de profundidade de descarga, obtém-se entre R$ 120 e R$ 185 por MWh descarregado. O valor de R$ 50/MWh adotado no caso de referência situa-se abaixo dessa faixa; por isso, o efeito de valores de R$ 100 e R$ 200/MWh é avaliado na Seção 3.8.4.</w:t>
+        <w:t xml:space="preserve">de baterias de íons de lítio para armazenamento estacionário de US$ 70/kWh em 2025 (BNEF, 2025), convertido pela taxa PTAX de 09/12/2025 (R$ 5,4025/US$) e acrescido de 74% de tributos incidentes no Brasil (EPE, 2024), e com vida útil de 4.000 a 6.000 ciclos a 90% de profundidade de descarga, esse limite fica entre R$ 120 e R$ 185 por MWh descarregado. Adota-se R$ 50/MWh no caso de referência, e o efeito de valores de R$ 100 e R$ 200/MWh é avaliado na Seção 3.8.4. Na decisão de construir o BESS (Seção 3.8.2), porém, o desgaste do uso contratado não é cobrado por MWh: o investimento é amortizado no prazo do contrato, sem valor residual, e o O&amp;M fixo inclui a reposição parcial de módulos (</w:t>
+      </w:r>
+      <w:r>
+        <w:rPr>
+          <w:i/>
+          <w:iCs/>
+        </w:rPr>
+        <w:t xml:space="preserve">augmentation</w:t>
+      </w:r>
+      <w:r>
+        <w:t xml:space="preserve">) que mantém a capacidade nominal durante a vida útil, com cerca de um ciclo por dia (NREL, 2024). Cobrar também o desgaste por MWh pagaria a bateria duas vezes.</w:t>
       </w:r>
     </w:p>
     <w:p>
@@ -20834,6 +20870,33 @@
                         </m:r>
                       </m:sup>
                     </m:sSup>
+                    <m:r>
+                      <m:rPr>
+                        <m:sty m:val="p"/>
+                      </m:rPr>
+                      <m:t>−</m:t>
+                    </m:r>
+                    <m:sSup>
+                      <m:e>
+                        <m:r>
+                          <m:t>C</m:t>
+                        </m:r>
+                      </m:e>
+                      <m:sup>
+                        <m:r>
+                          <m:t>r</m:t>
+                        </m:r>
+                        <m:r>
+                          <m:t>e</m:t>
+                        </m:r>
+                        <m:r>
+                          <m:t>d</m:t>
+                        </m:r>
+                        <m:r>
+                          <m:t>e</m:t>
+                        </m:r>
+                      </m:sup>
+                    </m:sSup>
                   </m:e>
                 </m:d>
                 <m:r>
@@ -21020,7 +21083,126 @@
         <w:t xml:space="preserve"> </w:t>
       </w:r>
       <w:r>
-        <w:t xml:space="preserve">é o custo anual de operação e manutenção fixo e</w:t>
+        <w:t xml:space="preserve">é o custo anual de operação e manutenção fixo,</w:t>
+      </w:r>
+      <w:r>
+        <w:t xml:space="preserve"> </w:t>
+      </w:r>
+      <m:oMath>
+        <m:sSup>
+          <m:e>
+            <m:r>
+              <m:t>C</m:t>
+            </m:r>
+          </m:e>
+          <m:sup>
+            <m:r>
+              <m:t>r</m:t>
+            </m:r>
+            <m:r>
+              <m:t>e</m:t>
+            </m:r>
+            <m:r>
+              <m:t>d</m:t>
+            </m:r>
+            <m:r>
+              <m:t>e</m:t>
+            </m:r>
+          </m:sup>
+        </m:sSup>
+        <m:r>
+          <m:rPr>
+            <m:sty m:val="p"/>
+          </m:rPr>
+          <m:t>=</m:t>
+        </m:r>
+        <m:r>
+          <m:t>12</m:t>
+        </m:r>
+        <m:r>
+          <m:t> </m:t>
+        </m:r>
+        <m:r>
+          <m:t>τ</m:t>
+        </m:r>
+        <m:r>
+          <m:t> </m:t>
+        </m:r>
+        <m:r>
+          <m:rPr>
+            <m:sty m:val="p"/>
+          </m:rPr>
+          <m:t>(</m:t>
+        </m:r>
+        <m:sSup>
+          <m:e>
+            <m:r>
+              <m:t>P</m:t>
+            </m:r>
+          </m:e>
+          <m:sup>
+            <m:r>
+              <m:t>p</m:t>
+            </m:r>
+            <m:r>
+              <m:t>v</m:t>
+            </m:r>
+          </m:sup>
+        </m:sSup>
+        <m:r>
+          <m:rPr>
+            <m:sty m:val="p"/>
+          </m:rPr>
+          <m:t>+</m:t>
+        </m:r>
+        <m:sSup>
+          <m:e>
+            <m:acc>
+              <m:accPr>
+                <m:chr m:val="‾"/>
+              </m:accPr>
+              <m:e>
+                <m:r>
+                  <m:t>P</m:t>
+                </m:r>
+              </m:e>
+            </m:acc>
+          </m:e>
+          <m:sup>
+            <m:r>
+              <m:t>d</m:t>
+            </m:r>
+            <m:r>
+              <m:t>i</m:t>
+            </m:r>
+            <m:r>
+              <m:t>s</m:t>
+            </m:r>
+          </m:sup>
+        </m:sSup>
+        <m:r>
+          <m:rPr>
+            <m:sty m:val="p"/>
+          </m:rPr>
+          <m:t>)</m:t>
+        </m:r>
+      </m:oMath>
+      <w:r>
+        <w:t xml:space="preserve"> </w:t>
+      </w:r>
+      <w:r>
+        <w:t xml:space="preserve">é o custo anual de uso da rede, com a tarifa de uso do sistema de transmissão na geração (TUST)</w:t>
+      </w:r>
+      <w:r>
+        <w:t xml:space="preserve"> </w:t>
+      </w:r>
+      <m:oMath>
+        <m:r>
+          <m:t>τ</m:t>
+        </m:r>
+      </m:oMath>
+      <w:r>
+        <w:t xml:space="preserve">, em R$/kW·mês, aplicada às potências da usina FV e do BESS, e</w:t>
       </w:r>
       <w:r>
         <w:t xml:space="preserve"> </w:t>
@@ -21265,7 +21447,7 @@
               <w:pStyle w:val="Compact"/>
             </w:pPr>
             <w:r>
-              <w:t xml:space="preserve">Hipótese do autor; o O&amp;M variável do eletrolisador e a degradação do BESS já estão no modelo de operação</w:t>
+              <w:t xml:space="preserve">BESS: NREL (2024), incluída a reposição parcial de módulos que mantém a capacidade nominal em 15 anos, com cerca de um ciclo por dia e sem O&amp;M variável; FV e eletrolisador: hipótese do autor</w:t>
             </w:r>
           </w:p>
         </w:tc>
@@ -21289,7 +21471,7 @@
               <w:pStyle w:val="Compact"/>
             </w:pPr>
             <w:r>
-              <w:t xml:space="preserve">8,0% e 12,1% ao ano</w:t>
+              <w:t xml:space="preserve">12,1% (central) e 8,0% ao ano</w:t>
             </w:r>
           </w:p>
         </w:tc>
@@ -21300,7 +21482,112 @@
               <w:pStyle w:val="Compact"/>
             </w:pPr>
             <w:r>
-              <w:t xml:space="preserve">ANEEL (2026): custo de capital regulatório da geração, após e antes de impostos</w:t>
+              <w:t xml:space="preserve">ANEEL (2026): custo de capital regulatório da geração antes e após impostos</w:t>
+            </w:r>
+          </w:p>
+        </w:tc>
+      </w:tr>
+      <w:tr>
+        <w:tc>
+          <w:tcPr/>
+          <w:p>
+            <w:pPr>
+              <w:pStyle w:val="Compact"/>
+            </w:pPr>
+            <w:r>
+              <w:t xml:space="preserve">Uso da rede (TUST de geração)</w:t>
+            </w:r>
+          </w:p>
+        </w:tc>
+        <w:tc>
+          <w:tcPr/>
+          <w:p>
+            <w:pPr>
+              <w:pStyle w:val="Compact"/>
+            </w:pPr>
+            <w:r>
+              <w:t xml:space="preserve">R$ 5,68; 10,93; 19,49/kW·mês</w:t>
+            </w:r>
+          </w:p>
+        </w:tc>
+        <w:tc>
+          <w:tcPr/>
+          <w:p>
+            <w:pPr>
+              <w:pStyle w:val="Compact"/>
+            </w:pPr>
+            <w:r>
+              <w:t xml:space="preserve">Ciclo 2026/2027: média nacional e faixa entre regiões (MOVIMENTO ECONÔMICO, 2026); armazenamento despachado pelo ONS paga apenas na injeção (CENÁRIO ENERGIA, 2026)</w:t>
+            </w:r>
+          </w:p>
+        </w:tc>
+      </w:tr>
+      <w:tr>
+        <w:tc>
+          <w:tcPr/>
+          <w:p>
+            <w:pPr>
+              <w:pStyle w:val="Compact"/>
+            </w:pPr>
+            <w:r>
+              <w:t xml:space="preserve">Consumo auxiliar do BESS</w:t>
+            </w:r>
+          </w:p>
+        </w:tc>
+        <w:tc>
+          <w:tcPr/>
+          <w:p>
+            <w:pPr>
+              <w:pStyle w:val="Compact"/>
+            </w:pPr>
+            <w:r>
+              <w:t xml:space="preserve">0; 1%; 2% da potência nominal</w:t>
+            </w:r>
+          </w:p>
+        </w:tc>
+        <w:tc>
+          <w:tcPr/>
+          <w:p>
+            <w:pPr>
+              <w:pStyle w:val="Compact"/>
+            </w:pPr>
+            <w:r>
+              <w:t xml:space="preserve">Valor indicativo de fornecedores, de 0,8% a 1,6% da potência do conversor (ENERGY CENTRAL, 2025)</w:t>
+            </w:r>
+          </w:p>
+        </w:tc>
+      </w:tr>
+      <w:tr>
+        <w:tc>
+          <w:tcPr/>
+          <w:p>
+            <w:pPr>
+              <w:pStyle w:val="Compact"/>
+            </w:pPr>
+            <w:r>
+              <w:t xml:space="preserve">Disponibilidade</w:t>
+            </w:r>
+          </w:p>
+        </w:tc>
+        <w:tc>
+          <w:tcPr/>
+          <w:p>
+            <w:pPr>
+              <w:pStyle w:val="Compact"/>
+            </w:pPr>
+            <w:r>
+              <w:t xml:space="preserve">100% (sensibilidade: 97%)</w:t>
+            </w:r>
+          </w:p>
+        </w:tc>
+        <w:tc>
+          <w:tcPr/>
+          <w:p>
+            <w:pPr>
+              <w:pStyle w:val="Compact"/>
+            </w:pPr>
+            <w:r>
+              <w:t xml:space="preserve">Portaria MME nº 136/2026: disponibilidade integral, com isenção de penalidade para a indisponibilidade acordada com o ONS</w:t>
             </w:r>
           </w:p>
         </w:tc>
@@ -21354,7 +21641,7 @@
         <w:pStyle w:val="BodyText"/>
       </w:pPr>
       <w:r>
-        <w:t xml:space="preserve">Como o lucro operacional não considera tributos sobre a renda, o VPL calculado com a taxa após impostos é otimista; a taxa antes de impostos fornece uma avaliação mais conservadora. A partir do VPL, calcula-se ainda o preço de equilíbrio do hidrogênio,</w:t>
+        <w:t xml:space="preserve">Como o fluxo de caixa é calculado antes dos tributos sobre a renda, adota-se como taxa central o custo de capital antes de impostos (12,1%), que já incorpora o efeito desses tributos. A taxa após impostos (8,0%) é apresentada apenas como sensibilidade, pois, aplicada a um fluxo antes de impostos, ignora o imposto de renda e superestima o VPL. A partir do VPL, calcula-se ainda o preço de equilíbrio do hidrogênio,</w:t>
       </w:r>
       <w:r>
         <w:t xml:space="preserve"> </w:t>
@@ -21670,9 +21957,819 @@
             </m:r>
           </m:sup>
         </m:sSup>
+        <m:r>
+          <m:rPr>
+            <m:sty m:val="p"/>
+          </m:rPr>
+          <m:t>+</m:t>
+        </m:r>
+        <m:r>
+          <m:t>12</m:t>
+        </m:r>
+        <m:r>
+          <m:t> </m:t>
+        </m:r>
+        <m:r>
+          <m:t>τ</m:t>
+        </m:r>
+        <m:r>
+          <m:t> </m:t>
+        </m:r>
+        <m:sSup>
+          <m:e>
+            <m:acc>
+              <m:accPr>
+                <m:chr m:val="‾"/>
+              </m:accPr>
+              <m:e>
+                <m:r>
+                  <m:t>P</m:t>
+                </m:r>
+              </m:e>
+            </m:acc>
+          </m:e>
+          <m:sup>
+            <m:r>
+              <m:t>d</m:t>
+            </m:r>
+            <m:r>
+              <m:t>i</m:t>
+            </m:r>
+            <m:r>
+              <m:t>s</m:t>
+            </m:r>
+          </m:sup>
+        </m:sSup>
       </m:oMath>
       <w:r>
-        <w:t xml:space="preserve">. A potência ofertada passa a ser dada pela Equação (3.42):</w:t>
+        <w:t xml:space="preserve">, que inclui o capital, o O&amp;M fixo com a reposição parcial de módulos e o uso da rede. Nessa decisão, o lucro operacional</w:t>
+      </w:r>
+      <w:r>
+        <w:t xml:space="preserve"> </w:t>
+      </w:r>
+      <m:oMath>
+        <m:r>
+          <m:t>Q</m:t>
+        </m:r>
+        <m:r>
+          <m:rPr>
+            <m:sty m:val="p"/>
+          </m:rPr>
+          <m:t>(</m:t>
+        </m:r>
+        <m:r>
+          <m:t>P</m:t>
+        </m:r>
+        <m:r>
+          <m:rPr>
+            <m:sty m:val="p"/>
+          </m:rPr>
+          <m:t>)</m:t>
+        </m:r>
+      </m:oMath>
+      <w:r>
+        <w:t xml:space="preserve"> </w:t>
+      </w:r>
+      <w:r>
+        <w:t xml:space="preserve">da Seção 3.8.1 é ajustado em dois pontos, conforme a Equação (3.42): devolve-se o custo de degradação do módulo LRCAP, cujo desgaste já está no investimento e no O&amp;M fixo (Seção 3.5), e desconta-se o consumo auxiliar do BESS que não é custeado pela CONCAP:</w:t>
+      </w:r>
+    </w:p>
+    <w:tbl>
+      <w:tblPr>
+        <w:tblW w:w="9071" w:type="dxa"/>
+        <w:tblBorders>
+          <w:top w:val="nil"/>
+          <w:left w:val="nil"/>
+          <w:bottom w:val="nil"/>
+          <w:right w:val="nil"/>
+          <w:insideH w:val="nil"/>
+          <w:insideV w:val="nil"/>
+        </w:tblBorders>
+        <w:tblLayout w:type="fixed"/>
+        <w:tblCellMar>
+          <w:left w:w="0" w:type="dxa"/>
+          <w:right w:w="0" w:type="dxa"/>
+        </w:tblCellMar>
+      </w:tblPr>
+      <w:tblGrid>
+        <w:gridCol w:w="8071"/>
+        <w:gridCol w:w="1000"/>
+      </w:tblGrid>
+      <w:tr>
+        <w:tc>
+          <w:tcPr>
+            <w:tcW w:w="8071" w:type="dxa"/>
+            <w:vAlign w:val="center"/>
+          </w:tcPr>
+          <w:p>
+            <w:pPr>
+              <w:pStyle w:val="BodyText"/>
+            </w:pPr>
+            <m:oMathPara>
+              <m:oMathParaPr>
+                <m:jc m:val="center"/>
+              </m:oMathParaPr>
+              <m:oMath>
+                <m:sSup>
+                  <m:e>
+                    <m:r>
+                      <m:t>Q</m:t>
+                    </m:r>
+                  </m:e>
+                  <m:sup>
+                    <m:r>
+                      <m:t>i</m:t>
+                    </m:r>
+                    <m:r>
+                      <m:t>n</m:t>
+                    </m:r>
+                    <m:r>
+                      <m:t>v</m:t>
+                    </m:r>
+                  </m:sup>
+                </m:sSup>
+                <m:r>
+                  <m:rPr>
+                    <m:sty m:val="p"/>
+                  </m:rPr>
+                  <m:t>(</m:t>
+                </m:r>
+                <m:r>
+                  <m:t>P</m:t>
+                </m:r>
+                <m:r>
+                  <m:rPr>
+                    <m:sty m:val="p"/>
+                  </m:rPr>
+                  <m:t>)</m:t>
+                </m:r>
+                <m:r>
+                  <m:rPr>
+                    <m:sty m:val="p"/>
+                  </m:rPr>
+                  <m:t>=</m:t>
+                </m:r>
+                <m:r>
+                  <m:t>Q</m:t>
+                </m:r>
+                <m:r>
+                  <m:rPr>
+                    <m:sty m:val="p"/>
+                  </m:rPr>
+                  <m:t>(</m:t>
+                </m:r>
+                <m:r>
+                  <m:t>P</m:t>
+                </m:r>
+                <m:r>
+                  <m:rPr>
+                    <m:sty m:val="p"/>
+                  </m:rPr>
+                  <m:t>)</m:t>
+                </m:r>
+                <m:r>
+                  <m:rPr>
+                    <m:sty m:val="p"/>
+                  </m:rPr>
+                  <m:t>+</m:t>
+                </m:r>
+                <m:sSup>
+                  <m:e>
+                    <m:r>
+                      <m:t>c</m:t>
+                    </m:r>
+                  </m:e>
+                  <m:sup>
+                    <m:r>
+                      <m:t>d</m:t>
+                    </m:r>
+                    <m:r>
+                      <m:t>e</m:t>
+                    </m:r>
+                    <m:r>
+                      <m:t>g</m:t>
+                    </m:r>
+                  </m:sup>
+                </m:sSup>
+                <m:sSup>
+                  <m:e>
+                    <m:r>
+                      <m:t>E</m:t>
+                    </m:r>
+                  </m:e>
+                  <m:sup>
+                    <m:r>
+                      <m:t>o</m:t>
+                    </m:r>
+                    <m:r>
+                      <m:t>n</m:t>
+                    </m:r>
+                    <m:r>
+                      <m:t>s</m:t>
+                    </m:r>
+                  </m:sup>
+                </m:sSup>
+                <m:r>
+                  <m:t>P</m:t>
+                </m:r>
+                <m:r>
+                  <m:rPr>
+                    <m:sty m:val="p"/>
+                  </m:rPr>
+                  <m:t>−</m:t>
+                </m:r>
+                <m:acc>
+                  <m:accPr>
+                    <m:chr m:val="‾"/>
+                  </m:accPr>
+                  <m:e>
+                    <m:r>
+                      <m:t>λ</m:t>
+                    </m:r>
+                  </m:e>
+                </m:acc>
+                <m:d>
+                  <m:dPr>
+                    <m:begChr m:val="["/>
+                    <m:sepChr m:val=""/>
+                    <m:endChr m:val="]"/>
+                    <m:grow/>
+                  </m:dPr>
+                  <m:e>
+                    <m:r>
+                      <m:t>a</m:t>
+                    </m:r>
+                    <m:r>
+                      <m:t>H</m:t>
+                    </m:r>
+                    <m:d>
+                      <m:dPr>
+                        <m:begChr m:val="("/>
+                        <m:sepChr m:val=""/>
+                        <m:endChr m:val=")"/>
+                        <m:grow/>
+                      </m:dPr>
+                      <m:e>
+                        <m:sSup>
+                          <m:e>
+                            <m:acc>
+                              <m:accPr>
+                                <m:chr m:val="‾"/>
+                              </m:accPr>
+                              <m:e>
+                                <m:r>
+                                  <m:t>P</m:t>
+                                </m:r>
+                              </m:e>
+                            </m:acc>
+                          </m:e>
+                          <m:sup>
+                            <m:r>
+                              <m:t>d</m:t>
+                            </m:r>
+                            <m:r>
+                              <m:t>i</m:t>
+                            </m:r>
+                            <m:r>
+                              <m:t>s</m:t>
+                            </m:r>
+                          </m:sup>
+                        </m:sSup>
+                        <m:r>
+                          <m:rPr>
+                            <m:sty m:val="p"/>
+                          </m:rPr>
+                          <m:t>−</m:t>
+                        </m:r>
+                        <m:r>
+                          <m:t>P</m:t>
+                        </m:r>
+                      </m:e>
+                    </m:d>
+                    <m:r>
+                      <m:rPr>
+                        <m:sty m:val="p"/>
+                      </m:rPr>
+                      <m:t>+</m:t>
+                    </m:r>
+                    <m:r>
+                      <m:rPr>
+                        <m:sty m:val="p"/>
+                      </m:rPr>
+                      <m:t>max</m:t>
+                    </m:r>
+                    <m:r>
+                      <m:t>​</m:t>
+                    </m:r>
+                    <m:d>
+                      <m:dPr>
+                        <m:begChr m:val="("/>
+                        <m:sepChr m:val=""/>
+                        <m:endChr m:val=")"/>
+                        <m:grow/>
+                      </m:dPr>
+                      <m:e>
+                        <m:r>
+                          <m:t>0</m:t>
+                        </m:r>
+                        <m:r>
+                          <m:rPr>
+                            <m:sty m:val="p"/>
+                          </m:rPr>
+                          <m:t>,</m:t>
+                        </m:r>
+                        <m:r>
+                          <m:t> </m:t>
+                        </m:r>
+                        <m:r>
+                          <m:t>a</m:t>
+                        </m:r>
+                        <m:r>
+                          <m:t>H</m:t>
+                        </m:r>
+                        <m:r>
+                          <m:rPr>
+                            <m:sty m:val="p"/>
+                          </m:rPr>
+                          <m:t>−</m:t>
+                        </m:r>
+                        <m:r>
+                          <m:t>ϕ</m:t>
+                        </m:r>
+                        <m:sSup>
+                          <m:e>
+                            <m:r>
+                              <m:t>E</m:t>
+                            </m:r>
+                          </m:e>
+                          <m:sup>
+                            <m:r>
+                              <m:t>o</m:t>
+                            </m:r>
+                            <m:r>
+                              <m:t>n</m:t>
+                            </m:r>
+                            <m:r>
+                              <m:t>s</m:t>
+                            </m:r>
+                          </m:sup>
+                        </m:sSup>
+                      </m:e>
+                    </m:d>
+                    <m:r>
+                      <m:t>P</m:t>
+                    </m:r>
+                  </m:e>
+                </m:d>
+              </m:oMath>
+            </m:oMathPara>
+          </w:p>
+        </w:tc>
+        <w:tc>
+          <w:tcPr>
+            <w:tcW w:w="1000" w:type="dxa"/>
+            <w:vAlign w:val="center"/>
+          </w:tcPr>
+          <w:p>
+            <w:pPr>
+              <w:pStyle w:val="NumeroEquacao"/>
+            </w:pPr>
+            <w:r>
+              <w:t>(3.42)</w:t>
+            </w:r>
+          </w:p>
+        </w:tc>
+      </w:tr>
+    </w:tbl>
+    <w:p>
+      <w:pPr>
+        <w:pStyle w:val="FirstParagraph"/>
+      </w:pPr>
+      <w:r>
+        <w:t xml:space="preserve">em que</w:t>
+      </w:r>
+      <w:r>
+        <w:t xml:space="preserve"> </w:t>
+      </w:r>
+      <m:oMath>
+        <m:sSup>
+          <m:e>
+            <m:r>
+              <m:t>E</m:t>
+            </m:r>
+          </m:e>
+          <m:sup>
+            <m:r>
+              <m:t>o</m:t>
+            </m:r>
+            <m:r>
+              <m:t>n</m:t>
+            </m:r>
+            <m:r>
+              <m:t>s</m:t>
+            </m:r>
+          </m:sup>
+        </m:sSup>
+      </m:oMath>
+      <w:r>
+        <w:t xml:space="preserve"> </w:t>
+      </w:r>
+      <w:r>
+        <w:t xml:space="preserve">é a energia injetada pelo módulo LRCAP por MW contratado em um ano,</w:t>
+      </w:r>
+      <w:r>
+        <w:t xml:space="preserve"> </w:t>
+      </w:r>
+      <m:oMath>
+        <m:r>
+          <m:t>a</m:t>
+        </m:r>
+      </m:oMath>
+      <w:r>
+        <w:t xml:space="preserve"> </w:t>
+      </w:r>
+      <w:r>
+        <w:t xml:space="preserve">é o consumo auxiliar em fração da potência,</w:t>
+      </w:r>
+      <w:r>
+        <w:t xml:space="preserve"> </w:t>
+      </w:r>
+      <m:oMath>
+        <m:r>
+          <m:t>H</m:t>
+        </m:r>
+      </m:oMath>
+      <w:r>
+        <w:t xml:space="preserve"> </w:t>
+      </w:r>
+      <w:r>
+        <w:t xml:space="preserve">é o número de horas do ano e</w:t>
+      </w:r>
+      <w:r>
+        <w:t xml:space="preserve"> </w:t>
+      </w:r>
+      <m:oMath>
+        <m:acc>
+          <m:accPr>
+            <m:chr m:val="‾"/>
+          </m:accPr>
+          <m:e>
+            <m:r>
+              <m:t>λ</m:t>
+            </m:r>
+          </m:e>
+        </m:acc>
+      </m:oMath>
+      <w:r>
+        <w:t xml:space="preserve"> </w:t>
+      </w:r>
+      <w:r>
+        <w:t xml:space="preserve">é o PLD médio. O primeiro termo entre colchetes é o consumo do módulo mercantil, pago pelo empreendedor. O segundo é a parcela do consumo do módulo LRCAP que, medida no seu ponto de medição e contada como recarga, excede a folga</w:t>
+      </w:r>
+      <w:r>
+        <w:t xml:space="preserve"> </w:t>
+      </w:r>
+      <m:oMath>
+        <m:r>
+          <m:t>ϕ</m:t>
+        </m:r>
+        <m:sSup>
+          <m:e>
+            <m:r>
+              <m:t>E</m:t>
+            </m:r>
+          </m:e>
+          <m:sup>
+            <m:r>
+              <m:t>o</m:t>
+            </m:r>
+            <m:r>
+              <m:t>n</m:t>
+            </m:r>
+            <m:r>
+              <m:t>s</m:t>
+            </m:r>
+          </m:sup>
+        </m:sSup>
+      </m:oMath>
+      <w:r>
+        <w:t xml:space="preserve"> </w:t>
+      </w:r>
+      <w:r>
+        <w:t xml:space="preserve">entre a recarga custeada pela CONCAP,</w:t>
+      </w:r>
+      <w:r>
+        <w:t xml:space="preserve"> </w:t>
+      </w:r>
+      <m:oMath>
+        <m:sSup>
+          <m:e>
+            <m:r>
+              <m:t>E</m:t>
+            </m:r>
+          </m:e>
+          <m:sup>
+            <m:r>
+              <m:t>o</m:t>
+            </m:r>
+            <m:r>
+              <m:t>n</m:t>
+            </m:r>
+            <m:r>
+              <m:t>s</m:t>
+            </m:r>
+          </m:sup>
+        </m:sSup>
+        <m:r>
+          <m:rPr>
+            <m:sty m:val="p"/>
+          </m:rPr>
+          <m:t>/</m:t>
+        </m:r>
+        <m:sSup>
+          <m:e>
+            <m:r>
+              <m:rPr>
+                <m:sty m:val="p"/>
+              </m:rPr>
+              <m:t>R</m:t>
+            </m:r>
+            <m:r>
+              <m:rPr>
+                <m:sty m:val="p"/>
+              </m:rPr>
+              <m:t>T</m:t>
+            </m:r>
+            <m:r>
+              <m:rPr>
+                <m:sty m:val="p"/>
+              </m:rPr>
+              <m:t>E</m:t>
+            </m:r>
+          </m:e>
+          <m:sup>
+            <m:r>
+              <m:t>r</m:t>
+            </m:r>
+            <m:r>
+              <m:t>e</m:t>
+            </m:r>
+            <m:r>
+              <m:t>f</m:t>
+            </m:r>
+          </m:sup>
+        </m:sSup>
+      </m:oMath>
+      <w:r>
+        <w:t xml:space="preserve">, e a recarga necessária,</w:t>
+      </w:r>
+      <w:r>
+        <w:t xml:space="preserve"> </w:t>
+      </w:r>
+      <m:oMath>
+        <m:sSup>
+          <m:e>
+            <m:r>
+              <m:t>E</m:t>
+            </m:r>
+          </m:e>
+          <m:sup>
+            <m:r>
+              <m:t>o</m:t>
+            </m:r>
+            <m:r>
+              <m:t>n</m:t>
+            </m:r>
+            <m:r>
+              <m:t>s</m:t>
+            </m:r>
+          </m:sup>
+        </m:sSup>
+        <m:r>
+          <m:rPr>
+            <m:sty m:val="p"/>
+          </m:rPr>
+          <m:t>/</m:t>
+        </m:r>
+        <m:r>
+          <m:rPr>
+            <m:sty m:val="p"/>
+          </m:rPr>
+          <m:t>(</m:t>
+        </m:r>
+        <m:sSup>
+          <m:e>
+            <m:r>
+              <m:t>η</m:t>
+            </m:r>
+          </m:e>
+          <m:sup>
+            <m:r>
+              <m:t>c</m:t>
+            </m:r>
+            <m:r>
+              <m:t>h</m:t>
+            </m:r>
+          </m:sup>
+        </m:sSup>
+        <m:sSup>
+          <m:e>
+            <m:r>
+              <m:t>η</m:t>
+            </m:r>
+          </m:e>
+          <m:sup>
+            <m:r>
+              <m:t>d</m:t>
+            </m:r>
+            <m:r>
+              <m:t>i</m:t>
+            </m:r>
+            <m:r>
+              <m:t>s</m:t>
+            </m:r>
+          </m:sup>
+        </m:sSup>
+        <m:r>
+          <m:rPr>
+            <m:sty m:val="p"/>
+          </m:rPr>
+          <m:t>)</m:t>
+        </m:r>
+      </m:oMath>
+      <w:r>
+        <w:t xml:space="preserve">, isto é,</w:t>
+      </w:r>
+      <w:r>
+        <w:t xml:space="preserve"> </w:t>
+      </w:r>
+      <m:oMath>
+        <m:r>
+          <m:t>ϕ</m:t>
+        </m:r>
+        <m:r>
+          <m:rPr>
+            <m:sty m:val="p"/>
+          </m:rPr>
+          <m:t>=</m:t>
+        </m:r>
+        <m:r>
+          <m:t>1</m:t>
+        </m:r>
+        <m:r>
+          <m:rPr>
+            <m:sty m:val="p"/>
+          </m:rPr>
+          <m:t>/</m:t>
+        </m:r>
+        <m:sSup>
+          <m:e>
+            <m:r>
+              <m:rPr>
+                <m:sty m:val="p"/>
+              </m:rPr>
+              <m:t>R</m:t>
+            </m:r>
+            <m:r>
+              <m:rPr>
+                <m:sty m:val="p"/>
+              </m:rPr>
+              <m:t>T</m:t>
+            </m:r>
+            <m:r>
+              <m:rPr>
+                <m:sty m:val="p"/>
+              </m:rPr>
+              <m:t>E</m:t>
+            </m:r>
+          </m:e>
+          <m:sup>
+            <m:r>
+              <m:t>r</m:t>
+            </m:r>
+            <m:r>
+              <m:t>e</m:t>
+            </m:r>
+            <m:r>
+              <m:t>f</m:t>
+            </m:r>
+          </m:sup>
+        </m:sSup>
+        <m:r>
+          <m:rPr>
+            <m:sty m:val="p"/>
+          </m:rPr>
+          <m:t>−</m:t>
+        </m:r>
+        <m:r>
+          <m:t>1</m:t>
+        </m:r>
+        <m:r>
+          <m:rPr>
+            <m:sty m:val="p"/>
+          </m:rPr>
+          <m:t>/</m:t>
+        </m:r>
+        <m:r>
+          <m:rPr>
+            <m:sty m:val="p"/>
+          </m:rPr>
+          <m:t>(</m:t>
+        </m:r>
+        <m:sSup>
+          <m:e>
+            <m:r>
+              <m:t>η</m:t>
+            </m:r>
+          </m:e>
+          <m:sup>
+            <m:r>
+              <m:t>c</m:t>
+            </m:r>
+            <m:r>
+              <m:t>h</m:t>
+            </m:r>
+          </m:sup>
+        </m:sSup>
+        <m:sSup>
+          <m:e>
+            <m:r>
+              <m:t>η</m:t>
+            </m:r>
+          </m:e>
+          <m:sup>
+            <m:r>
+              <m:t>d</m:t>
+            </m:r>
+            <m:r>
+              <m:t>i</m:t>
+            </m:r>
+            <m:r>
+              <m:t>s</m:t>
+            </m:r>
+          </m:sup>
+        </m:sSup>
+        <m:r>
+          <m:rPr>
+            <m:sty m:val="p"/>
+          </m:rPr>
+          <m:t>)</m:t>
+        </m:r>
+      </m:oMath>
+      <w:r>
+        <w:t xml:space="preserve"> </w:t>
+      </w:r>
+      <w:r>
+        <w:t xml:space="preserve">(BRASIL, 2026, art. 9º, §§ 7º e 8º). Com despacho diário,</w:t>
+      </w:r>
+      <w:r>
+        <w:t xml:space="preserve"> </w:t>
+      </w:r>
+      <m:oMath>
+        <m:sSup>
+          <m:e>
+            <m:r>
+              <m:t>E</m:t>
+            </m:r>
+          </m:e>
+          <m:sup>
+            <m:r>
+              <m:t>o</m:t>
+            </m:r>
+            <m:r>
+              <m:t>n</m:t>
+            </m:r>
+            <m:r>
+              <m:t>s</m:t>
+            </m:r>
+          </m:sup>
+        </m:sSup>
+        <m:r>
+          <m:rPr>
+            <m:sty m:val="p"/>
+          </m:rPr>
+          <m:t>≈</m:t>
+        </m:r>
+        <m:r>
+          <m:t>1.461</m:t>
+        </m:r>
+      </m:oMath>
+      <w:r>
+        <w:t xml:space="preserve"> </w:t>
+      </w:r>
+      <w:r>
+        <w:t xml:space="preserve">MWh/MW, a folga é de cerca de 100 MWh/MW por ano e cobre um consumo auxiliar de até 1,1% da potência. A receita fixa é multiplicada pela disponibilidade</w:t>
+      </w:r>
+      <w:r>
+        <w:t xml:space="preserve"> </w:t>
+      </w:r>
+      <m:oMath>
+        <m:r>
+          <m:t>d</m:t>
+        </m:r>
+      </m:oMath>
+      <w:r>
+        <w:t xml:space="preserve">, e a potência ofertada passa a ser dada pela Equação (3.43):</w:t>
       </w:r>
     </w:p>
     <w:tbl>
@@ -21842,6 +22939,9 @@
                                 <m:t>R</m:t>
                               </m:r>
                               <m:r>
+                                <m:t>d</m:t>
+                              </m:r>
+                              <m:r>
                                 <m:t>P</m:t>
                               </m:r>
                               <m:r>
@@ -21850,9 +22950,24 @@
                                 </m:rPr>
                                 <m:t>+</m:t>
                               </m:r>
-                              <m:r>
-                                <m:t>Q</m:t>
-                              </m:r>
+                              <m:sSup>
+                                <m:e>
+                                  <m:r>
+                                    <m:t>Q</m:t>
+                                  </m:r>
+                                </m:e>
+                                <m:sup>
+                                  <m:r>
+                                    <m:t>i</m:t>
+                                  </m:r>
+                                  <m:r>
+                                    <m:t>n</m:t>
+                                  </m:r>
+                                  <m:r>
+                                    <m:t>v</m:t>
+                                  </m:r>
+                                </m:sup>
+                              </m:sSup>
                               <m:r>
                                 <m:rPr>
                                   <m:sty m:val="p"/>
@@ -21933,6 +23048,9 @@
                                 <m:t>R</m:t>
                               </m:r>
                               <m:r>
+                                <m:t>d</m:t>
+                              </m:r>
+                              <m:r>
                                 <m:t>P</m:t>
                               </m:r>
                               <m:r>
@@ -21941,9 +23059,24 @@
                                 </m:rPr>
                                 <m:t>+</m:t>
                               </m:r>
-                              <m:r>
-                                <m:t>Q</m:t>
-                              </m:r>
+                              <m:sSup>
+                                <m:e>
+                                  <m:r>
+                                    <m:t>Q</m:t>
+                                  </m:r>
+                                </m:e>
+                                <m:sup>
+                                  <m:r>
+                                    <m:t>i</m:t>
+                                  </m:r>
+                                  <m:r>
+                                    <m:t>n</m:t>
+                                  </m:r>
+                                  <m:r>
+                                    <m:t>v</m:t>
+                                  </m:r>
+                                </m:sup>
+                              </m:sSup>
                               <m:r>
                                 <m:rPr>
                                   <m:sty m:val="p"/>
@@ -22049,7 +23182,7 @@
               <w:pStyle w:val="NumeroEquacao"/>
             </w:pPr>
             <w:r>
-              <w:t>(3.42)</w:t>
+              <w:t>(3.43)</w:t>
             </w:r>
           </w:p>
         </w:tc>
@@ -22158,7 +23291,7 @@
         </m:r>
       </m:oMath>
       <w:r>
-        <w:t xml:space="preserve">. Ele é calculado para as três faixas de investimento e para as duas taxas de desconto do Quadro 3.3.</w:t>
+        <w:t xml:space="preserve">. Ele é calculado com resolução de R$ 1 mil/(MW·ano) para as três faixas de investimento e as duas taxas de desconto do Quadro 3.3 e, no caso central, decomposto nas parcelas de capital, O&amp;M, uso da rede, consumo auxiliar e uso mercantil, cuja soma é o lance.</w:t>
       </w:r>
     </w:p>
     <w:bookmarkEnd w:id="38"/>
@@ -22317,7 +23450,7 @@
         </m:sSup>
       </m:oMath>
       <w:r>
-        <w:t xml:space="preserve">, conforme a Equação (3.43):</w:t>
+        <w:t xml:space="preserve">, conforme a Equação (3.44):</w:t>
       </w:r>
     </w:p>
     <w:tbl>
@@ -22505,7 +23638,7 @@
               <w:pStyle w:val="NumeroEquacao"/>
             </w:pPr>
             <w:r>
-              <w:t>(3.43)</w:t>
+              <w:t>(3.44)</w:t>
             </w:r>
           </w:p>
         </w:tc>
@@ -22582,7 +23715,7 @@
         <w:pStyle w:val="BodyText"/>
       </w:pPr>
       <w:r>
-        <w:t xml:space="preserve">Essa relação permite também aproximar o lance mínimo da Seção 3.8.2. No lance mínimo, a potência ofertada tende à potência total do BESS (</w:t>
+        <w:t xml:space="preserve">Essa relação vale para o BESS existente. Para o BESS a construir, ela permite aproximar o lance mínimo da Seção 3.8.2. No lance mínimo, a potência ofertada tende à potência total do BESS (</w:t>
       </w:r>
       <m:oMath>
         <m:r>
@@ -22794,17 +23927,35 @@
         </m:sSup>
       </m:oMath>
       <w:r>
-        <w:t xml:space="preserve">, e a condição de indiferença</w:t>
+        <w:t xml:space="preserve">. Como a Equação (3.42) devolve o termo de degradação,</w:t>
       </w:r>
       <w:r>
         <w:t xml:space="preserve"> </w:t>
       </w:r>
       <m:oMath>
-        <m:r>
-          <m:t>R</m:t>
-        </m:r>
-        <m:r>
-          <m:t> </m:t>
+        <m:sSup>
+          <m:e>
+            <m:r>
+              <m:t>Q</m:t>
+            </m:r>
+          </m:e>
+          <m:sup>
+            <m:r>
+              <m:t>i</m:t>
+            </m:r>
+            <m:r>
+              <m:t>n</m:t>
+            </m:r>
+            <m:r>
+              <m:t>v</m:t>
+            </m:r>
+          </m:sup>
+        </m:sSup>
+        <m:r>
+          <m:rPr>
+            <m:sty m:val="p"/>
+          </m:rPr>
+          <m:t>(</m:t>
         </m:r>
         <m:sSup>
           <m:e>
@@ -22835,17 +23986,72 @@
           <m:rPr>
             <m:sty m:val="p"/>
           </m:rPr>
-          <m:t>+</m:t>
-        </m:r>
-        <m:r>
-          <m:t>Q</m:t>
+          <m:t>)</m:t>
         </m:r>
         <m:r>
           <m:rPr>
             <m:sty m:val="p"/>
           </m:rPr>
-          <m:t>(</m:t>
-        </m:r>
+          <m:t>≈</m:t>
+        </m:r>
+        <m:sSup>
+          <m:e>
+            <m:r>
+              <m:rPr>
+                <m:sty m:val="p"/>
+              </m:rPr>
+              <m:t>Π</m:t>
+            </m:r>
+          </m:e>
+          <m:sup>
+            <m:r>
+              <m:t>0</m:t>
+            </m:r>
+          </m:sup>
+        </m:sSup>
+        <m:r>
+          <m:rPr>
+            <m:sty m:val="p"/>
+          </m:rPr>
+          <m:t>−</m:t>
+        </m:r>
+        <m:d>
+          <m:dPr>
+            <m:begChr m:val="("/>
+            <m:sepChr m:val=""/>
+            <m:endChr m:val=")"/>
+            <m:grow/>
+          </m:dPr>
+          <m:e>
+            <m:r>
+              <m:t>κ</m:t>
+            </m:r>
+            <m:r>
+              <m:rPr>
+                <m:sty m:val="p"/>
+              </m:rPr>
+              <m:t>+</m:t>
+            </m:r>
+            <m:sSup>
+              <m:e>
+                <m:r>
+                  <m:t>κ</m:t>
+                </m:r>
+              </m:e>
+              <m:sup>
+                <m:r>
+                  <m:t>a</m:t>
+                </m:r>
+                <m:r>
+                  <m:t>u</m:t>
+                </m:r>
+                <m:r>
+                  <m:t>x</m:t>
+                </m:r>
+              </m:sup>
+            </m:sSup>
+          </m:e>
+        </m:d>
         <m:sSup>
           <m:e>
             <m:acc>
@@ -22871,6 +24077,135 @@
             </m:r>
           </m:sup>
         </m:sSup>
+      </m:oMath>
+      <w:r>
+        <w:t xml:space="preserve">, em que</w:t>
+      </w:r>
+      <w:r>
+        <w:t xml:space="preserve"> </w:t>
+      </w:r>
+      <m:oMath>
+        <m:sSup>
+          <m:e>
+            <m:r>
+              <m:t>κ</m:t>
+            </m:r>
+          </m:e>
+          <m:sup>
+            <m:r>
+              <m:t>a</m:t>
+            </m:r>
+            <m:r>
+              <m:t>u</m:t>
+            </m:r>
+            <m:r>
+              <m:t>x</m:t>
+            </m:r>
+          </m:sup>
+        </m:sSup>
+      </m:oMath>
+      <w:r>
+        <w:t xml:space="preserve"> </w:t>
+      </w:r>
+      <w:r>
+        <w:t xml:space="preserve">é o consumo auxiliar não custeado, por MW. A condição de indiferença</w:t>
+      </w:r>
+      <w:r>
+        <w:t xml:space="preserve"> </w:t>
+      </w:r>
+      <m:oMath>
+        <m:r>
+          <m:t>R</m:t>
+        </m:r>
+        <m:r>
+          <m:t> </m:t>
+        </m:r>
+        <m:r>
+          <m:t>d</m:t>
+        </m:r>
+        <m:r>
+          <m:t> </m:t>
+        </m:r>
+        <m:sSup>
+          <m:e>
+            <m:acc>
+              <m:accPr>
+                <m:chr m:val="‾"/>
+              </m:accPr>
+              <m:e>
+                <m:r>
+                  <m:t>P</m:t>
+                </m:r>
+              </m:e>
+            </m:acc>
+          </m:e>
+          <m:sup>
+            <m:r>
+              <m:t>d</m:t>
+            </m:r>
+            <m:r>
+              <m:t>i</m:t>
+            </m:r>
+            <m:r>
+              <m:t>s</m:t>
+            </m:r>
+          </m:sup>
+        </m:sSup>
+        <m:r>
+          <m:rPr>
+            <m:sty m:val="p"/>
+          </m:rPr>
+          <m:t>+</m:t>
+        </m:r>
+        <m:sSup>
+          <m:e>
+            <m:r>
+              <m:t>Q</m:t>
+            </m:r>
+          </m:e>
+          <m:sup>
+            <m:r>
+              <m:t>i</m:t>
+            </m:r>
+            <m:r>
+              <m:t>n</m:t>
+            </m:r>
+            <m:r>
+              <m:t>v</m:t>
+            </m:r>
+          </m:sup>
+        </m:sSup>
+        <m:r>
+          <m:rPr>
+            <m:sty m:val="p"/>
+          </m:rPr>
+          <m:t>(</m:t>
+        </m:r>
+        <m:sSup>
+          <m:e>
+            <m:acc>
+              <m:accPr>
+                <m:chr m:val="‾"/>
+              </m:accPr>
+              <m:e>
+                <m:r>
+                  <m:t>P</m:t>
+                </m:r>
+              </m:e>
+            </m:acc>
+          </m:e>
+          <m:sup>
+            <m:r>
+              <m:t>d</m:t>
+            </m:r>
+            <m:r>
+              <m:t>i</m:t>
+            </m:r>
+            <m:r>
+              <m:t>s</m:t>
+            </m:r>
+          </m:sup>
+        </m:sSup>
         <m:r>
           <m:rPr>
             <m:sty m:val="p"/>
@@ -22930,7 +24265,7 @@
         <w:t xml:space="preserve"> </w:t>
       </w:r>
       <w:r>
-        <w:t xml:space="preserve">resulta na Equação (3.44):</w:t>
+        <w:t xml:space="preserve">resulta na Equação (3.45):</w:t>
       </w:r>
     </w:p>
     <w:tbl>
@@ -22998,131 +24333,201 @@
                     <m:type m:val="bar"/>
                   </m:fPr>
                   <m:num>
-                    <m:sSup>
-                      <m:e>
+                    <m:r>
+                      <m:t>1</m:t>
+                    </m:r>
+                  </m:num>
+                  <m:den>
+                    <m:r>
+                      <m:t>d</m:t>
+                    </m:r>
+                  </m:den>
+                </m:f>
+                <m:d>
+                  <m:dPr>
+                    <m:begChr m:val="("/>
+                    <m:sepChr m:val=""/>
+                    <m:endChr m:val=")"/>
+                    <m:grow/>
+                  </m:dPr>
+                  <m:e>
+                    <m:f>
+                      <m:fPr>
+                        <m:type m:val="bar"/>
+                      </m:fPr>
+                      <m:num>
+                        <m:sSup>
+                          <m:e>
+                            <m:r>
+                              <m:t>I</m:t>
+                            </m:r>
+                          </m:e>
+                          <m:sup>
+                            <m:r>
+                              <m:t>b</m:t>
+                            </m:r>
+                            <m:r>
+                              <m:t>e</m:t>
+                            </m:r>
+                            <m:r>
+                              <m:t>s</m:t>
+                            </m:r>
+                            <m:r>
+                              <m:t>s</m:t>
+                            </m:r>
+                          </m:sup>
+                        </m:sSup>
                         <m:r>
-                          <m:t>C</m:t>
-                        </m:r>
-                      </m:e>
-                      <m:sup>
-                        <m:r>
-                          <m:t>b</m:t>
+                          <m:rPr>
+                            <m:sty m:val="p"/>
+                          </m:rPr>
+                          <m:t>/</m:t>
                         </m:r>
                         <m:r>
-                          <m:t>e</m:t>
+                          <m:t>F</m:t>
                         </m:r>
                         <m:r>
-                          <m:t>s</m:t>
-                        </m:r>
-                        <m:r>
-                          <m:t>s</m:t>
-                        </m:r>
-                      </m:sup>
-                    </m:sSup>
-                  </m:num>
-                  <m:den>
-                    <m:sSup>
-                      <m:e>
-                        <m:acc>
-                          <m:accPr>
-                            <m:chr m:val="‾"/>
-                          </m:accPr>
-                          <m:e>
-                            <m:r>
-                              <m:t>P</m:t>
-                            </m:r>
-                          </m:e>
-                        </m:acc>
-                      </m:e>
-                      <m:sup>
-                        <m:r>
-                          <m:t>d</m:t>
+                          <m:rPr>
+                            <m:sty m:val="p"/>
+                          </m:rPr>
+                          <m:t>(</m:t>
                         </m:r>
                         <m:r>
                           <m:t>i</m:t>
                         </m:r>
                         <m:r>
-                          <m:t>s</m:t>
+                          <m:rPr>
+                            <m:sty m:val="p"/>
+                          </m:rPr>
+                          <m:t>,</m:t>
+                        </m:r>
+                        <m:r>
+                          <m:t>n</m:t>
+                        </m:r>
+                        <m:r>
+                          <m:rPr>
+                            <m:sty m:val="p"/>
+                          </m:rPr>
+                          <m:t>)</m:t>
+                        </m:r>
+                        <m:r>
+                          <m:rPr>
+                            <m:sty m:val="p"/>
+                          </m:rPr>
+                          <m:t>+</m:t>
+                        </m:r>
+                        <m:sSup>
+                          <m:e>
+                            <m:r>
+                              <m:t>C</m:t>
+                            </m:r>
+                          </m:e>
+                          <m:sup>
+                            <m:r>
+                              <m:t>o</m:t>
+                            </m:r>
+                            <m:r>
+                              <m:t>m</m:t>
+                            </m:r>
+                            <m:r>
+                              <m:rPr>
+                                <m:sty m:val="p"/>
+                              </m:rPr>
+                              <m:t>,</m:t>
+                            </m:r>
+                            <m:r>
+                              <m:t>b</m:t>
+                            </m:r>
+                            <m:r>
+                              <m:t>e</m:t>
+                            </m:r>
+                            <m:r>
+                              <m:t>s</m:t>
+                            </m:r>
+                            <m:r>
+                              <m:t>s</m:t>
+                            </m:r>
+                          </m:sup>
+                        </m:sSup>
+                      </m:num>
+                      <m:den>
+                        <m:sSup>
+                          <m:e>
+                            <m:acc>
+                              <m:accPr>
+                                <m:chr m:val="‾"/>
+                              </m:accPr>
+                              <m:e>
+                                <m:r>
+                                  <m:t>P</m:t>
+                                </m:r>
+                              </m:e>
+                            </m:acc>
+                          </m:e>
+                          <m:sup>
+                            <m:r>
+                              <m:t>d</m:t>
+                            </m:r>
+                            <m:r>
+                              <m:t>i</m:t>
+                            </m:r>
+                            <m:r>
+                              <m:t>s</m:t>
+                            </m:r>
+                          </m:sup>
+                        </m:sSup>
+                      </m:den>
+                    </m:f>
+                    <m:r>
+                      <m:rPr>
+                        <m:sty m:val="p"/>
+                      </m:rPr>
+                      <m:t>+</m:t>
+                    </m:r>
+                    <m:r>
+                      <m:t>12</m:t>
+                    </m:r>
+                    <m:r>
+                      <m:t> </m:t>
+                    </m:r>
+                    <m:r>
+                      <m:t>τ</m:t>
+                    </m:r>
+                    <m:r>
+                      <m:rPr>
+                        <m:sty m:val="p"/>
+                      </m:rPr>
+                      <m:t>+</m:t>
+                    </m:r>
+                    <m:r>
+                      <m:t>κ</m:t>
+                    </m:r>
+                    <m:r>
+                      <m:rPr>
+                        <m:sty m:val="p"/>
+                      </m:rPr>
+                      <m:t>+</m:t>
+                    </m:r>
+                    <m:sSup>
+                      <m:e>
+                        <m:r>
+                          <m:t>κ</m:t>
+                        </m:r>
+                      </m:e>
+                      <m:sup>
+                        <m:r>
+                          <m:t>a</m:t>
+                        </m:r>
+                        <m:r>
+                          <m:t>u</m:t>
+                        </m:r>
+                        <m:r>
+                          <m:t>x</m:t>
                         </m:r>
                       </m:sup>
                     </m:sSup>
-                  </m:den>
-                </m:f>
-                <m:r>
-                  <m:rPr>
-                    <m:sty m:val="p"/>
-                  </m:rPr>
-                  <m:t>+</m:t>
-                </m:r>
-                <m:sSup>
-                  <m:e>
-                    <m:r>
-                      <m:t>c</m:t>
-                    </m:r>
                   </m:e>
-                  <m:sup>
-                    <m:r>
-                      <m:t>d</m:t>
-                    </m:r>
-                    <m:r>
-                      <m:t>e</m:t>
-                    </m:r>
-                    <m:r>
-                      <m:t>g</m:t>
-                    </m:r>
-                  </m:sup>
-                </m:sSup>
-                <m:r>
-                  <m:t> </m:t>
-                </m:r>
-                <m:sSup>
-                  <m:e>
-                    <m:r>
-                      <m:t>H</m:t>
-                    </m:r>
-                  </m:e>
-                  <m:sup>
-                    <m:r>
-                      <m:t>c</m:t>
-                    </m:r>
-                    <m:r>
-                      <m:t>a</m:t>
-                    </m:r>
-                    <m:r>
-                      <m:t>p</m:t>
-                    </m:r>
-                  </m:sup>
-                </m:sSup>
-                <m:r>
-                  <m:t> </m:t>
-                </m:r>
-                <m:sSup>
-                  <m:e>
-                    <m:r>
-                      <m:t>N</m:t>
-                    </m:r>
-                  </m:e>
-                  <m:sup>
-                    <m:r>
-                      <m:t>o</m:t>
-                    </m:r>
-                    <m:r>
-                      <m:t>n</m:t>
-                    </m:r>
-                    <m:r>
-                      <m:t>s</m:t>
-                    </m:r>
-                  </m:sup>
-                </m:sSup>
-                <m:r>
-                  <m:rPr>
-                    <m:sty m:val="p"/>
-                  </m:rPr>
-                  <m:t>+</m:t>
-                </m:r>
-                <m:r>
-                  <m:t>κ</m:t>
-                </m:r>
+                </m:d>
               </m:oMath>
             </m:oMathPara>
           </w:p>
@@ -23137,7 +24542,7 @@
               <w:pStyle w:val="NumeroEquacao"/>
             </w:pPr>
             <w:r>
-              <w:t>(3.44)</w:t>
+              <w:t>(3.45)</w:t>
             </w:r>
           </w:p>
         </w:tc>
@@ -23148,7 +24553,7 @@
         <w:pStyle w:val="FirstParagraph"/>
       </w:pPr>
       <w:r>
-        <w:t xml:space="preserve">isto é, o lance mínimo de um BESS a construir corresponde aproximadamente ao seu custo anual equivalente por MW, acrescido do custo de degradação imposto pelo despacho do ONS e do custo da recarga excedente. A aproximação desconsidera o valor residual do uso mercantil da bateria e é verificada no Capítulo 4.</w:t>
+        <w:t xml:space="preserve">isto é, o lance mínimo de um BESS a construir corresponde aproximadamente ao seu custo anual equivalente por MW — capital, O&amp;M com reposição de módulos e uso da rede —, acrescido da recarga e do consumo auxiliar não custeados pela CONCAP e dividido pela disponibilidade. Como o desgaste do despacho já está no O&amp;M, o lance não depende do custo de degradação por MWh e só depende da frequência do despacho por meio do consumo auxiliar, cuja folga diminui quando o módulo é despachado menos vezes. A aproximação desconsidera o valor residual do uso mercantil da bateria e é verificada no Capítulo 4.</w:t>
       </w:r>
     </w:p>
     <w:bookmarkEnd w:id="39"/>
@@ -24161,7 +25566,7 @@
         <w:t xml:space="preserve"> </w:t>
       </w:r>
       <w:r>
-        <w:t xml:space="preserve">a receita fixa é rateada linearmente no horizonte, sem reajuste pelo Índice Nacional de Preços ao Consumidor Amplo (IPCA), sem o abatimento mensal por desempenho e sem as penalidades por indisponibilidade, cujos detalhes dependem do edital do leilão;</w:t>
+        <w:t xml:space="preserve">a receita fixa é rateada linearmente no horizonte, sem reajuste pelo Índice Nacional de Preços ao Consumidor Amplo (IPCA), sem o abatimento mensal por desempenho e sem as penalidades por indisponibilidade, cujos detalhes dependem do edital do leilão; o efeito de uma disponibilidade de 97% sobre o lance é avaliado como sensibilidade;</w:t>
       </w:r>
     </w:p>
     <w:p>
@@ -24234,7 +25639,7 @@
         <w:t xml:space="preserve"> </w:t>
       </w:r>
       <w:r>
-        <w:t xml:space="preserve">o custo de degradação do BESS é proporcional à energia descarregada, sem dependência da profundidade de descarga, e seu valor de referência (R$ 50/MWh) é inferior à estimativa baseada no custo de reposição dos módulos, o que é tratado por análise de sensibilidade;</w:t>
+        <w:t xml:space="preserve">o custo de degradação do BESS existente é proporcional à energia descarregada, sem dependência da profundidade de descarga, e seu valor de referência (R$ 50/MWh) é inferior ao custo integral de reposição dos módulos, o que é tratado por análise de sensibilidade; na decisão de construir o BESS, o desgaste do uso contratado está no O&amp;M fixo, e o uso mercantil mantém o custo por MWh, hipótese conservadora, pois o O&amp;M de referência já cobre cerca de um ciclo por dia;</w:t>
       </w:r>
     </w:p>
     <w:p>
@@ -24376,7 +25781,7 @@
         <w:t xml:space="preserve"> </w:t>
       </w:r>
       <w:r>
-        <w:t xml:space="preserve">a análise de viabilidade considera fluxo de caixa constante em termos reais, sem tributos sobre a renda, sem financiamento, sem valor residual e com custo de O&amp;M fixo hipotético, e utiliza o lucro operacional calculado com os parâmetros provisórios de operação;</w:t>
+        <w:t xml:space="preserve">a análise de viabilidade considera fluxo de caixa constante em termos reais, antes dos tributos sobre a renda e descontado à taxa antes de impostos, sem financiamento, sem benefícios fiscais e sem valor residual; o O&amp;M fixo da FV e do eletrolisador é hipotético, a TUST é a média nacional, e não a do barramento de conexão, e o consumo auxiliar é um valor indicativo; o lucro operacional é calculado com os parâmetros provisórios de operação;</w:t>
       </w:r>
     </w:p>
     <w:p>
@@ -24656,6 +26061,27 @@
         <w:pStyle w:val="Referencia"/>
       </w:pPr>
       <w:r>
+        <w:t xml:space="preserve">CENÁRIO ENERGIA.</w:t>
+      </w:r>
+      <w:r>
+        <w:t xml:space="preserve"> </w:t>
+      </w:r>
+      <w:r>
+        <w:rPr>
+          <w:b/>
+          <w:bCs/>
+        </w:rPr>
+        <w:t xml:space="preserve">ANEEL aprova marco de baterias com tarifação dupla para sistemas sem despacho do ONS</w:t>
+      </w:r>
+      <w:r>
+        <w:t xml:space="preserve">. 2 jun. 2026. Disponível em: https://cenarioenergia.com.br/2026/06/02/aneel-aprova-marco-de-baterias-com-tarifacao-dupla-para-sistemas-sem-despacho-do-ons/. Acesso em: 13 out. 2026.</w:t>
+      </w:r>
+    </w:p>
+    <w:p>
+      <w:pPr>
+        <w:pStyle w:val="Referencia"/>
+      </w:pPr>
+      <w:r>
         <w:t xml:space="preserve">CONEJO, A. J.</w:t>
       </w:r>
       <w:r>
@@ -24708,6 +26134,27 @@
         <w:pStyle w:val="Referencia"/>
       </w:pPr>
       <w:r>
+        <w:t xml:space="preserve">ENERGY CENTRAL.</w:t>
+      </w:r>
+      <w:r>
+        <w:t xml:space="preserve"> </w:t>
+      </w:r>
+      <w:r>
+        <w:rPr>
+          <w:b/>
+          <w:bCs/>
+        </w:rPr>
+        <w:t xml:space="preserve">BESS 5 MWh aux consumption</w:t>
+      </w:r>
+      <w:r>
+        <w:t xml:space="preserve">. 2025. Disponível em: https://www.energycentral.com/energy-biz/post/bess-5-mwh-aux-consumption-nB19OmDcUfffS2B. Acesso em: 13 out. 2026.</w:t>
+      </w:r>
+    </w:p>
+    <w:p>
+      <w:pPr>
+        <w:pStyle w:val="Referencia"/>
+      </w:pPr>
+      <w:r>
         <w:t xml:space="preserve">EPE – EMPRESA DE PESQUISA ENERGÉTICA.</w:t>
       </w:r>
       <w:r>
@@ -24880,6 +26327,48 @@
       </w:r>
       <w:r>
         <w:t xml:space="preserve">, v. 86, n. 6, p. 1803–1815, 2012.</w:t>
+      </w:r>
+    </w:p>
+    <w:p>
+      <w:pPr>
+        <w:pStyle w:val="Referencia"/>
+      </w:pPr>
+      <w:r>
+        <w:t xml:space="preserve">MOVIMENTO ECONÔMICO.</w:t>
+      </w:r>
+      <w:r>
+        <w:t xml:space="preserve"> </w:t>
+      </w:r>
+      <w:r>
+        <w:rPr>
+          <w:b/>
+          <w:bCs/>
+        </w:rPr>
+        <w:t xml:space="preserve">Aneel conclui tarifas de transmissão e NE sai favorecido no ciclo 2026/2027</w:t>
+      </w:r>
+      <w:r>
+        <w:t xml:space="preserve">. 29 jun. 2026. Disponível em: https://movimentoeconomico.com.br/economia/energia/2026/06/29/aneel-conclui-tarifas-de-transmissao-e-ne-sai-favorecido-no-ciclo-2026-2027/. Acesso em: 13 out. 2026.</w:t>
+      </w:r>
+    </w:p>
+    <w:p>
+      <w:pPr>
+        <w:pStyle w:val="Referencia"/>
+      </w:pPr>
+      <w:r>
+        <w:t xml:space="preserve">NREL – NATIONAL RENEWABLE ENERGY LABORATORY.</w:t>
+      </w:r>
+      <w:r>
+        <w:t xml:space="preserve"> </w:t>
+      </w:r>
+      <w:r>
+        <w:rPr>
+          <w:b/>
+          <w:bCs/>
+        </w:rPr>
+        <w:t xml:space="preserve">2024 Annual Technology Baseline</w:t>
+      </w:r>
+      <w:r>
+        <w:t xml:space="preserve">: utility-scale battery storage. Golden: NREL, 2024. Disponível em: https://atb.nrel.gov/electricity/2024/utility-scale_battery_storage. Acesso em: 13 out. 2026.</w:t>
       </w:r>
     </w:p>
     <w:p>

</xml_diff>

<commit_message>
Lance do BESS dimensionado para o contrato e da bateria isolada
- viabilidade.py: lance_dimensionado() e dimensionamento(): BESS com potência igual à
  contratada e energia rho·P (sem módulo mercantil), no híbrido (conexão compartilhada
  com a FV) e numa bateria isolada; saída lance_dimensionamento.csv.
- Capítulo 3: método do dimensionamento e da bateria isolada (Seção 3.8.3) e hipótese a).

Co-Authored-By: Claude Opus 5.5 <noreply@anthropic.com>
Claude-Session: https://claude.ai/code/session_01YFtn9hiQUHbNLSX7rUNYuK
</commit_message>
<xml_diff>
--- a/docs/dissertacao/cap3_metodologia.docx
+++ b/docs/dissertacao/cap3_metodologia.docx
@@ -80,7 +80,7 @@
         </w:numPr>
       </w:pPr>
       <w:r>
-        <w:t xml:space="preserve">as capacidades instaladas da usina FV, do BESS e do eletrolisador são dados de entrada, e não variáveis de decisão — o dimensionamento ótimo dos equipamentos está fora do escopo desta etapa, e o efeito do tamanho do eletrolisador e do tanque de hidrogênio é avaliado por análise de sensibilidade (Seção 3.8.4);</w:t>
+        <w:t xml:space="preserve">as capacidades instaladas da usina FV, do BESS e do eletrolisador são dados de entrada, e não variáveis de decisão — o dimensionamento ótimo dos equipamentos está fora do escopo desta etapa, e o efeito do tamanho do eletrolisador e do tanque de hidrogênio é avaliado por análise de sensibilidade (Seção 3.8.4); para o BESS a construir, avalia-se ainda a bateria dimensionada para o contrato do leilão (Seção 3.8.3);</w:t>
       </w:r>
     </w:p>
     <w:p>
@@ -25014,6 +25014,376 @@
       </w:pPr>
       <w:r>
         <w:t xml:space="preserve">isto é, o lance mínimo de um BESS a construir corresponde aproximadamente ao seu custo anual equivalente por MW — capital, O&amp;M com reposição de módulos e uso da rede —, acrescido da recarga e do consumo auxiliar não custeados pela CONCAP e dividido pela disponibilidade. Como o desgaste do despacho já está no O&amp;M, o lance não depende do custo de degradação por MWh e só depende da frequência do despacho por meio do consumo auxiliar, cuja folga diminui quando o módulo é despachado menos vezes. A aproximação desconsidera o valor residual do uso mercantil da bateria e é verificada no Capítulo 4.</w:t>
+      </w:r>
+    </w:p>
+    <w:p>
+      <w:pPr>
+        <w:pStyle w:val="BodyText"/>
+      </w:pPr>
+      <w:r>
+        <w:rPr>
+          <w:b/>
+          <w:bCs/>
+        </w:rPr>
+        <w:t xml:space="preserve">Dimensionamento do BESS e bateria isolada.</w:t>
+      </w:r>
+      <w:r>
+        <w:t xml:space="preserve"> </w:t>
+      </w:r>
+      <w:r>
+        <w:t xml:space="preserve">As curvas de oferta são obtidas para o BESS de referência, de 60 MW e 300 MWh. Para um BESS construído para o leilão, porém, a potência e a energia podem ser escolhidas junto com o lance. Avalia-se, por isso, o BESS dimensionado para o contrato, com</w:t>
+      </w:r>
+      <w:r>
+        <w:t xml:space="preserve"> </w:t>
+      </w:r>
+      <m:oMath>
+        <m:sSup>
+          <m:e>
+            <m:acc>
+              <m:accPr>
+                <m:chr m:val="‾"/>
+              </m:accPr>
+              <m:e>
+                <m:r>
+                  <m:t>P</m:t>
+                </m:r>
+              </m:e>
+            </m:acc>
+          </m:e>
+          <m:sup>
+            <m:r>
+              <m:t>d</m:t>
+            </m:r>
+            <m:r>
+              <m:t>i</m:t>
+            </m:r>
+            <m:r>
+              <m:t>s</m:t>
+            </m:r>
+          </m:sup>
+        </m:sSup>
+        <m:r>
+          <m:rPr>
+            <m:sty m:val="p"/>
+          </m:rPr>
+          <m:t>=</m:t>
+        </m:r>
+        <m:sSup>
+          <m:e>
+            <m:r>
+              <m:t>P</m:t>
+            </m:r>
+          </m:e>
+          <m:sup>
+            <m:r>
+              <m:t>c</m:t>
+            </m:r>
+            <m:r>
+              <m:t>a</m:t>
+            </m:r>
+            <m:r>
+              <m:t>p</m:t>
+            </m:r>
+          </m:sup>
+        </m:sSup>
+      </m:oMath>
+      <w:r>
+        <w:t xml:space="preserve"> </w:t>
+      </w:r>
+      <w:r>
+        <w:t xml:space="preserve">e</w:t>
+      </w:r>
+      <w:r>
+        <w:t xml:space="preserve"> </w:t>
+      </w:r>
+      <m:oMath>
+        <m:sSup>
+          <m:e>
+            <m:r>
+              <m:t>E</m:t>
+            </m:r>
+          </m:e>
+          <m:sup>
+            <m:r>
+              <m:t>t</m:t>
+            </m:r>
+            <m:r>
+              <m:t>o</m:t>
+            </m:r>
+            <m:r>
+              <m:t>t</m:t>
+            </m:r>
+          </m:sup>
+        </m:sSup>
+        <m:r>
+          <m:rPr>
+            <m:sty m:val="p"/>
+          </m:rPr>
+          <m:t>=</m:t>
+        </m:r>
+        <m:r>
+          <m:t>ρ</m:t>
+        </m:r>
+        <m:sSup>
+          <m:e>
+            <m:r>
+              <m:t>P</m:t>
+            </m:r>
+          </m:e>
+          <m:sup>
+            <m:r>
+              <m:t>c</m:t>
+            </m:r>
+            <m:r>
+              <m:t>a</m:t>
+            </m:r>
+            <m:r>
+              <m:t>p</m:t>
+            </m:r>
+          </m:sup>
+        </m:sSup>
+      </m:oMath>
+      <w:r>
+        <w:t xml:space="preserve">, isto é, um módulo LRCAP sem módulo mercantil. Como a energia desse módulo é liquidada na CONCAP, ele não altera a operação da usina, e</w:t>
+      </w:r>
+      <w:r>
+        <w:t xml:space="preserve"> </w:t>
+      </w:r>
+      <m:oMath>
+        <m:sSup>
+          <m:e>
+            <m:r>
+              <m:t>Q</m:t>
+            </m:r>
+          </m:e>
+          <m:sup>
+            <m:r>
+              <m:t>i</m:t>
+            </m:r>
+            <m:r>
+              <m:t>n</m:t>
+            </m:r>
+            <m:r>
+              <m:t>v</m:t>
+            </m:r>
+          </m:sup>
+        </m:sSup>
+        <m:r>
+          <m:rPr>
+            <m:sty m:val="p"/>
+          </m:rPr>
+          <m:t>(</m:t>
+        </m:r>
+        <m:sSup>
+          <m:e>
+            <m:r>
+              <m:t>P</m:t>
+            </m:r>
+          </m:e>
+          <m:sup>
+            <m:r>
+              <m:t>c</m:t>
+            </m:r>
+            <m:r>
+              <m:t>a</m:t>
+            </m:r>
+            <m:r>
+              <m:t>p</m:t>
+            </m:r>
+          </m:sup>
+        </m:sSup>
+        <m:r>
+          <m:rPr>
+            <m:sty m:val="p"/>
+          </m:rPr>
+          <m:t>)</m:t>
+        </m:r>
+        <m:r>
+          <m:rPr>
+            <m:sty m:val="p"/>
+          </m:rPr>
+          <m:t>=</m:t>
+        </m:r>
+        <m:sSup>
+          <m:e>
+            <m:r>
+              <m:rPr>
+                <m:sty m:val="p"/>
+              </m:rPr>
+              <m:t>Π</m:t>
+            </m:r>
+          </m:e>
+          <m:sup>
+            <m:r>
+              <m:t>0</m:t>
+            </m:r>
+          </m:sup>
+        </m:sSup>
+        <m:r>
+          <m:rPr>
+            <m:sty m:val="p"/>
+          </m:rPr>
+          <m:t>−</m:t>
+        </m:r>
+        <m:sSup>
+          <m:e>
+            <m:r>
+              <m:t>κ</m:t>
+            </m:r>
+          </m:e>
+          <m:sup>
+            <m:r>
+              <m:t>a</m:t>
+            </m:r>
+            <m:r>
+              <m:t>u</m:t>
+            </m:r>
+            <m:r>
+              <m:t>x</m:t>
+            </m:r>
+          </m:sup>
+        </m:sSup>
+        <m:sSup>
+          <m:e>
+            <m:r>
+              <m:t>P</m:t>
+            </m:r>
+          </m:e>
+          <m:sup>
+            <m:r>
+              <m:t>c</m:t>
+            </m:r>
+            <m:r>
+              <m:t>a</m:t>
+            </m:r>
+            <m:r>
+              <m:t>p</m:t>
+            </m:r>
+          </m:sup>
+        </m:sSup>
+      </m:oMath>
+      <w:r>
+        <w:t xml:space="preserve">. O lance mínimo é, então, dado exatamente pela Equação (3.45), com</w:t>
+      </w:r>
+      <w:r>
+        <w:t xml:space="preserve"> </w:t>
+      </w:r>
+      <m:oMath>
+        <m:r>
+          <m:t>κ</m:t>
+        </m:r>
+        <m:r>
+          <m:rPr>
+            <m:sty m:val="p"/>
+          </m:rPr>
+          <m:t>=</m:t>
+        </m:r>
+        <m:r>
+          <m:t>0</m:t>
+        </m:r>
+      </m:oMath>
+      <w:r>
+        <w:t xml:space="preserve">, para cada potência entre</w:t>
+      </w:r>
+      <w:r>
+        <w:t xml:space="preserve"> </w:t>
+      </w:r>
+      <m:oMath>
+        <m:sSup>
+          <m:e>
+            <m:bar>
+              <m:barPr>
+                <m:pos m:val="bot"/>
+              </m:barPr>
+              <m:e>
+                <m:r>
+                  <m:t>P</m:t>
+                </m:r>
+              </m:e>
+            </m:bar>
+          </m:e>
+          <m:sup>
+            <m:r>
+              <m:t>c</m:t>
+            </m:r>
+            <m:r>
+              <m:t>a</m:t>
+            </m:r>
+            <m:r>
+              <m:t>p</m:t>
+            </m:r>
+          </m:sup>
+        </m:sSup>
+      </m:oMath>
+      <w:r>
+        <w:t xml:space="preserve"> </w:t>
+      </w:r>
+      <w:r>
+        <w:t xml:space="preserve">e a potência do BESS de referência. Para isolar o papel do arranjo híbrido, o mesmo cálculo é feito para uma bateria isolada, sem a usina FV e o eletrolisador, cujo montante de uso de injeção é a própria potência (</w:t>
+      </w:r>
+      <m:oMath>
+        <m:sSup>
+          <m:e>
+            <m:r>
+              <m:t>M</m:t>
+            </m:r>
+          </m:e>
+          <m:sup>
+            <m:r>
+              <m:t>0</m:t>
+            </m:r>
+          </m:sup>
+        </m:sSup>
+        <m:r>
+          <m:rPr>
+            <m:sty m:val="p"/>
+          </m:rPr>
+          <m:t>=</m:t>
+        </m:r>
+        <m:r>
+          <m:t>0</m:t>
+        </m:r>
+      </m:oMath>
+      <w:r>
+        <w:t xml:space="preserve"> </w:t>
+      </w:r>
+      <w:r>
+        <w:t xml:space="preserve">e</w:t>
+      </w:r>
+      <w:r>
+        <w:t xml:space="preserve"> </w:t>
+      </w:r>
+      <m:oMath>
+        <m:r>
+          <m:t>M</m:t>
+        </m:r>
+        <m:r>
+          <m:rPr>
+            <m:sty m:val="p"/>
+          </m:rPr>
+          <m:t>=</m:t>
+        </m:r>
+        <m:sSup>
+          <m:e>
+            <m:r>
+              <m:t>P</m:t>
+            </m:r>
+          </m:e>
+          <m:sup>
+            <m:r>
+              <m:t>c</m:t>
+            </m:r>
+            <m:r>
+              <m:t>a</m:t>
+            </m:r>
+            <m:r>
+              <m:t>p</m:t>
+            </m:r>
+          </m:sup>
+        </m:sSup>
+      </m:oMath>
+      <w:r>
+        <w:t xml:space="preserve">). Como, no lance, ambas operam apenas o módulo LRCAP, a diferença entre os dois lances mede o valor do compartilhamento da conexão. O valor do módulo mercantil é avaliado comparando-se o lucro que ele acrescenta na curva de oferta com o seu custo anual.</w:t>
       </w:r>
     </w:p>
     <w:bookmarkEnd w:id="39"/>

</xml_diff>

<commit_message>
Capítulos 3 e 4: limite de emissões do hidrogênio
Cap. 3: restrições (3.20) e (3.21), parâmetros, fator de emissão horário
do SIN nos dados de entrada, casos do Quadro 3.2, hipótese n) e novas
referências (Lei 14.948/2024, IPCC, MCTI, ONS, UE, Schlömer et al.);
referências reordenadas.
Cap. 4: nova Subseção 4.3.5 com a Figura 4.6 e a Tabela 4.9, casos na
Tabela 4.2 e síntese; figuras, tabelas e subseções seguintes renumeradas
e referências cruzadas corrigidas.

Co-Authored-By: Claude Opus 5.5 <noreply@anthropic.com>
Claude-Session: https://claude.ai/code/session_01YFtn9hiQUHbNLSX7rUNYuK
</commit_message>
<xml_diff>
--- a/docs/dissertacao/cap3_metodologia.docx
+++ b/docs/dissertacao/cap3_metodologia.docx
@@ -863,7 +863,25 @@
         </m:r>
       </m:oMath>
       <w:r>
-        <w:t xml:space="preserve">.</w:t>
+        <w:t xml:space="preserve">. No limite de emissões do hidrogênio (Seção 3.4.5),</w:t>
+      </w:r>
+      <w:r>
+        <w:t xml:space="preserve"> </w:t>
+      </w:r>
+      <m:oMath>
+        <m:r>
+          <m:rPr>
+            <m:scr m:val="script"/>
+            <m:sty m:val="p"/>
+          </m:rPr>
+          <m:t>W</m:t>
+        </m:r>
+      </m:oMath>
+      <w:r>
+        <w:t xml:space="preserve"> </w:t>
+      </w:r>
+      <w:r>
+        <w:t xml:space="preserve">denota o conjunto de semanas do horizonte, cada qual tratada como o conjunto de seus intervalos.</w:t>
       </w:r>
     </w:p>
     <w:bookmarkEnd w:id="15"/>
@@ -2307,6 +2325,206 @@
             </w:pPr>
             <w:r>
               <w:t xml:space="preserve">250</w:t>
+            </w:r>
+          </w:p>
+        </w:tc>
+      </w:tr>
+      <w:tr>
+        <w:tc>
+          <w:tcPr/>
+          <w:p>
+            <w:pPr>
+              <w:pStyle w:val="Compact"/>
+            </w:pPr>
+            <m:oMath>
+              <m:sSub>
+                <m:e>
+                  <m:r>
+                    <m:t>f</m:t>
+                  </m:r>
+                </m:e>
+                <m:sub>
+                  <m:r>
+                    <m:t>t</m:t>
+                  </m:r>
+                </m:sub>
+              </m:sSub>
+            </m:oMath>
+          </w:p>
+        </w:tc>
+        <w:tc>
+          <w:tcPr/>
+          <w:p>
+            <w:pPr>
+              <w:pStyle w:val="Compact"/>
+            </w:pPr>
+            <w:r>
+              <w:t xml:space="preserve">Fator de emissão da energia da rede no intervalo</w:t>
+            </w:r>
+            <w:r>
+              <w:t xml:space="preserve"> </w:t>
+            </w:r>
+            <m:oMath>
+              <m:r>
+                <m:t>t</m:t>
+              </m:r>
+            </m:oMath>
+          </w:p>
+        </w:tc>
+        <w:tc>
+          <w:tcPr/>
+          <w:p>
+            <w:pPr>
+              <w:pStyle w:val="Compact"/>
+            </w:pPr>
+            <w:r>
+              <w:t xml:space="preserve">kgCO₂/MWh</w:t>
+            </w:r>
+          </w:p>
+        </w:tc>
+        <w:tc>
+          <w:tcPr/>
+          <w:p>
+            <w:pPr>
+              <w:pStyle w:val="Compact"/>
+            </w:pPr>
+            <w:r>
+              <w:t xml:space="preserve">série (Seção 3.5) ou 449 (marginal)</w:t>
+            </w:r>
+          </w:p>
+        </w:tc>
+      </w:tr>
+      <w:tr>
+        <w:tc>
+          <w:tcPr/>
+          <w:p>
+            <w:pPr>
+              <w:pStyle w:val="Compact"/>
+            </w:pPr>
+            <m:oMath>
+              <m:r>
+                <m:t>L</m:t>
+              </m:r>
+            </m:oMath>
+          </w:p>
+        </w:tc>
+        <w:tc>
+          <w:tcPr/>
+          <w:p>
+            <w:pPr>
+              <w:pStyle w:val="Compact"/>
+            </w:pPr>
+            <w:r>
+              <w:t xml:space="preserve">Limite de intensidade de emissões do hidrogênio</w:t>
+            </w:r>
+          </w:p>
+        </w:tc>
+        <w:tc>
+          <w:tcPr/>
+          <w:p>
+            <w:pPr>
+              <w:pStyle w:val="Compact"/>
+            </w:pPr>
+            <w:r>
+              <w:t xml:space="preserve">kgCO₂/kgH₂</w:t>
+            </w:r>
+          </w:p>
+        </w:tc>
+        <w:tc>
+          <w:tcPr/>
+          <w:p>
+            <w:pPr>
+              <w:pStyle w:val="Compact"/>
+            </w:pPr>
+            <w:r>
+              <w:t xml:space="preserve">sem limite (referência); 7 ou 3,4</w:t>
+            </w:r>
+          </w:p>
+        </w:tc>
+      </w:tr>
+      <w:tr>
+        <w:tc>
+          <w:tcPr/>
+          <w:p>
+            <w:pPr>
+              <w:pStyle w:val="Compact"/>
+            </w:pPr>
+            <m:oMath>
+              <m:sSup>
+                <m:e>
+                  <m:r>
+                    <m:t>f</m:t>
+                  </m:r>
+                </m:e>
+                <m:sup>
+                  <m:r>
+                    <m:t>p</m:t>
+                  </m:r>
+                  <m:r>
+                    <m:t>v</m:t>
+                  </m:r>
+                </m:sup>
+              </m:sSup>
+              <m:r>
+                <m:rPr>
+                  <m:sty m:val="p"/>
+                </m:rPr>
+                <m:t>,</m:t>
+              </m:r>
+              <m:sSup>
+                <m:e>
+                  <m:r>
+                    <m:t>e</m:t>
+                  </m:r>
+                </m:e>
+                <m:sup>
+                  <m:r>
+                    <m:t>p</m:t>
+                  </m:r>
+                  <m:r>
+                    <m:t>r</m:t>
+                  </m:r>
+                  <m:r>
+                    <m:t>o</m:t>
+                  </m:r>
+                  <m:r>
+                    <m:t>c</m:t>
+                  </m:r>
+                </m:sup>
+              </m:sSup>
+            </m:oMath>
+          </w:p>
+        </w:tc>
+        <w:tc>
+          <w:tcPr/>
+          <w:p>
+            <w:pPr>
+              <w:pStyle w:val="Compact"/>
+            </w:pPr>
+            <w:r>
+              <w:t xml:space="preserve">Emissões atribuídas à energia FV e às demais etapas da produção de H₂</w:t>
+            </w:r>
+          </w:p>
+        </w:tc>
+        <w:tc>
+          <w:tcPr/>
+          <w:p>
+            <w:pPr>
+              <w:pStyle w:val="Compact"/>
+            </w:pPr>
+            <w:r>
+              <w:t xml:space="preserve">kgCO₂/MWh; kgCO₂/kg</w:t>
+            </w:r>
+          </w:p>
+        </w:tc>
+        <w:tc>
+          <w:tcPr/>
+          <w:p>
+            <w:pPr>
+              <w:pStyle w:val="Compact"/>
+            </w:pPr>
+            <w:r>
+              <w:t xml:space="preserve">0; 0</w:t>
             </w:r>
           </w:p>
         </w:tc>
@@ -10315,7 +10533,881 @@
         <w:pStyle w:val="BodyText"/>
       </w:pPr>
       <w:r>
-        <w:t xml:space="preserve">O modelo resultante, composto pela função objetivo da Equação (3.1) e pelas restrições das Equações (3.3) a (3.19), é um MILP. Sem contrato de hidrogênio, para um horizonte de uma semana (168 h), o problema possui 1.688 variáveis contínuas, 505 variáveis binárias e 2.692 restrições; para um ano (8.760 h), 87.966 variáveis contínuas, 26.281 binárias e 140.164 restrições. O contrato acrescenta duas restrições por dia.</w:t>
+        <w:rPr>
+          <w:b/>
+          <w:bCs/>
+        </w:rPr>
+        <w:t xml:space="preserve">Limite de emissões do hidrogênio.</w:t>
+      </w:r>
+      <w:r>
+        <w:t xml:space="preserve"> </w:t>
+      </w:r>
+      <w:r>
+        <w:t xml:space="preserve">No caso de referência, a vedação à importação (</w:t>
+      </w:r>
+      <m:oMath>
+        <m:sSup>
+          <m:e>
+            <m:acc>
+              <m:accPr>
+                <m:chr m:val="‾"/>
+              </m:accPr>
+              <m:e>
+                <m:r>
+                  <m:t>P</m:t>
+                </m:r>
+              </m:e>
+            </m:acc>
+          </m:e>
+          <m:sup>
+            <m:r>
+              <m:t>i</m:t>
+            </m:r>
+            <m:r>
+              <m:t>m</m:t>
+            </m:r>
+            <m:r>
+              <m:t>p</m:t>
+            </m:r>
+            <m:r>
+              <m:rPr>
+                <m:sty m:val="p"/>
+              </m:rPr>
+              <m:t>,</m:t>
+            </m:r>
+            <m:r>
+              <m:t>m</m:t>
+            </m:r>
+          </m:sup>
+        </m:sSup>
+        <m:r>
+          <m:rPr>
+            <m:sty m:val="p"/>
+          </m:rPr>
+          <m:t>=</m:t>
+        </m:r>
+        <m:r>
+          <m:t>0</m:t>
+        </m:r>
+      </m:oMath>
+      <w:r>
+        <w:t xml:space="preserve">) assegura que o hidrogênio seja produzido apenas com energia renovável local. O marco legal do hidrogênio de baixa emissão de carbono, porém, qualifica o hidrogênio pela intensidade de emissões de gases de efeito estufa, apurada por análise de ciclo de vida, com valor inicial de até 7 kgCO₂eq/kgH₂, mantido até 2030 (BRASIL, 2024). Para representar esse critério, o modelo admite, como alternativa à vedação, um limite</w:t>
+      </w:r>
+      <w:r>
+        <w:t xml:space="preserve"> </w:t>
+      </w:r>
+      <m:oMath>
+        <m:r>
+          <m:t>L</m:t>
+        </m:r>
+      </m:oMath>
+      <w:r>
+        <w:t xml:space="preserve"> </w:t>
+      </w:r>
+      <w:r>
+        <w:t xml:space="preserve">à intensidade de emissões do hidrogênio. A energia importada pode ser destinada apenas ao eletrolisador, no mesmo intervalo, e é integralmente atribuída ao hidrogênio (Equação (3.20)); em cada semana</w:t>
+      </w:r>
+      <w:r>
+        <w:t xml:space="preserve"> </w:t>
+      </w:r>
+      <m:oMath>
+        <m:r>
+          <m:t>w</m:t>
+        </m:r>
+        <m:r>
+          <m:rPr>
+            <m:sty m:val="p"/>
+          </m:rPr>
+          <m:t>∈</m:t>
+        </m:r>
+        <m:r>
+          <m:rPr>
+            <m:scr m:val="script"/>
+            <m:sty m:val="p"/>
+          </m:rPr>
+          <m:t>W</m:t>
+        </m:r>
+      </m:oMath>
+      <w:r>
+        <w:t xml:space="preserve">, as emissões atribuídas ao hidrogênio não podem exceder</w:t>
+      </w:r>
+      <w:r>
+        <w:t xml:space="preserve"> </w:t>
+      </w:r>
+      <m:oMath>
+        <m:r>
+          <m:t>L</m:t>
+        </m:r>
+      </m:oMath>
+      <w:r>
+        <w:t xml:space="preserve"> </w:t>
+      </w:r>
+      <w:r>
+        <w:t xml:space="preserve">vezes a sua produção (Equação (3.21)):</w:t>
+      </w:r>
+    </w:p>
+    <w:tbl>
+      <w:tblPr>
+        <w:tblW w:w="9071" w:type="dxa"/>
+        <w:tblBorders>
+          <w:top w:val="nil"/>
+          <w:left w:val="nil"/>
+          <w:bottom w:val="nil"/>
+          <w:right w:val="nil"/>
+          <w:insideH w:val="nil"/>
+          <w:insideV w:val="nil"/>
+        </w:tblBorders>
+        <w:tblLayout w:type="fixed"/>
+        <w:tblCellMar>
+          <w:left w:w="0" w:type="dxa"/>
+          <w:right w:w="0" w:type="dxa"/>
+        </w:tblCellMar>
+      </w:tblPr>
+      <w:tblGrid>
+        <w:gridCol w:w="8071"/>
+        <w:gridCol w:w="1000"/>
+      </w:tblGrid>
+      <w:tr>
+        <w:tc>
+          <w:tcPr>
+            <w:tcW w:w="8071" w:type="dxa"/>
+            <w:vAlign w:val="center"/>
+          </w:tcPr>
+          <w:p>
+            <w:pPr>
+              <w:pStyle w:val="BodyText"/>
+            </w:pPr>
+            <m:oMathPara>
+              <m:oMathParaPr>
+                <m:jc m:val="center"/>
+              </m:oMathParaPr>
+              <m:oMath>
+                <m:sSubSup>
+                  <m:e>
+                    <m:r>
+                      <m:t>p</m:t>
+                    </m:r>
+                  </m:e>
+                  <m:sub>
+                    <m:r>
+                      <m:t>t</m:t>
+                    </m:r>
+                  </m:sub>
+                  <m:sup>
+                    <m:r>
+                      <m:t>i</m:t>
+                    </m:r>
+                    <m:r>
+                      <m:t>m</m:t>
+                    </m:r>
+                    <m:r>
+                      <m:t>p</m:t>
+                    </m:r>
+                  </m:sup>
+                </m:sSubSup>
+                <m:r>
+                  <m:rPr>
+                    <m:sty m:val="p"/>
+                  </m:rPr>
+                  <m:t>≤</m:t>
+                </m:r>
+                <m:sSubSup>
+                  <m:e>
+                    <m:r>
+                      <m:t>p</m:t>
+                    </m:r>
+                  </m:e>
+                  <m:sub>
+                    <m:r>
+                      <m:t>t</m:t>
+                    </m:r>
+                  </m:sub>
+                  <m:sup>
+                    <m:r>
+                      <m:t>e</m:t>
+                    </m:r>
+                    <m:r>
+                      <m:t>l</m:t>
+                    </m:r>
+                  </m:sup>
+                </m:sSubSup>
+                <m:r>
+                  <m:t>  </m:t>
+                </m:r>
+                <m:r>
+                  <m:rPr>
+                    <m:sty m:val="p"/>
+                  </m:rPr>
+                  <m:t>∀</m:t>
+                </m:r>
+                <m:r>
+                  <m:t>t</m:t>
+                </m:r>
+                <m:r>
+                  <m:rPr>
+                    <m:sty m:val="p"/>
+                  </m:rPr>
+                  <m:t>∈</m:t>
+                </m:r>
+                <m:r>
+                  <m:rPr>
+                    <m:scr m:val="script"/>
+                    <m:sty m:val="p"/>
+                  </m:rPr>
+                  <m:t>T</m:t>
+                </m:r>
+              </m:oMath>
+            </m:oMathPara>
+          </w:p>
+        </w:tc>
+        <w:tc>
+          <w:tcPr>
+            <w:tcW w:w="1000" w:type="dxa"/>
+            <w:vAlign w:val="center"/>
+          </w:tcPr>
+          <w:p>
+            <w:pPr>
+              <w:pStyle w:val="NumeroEquacao"/>
+            </w:pPr>
+            <w:r>
+              <w:t>(3.20)</w:t>
+            </w:r>
+          </w:p>
+        </w:tc>
+      </w:tr>
+    </w:tbl>
+    <w:tbl>
+      <w:tblPr>
+        <w:tblW w:w="9071" w:type="dxa"/>
+        <w:tblBorders>
+          <w:top w:val="nil"/>
+          <w:left w:val="nil"/>
+          <w:bottom w:val="nil"/>
+          <w:right w:val="nil"/>
+          <w:insideH w:val="nil"/>
+          <w:insideV w:val="nil"/>
+        </w:tblBorders>
+        <w:tblLayout w:type="fixed"/>
+        <w:tblCellMar>
+          <w:left w:w="0" w:type="dxa"/>
+          <w:right w:w="0" w:type="dxa"/>
+        </w:tblCellMar>
+      </w:tblPr>
+      <w:tblGrid>
+        <w:gridCol w:w="8071"/>
+        <w:gridCol w:w="1000"/>
+      </w:tblGrid>
+      <w:tr>
+        <w:tc>
+          <w:tcPr>
+            <w:tcW w:w="8071" w:type="dxa"/>
+            <w:vAlign w:val="center"/>
+          </w:tcPr>
+          <w:p>
+            <w:pPr>
+              <w:pStyle w:val="FirstParagraph"/>
+            </w:pPr>
+            <m:oMathPara>
+              <m:oMathParaPr>
+                <m:jc m:val="center"/>
+              </m:oMathParaPr>
+              <m:oMath>
+                <m:nary>
+                  <m:naryPr>
+                    <m:chr m:val="∑"/>
+                    <m:limLoc m:val="undOvr"/>
+                    <m:subHide m:val="off"/>
+                    <m:supHide m:val="on"/>
+                  </m:naryPr>
+                  <m:sub>
+                    <m:r>
+                      <m:t>t</m:t>
+                    </m:r>
+                    <m:r>
+                      <m:rPr>
+                        <m:sty m:val="p"/>
+                      </m:rPr>
+                      <m:t>∈</m:t>
+                    </m:r>
+                    <m:r>
+                      <m:t>w</m:t>
+                    </m:r>
+                  </m:sub>
+                  <m:sup>
+                    <m:r>
+                      <m:t>​</m:t>
+                    </m:r>
+                  </m:sup>
+                  <m:e>
+                    <m:d>
+                      <m:dPr>
+                        <m:begChr m:val="["/>
+                        <m:sepChr m:val=""/>
+                        <m:endChr m:val="]"/>
+                        <m:grow/>
+                      </m:dPr>
+                      <m:e>
+                        <m:sSub>
+                          <m:e>
+                            <m:r>
+                              <m:t>f</m:t>
+                            </m:r>
+                          </m:e>
+                          <m:sub>
+                            <m:r>
+                              <m:t>t</m:t>
+                            </m:r>
+                          </m:sub>
+                        </m:sSub>
+                        <m:r>
+                          <m:t> </m:t>
+                        </m:r>
+                        <m:sSubSup>
+                          <m:e>
+                            <m:r>
+                              <m:t>p</m:t>
+                            </m:r>
+                          </m:e>
+                          <m:sub>
+                            <m:r>
+                              <m:t>t</m:t>
+                            </m:r>
+                          </m:sub>
+                          <m:sup>
+                            <m:r>
+                              <m:t>i</m:t>
+                            </m:r>
+                            <m:r>
+                              <m:t>m</m:t>
+                            </m:r>
+                            <m:r>
+                              <m:t>p</m:t>
+                            </m:r>
+                          </m:sup>
+                        </m:sSubSup>
+                        <m:r>
+                          <m:rPr>
+                            <m:sty m:val="p"/>
+                          </m:rPr>
+                          <m:t>+</m:t>
+                        </m:r>
+                        <m:sSup>
+                          <m:e>
+                            <m:r>
+                              <m:t>f</m:t>
+                            </m:r>
+                          </m:e>
+                          <m:sup>
+                            <m:r>
+                              <m:t>p</m:t>
+                            </m:r>
+                            <m:r>
+                              <m:t>v</m:t>
+                            </m:r>
+                          </m:sup>
+                        </m:sSup>
+                        <m:d>
+                          <m:dPr>
+                            <m:begChr m:val="("/>
+                            <m:sepChr m:val=""/>
+                            <m:endChr m:val=")"/>
+                            <m:grow/>
+                          </m:dPr>
+                          <m:e>
+                            <m:sSubSup>
+                              <m:e>
+                                <m:r>
+                                  <m:t>p</m:t>
+                                </m:r>
+                              </m:e>
+                              <m:sub>
+                                <m:r>
+                                  <m:t>t</m:t>
+                                </m:r>
+                              </m:sub>
+                              <m:sup>
+                                <m:r>
+                                  <m:t>e</m:t>
+                                </m:r>
+                                <m:r>
+                                  <m:t>l</m:t>
+                                </m:r>
+                              </m:sup>
+                            </m:sSubSup>
+                            <m:r>
+                              <m:rPr>
+                                <m:sty m:val="p"/>
+                              </m:rPr>
+                              <m:t>−</m:t>
+                            </m:r>
+                            <m:sSubSup>
+                              <m:e>
+                                <m:r>
+                                  <m:t>p</m:t>
+                                </m:r>
+                              </m:e>
+                              <m:sub>
+                                <m:r>
+                                  <m:t>t</m:t>
+                                </m:r>
+                              </m:sub>
+                              <m:sup>
+                                <m:r>
+                                  <m:t>i</m:t>
+                                </m:r>
+                                <m:r>
+                                  <m:t>m</m:t>
+                                </m:r>
+                                <m:r>
+                                  <m:t>p</m:t>
+                                </m:r>
+                              </m:sup>
+                            </m:sSubSup>
+                          </m:e>
+                        </m:d>
+                        <m:r>
+                          <m:rPr>
+                            <m:sty m:val="p"/>
+                          </m:rPr>
+                          <m:t>+</m:t>
+                        </m:r>
+                        <m:sSup>
+                          <m:e>
+                            <m:r>
+                              <m:t>e</m:t>
+                            </m:r>
+                          </m:e>
+                          <m:sup>
+                            <m:r>
+                              <m:t>p</m:t>
+                            </m:r>
+                            <m:r>
+                              <m:t>r</m:t>
+                            </m:r>
+                            <m:r>
+                              <m:t>o</m:t>
+                            </m:r>
+                            <m:r>
+                              <m:t>c</m:t>
+                            </m:r>
+                          </m:sup>
+                        </m:sSup>
+                        <m:r>
+                          <m:t> </m:t>
+                        </m:r>
+                        <m:sSub>
+                          <m:e>
+                            <m:r>
+                              <m:t>m</m:t>
+                            </m:r>
+                          </m:e>
+                          <m:sub>
+                            <m:r>
+                              <m:t>t</m:t>
+                            </m:r>
+                          </m:sub>
+                        </m:sSub>
+                      </m:e>
+                    </m:d>
+                  </m:e>
+                </m:nary>
+                <m:r>
+                  <m:rPr>
+                    <m:sty m:val="p"/>
+                  </m:rPr>
+                  <m:t>Δ</m:t>
+                </m:r>
+                <m:r>
+                  <m:t>t</m:t>
+                </m:r>
+                <m:r>
+                  <m:t> </m:t>
+                </m:r>
+                <m:r>
+                  <m:rPr>
+                    <m:sty m:val="p"/>
+                  </m:rPr>
+                  <m:t>≤</m:t>
+                </m:r>
+                <m:r>
+                  <m:t> </m:t>
+                </m:r>
+                <m:r>
+                  <m:t>L</m:t>
+                </m:r>
+                <m:nary>
+                  <m:naryPr>
+                    <m:chr m:val="∑"/>
+                    <m:limLoc m:val="undOvr"/>
+                    <m:subHide m:val="off"/>
+                    <m:supHide m:val="on"/>
+                  </m:naryPr>
+                  <m:sub>
+                    <m:r>
+                      <m:t>t</m:t>
+                    </m:r>
+                    <m:r>
+                      <m:rPr>
+                        <m:sty m:val="p"/>
+                      </m:rPr>
+                      <m:t>∈</m:t>
+                    </m:r>
+                    <m:r>
+                      <m:t>w</m:t>
+                    </m:r>
+                  </m:sub>
+                  <m:sup>
+                    <m:r>
+                      <m:t>​</m:t>
+                    </m:r>
+                  </m:sup>
+                  <m:e>
+                    <m:sSub>
+                      <m:e>
+                        <m:r>
+                          <m:t>m</m:t>
+                        </m:r>
+                      </m:e>
+                      <m:sub>
+                        <m:r>
+                          <m:t>t</m:t>
+                        </m:r>
+                      </m:sub>
+                    </m:sSub>
+                  </m:e>
+                </m:nary>
+                <m:r>
+                  <m:t> </m:t>
+                </m:r>
+                <m:r>
+                  <m:rPr>
+                    <m:sty m:val="p"/>
+                  </m:rPr>
+                  <m:t>Δ</m:t>
+                </m:r>
+                <m:r>
+                  <m:t>t</m:t>
+                </m:r>
+                <m:r>
+                  <m:t>  </m:t>
+                </m:r>
+                <m:r>
+                  <m:rPr>
+                    <m:sty m:val="p"/>
+                  </m:rPr>
+                  <m:t>∀</m:t>
+                </m:r>
+                <m:r>
+                  <m:t>w</m:t>
+                </m:r>
+                <m:r>
+                  <m:rPr>
+                    <m:sty m:val="p"/>
+                  </m:rPr>
+                  <m:t>∈</m:t>
+                </m:r>
+                <m:r>
+                  <m:rPr>
+                    <m:scr m:val="script"/>
+                    <m:sty m:val="p"/>
+                  </m:rPr>
+                  <m:t>W</m:t>
+                </m:r>
+              </m:oMath>
+            </m:oMathPara>
+          </w:p>
+        </w:tc>
+        <w:tc>
+          <w:tcPr>
+            <w:tcW w:w="1000" w:type="dxa"/>
+            <w:vAlign w:val="center"/>
+          </w:tcPr>
+          <w:p>
+            <w:pPr>
+              <w:pStyle w:val="NumeroEquacao"/>
+            </w:pPr>
+            <w:r>
+              <w:t>(3.21)</w:t>
+            </w:r>
+          </w:p>
+        </w:tc>
+      </w:tr>
+    </w:tbl>
+    <w:p>
+      <w:pPr>
+        <w:pStyle w:val="FirstParagraph"/>
+      </w:pPr>
+      <w:r>
+        <w:t xml:space="preserve">em que</w:t>
+      </w:r>
+      <w:r>
+        <w:t xml:space="preserve"> </w:t>
+      </w:r>
+      <m:oMath>
+        <m:sSub>
+          <m:e>
+            <m:r>
+              <m:t>f</m:t>
+            </m:r>
+          </m:e>
+          <m:sub>
+            <m:r>
+              <m:t>t</m:t>
+            </m:r>
+          </m:sub>
+        </m:sSub>
+      </m:oMath>
+      <w:r>
+        <w:t xml:space="preserve"> </w:t>
+      </w:r>
+      <w:r>
+        <w:t xml:space="preserve">é o fator de emissão da energia da rede no intervalo</w:t>
+      </w:r>
+      <w:r>
+        <w:t xml:space="preserve"> </w:t>
+      </w:r>
+      <m:oMath>
+        <m:r>
+          <m:t>t</m:t>
+        </m:r>
+      </m:oMath>
+      <w:r>
+        <w:t xml:space="preserve">,</w:t>
+      </w:r>
+      <w:r>
+        <w:t xml:space="preserve"> </w:t>
+      </w:r>
+      <m:oMath>
+        <m:sSup>
+          <m:e>
+            <m:r>
+              <m:t>f</m:t>
+            </m:r>
+          </m:e>
+          <m:sup>
+            <m:r>
+              <m:t>p</m:t>
+            </m:r>
+            <m:r>
+              <m:t>v</m:t>
+            </m:r>
+          </m:sup>
+        </m:sSup>
+      </m:oMath>
+      <w:r>
+        <w:t xml:space="preserve"> </w:t>
+      </w:r>
+      <w:r>
+        <w:t xml:space="preserve">é o fator atribuído à energia FV, consumida diretamente ou após o armazenamento no módulo mercantil, e</w:t>
+      </w:r>
+      <w:r>
+        <w:t xml:space="preserve"> </w:t>
+      </w:r>
+      <m:oMath>
+        <m:sSup>
+          <m:e>
+            <m:r>
+              <m:t>e</m:t>
+            </m:r>
+          </m:e>
+          <m:sup>
+            <m:r>
+              <m:t>p</m:t>
+            </m:r>
+            <m:r>
+              <m:t>r</m:t>
+            </m:r>
+            <m:r>
+              <m:t>o</m:t>
+            </m:r>
+            <m:r>
+              <m:t>c</m:t>
+            </m:r>
+          </m:sup>
+        </m:sSup>
+      </m:oMath>
+      <w:r>
+        <w:t xml:space="preserve"> </w:t>
+      </w:r>
+      <w:r>
+        <w:t xml:space="preserve">representa as emissões das demais etapas por kg de hidrogênio. Pela Equação (3.16), com</w:t>
+      </w:r>
+      <w:r>
+        <w:t xml:space="preserve"> </w:t>
+      </w:r>
+      <m:oMath>
+        <m:sSup>
+          <m:e>
+            <m:r>
+              <m:t>f</m:t>
+            </m:r>
+          </m:e>
+          <m:sup>
+            <m:r>
+              <m:t>p</m:t>
+            </m:r>
+            <m:r>
+              <m:t>v</m:t>
+            </m:r>
+          </m:sup>
+        </m:sSup>
+        <m:r>
+          <m:rPr>
+            <m:sty m:val="p"/>
+          </m:rPr>
+          <m:t>=</m:t>
+        </m:r>
+        <m:sSup>
+          <m:e>
+            <m:r>
+              <m:t>e</m:t>
+            </m:r>
+          </m:e>
+          <m:sup>
+            <m:r>
+              <m:t>p</m:t>
+            </m:r>
+            <m:r>
+              <m:t>r</m:t>
+            </m:r>
+            <m:r>
+              <m:t>o</m:t>
+            </m:r>
+            <m:r>
+              <m:t>c</m:t>
+            </m:r>
+          </m:sup>
+        </m:sSup>
+        <m:r>
+          <m:rPr>
+            <m:sty m:val="p"/>
+          </m:rPr>
+          <m:t>=</m:t>
+        </m:r>
+        <m:r>
+          <m:t>0</m:t>
+        </m:r>
+      </m:oMath>
+      <w:r>
+        <w:t xml:space="preserve">, a restrição equivale a limitar o fator de emissão médio da energia do eletrolisador, em cada semana, a</w:t>
+      </w:r>
+      <w:r>
+        <w:t xml:space="preserve"> </w:t>
+      </w:r>
+      <m:oMath>
+        <m:r>
+          <m:t>L</m:t>
+        </m:r>
+        <m:r>
+          <m:t> </m:t>
+        </m:r>
+        <m:sSup>
+          <m:e>
+            <m:r>
+              <m:t>k</m:t>
+            </m:r>
+          </m:e>
+          <m:sup>
+            <m:r>
+              <m:t>e</m:t>
+            </m:r>
+            <m:r>
+              <m:t>l</m:t>
+            </m:r>
+          </m:sup>
+        </m:sSup>
+        <m:r>
+          <m:rPr>
+            <m:sty m:val="p"/>
+          </m:rPr>
+          <m:t>/</m:t>
+        </m:r>
+        <m:r>
+          <m:t>1000</m:t>
+        </m:r>
+      </m:oMath>
+      <w:r>
+        <w:t xml:space="preserve">: 127 kgCO₂/MWh para</w:t>
+      </w:r>
+      <w:r>
+        <w:t xml:space="preserve"> </w:t>
+      </w:r>
+      <m:oMath>
+        <m:r>
+          <m:t>L</m:t>
+        </m:r>
+        <m:r>
+          <m:rPr>
+            <m:sty m:val="p"/>
+          </m:rPr>
+          <m:t>=</m:t>
+        </m:r>
+        <m:r>
+          <m:t>7</m:t>
+        </m:r>
+      </m:oMath>
+      <w:r>
+        <w:t xml:space="preserve"> </w:t>
+      </w:r>
+      <w:r>
+        <w:t xml:space="preserve">e 62 kgCO₂/MWh para</w:t>
+      </w:r>
+      <w:r>
+        <w:t xml:space="preserve"> </w:t>
+      </w:r>
+      <m:oMath>
+        <m:r>
+          <m:t>L</m:t>
+        </m:r>
+        <m:r>
+          <m:rPr>
+            <m:sty m:val="p"/>
+          </m:rPr>
+          <m:t>=</m:t>
+        </m:r>
+        <m:r>
+          <m:t>3</m:t>
+        </m:r>
+        <m:r>
+          <m:rPr>
+            <m:sty m:val="p"/>
+          </m:rPr>
+          <m:t>,</m:t>
+        </m:r>
+        <m:r>
+          <m:t>4</m:t>
+        </m:r>
+      </m:oMath>
+      <w:r>
+        <w:t xml:space="preserve">. Cada MWh de origem FV consumido pelo eletrolisador abre espaço, assim, para a importação de uma fração de MWh da rede. A restrição é linear e não introduz variáveis binárias; com</w:t>
+      </w:r>
+      <w:r>
+        <w:t xml:space="preserve"> </w:t>
+      </w:r>
+      <m:oMath>
+        <m:r>
+          <m:t>L</m:t>
+        </m:r>
+        <m:r>
+          <m:rPr>
+            <m:sty m:val="p"/>
+          </m:rPr>
+          <m:t>=</m:t>
+        </m:r>
+        <m:r>
+          <m:t>0</m:t>
+        </m:r>
+      </m:oMath>
+      <w:r>
+        <w:t xml:space="preserve">, ela reproduz a vedação à importação. A janela semanal coincide com os blocos da decomposição (Seção 3.6.2), de modo que a restrição pertence integralmente a cada subproblema. O valor de 3,4 kgCO₂/kgH₂ corresponde aproximadamente ao critério europeu para combustíveis renováveis de origem não biológica, de redução de 70% das emissões em relação ao comparador fóssil de 94 gCO₂eq/MJ (UNIÃO EUROPEIA, 2023), e é avaliado como sensibilidade.</w:t>
+      </w:r>
+    </w:p>
+    <w:p>
+      <w:pPr>
+        <w:pStyle w:val="BodyText"/>
+      </w:pPr>
+      <w:r>
+        <w:t xml:space="preserve">O modelo resultante, composto pela função objetivo da Equação (3.1) e pelas restrições das Equações (3.3) a (3.21), é um MILP. Sem contrato de hidrogênio, para um horizonte de uma semana (168 h), o problema possui 1.688 variáveis contínuas, 505 variáveis binárias e 2.692 restrições; para um ano (8.760 h), 87.966 variáveis contínuas, 26.281 binárias e 140.164 restrições. O contrato acrescenta duas restrições por dia, e o limite de emissões, uma restrição por intervalo e uma por semana.</w:t>
       </w:r>
     </w:p>
     <w:bookmarkEnd w:id="19"/>
@@ -10519,6 +11611,73 @@
           <w:b/>
           <w:bCs/>
         </w:rPr>
+        <w:t xml:space="preserve">Fator de emissão da rede.</w:t>
+      </w:r>
+      <w:r>
+        <w:t xml:space="preserve"> </w:t>
+      </w:r>
+      <w:r>
+        <w:t xml:space="preserve">Nos casos com limite de emissões, o fator de emissão horário da energia da rede,</w:t>
+      </w:r>
+      <w:r>
+        <w:t xml:space="preserve"> </w:t>
+      </w:r>
+      <m:oMath>
+        <m:sSub>
+          <m:e>
+            <m:r>
+              <m:t>f</m:t>
+            </m:r>
+          </m:e>
+          <m:sub>
+            <m:r>
+              <m:t>t</m:t>
+            </m:r>
+          </m:sub>
+        </m:sSub>
+      </m:oMath>
+      <w:r>
+        <w:t xml:space="preserve">, foi estimado a partir da geração horária por usina do Sistema Interligado Nacional (SIN), disponibilizada pelo ONS em seu portal de dados abertos (ONS, 2026), para os anos de 2021 a 2025. Em cada hora, somam-se as emissões das termelétricas a combustíveis fósseis — a geração de cada usina multiplicada pelo fator de emissão do combustível (IPCC, 2006) e dividida por um rendimento típico: 45% para o gás natural (449 kgCO₂/MWh), 35% para o carvão mineral (988 kgCO₂/MWh) e 38% para os óleos diesel e combustível (702 e 733 kgCO₂/MWh) — e divide-se o total pela geração do SIN, excluídas a micro e a minigeração distribuídas. A biomassa, os resíduos industriais, a fonte nuclear e as demais renováveis entram com emissão nula. Os fatores médios anuais resultantes são de 94, 31, 27, 37 e 42 kgCO₂/MWh, de 2021 a 2025. De janeiro a abril de 2025, as médias mensais ficam entre 2% e 5% abaixo dos fatores publicados pelo Ministério da Ciência, Tecnologia e Inovação (MCTI, 2025), cuja metodologia passou a incluir, naquele ano, os novos empreendimentos renováveis conectados ao SIN; pela metodologia anterior, os fatores oficiais de 2021 a 2023 são de 34% a 42% maiores que os aqui estimados. Como alternativa, considera-se um fator marginal constante, de 449 kgCO₂/MWh, que supõe que toda energia importada é suprida por uma termelétrica a gás natural. Os fatores consideram apenas as emissões de operação; para manter a mesma fronteira, a energia FV entra com fator nulo (</w:t>
+      </w:r>
+      <m:oMath>
+        <m:sSup>
+          <m:e>
+            <m:r>
+              <m:t>f</m:t>
+            </m:r>
+          </m:e>
+          <m:sup>
+            <m:r>
+              <m:t>p</m:t>
+            </m:r>
+            <m:r>
+              <m:t>v</m:t>
+            </m:r>
+          </m:sup>
+        </m:sSup>
+        <m:r>
+          <m:rPr>
+            <m:sty m:val="p"/>
+          </m:rPr>
+          <m:t>=</m:t>
+        </m:r>
+        <m:r>
+          <m:t>0</m:t>
+        </m:r>
+      </m:oMath>
+      <w:r>
+        <w:t xml:space="preserve">).</w:t>
+      </w:r>
+    </w:p>
+    <w:p>
+      <w:pPr>
+        <w:pStyle w:val="BodyText"/>
+      </w:pPr>
+      <w:r>
+        <w:rPr>
+          <w:b/>
+          <w:bCs/>
+        </w:rPr>
         <w:t xml:space="preserve">Parâmetros técnico-econômicos.</w:t>
       </w:r>
       <w:r>
@@ -10756,7 +11915,7 @@
         <w:t xml:space="preserve"> </w:t>
       </w:r>
       <w:r>
-        <w:t xml:space="preserve">e impondo-se condições de contorno cíclicas em cada bloco — aproximação cujo efeito é avaliado ao final desta seção —, o problema anual pode ser reescrito conforme a Equação (3.20):</w:t>
+        <w:t xml:space="preserve">e impondo-se condições de contorno cíclicas em cada bloco — aproximação cujo efeito é avaliado ao final desta seção —, o problema anual pode ser reescrito conforme a Equação (3.22):</w:t>
       </w:r>
     </w:p>
     <w:tbl>
@@ -11079,7 +12238,7 @@
               <w:pStyle w:val="NumeroEquacao"/>
             </w:pPr>
             <w:r>
-              <w:t>(3.20)</w:t>
+              <w:t>(3.22)</w:t>
             </w:r>
           </w:p>
         </w:tc>
@@ -11454,7 +12613,7 @@
         <w:t xml:space="preserve"> </w:t>
       </w:r>
       <w:r>
-        <w:t xml:space="preserve">o multiplicador dual dessa restrição na relaxação linear do subproblema, calcula-se o valor da relaxação lagrangiana da Equação (3.21):</w:t>
+        <w:t xml:space="preserve">o multiplicador dual dessa restrição na relaxação linear do subproblema, calcula-se o valor da relaxação lagrangiana da Equação (3.23):</w:t>
       </w:r>
     </w:p>
     <w:tbl>
@@ -11697,7 +12856,7 @@
               <w:pStyle w:val="NumeroEquacao"/>
             </w:pPr>
             <w:r>
-              <w:t>(3.21)</w:t>
+              <w:t>(3.23)</w:t>
             </w:r>
           </w:p>
         </w:tc>
@@ -11889,7 +13048,7 @@
         </m:r>
       </m:oMath>
       <w:r>
-        <w:t xml:space="preserve">, o que fornece o corte válido da Equação (3.22):</w:t>
+        <w:t xml:space="preserve">, o que fornece o corte válido da Equação (3.24):</w:t>
       </w:r>
     </w:p>
     <w:tbl>
@@ -12036,7 +13195,7 @@
               <w:pStyle w:val="NumeroEquacao"/>
             </w:pPr>
             <w:r>
-              <w:t>(3.22)</w:t>
+              <w:t>(3.24)</w:t>
             </w:r>
           </w:p>
         </w:tc>
@@ -12091,7 +13250,7 @@
         <w:pStyle w:val="BodyText"/>
       </w:pPr>
       <w:r>
-        <w:t xml:space="preserve">O problema mestre, apresentado na Equação (3.23), é um MILP de pequeno porte, com uma variável contínua para a potência, uma binária para a participação e uma variável</w:t>
+        <w:t xml:space="preserve">O problema mestre, apresentado na Equação (3.25), é um MILP de pequeno porte, com uma variável contínua para a potência, uma binária para a participação e uma variável</w:t>
       </w:r>
       <w:r>
         <w:t xml:space="preserve"> </w:t>
@@ -12449,7 +13608,7 @@
               <w:pStyle w:val="NumeroEquacao"/>
             </w:pPr>
             <w:r>
-              <w:t>(3.23)</w:t>
+              <w:t>(3.25)</w:t>
             </w:r>
           </w:p>
         </w:tc>
@@ -12786,7 +13945,7 @@
         <w:t xml:space="preserve"> </w:t>
       </w:r>
       <w:r>
-        <w:t xml:space="preserve">da Equação (3.21) deixaria de ser o mesmo entre iterações.</w:t>
+        <w:t xml:space="preserve">da Equação (3.23) deixaria de ser o mesmo entre iterações.</w:t>
       </w:r>
     </w:p>
     <w:bookmarkEnd w:id="26"/>
@@ -13662,7 +14821,7 @@
         <w:t xml:space="preserve"> </w:t>
       </w:r>
       <w:r>
-        <w:t xml:space="preserve">é dado pela Equação (3.24):</w:t>
+        <w:t xml:space="preserve">é dado pela Equação (3.26):</w:t>
       </w:r>
     </w:p>
     <w:tbl>
@@ -13906,7 +15065,7 @@
               <w:pStyle w:val="NumeroEquacao"/>
             </w:pPr>
             <w:r>
-              <w:t>(3.24)</w:t>
+              <w:t>(3.26)</w:t>
             </w:r>
           </w:p>
         </w:tc>
@@ -14008,7 +15167,7 @@
         <w:t xml:space="preserve">Conditional Value-at-Risk</w:t>
       </w:r>
       <w:r>
-        <w:t xml:space="preserve">, CVaR), conforme a Equação (3.25):</w:t>
+        <w:t xml:space="preserve">, CVaR), conforme a Equação (3.27):</w:t>
       </w:r>
     </w:p>
     <w:tbl>
@@ -14296,7 +15455,7 @@
               <w:pStyle w:val="NumeroEquacao"/>
             </w:pPr>
             <w:r>
-              <w:t>(3.25)</w:t>
+              <w:t>(3.27)</w:t>
             </w:r>
           </w:p>
         </w:tc>
@@ -14500,7 +15659,7 @@
         <w:t xml:space="preserve"> </w:t>
       </w:r>
       <w:r>
-        <w:t xml:space="preserve">e pode ser escrito na forma linear de Rockafellar e Uryasev (2000), apresentada na Equação (3.26):</w:t>
+        <w:t xml:space="preserve">e pode ser escrito na forma linear de Rockafellar e Uryasev (2000), apresentada na Equação (3.28):</w:t>
       </w:r>
     </w:p>
     <w:tbl>
@@ -14837,7 +15996,7 @@
               <w:pStyle w:val="NumeroEquacao"/>
             </w:pPr>
             <w:r>
-              <w:t>(3.26)</w:t>
+              <w:t>(3.28)</w:t>
             </w:r>
           </w:p>
         </w:tc>
@@ -15414,7 +16573,7 @@
         <w:t xml:space="preserve"> </w:t>
       </w:r>
       <w:r>
-        <w:t xml:space="preserve">por subproblema, além das variáveis do CVaR, conforme as Equações (3.27) a (3.29):</w:t>
+        <w:t xml:space="preserve">por subproblema, além das variáveis do CVaR, conforme as Equações (3.29) a (3.31):</w:t>
       </w:r>
     </w:p>
     <w:tbl>
@@ -15651,7 +16810,7 @@
               <w:pStyle w:val="NumeroEquacao"/>
             </w:pPr>
             <w:r>
-              <w:t>(3.27)</w:t>
+              <w:t>(3.29)</w:t>
             </w:r>
           </w:p>
         </w:tc>
@@ -15968,7 +17127,7 @@
               <w:pStyle w:val="NumeroEquacao"/>
             </w:pPr>
             <w:r>
-              <w:t>(3.28)</w:t>
+              <w:t>(3.30)</w:t>
             </w:r>
           </w:p>
         </w:tc>
@@ -16188,7 +17347,7 @@
               <w:pStyle w:val="NumeroEquacao"/>
             </w:pPr>
             <w:r>
-              <w:t>(3.29)</w:t>
+              <w:t>(3.31)</w:t>
             </w:r>
           </w:p>
         </w:tc>
@@ -16555,7 +17714,7 @@
         <w:t xml:space="preserve">recourse problem</w:t>
       </w:r>
       <w:r>
-        <w:t xml:space="preserve">, RP) é o lucro esperado ótimo da Equação (3.25) com</w:t>
+        <w:t xml:space="preserve">, RP) é o lucro esperado ótimo da Equação (3.27) com</w:t>
       </w:r>
       <w:r>
         <w:t xml:space="preserve"> </w:t>
@@ -16575,7 +17734,7 @@
         </m:r>
       </m:oMath>
       <w:r>
-        <w:t xml:space="preserve">, dado pela Equação (3.30):</w:t>
+        <w:t xml:space="preserve">, dado pela Equação (3.32):</w:t>
       </w:r>
     </w:p>
     <w:tbl>
@@ -16786,7 +17945,7 @@
               <w:pStyle w:val="NumeroEquacao"/>
             </w:pPr>
             <w:r>
-              <w:t>(3.30)</w:t>
+              <w:t>(3.32)</w:t>
             </w:r>
           </w:p>
         </w:tc>
@@ -16823,7 +17982,7 @@
         <w:t xml:space="preserve">wait-and-see</w:t>
       </w:r>
       <w:r>
-        <w:t xml:space="preserve">, WS) corresponde a um agente que conhece o cenário antes de decidir a potência e escolhe, em cada um, a contratação ótima, conforme a Equação (3.31):</w:t>
+        <w:t xml:space="preserve">, WS) corresponde a um agente que conhece o cenário antes de decidir a potência e escolhe, em cada um, a contratação ótima, conforme a Equação (3.33):</w:t>
       </w:r>
     </w:p>
     <w:tbl>
@@ -17028,7 +18187,7 @@
               <w:pStyle w:val="NumeroEquacao"/>
             </w:pPr>
             <w:r>
-              <w:t>(3.31)</w:t>
+              <w:t>(3.33)</w:t>
             </w:r>
           </w:p>
         </w:tc>
@@ -17113,7 +18272,7 @@
         </m:sSup>
       </m:oMath>
       <w:r>
-        <w:t xml:space="preserve">, segundo a Equação (3.32):</w:t>
+        <w:t xml:space="preserve">, segundo a Equação (3.34):</w:t>
       </w:r>
     </w:p>
     <w:tbl>
@@ -17299,7 +18458,7 @@
               <w:pStyle w:val="NumeroEquacao"/>
             </w:pPr>
             <w:r>
-              <w:t>(3.32)</w:t>
+              <w:t>(3.34)</w:t>
             </w:r>
           </w:p>
         </w:tc>
@@ -17359,7 +18518,7 @@
         <w:t xml:space="preserve"> </w:t>
       </w:r>
       <w:r>
-        <w:t xml:space="preserve">é aplicada aos cenários originais, dado pela Equação (3.33):</w:t>
+        <w:t xml:space="preserve">é aplicada aos cenários originais, dado pela Equação (3.35):</w:t>
       </w:r>
     </w:p>
     <w:tbl>
@@ -17534,7 +18693,7 @@
               <w:pStyle w:val="NumeroEquacao"/>
             </w:pPr>
             <w:r>
-              <w:t>(3.33)</w:t>
+              <w:t>(3.35)</w:t>
             </w:r>
           </w:p>
         </w:tc>
@@ -17545,7 +18704,7 @@
         <w:pStyle w:val="FirstParagraph"/>
       </w:pPr>
       <w:r>
-        <w:t xml:space="preserve">A partir dessas quantidades, os indicadores são dados pelas Equações (3.34) e (3.35):</w:t>
+        <w:t xml:space="preserve">A partir dessas quantidades, os indicadores são dados pelas Equações (3.36) e (3.37):</w:t>
       </w:r>
     </w:p>
     <w:tbl>
@@ -17658,7 +18817,7 @@
               <w:pStyle w:val="NumeroEquacao"/>
             </w:pPr>
             <w:r>
-              <w:t>(3.34)</w:t>
+              <w:t>(3.36)</w:t>
             </w:r>
           </w:p>
         </w:tc>
@@ -17774,7 +18933,7 @@
               <w:pStyle w:val="NumeroEquacao"/>
             </w:pPr>
             <w:r>
-              <w:t>(3.35)</w:t>
+              <w:t>(3.37)</w:t>
             </w:r>
           </w:p>
         </w:tc>
@@ -18341,7 +19500,7 @@
         <w:t xml:space="preserve"> </w:t>
       </w:r>
       <w:r>
-        <w:t xml:space="preserve">e, pela Equação (3.33), o EEV.</w:t>
+        <w:t xml:space="preserve">e, pela Equação (3.35), o EEV.</w:t>
       </w:r>
     </w:p>
     <w:p>
@@ -18886,7 +20045,7 @@
         </m:r>
       </m:oMath>
       <w:r>
-        <w:t xml:space="preserve">, dado pela Equação (3.36) (na prática, calculado com</w:t>
+        <w:t xml:space="preserve">, dado pela Equação (3.38) (na prática, calculado com</w:t>
       </w:r>
       <w:r>
         <w:t xml:space="preserve"> </w:t>
@@ -19103,7 +20262,7 @@
               <w:pStyle w:val="NumeroEquacao"/>
             </w:pPr>
             <w:r>
-              <w:t>(3.36)</w:t>
+              <w:t>(3.38)</w:t>
             </w:r>
           </w:p>
         </w:tc>
@@ -19501,7 +20660,7 @@
         <w:t xml:space="preserve"> </w:t>
       </w:r>
       <w:r>
-        <w:t xml:space="preserve">fixo e com os estados de fronteira dos blocos dados pela relaxação linear de cada ano (Seção 3.6.2). O custo de oportunidade marginal é aproximado pelas diferenças finitas da Equação (3.37):</w:t>
+        <w:t xml:space="preserve">fixo e com os estados de fronteira dos blocos dados pela relaxação linear de cada ano (Seção 3.6.2). O custo de oportunidade marginal é aproximado pelas diferenças finitas da Equação (3.39):</w:t>
       </w:r>
     </w:p>
     <w:tbl>
@@ -19834,7 +20993,7 @@
               <w:pStyle w:val="NumeroEquacao"/>
             </w:pPr>
             <w:r>
-              <w:t>(3.37)</w:t>
+              <w:t>(3.39)</w:t>
             </w:r>
           </w:p>
         </w:tc>
@@ -19856,7 +21015,7 @@
         </m:r>
       </m:oMath>
       <w:r>
-        <w:t xml:space="preserve">, a potência ótima a ofertar é dada pela Equação (3.38), e o conjunto de pares</w:t>
+        <w:t xml:space="preserve">, a potência ótima a ofertar é dada pela Equação (3.40), e o conjunto de pares</w:t>
       </w:r>
       <w:r>
         <w:t xml:space="preserve"> </w:t>
@@ -20086,7 +21245,7 @@
               <w:pStyle w:val="NumeroEquacao"/>
             </w:pPr>
             <w:r>
-              <w:t>(3.38)</w:t>
+              <w:t>(3.40)</w:t>
             </w:r>
           </w:p>
         </w:tc>
@@ -20123,7 +21282,7 @@
         </m:sSup>
       </m:oMath>
       <w:r>
-        <w:t xml:space="preserve">, é a menor receita fixa para a qual participar do leilão é preferível a não participar, conforme a Equação (3.39); a receita de oferta integral,</w:t>
+        <w:t xml:space="preserve">, é a menor receita fixa para a qual participar do leilão é preferível a não participar, conforme a Equação (3.41); a receita de oferta integral,</w:t>
       </w:r>
       <w:r>
         <w:t xml:space="preserve"> </w:t>
@@ -20149,7 +21308,7 @@
         </m:sSup>
       </m:oMath>
       <w:r>
-        <w:t xml:space="preserve">, é a menor receita para a qual ofertar a potência máxima supera qualquer alternativa, conforme a Equação (3.40):</w:t>
+        <w:t xml:space="preserve">, é a menor receita para a qual ofertar a potência máxima supera qualquer alternativa, conforme a Equação (3.42):</w:t>
       </w:r>
     </w:p>
     <w:tbl>
@@ -20341,7 +21500,7 @@
               <w:pStyle w:val="NumeroEquacao"/>
             </w:pPr>
             <w:r>
-              <w:t>(3.39)</w:t>
+              <w:t>(3.41)</w:t>
             </w:r>
           </w:p>
         </w:tc>
@@ -20611,7 +21770,7 @@
               <w:pStyle w:val="NumeroEquacao"/>
             </w:pPr>
             <w:r>
-              <w:t>(3.40)</w:t>
+              <w:t>(3.42)</w:t>
             </w:r>
           </w:p>
         </w:tc>
@@ -20727,7 +21886,7 @@
         <w:t xml:space="preserve"> </w:t>
       </w:r>
       <w:r>
-        <w:t xml:space="preserve">anos), sem valor residual, conforme a Equação (3.41):</w:t>
+        <w:t xml:space="preserve">anos), sem valor residual, conforme a Equação (3.43):</w:t>
       </w:r>
     </w:p>
     <w:tbl>
@@ -21015,7 +22174,7 @@
               <w:pStyle w:val="NumeroEquacao"/>
             </w:pPr>
             <w:r>
-              <w:t>(3.41)</w:t>
+              <w:t>(3.43)</w:t>
             </w:r>
           </w:p>
         </w:tc>
@@ -22421,7 +23580,7 @@
         <w:t xml:space="preserve"> </w:t>
       </w:r>
       <w:r>
-        <w:t xml:space="preserve">da Seção 3.8.1 é ajustado em dois pontos, conforme a Equação (3.42): devolve-se o custo de degradação do módulo LRCAP, cujo desgaste já está no investimento e no O&amp;M fixo (Seção 3.5), e desconta-se o consumo auxiliar do BESS que não é custeado pela CONCAP:</w:t>
+        <w:t xml:space="preserve">da Seção 3.8.1 é ajustado em dois pontos, conforme a Equação (3.44): devolve-se o custo de degradação do módulo LRCAP, cujo desgaste já está no investimento e no O&amp;M fixo (Seção 3.5), e desconta-se o consumo auxiliar do BESS que não é custeado pela CONCAP:</w:t>
       </w:r>
     </w:p>
     <w:tbl>
@@ -22725,7 +23884,7 @@
               <w:pStyle w:val="NumeroEquacao"/>
             </w:pPr>
             <w:r>
-              <w:t>(3.42)</w:t>
+              <w:t>(3.44)</w:t>
             </w:r>
           </w:p>
         </w:tc>
@@ -23159,7 +24318,7 @@
         </m:r>
       </m:oMath>
       <w:r>
-        <w:t xml:space="preserve">, e a potência ofertada passa a ser dada pela Equação (3.43):</w:t>
+        <w:t xml:space="preserve">, e a potência ofertada passa a ser dada pela Equação (3.45):</w:t>
       </w:r>
     </w:p>
     <w:tbl>
@@ -23572,7 +24731,7 @@
               <w:pStyle w:val="NumeroEquacao"/>
             </w:pPr>
             <w:r>
-              <w:t>(3.43)</w:t>
+              <w:t>(3.45)</w:t>
             </w:r>
           </w:p>
         </w:tc>
@@ -23840,7 +24999,7 @@
         </m:sSup>
       </m:oMath>
       <w:r>
-        <w:t xml:space="preserve">, conforme a Equação (3.44):</w:t>
+        <w:t xml:space="preserve">, conforme a Equação (3.46):</w:t>
       </w:r>
     </w:p>
     <w:tbl>
@@ -24028,7 +25187,7 @@
               <w:pStyle w:val="NumeroEquacao"/>
             </w:pPr>
             <w:r>
-              <w:t>(3.44)</w:t>
+              <w:t>(3.46)</w:t>
             </w:r>
           </w:p>
         </w:tc>
@@ -24317,7 +25476,7 @@
         </m:sSup>
       </m:oMath>
       <w:r>
-        <w:t xml:space="preserve">. Como a Equação (3.42) devolve o termo de degradação,</w:t>
+        <w:t xml:space="preserve">. Como a Equação (3.44) devolve o termo de degradação,</w:t>
       </w:r>
       <w:r>
         <w:t xml:space="preserve"> </w:t>
@@ -24655,7 +25814,7 @@
         <w:t xml:space="preserve"> </w:t>
       </w:r>
       <w:r>
-        <w:t xml:space="preserve">resulta na Equação (3.45):</w:t>
+        <w:t xml:space="preserve">resulta na Equação (3.47):</w:t>
       </w:r>
     </w:p>
     <w:tbl>
@@ -25002,7 +26161,7 @@
               <w:pStyle w:val="NumeroEquacao"/>
             </w:pPr>
             <w:r>
-              <w:t>(3.45)</w:t>
+              <w:t>(3.47)</w:t>
             </w:r>
           </w:p>
         </w:tc>
@@ -25263,7 +26422,7 @@
         </m:sSup>
       </m:oMath>
       <w:r>
-        <w:t xml:space="preserve">. O lance mínimo é, então, dado exatamente pela Equação (3.45), com</w:t>
+        <w:t xml:space="preserve">. O lance mínimo é, então, dado exatamente pela Equação (3.47), com</w:t>
       </w:r>
       <w:r>
         <w:t xml:space="preserve"> </w:t>
@@ -25418,7 +26577,7 @@
         </m:r>
       </m:oMath>
       <w:r>
-        <w:t xml:space="preserve">), nos casos do Quadro 3.2. Os casos variam as hipóteses que a análise do caso de referência indicou como determinantes para o custo de oportunidade: a existência de um limite de demanda de hidrogênio (Seção 3.4.5), a vedação à importação de energia da rede, a frequência do despacho do ONS, o custo de degradação do BESS e o dimensionamento do eletrolisador e do tanque de hidrogênio.</w:t>
+        <w:t xml:space="preserve">), nos casos do Quadro 3.2. Os casos variam as hipóteses que a análise do caso de referência indicou como determinantes para o custo de oportunidade: a existência de um limite de demanda de hidrogênio (Seção 3.4.5), a regra de suprimento do eletrolisador pela rede — vedação, limite de emissões ou importação livre —, a frequência do despacho do ONS, o custo de degradação do BESS e o dimensionamento do eletrolisador e do tanque de hidrogênio.</w:t>
       </w:r>
     </w:p>
     <w:p>
@@ -25929,6 +27088,160 @@
               <w:pStyle w:val="Compact"/>
             </w:pPr>
             <w:r>
+              <w:t xml:space="preserve">Limite de emissões, fator médio</w:t>
+            </w:r>
+          </w:p>
+        </w:tc>
+        <w:tc>
+          <w:tcPr/>
+          <w:p>
+            <w:pPr>
+              <w:pStyle w:val="Compact"/>
+            </w:pPr>
+            <w:r>
+              <w:t xml:space="preserve">Sem limite de volume</w:t>
+            </w:r>
+          </w:p>
+        </w:tc>
+        <w:tc>
+          <w:tcPr/>
+          <w:p>
+            <w:pPr>
+              <w:pStyle w:val="Compact"/>
+            </w:pPr>
+            <w:r>
+              <w:t xml:space="preserve">Só ao eletrolisador, com</w:t>
+            </w:r>
+            <w:r>
+              <w:t xml:space="preserve"> </w:t>
+            </w:r>
+            <m:oMath>
+              <m:r>
+                <m:t>L</m:t>
+              </m:r>
+            </m:oMath>
+            <w:r>
+              <w:t xml:space="preserve"> </w:t>
+            </w:r>
+            <w:r>
+              <w:t xml:space="preserve">de 7 ou 3,4 kgCO₂/kgH₂</w:t>
+            </w:r>
+          </w:p>
+        </w:tc>
+        <w:tc>
+          <w:tcPr/>
+          <w:p>
+            <w:pPr>
+              <w:pStyle w:val="Compact"/>
+            </w:pPr>
+            <m:oMath>
+              <m:sSub>
+                <m:e>
+                  <m:r>
+                    <m:t>f</m:t>
+                  </m:r>
+                </m:e>
+                <m:sub>
+                  <m:r>
+                    <m:t>t</m:t>
+                  </m:r>
+                </m:sub>
+              </m:sSub>
+            </m:oMath>
+            <w:r>
+              <w:t xml:space="preserve"> </w:t>
+            </w:r>
+            <w:r>
+              <w:t xml:space="preserve">médio horário do SIN</w:t>
+            </w:r>
+          </w:p>
+        </w:tc>
+      </w:tr>
+      <w:tr>
+        <w:tc>
+          <w:tcPr/>
+          <w:p>
+            <w:pPr>
+              <w:pStyle w:val="Compact"/>
+            </w:pPr>
+            <w:r>
+              <w:t xml:space="preserve">Limite de emissões, fator marginal</w:t>
+            </w:r>
+          </w:p>
+        </w:tc>
+        <w:tc>
+          <w:tcPr/>
+          <w:p>
+            <w:pPr>
+              <w:pStyle w:val="Compact"/>
+            </w:pPr>
+            <w:r>
+              <w:t xml:space="preserve">Sem limite de volume</w:t>
+            </w:r>
+          </w:p>
+        </w:tc>
+        <w:tc>
+          <w:tcPr/>
+          <w:p>
+            <w:pPr>
+              <w:pStyle w:val="Compact"/>
+            </w:pPr>
+            <w:r>
+              <w:t xml:space="preserve">Só ao eletrolisador, com</w:t>
+            </w:r>
+            <w:r>
+              <w:t xml:space="preserve"> </w:t>
+            </w:r>
+            <m:oMath>
+              <m:r>
+                <m:t>L</m:t>
+              </m:r>
+            </m:oMath>
+            <w:r>
+              <w:t xml:space="preserve"> </w:t>
+            </w:r>
+            <w:r>
+              <w:t xml:space="preserve">de 7 ou 3,4 kgCO₂/kgH₂</w:t>
+            </w:r>
+          </w:p>
+        </w:tc>
+        <w:tc>
+          <w:tcPr/>
+          <w:p>
+            <w:pPr>
+              <w:pStyle w:val="Compact"/>
+            </w:pPr>
+            <m:oMath>
+              <m:sSub>
+                <m:e>
+                  <m:r>
+                    <m:t>f</m:t>
+                  </m:r>
+                </m:e>
+                <m:sub>
+                  <m:r>
+                    <m:t>t</m:t>
+                  </m:r>
+                </m:sub>
+              </m:sSub>
+            </m:oMath>
+            <w:r>
+              <w:t xml:space="preserve"> </w:t>
+            </w:r>
+            <w:r>
+              <w:t xml:space="preserve">= 449 kgCO₂/MWh</w:t>
+            </w:r>
+          </w:p>
+        </w:tc>
+      </w:tr>
+      <w:tr>
+        <w:tc>
+          <w:tcPr/>
+          <w:p>
+            <w:pPr>
+              <w:pStyle w:val="Compact"/>
+            </w:pPr>
+            <w:r>
               <w:t xml:space="preserve">Frequência do despacho</w:t>
             </w:r>
           </w:p>
@@ -26225,7 +27538,7 @@
         </m:sSup>
       </m:oMath>
       <w:r>
-        <w:t xml:space="preserve">. Essa configuração corresponde a um critério de qualificação do hidrogênio baseado na intensidade de emissões, e não na origem física da energia, e é avaliada como alternativa à hipótese de suprimento exclusivamente fotovoltaico. Para cada caso, além da curva de oferta, registram-se a potência ótima e a operação média nos cenários para a receita fixa de referência, de R$ 600 mil/(MW·ano), e calcula-se o lance mínimo para a construção do BESS (Seção 3.8.2), com o lucro sem BESS recalculado nos casos que alteram o contrato de hidrogênio, a importação ou o eletrolisador.</w:t>
+        <w:t xml:space="preserve">, sem limite de emissões. Nos casos com limite de emissões, a energia da rede, ao mesmo custo, supre apenas o eletrolisador e está sujeita às Equações (3.20) e (3.21), o que representa o critério de qualificação do hidrogênio pela intensidade de emissões (BRASIL, 2024). Ambas as configurações são avaliadas como alternativas à hipótese de suprimento exclusivamente fotovoltaico. Para cada caso, além da curva de oferta, registram-se a potência ótima e a operação média nos cenários para a receita fixa de referência, de R$ 600 mil/(MW·ano), e calcula-se o lance mínimo para a construção do BESS (Seção 3.8.2), com o lucro sem BESS recalculado nos casos que alteram o contrato de hidrogênio, a importação ou o eletrolisador.</w:t>
       </w:r>
     </w:p>
     <w:bookmarkEnd w:id="40"/>
@@ -26286,7 +27599,7 @@
         <w:t xml:space="preserve">solver</w:t>
       </w:r>
       <w:r>
-        <w:t xml:space="preserve">, a fim de evitar a concorrência por núcleos de processamento. A consistência do modelo é verificada por um conjunto de testes automatizados que conferem, entre outros aspectos, o balanço de potência, os limites dos estados de carga, a exclusividade entre carga e descarga, o cumprimento do despacho do ONS e a seleção dos dias de despacho, o limite do ponto de conexão, as entregas do contrato de hidrogênio e a validade dos cortes de Benders. O código e os dados são mantidos sob controle de versão, o que assegura a reprodutibilidade dos resultados.</w:t>
+        <w:t xml:space="preserve">, a fim de evitar a concorrência por núcleos de processamento. A consistência do modelo é verificada por um conjunto de testes automatizados que conferem, entre outros aspectos, o balanço de potência, os limites dos estados de carga, a exclusividade entre carga e descarga, o cumprimento do despacho do ONS e a seleção dos dias de despacho, o limite do ponto de conexão, as entregas do contrato de hidrogênio, o limite de emissões do hidrogênio e a validade dos cortes de Benders. O código e os dados são mantidos sob controle de versão, o que assegura a reprodutibilidade dos resultados.</w:t>
       </w:r>
     </w:p>
     <w:bookmarkEnd w:id="42"/>
@@ -26632,7 +27945,41 @@
         <w:t xml:space="preserve"> </w:t>
       </w:r>
       <w:r>
-        <w:t xml:space="preserve">os cinco anos históricos são tratados como equiprováveis e constituem uma amostra pequena; o VSS e o EVPI são, portanto, medidos dentro da amostra, e a avaliação da decisão fora da amostra é deixada para trabalhos futuros.</w:t>
+        <w:t xml:space="preserve">os cinco anos históricos são tratados como equiprováveis e constituem uma amostra pequena; o VSS e o EVPI são, portanto, medidos dentro da amostra, e a avaliação da decisão fora da amostra é deixada para trabalhos futuros;</w:t>
+      </w:r>
+    </w:p>
+    <w:p>
+      <w:pPr>
+        <w:numPr>
+          <w:ilvl w:val="0"/>
+          <w:numId w:val="1005"/>
+        </w:numPr>
+      </w:pPr>
+      <w:r>
+        <w:rPr>
+          <w:b/>
+          <w:bCs/>
+        </w:rPr>
+        <w:t xml:space="preserve">limite de emissões simplificado:</w:t>
+      </w:r>
+      <w:r>
+        <w:t xml:space="preserve"> </w:t>
+      </w:r>
+      <w:r>
+        <w:t xml:space="preserve">a intensidade de emissões é apurada por semana, e não por hora ou por ano, e toda a energia importada é atribuída ao hidrogênio; o fator de emissão da rede é estimado com fatores do IPCC e rendimentos típicos por combustível, e não com o consumo de combustível de cada usina, e os fatores oficiais usados na comparação foram obtidos em fontes secundárias; a energia FV entra com emissão nula, ao passo que seu ciclo de vida, com mediana de 48 gCO₂eq/kWh em usinas de grande porte (SCHLÖMER</w:t>
+      </w:r>
+      <w:r>
+        <w:t xml:space="preserve"> </w:t>
+      </w:r>
+      <w:r>
+        <w:rPr>
+          <w:i/>
+          <w:iCs/>
+        </w:rPr>
+        <w:t xml:space="preserve">et al.</w:t>
+      </w:r>
+      <w:r>
+        <w:t xml:space="preserve">, 2014), corresponderia, sozinho, a 2,6 kgCO₂eq/kgH₂; e a metodologia de certificação — fator médio ou marginal, janela de apuração e fronteira do ciclo de vida — depende da regulamentação do Sistema Brasileiro de Certificação do Hidrogênio.</w:t>
       </w:r>
     </w:p>
     <w:bookmarkEnd w:id="43"/>
@@ -26776,6 +28123,14 @@
         <w:pStyle w:val="Referencia"/>
       </w:pPr>
       <w:r>
+        <w:t xml:space="preserve">BRASIL. Lei nº 14.948, de 2 de agosto de 2024. Institui o marco legal do hidrogênio de baixa emissão de carbono e dispõe sobre a Política Nacional do Hidrogênio de Baixa Emissão de Carbono. Brasília, DF: Presidência da República, 2024.</w:t>
+      </w:r>
+    </w:p>
+    <w:p>
+      <w:pPr>
+        <w:pStyle w:val="Referencia"/>
+      </w:pPr>
+      <w:r>
         <w:t xml:space="preserve">BRASIL. Ministério de Minas e Energia. Portaria Normativa MME nº 136, de 1º de junho de 2026. Estabelece as Diretrizes e a Sistemática para a realização dos Leilões para Contratação de Potência Elétrica, a partir de novos sistemas de armazenamento de energia em baterias.</w:t>
       </w:r>
       <w:r>
@@ -27146,6 +28501,69 @@
         <w:pStyle w:val="Referencia"/>
       </w:pPr>
       <w:r>
+        <w:t xml:space="preserve">HUANGFU, Q.; HALL, J. A. J. Parallelizing the dual revised simplex method.</w:t>
+      </w:r>
+      <w:r>
+        <w:t xml:space="preserve"> </w:t>
+      </w:r>
+      <w:r>
+        <w:rPr>
+          <w:b/>
+          <w:bCs/>
+        </w:rPr>
+        <w:t xml:space="preserve">Mathematical Programming Computation</w:t>
+      </w:r>
+      <w:r>
+        <w:t xml:space="preserve">, v. 10, n. 1, p. 119–142, 2018.</w:t>
+      </w:r>
+    </w:p>
+    <w:p>
+      <w:pPr>
+        <w:pStyle w:val="Referencia"/>
+      </w:pPr>
+      <w:r>
+        <w:t xml:space="preserve">HULD, T.; MÜLLER, R.; GAMBARDELLA, A. A new solar radiation database for estimating PV performance in Europe and Africa.</w:t>
+      </w:r>
+      <w:r>
+        <w:t xml:space="preserve"> </w:t>
+      </w:r>
+      <w:r>
+        <w:rPr>
+          <w:b/>
+          <w:bCs/>
+        </w:rPr>
+        <w:t xml:space="preserve">Solar Energy</w:t>
+      </w:r>
+      <w:r>
+        <w:t xml:space="preserve">, v. 86, n. 6, p. 1803–1815, 2012.</w:t>
+      </w:r>
+    </w:p>
+    <w:p>
+      <w:pPr>
+        <w:pStyle w:val="Referencia"/>
+      </w:pPr>
+      <w:r>
+        <w:t xml:space="preserve">IBGE – INSTITUTO BRASILEIRO DE GEOGRAFIA E ESTATÍSTICA.</w:t>
+      </w:r>
+      <w:r>
+        <w:t xml:space="preserve"> </w:t>
+      </w:r>
+      <w:r>
+        <w:rPr>
+          <w:b/>
+          <w:bCs/>
+        </w:rPr>
+        <w:t xml:space="preserve">Índice Nacional de Preços ao Consumidor Amplo (IPCA)</w:t>
+      </w:r>
+      <w:r>
+        <w:t xml:space="preserve">: séries históricas. Rio de Janeiro: IBGE, 2026. Disponível em: https://www.ibge.gov.br/estatisticas/economicas/precos-e-custos/9256-indice-nacional-de-precos-ao-consumidor-amplo.html. Acesso em: 3 out. 2026.</w:t>
+      </w:r>
+    </w:p>
+    <w:p>
+      <w:pPr>
+        <w:pStyle w:val="Referencia"/>
+      </w:pPr>
+      <w:r>
         <w:t xml:space="preserve">IEA – INTERNATIONAL ENERGY AGENCY.</w:t>
       </w:r>
       <w:r>
@@ -27167,7 +28585,7 @@
         <w:pStyle w:val="Referencia"/>
       </w:pPr>
       <w:r>
-        <w:t xml:space="preserve">IBGE – INSTITUTO BRASILEIRO DE GEOGRAFIA E ESTATÍSTICA.</w:t>
+        <w:t xml:space="preserve">IPCC – INTERGOVERNMENTAL PANEL ON CLIMATE CHANGE.</w:t>
       </w:r>
       <w:r>
         <w:t xml:space="preserve"> </w:t>
@@ -27177,10 +28595,10 @@
           <w:b/>
           <w:bCs/>
         </w:rPr>
-        <w:t xml:space="preserve">Índice Nacional de Preços ao Consumidor Amplo (IPCA)</w:t>
-      </w:r>
-      <w:r>
-        <w:t xml:space="preserve">: séries históricas. Rio de Janeiro: IBGE, 2026. Disponível em: https://www.ibge.gov.br/estatisticas/economicas/precos-e-custos/9256-indice-nacional-de-precos-ao-consumidor-amplo.html. Acesso em: 3 out. 2026.</w:t>
+        <w:t xml:space="preserve">2006 IPCC Guidelines for National Greenhouse Gas Inventories</w:t>
+      </w:r>
+      <w:r>
+        <w:t xml:space="preserve">. v. 2: Energy. Hayama: IGES, 2006.</w:t>
       </w:r>
     </w:p>
     <w:p>
@@ -27188,7 +28606,7 @@
         <w:pStyle w:val="Referencia"/>
       </w:pPr>
       <w:r>
-        <w:t xml:space="preserve">HUANGFU, Q.; HALL, J. A. J. Parallelizing the dual revised simplex method.</w:t>
+        <w:t xml:space="preserve">MCTI – MINISTÉRIO DA CIÊNCIA, TECNOLOGIA E INOVAÇÃO.</w:t>
       </w:r>
       <w:r>
         <w:t xml:space="preserve"> </w:t>
@@ -27198,10 +28616,10 @@
           <w:b/>
           <w:bCs/>
         </w:rPr>
-        <w:t xml:space="preserve">Mathematical Programming Computation</w:t>
-      </w:r>
-      <w:r>
-        <w:t xml:space="preserve">, v. 10, n. 1, p. 119–142, 2018.</w:t>
+        <w:t xml:space="preserve">Fatores de emissão de CO₂ pela geração de energia elétrica no Sistema Interligado Nacional</w:t>
+      </w:r>
+      <w:r>
+        <w:t xml:space="preserve">. Brasília: MCTI, 2025. Disponível em: https://www.gov.br/mcti/pt-br/acompanhe-o-mcti/sirene/dados-e-ferramentas/fatores-de-emissao.</w:t>
       </w:r>
     </w:p>
     <w:p>
@@ -27209,7 +28627,7 @@
         <w:pStyle w:val="Referencia"/>
       </w:pPr>
       <w:r>
-        <w:t xml:space="preserve">HULD, T.; MÜLLER, R.; GAMBARDELLA, A. A new solar radiation database for estimating PV performance in Europe and Africa.</w:t>
+        <w:t xml:space="preserve">MOVIMENTO ECONÔMICO.</w:t>
       </w:r>
       <w:r>
         <w:t xml:space="preserve"> </w:t>
@@ -27219,10 +28637,10 @@
           <w:b/>
           <w:bCs/>
         </w:rPr>
-        <w:t xml:space="preserve">Solar Energy</w:t>
-      </w:r>
-      <w:r>
-        <w:t xml:space="preserve">, v. 86, n. 6, p. 1803–1815, 2012.</w:t>
+        <w:t xml:space="preserve">Aneel conclui tarifas de transmissão e NE sai favorecido no ciclo 2026/2027</w:t>
+      </w:r>
+      <w:r>
+        <w:t xml:space="preserve">. 29 jun. 2026. Disponível em: https://movimentoeconomico.com.br/economia/energia/2026/06/29/aneel-conclui-tarifas-de-transmissao-e-ne-sai-favorecido-no-ciclo-2026-2027/. Acesso em: 13 out. 2026.</w:t>
       </w:r>
     </w:p>
     <w:p>
@@ -27230,7 +28648,7 @@
         <w:pStyle w:val="Referencia"/>
       </w:pPr>
       <w:r>
-        <w:t xml:space="preserve">MOVIMENTO ECONÔMICO.</w:t>
+        <w:t xml:space="preserve">NREL – NATIONAL RENEWABLE ENERGY LABORATORY.</w:t>
       </w:r>
       <w:r>
         <w:t xml:space="preserve"> </w:t>
@@ -27240,10 +28658,10 @@
           <w:b/>
           <w:bCs/>
         </w:rPr>
-        <w:t xml:space="preserve">Aneel conclui tarifas de transmissão e NE sai favorecido no ciclo 2026/2027</w:t>
-      </w:r>
-      <w:r>
-        <w:t xml:space="preserve">. 29 jun. 2026. Disponível em: https://movimentoeconomico.com.br/economia/energia/2026/06/29/aneel-conclui-tarifas-de-transmissao-e-ne-sai-favorecido-no-ciclo-2026-2027/. Acesso em: 13 out. 2026.</w:t>
+        <w:t xml:space="preserve">2024 Annual Technology Baseline</w:t>
+      </w:r>
+      <w:r>
+        <w:t xml:space="preserve">: utility-scale battery storage. Golden: NREL, 2024. Disponível em: https://atb.nrel.gov/electricity/2024/utility-scale_battery_storage. Acesso em: 13 out. 2026.</w:t>
       </w:r>
     </w:p>
     <w:p>
@@ -27251,7 +28669,7 @@
         <w:pStyle w:val="Referencia"/>
       </w:pPr>
       <w:r>
-        <w:t xml:space="preserve">NREL – NATIONAL RENEWABLE ENERGY LABORATORY.</w:t>
+        <w:t xml:space="preserve">ONS – OPERADOR NACIONAL DO SISTEMA ELÉTRICO.</w:t>
       </w:r>
       <w:r>
         <w:t xml:space="preserve"> </w:t>
@@ -27261,10 +28679,10 @@
           <w:b/>
           <w:bCs/>
         </w:rPr>
-        <w:t xml:space="preserve">2024 Annual Technology Baseline</w:t>
-      </w:r>
-      <w:r>
-        <w:t xml:space="preserve">: utility-scale battery storage. Golden: NREL, 2024. Disponível em: https://atb.nrel.gov/electricity/2024/utility-scale_battery_storage. Acesso em: 13 out. 2026.</w:t>
+        <w:t xml:space="preserve">Geração por usina em base horária</w:t>
+      </w:r>
+      <w:r>
+        <w:t xml:space="preserve">. Portal de Dados Abertos do ONS, 2026. Disponível em: https://dados.ons.org.br. Acesso em: 14 out. 2026.</w:t>
       </w:r>
     </w:p>
     <w:p>
@@ -27314,6 +28732,56 @@
         <w:pStyle w:val="Referencia"/>
       </w:pPr>
       <w:r>
+        <w:t xml:space="preserve">SCHLÖMER, S.</w:t>
+      </w:r>
+      <w:r>
+        <w:t xml:space="preserve"> </w:t>
+      </w:r>
+      <w:r>
+        <w:rPr>
+          <w:i/>
+          <w:iCs/>
+        </w:rPr>
+        <w:t xml:space="preserve">et al.</w:t>
+      </w:r>
+      <w:r>
+        <w:t xml:space="preserve"> </w:t>
+      </w:r>
+      <w:r>
+        <w:t xml:space="preserve">Annex III: technology-specific cost and performance parameters.</w:t>
+      </w:r>
+      <w:r>
+        <w:t xml:space="preserve"> </w:t>
+      </w:r>
+      <w:r>
+        <w:rPr>
+          <w:i/>
+          <w:iCs/>
+        </w:rPr>
+        <w:t xml:space="preserve">In</w:t>
+      </w:r>
+      <w:r>
+        <w:t xml:space="preserve">: IPCC – INTERGOVERNMENTAL PANEL ON CLIMATE CHANGE.</w:t>
+      </w:r>
+      <w:r>
+        <w:t xml:space="preserve"> </w:t>
+      </w:r>
+      <w:r>
+        <w:rPr>
+          <w:b/>
+          <w:bCs/>
+        </w:rPr>
+        <w:t xml:space="preserve">Climate Change 2014</w:t>
+      </w:r>
+      <w:r>
+        <w:t xml:space="preserve">: mitigation of climate change. Cambridge: Cambridge University Press, 2014.</w:t>
+      </w:r>
+    </w:p>
+    <w:p>
+      <w:pPr>
+        <w:pStyle w:val="Referencia"/>
+      </w:pPr>
+      <w:r>
         <w:t xml:space="preserve">TERNA.</w:t>
       </w:r>
       <w:r>
@@ -27328,6 +28796,27 @@
       </w:r>
       <w:r>
         <w:t xml:space="preserve">: 10 GWh of energy storage capacity awarded. Roma: Terna S.p.A., 1 out. 2025. Comunicado de imprensa. Disponível em: https://www.terna.it. Acesso em: 3 out. 2026.</w:t>
+      </w:r>
+    </w:p>
+    <w:p>
+      <w:pPr>
+        <w:pStyle w:val="Referencia"/>
+      </w:pPr>
+      <w:r>
+        <w:t xml:space="preserve">UNIÃO EUROPEIA. Regulamento Delegado (UE) 2023/1185 da Comissão, de 10 de fevereiro de 2023, que estabelece um limiar mínimo de redução das emissões de gases com efeito de estufa para os combustíveis de carbono reciclado e uma metodologia de avaliação da redução das emissões dos combustíveis renováveis de origem não biológica.</w:t>
+      </w:r>
+      <w:r>
+        <w:t xml:space="preserve"> </w:t>
+      </w:r>
+      <w:r>
+        <w:rPr>
+          <w:b/>
+          <w:bCs/>
+        </w:rPr>
+        <w:t xml:space="preserve">Jornal Oficial da União Europeia</w:t>
+      </w:r>
+      <w:r>
+        <w:t xml:space="preserve">, L 157, 20 jun. 2023.</w:t>
       </w:r>
     </w:p>
     <w:p>

</xml_diff>

<commit_message>
Revisão: custo de partida na formulação, taxa de 12,1% na anualização, comparação determinístico x estocástico e definição do custo de oportunidade
Co-Authored-By: Claude Opus 5.5 <noreply@anthropic.com>
Claude-Session: https://claude.ai/code/session_01YFtn9hiQUHbNLSX7rUNYuK
</commit_message>
<xml_diff>
--- a/docs/dissertacao/cap3_metodologia.docx
+++ b/docs/dissertacao/cap3_metodologia.docx
@@ -1818,6 +1818,72 @@
             </w:pPr>
             <w:r>
               <w:t xml:space="preserve">1,5</w:t>
+            </w:r>
+          </w:p>
+        </w:tc>
+      </w:tr>
+      <w:tr>
+        <w:tc>
+          <w:tcPr/>
+          <w:p>
+            <w:pPr>
+              <w:pStyle w:val="Compact"/>
+            </w:pPr>
+            <m:oMath>
+              <m:sSup>
+                <m:e>
+                  <m:r>
+                    <m:t>c</m:t>
+                  </m:r>
+                </m:e>
+                <m:sup>
+                  <m:r>
+                    <m:t>p</m:t>
+                  </m:r>
+                  <m:r>
+                    <m:t>a</m:t>
+                  </m:r>
+                  <m:r>
+                    <m:t>r</m:t>
+                  </m:r>
+                  <m:r>
+                    <m:t>t</m:t>
+                  </m:r>
+                </m:sup>
+              </m:sSup>
+            </m:oMath>
+          </w:p>
+        </w:tc>
+        <w:tc>
+          <w:tcPr/>
+          <w:p>
+            <w:pPr>
+              <w:pStyle w:val="Compact"/>
+            </w:pPr>
+            <w:r>
+              <w:t xml:space="preserve">Custo por partida do eletrolisador</w:t>
+            </w:r>
+          </w:p>
+        </w:tc>
+        <w:tc>
+          <w:tcPr/>
+          <w:p>
+            <w:pPr>
+              <w:pStyle w:val="Compact"/>
+            </w:pPr>
+            <w:r>
+              <w:t xml:space="preserve">R$/partida</w:t>
+            </w:r>
+          </w:p>
+        </w:tc>
+        <w:tc>
+          <w:tcPr/>
+          <w:p>
+            <w:pPr>
+              <w:pStyle w:val="Compact"/>
+            </w:pPr>
+            <w:r>
+              <w:t xml:space="preserve">0 (determinístico); 500 (estocástico)</w:t>
             </w:r>
           </w:p>
         </w:tc>
@@ -4238,6 +4304,83 @@
                   <m:sty m:val="p"/>
                 </m:rPr>
                 <m:t>}</m:t>
+              </m:r>
+            </m:oMath>
+          </w:p>
+        </w:tc>
+      </w:tr>
+      <w:tr>
+        <w:tc>
+          <w:tcPr/>
+          <w:p>
+            <w:pPr>
+              <w:pStyle w:val="Compact"/>
+            </w:pPr>
+            <m:oMath>
+              <m:sSub>
+                <m:e>
+                  <m:r>
+                    <m:t>u</m:t>
+                  </m:r>
+                </m:e>
+                <m:sub>
+                  <m:r>
+                    <m:t>t</m:t>
+                  </m:r>
+                </m:sub>
+              </m:sSub>
+            </m:oMath>
+          </w:p>
+        </w:tc>
+        <w:tc>
+          <w:tcPr/>
+          <w:p>
+            <w:pPr>
+              <w:pStyle w:val="Compact"/>
+            </w:pPr>
+            <w:r>
+              <w:t xml:space="preserve">Partida do eletrolisador no intervalo</w:t>
+            </w:r>
+            <w:r>
+              <w:t xml:space="preserve"> </w:t>
+            </w:r>
+            <m:oMath>
+              <m:r>
+                <m:t>t</m:t>
+              </m:r>
+            </m:oMath>
+          </w:p>
+        </w:tc>
+        <w:tc>
+          <w:tcPr/>
+          <w:p>
+            <w:pPr>
+              <w:pStyle w:val="Compact"/>
+            </w:pPr>
+            <m:oMath>
+              <m:r>
+                <m:rPr>
+                  <m:sty m:val="p"/>
+                </m:rPr>
+                <m:t>[</m:t>
+              </m:r>
+              <m:r>
+                <m:t>0</m:t>
+              </m:r>
+              <m:r>
+                <m:rPr>
+                  <m:sty m:val="p"/>
+                </m:rPr>
+                <m:t>,</m:t>
+              </m:r>
+              <m:r>
+                <m:t>1</m:t>
+              </m:r>
+              <m:r>
+                <m:rPr>
+                  <m:sty m:val="p"/>
+                </m:rPr>
+                <m:t>]</m:t>
               </m:r>
             </m:oMath>
           </w:p>
@@ -4651,6 +4794,78 @@
                   </m:naryPr>
                   <m:sub>
                     <m:r>
+                      <m:t>t</m:t>
+                    </m:r>
+                    <m:r>
+                      <m:rPr>
+                        <m:sty m:val="p"/>
+                      </m:rPr>
+                      <m:t>∈</m:t>
+                    </m:r>
+                    <m:r>
+                      <m:rPr>
+                        <m:scr m:val="script"/>
+                        <m:sty m:val="p"/>
+                      </m:rPr>
+                      <m:t>T</m:t>
+                    </m:r>
+                  </m:sub>
+                  <m:sup>
+                    <m:r>
+                      <m:t>​</m:t>
+                    </m:r>
+                  </m:sup>
+                  <m:e>
+                    <m:sSup>
+                      <m:e>
+                        <m:r>
+                          <m:t>c</m:t>
+                        </m:r>
+                      </m:e>
+                      <m:sup>
+                        <m:r>
+                          <m:t>p</m:t>
+                        </m:r>
+                        <m:r>
+                          <m:t>a</m:t>
+                        </m:r>
+                        <m:r>
+                          <m:t>r</m:t>
+                        </m:r>
+                        <m:r>
+                          <m:t>t</m:t>
+                        </m:r>
+                      </m:sup>
+                    </m:sSup>
+                  </m:e>
+                </m:nary>
+                <m:sSub>
+                  <m:e>
+                    <m:r>
+                      <m:t>u</m:t>
+                    </m:r>
+                  </m:e>
+                  <m:sub>
+                    <m:r>
+                      <m:t>t</m:t>
+                    </m:r>
+                  </m:sub>
+                </m:sSub>
+                <m:r>
+                  <m:rPr>
+                    <m:sty m:val="p"/>
+                  </m:rPr>
+                  <m:t>−</m:t>
+                </m:r>
+                <m:nary>
+                  <m:naryPr>
+                    <m:chr m:val="∑"/>
+                    <m:limLoc m:val="undOvr"/>
+                    <m:subHide m:val="off"/>
+                    <m:supHide m:val="on"/>
+                  </m:naryPr>
+                  <m:sub>
+                    <m:r>
                       <m:t>d</m:t>
                     </m:r>
                     <m:r>
@@ -4978,7 +5193,7 @@
         <w:pStyle w:val="FirstParagraph"/>
       </w:pPr>
       <w:r>
-        <w:t xml:space="preserve">Os termos correspondem, respectivamente, à receita da energia exportada ao MCP, ao custo da energia importada, à margem da comercialização do hidrogênio, à multa por déficit de entrega de hidrogênio, à receita fixa do LRCAP rateada no horizonte, ao custo da recarga excedente do módulo LRCAP e ao custo de degradação do BESS, aplicado à energia descarregada por ambos os módulos. Ressalta-se que a energia injetada pelo módulo LRCAP não compõe a receita do MCP do empreendedor, em conformidade com o art. 9º, § 6º, da Portaria.</w:t>
+        <w:t xml:space="preserve">Os termos correspondem, respectivamente, à receita da energia exportada ao MCP, ao custo da energia importada, à margem da comercialização do hidrogênio, ao custo de partida do eletrolisador, à multa por déficit de entrega de hidrogênio, à receita fixa do LRCAP rateada no horizonte, ao custo da recarga excedente do módulo LRCAP e ao custo de degradação do BESS, aplicado à energia descarregada por ambos os módulos. Ressalta-se que a energia injetada pelo módulo LRCAP não compõe a receita do MCP do empreendedor, em conformidade com o art. 9º, § 6º, da Portaria.</w:t>
       </w:r>
     </w:p>
     <w:p>
@@ -11772,7 +11987,7 @@
         <w:t xml:space="preserve"> </w:t>
       </w:r>
       <w:r>
-        <w:t xml:space="preserve">Como ainda não houve leilão de armazenamento em baterias no Brasil, a receita fixa foi delimitada por quatro referências. A inferior é o primeiro leilão do mecanismo italiano de contratação de capacidade de armazenamento (MACSE), realizado em setembro de 2025 com contratos de 15 anos e desenho semelhante ao do LRCAP, cujo preço médio de € 12.959/(MWh·ano) (TERNA, 2025) corresponde, para um sistema de 4 h e com a taxa de câmbio PTAX de 30/09/2025 (R$ 6,2396/€), a cerca de R$ 323 mil/(MW·ano). No LRCAP de março de 2026, que contratou o mesmo produto — potência disponível ao ONS —, termelétricas existentes a óleo e biodiesel obtiveram preço médio de R$ 831 mil/(MW·ano) (CCEE, 2026c), e o conjunto de termelétricas a gás natural, biometano e carvão e de ampliações de hidrelétricas, novas e existentes, R$ 2,334 milhões/(MW·ano) (CCEE, 2026b). Por fim, o custo de investimento de referência de sistemas de baterias, de R$ 5.000 a R$ 6.000/kW (BRASIL; EPE, 2025), corresponde, anualizado a 10% ao ano em 15 anos, a R$ 657 mil a R$ 789 mil/(MW·ano), sem considerar operação e manutenção, encargos e reposição de módulos. Com base nessas referências, a análise de sensibilidade abrange receitas fixas de R$ 330 mil a R$ 2,33 milhões/(MW·ano). O valor de R$ 600 mil/(MW·ano) adotado no caso de referência situa-se no extremo inferior dessa faixa, abaixo do preço obtido por usinas existentes e do custo anualizado de investimento em baterias, e constitui, portanto, uma hipótese conservadora quanto à atratividade do leilão.</w:t>
+        <w:t xml:space="preserve">Como ainda não houve leilão de armazenamento em baterias no Brasil, a receita fixa foi delimitada por quatro referências. A inferior é o primeiro leilão do mecanismo italiano de contratação de capacidade de armazenamento (MACSE), realizado em setembro de 2025 com contratos de 15 anos e desenho semelhante ao do LRCAP, cujo preço médio de € 12.959/(MWh·ano) (TERNA, 2025) corresponde, para um sistema de 4 h e com a taxa de câmbio PTAX de 30/09/2025 (R$ 6,2396/€), a cerca de R$ 323 mil/(MW·ano). No LRCAP de março de 2026, que contratou o mesmo produto — potência disponível ao ONS —, termelétricas existentes a óleo e biodiesel obtiveram preço médio de R$ 831 mil/(MW·ano) (CCEE, 2026c), e o conjunto de termelétricas a gás natural, biometano e carvão e de ampliações de hidrelétricas, novas e existentes, R$ 2,334 milhões/(MW·ano) (CCEE, 2026b). Por fim, o custo de investimento de referência de sistemas de baterias, de R$ 5.000 a R$ 6.000/kW (BRASIL; EPE, 2025), corresponde, anualizado à taxa central de 12,1% ao ano em 15 anos (Seção 3.8.2), a R$ 738 mil a R$ 886 mil/(MW·ano), sem considerar operação e manutenção, encargos e reposição de módulos. Com base nessas referências, a análise de sensibilidade abrange receitas fixas de R$ 330 mil a R$ 2,33 milhões/(MW·ano). O valor de R$ 600 mil/(MW·ano) adotado no caso de referência situa-se no extremo inferior dessa faixa, abaixo do preço obtido por usinas existentes e do custo anualizado de investimento em baterias, e constitui, portanto, uma hipótese conservadora quanto à atratividade do leilão.</w:t>
       </w:r>
     </w:p>
     <w:bookmarkEnd w:id="24"/>
@@ -16351,7 +16566,7 @@
         <w:pStyle w:val="FirstParagraph"/>
       </w:pPr>
       <w:r>
-        <w:t xml:space="preserve">No caso estocástico, considera-se ainda um custo por partida do eletrolisador,</w:t>
+        <w:t xml:space="preserve">No caso estocástico, o custo por partida do eletrolisador da Equação (3.1),</w:t>
       </w:r>
       <w:r>
         <w:t xml:space="preserve"> </w:t>
@@ -16380,7 +16595,7 @@
         </m:sSup>
       </m:oMath>
       <w:r>
-        <w:t xml:space="preserve">, associado a uma variável</w:t>
+        <w:t xml:space="preserve">, é de R$ 500 (valor de referência, a calibrar com o fabricante) e incide sobre a variável</w:t>
       </w:r>
       <w:r>
         <w:t xml:space="preserve"> </w:t>
@@ -16445,7 +16660,45 @@
         </m:sSub>
       </m:oMath>
       <w:r>
-        <w:t xml:space="preserve">, que penaliza ligamentos frequentes.</w:t>
+        <w:t xml:space="preserve">, que penaliza ligamentos frequentes; no caso determinístico,</w:t>
+      </w:r>
+      <w:r>
+        <w:t xml:space="preserve"> </w:t>
+      </w:r>
+      <m:oMath>
+        <m:sSup>
+          <m:e>
+            <m:r>
+              <m:t>c</m:t>
+            </m:r>
+          </m:e>
+          <m:sup>
+            <m:r>
+              <m:t>p</m:t>
+            </m:r>
+            <m:r>
+              <m:t>a</m:t>
+            </m:r>
+            <m:r>
+              <m:t>r</m:t>
+            </m:r>
+            <m:r>
+              <m:t>t</m:t>
+            </m:r>
+          </m:sup>
+        </m:sSup>
+        <m:r>
+          <m:rPr>
+            <m:sty m:val="p"/>
+          </m:rPr>
+          <m:t>=</m:t>
+        </m:r>
+        <m:r>
+          <m:t>0</m:t>
+        </m:r>
+      </m:oMath>
+      <w:r>
+        <w:t xml:space="preserve">.</w:t>
       </w:r>
     </w:p>
     <w:p>
@@ -20326,7 +20579,7 @@
         <w:t xml:space="preserve"> </w:t>
       </w:r>
       <w:r>
-        <w:t xml:space="preserve">mede quanto lucro operacional o empreendedor deixa de obter — no MCP e na venda de hidrogênio — por comprometer</w:t>
+        <w:t xml:space="preserve">mede quanto lucro operacional o empreendedor perde por comprometer</w:t>
       </w:r>
       <w:r>
         <w:t xml:space="preserve"> </w:t>
@@ -20340,7 +20593,83 @@
         <w:t xml:space="preserve"> </w:t>
       </w:r>
       <w:r>
-        <w:t xml:space="preserve">MW com o leilão, isto é, o custo de oportunidade da contratação. Seu valor por MW adicional,</w:t>
+        <w:t xml:space="preserve">MW com o leilão. Ela reúne duas parcelas: o lucro que deixa de obter no MCP e na venda de hidrogênio, que é o custo de oportunidade em sentido estrito, e o custo de degradação do módulo LRCAP pelo despacho do ONS, de</w:t>
+      </w:r>
+      <w:r>
+        <w:t xml:space="preserve"> </w:t>
+      </w:r>
+      <m:oMath>
+        <m:sSup>
+          <m:e>
+            <m:r>
+              <m:t>c</m:t>
+            </m:r>
+          </m:e>
+          <m:sup>
+            <m:r>
+              <m:t>d</m:t>
+            </m:r>
+            <m:r>
+              <m:t>e</m:t>
+            </m:r>
+            <m:r>
+              <m:t>g</m:t>
+            </m:r>
+          </m:sup>
+        </m:sSup>
+        <m:sSup>
+          <m:e>
+            <m:r>
+              <m:t>E</m:t>
+            </m:r>
+          </m:e>
+          <m:sup>
+            <m:r>
+              <m:t>o</m:t>
+            </m:r>
+            <m:r>
+              <m:t>n</m:t>
+            </m:r>
+            <m:r>
+              <m:t>s</m:t>
+            </m:r>
+          </m:sup>
+        </m:sSup>
+      </m:oMath>
+      <w:r>
+        <w:t xml:space="preserve"> </w:t>
+      </w:r>
+      <w:r>
+        <w:t xml:space="preserve">por MW contratado, em que</w:t>
+      </w:r>
+      <w:r>
+        <w:t xml:space="preserve"> </w:t>
+      </w:r>
+      <m:oMath>
+        <m:sSup>
+          <m:e>
+            <m:r>
+              <m:t>E</m:t>
+            </m:r>
+          </m:e>
+          <m:sup>
+            <m:r>
+              <m:t>o</m:t>
+            </m:r>
+            <m:r>
+              <m:t>n</m:t>
+            </m:r>
+            <m:r>
+              <m:t>s</m:t>
+            </m:r>
+          </m:sup>
+        </m:sSup>
+      </m:oMath>
+      <w:r>
+        <w:t xml:space="preserve"> </w:t>
+      </w:r>
+      <w:r>
+        <w:t xml:space="preserve">é a energia injetada pelo módulo por MW em um ano (Seção 3.8.2). Neste trabalho, denomina-se custo de oportunidade da contratação a soma das duas parcelas, pois é ela que a receita fixa precisa cobrir quando o BESS já existe. Seu valor por MW adicional,</w:t>
       </w:r>
       <w:r>
         <w:t xml:space="preserve"> </w:t>

</xml_diff>

<commit_message>
PIS/Cofins e reajuste da receita fixa no lance mínimo; VPL da usina sem BESS
Lance mínimo do BESS de referência passa a R$ 1,157 mi/MW·ano (R$ 1,104 mi dimensionado para o
contrato; R$ 1,240 mi isolada) com PIS/Cofins de 3,65%; sem reajuste pelo IPCA, R$ 1,444 mi.
A usina FV com eletrolisador sem BESS tem VPL de -R$ 276 mi, o que condiciona a vantagem do híbrido.

Co-Authored-By: Claude Opus 5.5 <noreply@anthropic.com>
Claude-Session: https://claude.ai/code/session_01YFtn9hiQUHbNLSX7rUNYuK
</commit_message>
<xml_diff>
--- a/docs/dissertacao/cap3_metodologia.docx
+++ b/docs/dissertacao/cap3_metodologia.docx
@@ -22385,6 +22385,21 @@
                         </m:r>
                       </m:sup>
                     </m:sSup>
+                    <m:r>
+                      <m:rPr>
+                        <m:sty m:val="p"/>
+                      </m:rPr>
+                      <m:t>−</m:t>
+                    </m:r>
+                    <m:r>
+                      <m:t>t</m:t>
+                    </m:r>
+                    <m:r>
+                      <m:t> </m:t>
+                    </m:r>
+                    <m:r>
+                      <m:t>B</m:t>
+                    </m:r>
                   </m:e>
                 </m:d>
                 <m:r>
@@ -22646,7 +22661,35 @@
         </m:r>
       </m:oMath>
       <w:r>
-        <w:t xml:space="preserve">, e</w:t>
+        <w:t xml:space="preserve">,</w:t>
+      </w:r>
+      <w:r>
+        <w:t xml:space="preserve"> </w:t>
+      </w:r>
+      <m:oMath>
+        <m:r>
+          <m:t>t</m:t>
+        </m:r>
+      </m:oMath>
+      <w:r>
+        <w:t xml:space="preserve"> </w:t>
+      </w:r>
+      <w:r>
+        <w:t xml:space="preserve">é a alíquota dos tributos sobre a receita bruta (PIS/Cofins),</w:t>
+      </w:r>
+      <w:r>
+        <w:t xml:space="preserve"> </w:t>
+      </w:r>
+      <m:oMath>
+        <m:r>
+          <m:t>B</m:t>
+        </m:r>
+      </m:oMath>
+      <w:r>
+        <w:t xml:space="preserve"> </w:t>
+      </w:r>
+      <w:r>
+        <w:t xml:space="preserve">é a receita bruta anual — receita fixa, venda de energia no MCP e venda de hidrogênio, este tomado líquido de ICMS —, e</w:t>
       </w:r>
       <w:r>
         <w:t xml:space="preserve"> </w:t>
@@ -23071,6 +23114,76 @@
           </w:p>
         </w:tc>
       </w:tr>
+      <w:tr>
+        <w:tc>
+          <w:tcPr/>
+          <w:p>
+            <w:pPr>
+              <w:pStyle w:val="Compact"/>
+            </w:pPr>
+            <w:r>
+              <w:t xml:space="preserve">Tributos sobre a receita (PIS/Cofins)</w:t>
+            </w:r>
+          </w:p>
+        </w:tc>
+        <w:tc>
+          <w:tcPr/>
+          <w:p>
+            <w:pPr>
+              <w:pStyle w:val="Compact"/>
+            </w:pPr>
+            <w:r>
+              <w:t xml:space="preserve">3,65% (lucro presumido; sensibilidade: 9,25%, não cumulativo)</w:t>
+            </w:r>
+          </w:p>
+        </w:tc>
+        <w:tc>
+          <w:tcPr/>
+          <w:p>
+            <w:pPr>
+              <w:pStyle w:val="Compact"/>
+            </w:pPr>
+            <w:r>
+              <w:t xml:space="preserve">Brasil (1998; 2002; 2003); encargos setoriais não incluídos</w:t>
+            </w:r>
+          </w:p>
+        </w:tc>
+      </w:tr>
+      <w:tr>
+        <w:tc>
+          <w:tcPr/>
+          <w:p>
+            <w:pPr>
+              <w:pStyle w:val="Compact"/>
+            </w:pPr>
+            <w:r>
+              <w:t xml:space="preserve">Reajuste da receita fixa</w:t>
+            </w:r>
+          </w:p>
+        </w:tc>
+        <w:tc>
+          <w:tcPr/>
+          <w:p>
+            <w:pPr>
+              <w:pStyle w:val="Compact"/>
+            </w:pPr>
+            <w:r>
+              <w:t xml:space="preserve">IPCA anual (sensibilidade: sem reajuste, com IPCA de 4% a.a.)</w:t>
+            </w:r>
+          </w:p>
+        </w:tc>
+        <w:tc>
+          <w:tcPr/>
+          <w:p>
+            <w:pPr>
+              <w:pStyle w:val="Compact"/>
+            </w:pPr>
+            <w:r>
+              <w:t xml:space="preserve">A confirmar na Portaria MME nº 136/2026 e no edital</w:t>
+            </w:r>
+          </w:p>
+        </w:tc>
+      </w:tr>
     </w:tbl>
     <w:p>
       <w:pPr>
@@ -23085,7 +23198,29 @@
         <w:pStyle w:val="BodyText"/>
       </w:pPr>
       <w:r>
-        <w:t xml:space="preserve">Como o fluxo de caixa é calculado antes dos tributos sobre a renda, adota-se como taxa central o custo de capital antes de impostos (12,1%), que já incorpora o efeito desses tributos. A taxa após impostos (8,0%) é apresentada apenas como sensibilidade, pois, aplicada a um fluxo antes de impostos, ignora o imposto de renda e superestima o VPL. A partir do VPL, calcula-se ainda o preço de equilíbrio do hidrogênio,</w:t>
+        <w:t xml:space="preserve">Como o fluxo de caixa é calculado antes dos tributos sobre a renda, adota-se como taxa central o custo de capital antes de impostos (12,1%), que já incorpora o efeito desses tributos. A taxa antes de impostos não cobre, porém, os tributos sobre a receita, que são deduzidos do fluxo: adota-se o regime cumulativo do lucro presumido (</w:t>
+      </w:r>
+      <m:oMath>
+        <m:r>
+          <m:t>t</m:t>
+        </m:r>
+      </m:oMath>
+      <w:r>
+        <w:t xml:space="preserve"> </w:t>
+      </w:r>
+      <w:r>
+        <w:t xml:space="preserve">= 3,65%; BRASIL, 1998), admitido para receita bruta anual de até R$ 78 milhões (BRASIL, 2013), caso de uma sociedade de propósito específico só do BESS, e avalia-se o regime não cumulativo (</w:t>
+      </w:r>
+      <m:oMath>
+        <m:r>
+          <m:t>t</m:t>
+        </m:r>
+      </m:oMath>
+      <w:r>
+        <w:t xml:space="preserve"> </w:t>
+      </w:r>
+      <w:r>
+        <w:t xml:space="preserve">= 9,25%, sem créditos; BRASIL, 2002; 2003) como sensibilidade. Encargos setoriais, como a taxa de fiscalização da ANEEL e a contribuição à CCEE, não foram incluídos. A receita fixa é suposta reajustada anualmente pelo IPCA, o que a torna constante em termos reais, coerente com o fluxo de caixa; como essa regra ainda deve ser confirmada na Portaria e no edital, avalia-se também a receita constante em termos nominais. A taxa após impostos (8,0%) é apresentada apenas como sensibilidade, pois, aplicada a um fluxo antes de impostos, ignora o imposto de renda e superestima o VPL. A partir do VPL, calcula-se ainda o preço de equilíbrio do hidrogênio,</w:t>
       </w:r>
       <w:r>
         <w:t xml:space="preserve"> </w:t>
@@ -23169,51 +23304,73 @@
           </m:rPr>
           <m:t>/</m:t>
         </m:r>
-        <m:r>
-          <m:rPr>
-            <m:sty m:val="p"/>
-          </m:rPr>
-          <m:t>(</m:t>
-        </m:r>
-        <m:r>
-          <m:t>F</m:t>
-        </m:r>
-        <m:r>
-          <m:rPr>
-            <m:sty m:val="p"/>
-          </m:rPr>
-          <m:t>(</m:t>
-        </m:r>
-        <m:r>
-          <m:t>i</m:t>
-        </m:r>
-        <m:r>
-          <m:rPr>
-            <m:sty m:val="p"/>
-          </m:rPr>
-          <m:t>,</m:t>
-        </m:r>
-        <m:r>
-          <m:t>n</m:t>
-        </m:r>
-        <m:r>
-          <m:rPr>
-            <m:sty m:val="p"/>
-          </m:rPr>
-          <m:t>)</m:t>
-        </m:r>
-        <m:r>
-          <m:t> </m:t>
-        </m:r>
-        <m:r>
-          <m:t>V</m:t>
-        </m:r>
-        <m:r>
-          <m:rPr>
-            <m:sty m:val="p"/>
-          </m:rPr>
-          <m:t>)</m:t>
-        </m:r>
+        <m:d>
+          <m:dPr>
+            <m:begChr m:val="["/>
+            <m:sepChr m:val=""/>
+            <m:endChr m:val="]"/>
+            <m:grow/>
+          </m:dPr>
+          <m:e>
+            <m:r>
+              <m:t>F</m:t>
+            </m:r>
+            <m:r>
+              <m:rPr>
+                <m:sty m:val="p"/>
+              </m:rPr>
+              <m:t>(</m:t>
+            </m:r>
+            <m:r>
+              <m:t>i</m:t>
+            </m:r>
+            <m:r>
+              <m:rPr>
+                <m:sty m:val="p"/>
+              </m:rPr>
+              <m:t>,</m:t>
+            </m:r>
+            <m:r>
+              <m:t>n</m:t>
+            </m:r>
+            <m:r>
+              <m:rPr>
+                <m:sty m:val="p"/>
+              </m:rPr>
+              <m:t>)</m:t>
+            </m:r>
+            <m:r>
+              <m:t> </m:t>
+            </m:r>
+            <m:r>
+              <m:t>V</m:t>
+            </m:r>
+            <m:r>
+              <m:rPr>
+                <m:sty m:val="p"/>
+              </m:rPr>
+              <m:t>(</m:t>
+            </m:r>
+            <m:r>
+              <m:t>1</m:t>
+            </m:r>
+            <m:r>
+              <m:rPr>
+                <m:sty m:val="p"/>
+              </m:rPr>
+              <m:t>−</m:t>
+            </m:r>
+            <m:r>
+              <m:t>t</m:t>
+            </m:r>
+            <m:r>
+              <m:rPr>
+                <m:sty m:val="p"/>
+              </m:rPr>
+              <m:t>)</m:t>
+            </m:r>
+          </m:e>
+        </m:d>
       </m:oMath>
       <w:r>
         <w:t xml:space="preserve">, em que</w:t>
@@ -24636,18 +24793,321 @@
         <w:t xml:space="preserve"> </w:t>
       </w:r>
       <w:r>
-        <w:t xml:space="preserve">MWh/MW, a folga é de cerca de 100 MWh/MW por ano e cobre um consumo auxiliar de até 1,1% da potência. A receita fixa é multiplicada pela disponibilidade</w:t>
+        <w:t xml:space="preserve">MWh/MW, a folga é de cerca de 100 MWh/MW por ano e cobre um consumo auxiliar de até 1,1% da potência. A receita fixa é multiplicada pelo fator</w:t>
       </w:r>
       <w:r>
         <w:t xml:space="preserve"> </w:t>
       </w:r>
       <m:oMath>
         <m:r>
+          <m:t>k</m:t>
+        </m:r>
+        <m:r>
+          <m:rPr>
+            <m:sty m:val="p"/>
+          </m:rPr>
+          <m:t>=</m:t>
+        </m:r>
+        <m:r>
           <m:t>d</m:t>
         </m:r>
+        <m:r>
+          <m:t> </m:t>
+        </m:r>
+        <m:r>
+          <m:rPr>
+            <m:sty m:val="p"/>
+          </m:rPr>
+          <m:t>(</m:t>
+        </m:r>
+        <m:r>
+          <m:t>1</m:t>
+        </m:r>
+        <m:r>
+          <m:rPr>
+            <m:sty m:val="p"/>
+          </m:rPr>
+          <m:t>−</m:t>
+        </m:r>
+        <m:r>
+          <m:t>t</m:t>
+        </m:r>
+        <m:r>
+          <m:rPr>
+            <m:sty m:val="p"/>
+          </m:rPr>
+          <m:t>)</m:t>
+        </m:r>
+        <m:r>
+          <m:t> </m:t>
+        </m:r>
+        <m:r>
+          <m:t>φ</m:t>
+        </m:r>
       </m:oMath>
       <w:r>
-        <w:t xml:space="preserve">, e a potência ofertada passa a ser dada pela Equação (3.45):</w:t>
+        <w:t xml:space="preserve">, em que</w:t>
+      </w:r>
+      <w:r>
+        <w:t xml:space="preserve"> </w:t>
+      </w:r>
+      <m:oMath>
+        <m:r>
+          <m:t>d</m:t>
+        </m:r>
+      </m:oMath>
+      <w:r>
+        <w:t xml:space="preserve"> </w:t>
+      </w:r>
+      <w:r>
+        <w:t xml:space="preserve">é a disponibilidade,</w:t>
+      </w:r>
+      <w:r>
+        <w:t xml:space="preserve"> </w:t>
+      </w:r>
+      <m:oMath>
+        <m:r>
+          <m:t>t</m:t>
+        </m:r>
+      </m:oMath>
+      <w:r>
+        <w:t xml:space="preserve"> </w:t>
+      </w:r>
+      <w:r>
+        <w:t xml:space="preserve">a alíquota dos tributos sobre a receita e</w:t>
+      </w:r>
+      <w:r>
+        <w:t xml:space="preserve"> </w:t>
+      </w:r>
+      <m:oMath>
+        <m:r>
+          <m:t>φ</m:t>
+        </m:r>
+      </m:oMath>
+      <w:r>
+        <w:t xml:space="preserve"> </w:t>
+      </w:r>
+      <w:r>
+        <w:t xml:space="preserve">a perda de valor real da receita fixa sem reajuste pelo IPCA:</w:t>
+      </w:r>
+      <w:r>
+        <w:t xml:space="preserve"> </w:t>
+      </w:r>
+      <m:oMath>
+        <m:r>
+          <m:t>φ</m:t>
+        </m:r>
+        <m:r>
+          <m:rPr>
+            <m:sty m:val="p"/>
+          </m:rPr>
+          <m:t>=</m:t>
+        </m:r>
+        <m:r>
+          <m:t>1</m:t>
+        </m:r>
+      </m:oMath>
+      <w:r>
+        <w:t xml:space="preserve"> </w:t>
+      </w:r>
+      <w:r>
+        <w:t xml:space="preserve">com reajuste e</w:t>
+      </w:r>
+      <w:r>
+        <w:t xml:space="preserve"> </w:t>
+      </w:r>
+      <m:oMath>
+        <m:r>
+          <m:t>φ</m:t>
+        </m:r>
+        <m:r>
+          <m:rPr>
+            <m:sty m:val="p"/>
+          </m:rPr>
+          <m:t>=</m:t>
+        </m:r>
+        <m:r>
+          <m:t>F</m:t>
+        </m:r>
+        <m:r>
+          <m:rPr>
+            <m:sty m:val="p"/>
+          </m:rPr>
+          <m:t>(</m:t>
+        </m:r>
+        <m:sSup>
+          <m:e>
+            <m:r>
+              <m:t>i</m:t>
+            </m:r>
+          </m:e>
+          <m:sup>
+            <m:r>
+              <m:rPr>
+                <m:sty m:val="p"/>
+              </m:rPr>
+              <m:t>′</m:t>
+            </m:r>
+          </m:sup>
+        </m:sSup>
+        <m:r>
+          <m:rPr>
+            <m:sty m:val="p"/>
+          </m:rPr>
+          <m:t>,</m:t>
+        </m:r>
+        <m:r>
+          <m:t>n</m:t>
+        </m:r>
+        <m:r>
+          <m:rPr>
+            <m:sty m:val="p"/>
+          </m:rPr>
+          <m:t>)</m:t>
+        </m:r>
+        <m:r>
+          <m:rPr>
+            <m:sty m:val="p"/>
+          </m:rPr>
+          <m:t>/</m:t>
+        </m:r>
+        <m:r>
+          <m:t>F</m:t>
+        </m:r>
+        <m:r>
+          <m:rPr>
+            <m:sty m:val="p"/>
+          </m:rPr>
+          <m:t>(</m:t>
+        </m:r>
+        <m:r>
+          <m:t>i</m:t>
+        </m:r>
+        <m:r>
+          <m:rPr>
+            <m:sty m:val="p"/>
+          </m:rPr>
+          <m:t>,</m:t>
+        </m:r>
+        <m:r>
+          <m:t>n</m:t>
+        </m:r>
+        <m:r>
+          <m:rPr>
+            <m:sty m:val="p"/>
+          </m:rPr>
+          <m:t>)</m:t>
+        </m:r>
+      </m:oMath>
+      <w:r>
+        <w:t xml:space="preserve"> </w:t>
+      </w:r>
+      <w:r>
+        <w:t xml:space="preserve">sem ele, com</w:t>
+      </w:r>
+      <w:r>
+        <w:t xml:space="preserve"> </w:t>
+      </w:r>
+      <m:oMath>
+        <m:sSup>
+          <m:e>
+            <m:r>
+              <m:t>i</m:t>
+            </m:r>
+          </m:e>
+          <m:sup>
+            <m:r>
+              <m:rPr>
+                <m:sty m:val="p"/>
+              </m:rPr>
+              <m:t>′</m:t>
+            </m:r>
+          </m:sup>
+        </m:sSup>
+        <m:r>
+          <m:rPr>
+            <m:sty m:val="p"/>
+          </m:rPr>
+          <m:t>=</m:t>
+        </m:r>
+        <m:r>
+          <m:rPr>
+            <m:sty m:val="p"/>
+          </m:rPr>
+          <m:t>(</m:t>
+        </m:r>
+        <m:r>
+          <m:t>1</m:t>
+        </m:r>
+        <m:r>
+          <m:rPr>
+            <m:sty m:val="p"/>
+          </m:rPr>
+          <m:t>+</m:t>
+        </m:r>
+        <m:r>
+          <m:t>i</m:t>
+        </m:r>
+        <m:r>
+          <m:rPr>
+            <m:sty m:val="p"/>
+          </m:rPr>
+          <m:t>)</m:t>
+        </m:r>
+        <m:r>
+          <m:rPr>
+            <m:sty m:val="p"/>
+          </m:rPr>
+          <m:t>(</m:t>
+        </m:r>
+        <m:r>
+          <m:t>1</m:t>
+        </m:r>
+        <m:r>
+          <m:rPr>
+            <m:sty m:val="p"/>
+          </m:rPr>
+          <m:t>+</m:t>
+        </m:r>
+        <m:sSup>
+          <m:e>
+            <m:r>
+              <m:t>π</m:t>
+            </m:r>
+          </m:e>
+          <m:sup>
+            <m:r>
+              <m:t>i</m:t>
+            </m:r>
+            <m:r>
+              <m:t>p</m:t>
+            </m:r>
+            <m:r>
+              <m:t>c</m:t>
+            </m:r>
+            <m:r>
+              <m:t>a</m:t>
+            </m:r>
+          </m:sup>
+        </m:sSup>
+        <m:r>
+          <m:rPr>
+            <m:sty m:val="p"/>
+          </m:rPr>
+          <m:t>)</m:t>
+        </m:r>
+        <m:r>
+          <m:rPr>
+            <m:sty m:val="p"/>
+          </m:rPr>
+          <m:t>−</m:t>
+        </m:r>
+        <m:r>
+          <m:t>1</m:t>
+        </m:r>
+      </m:oMath>
+      <w:r>
+        <w:t xml:space="preserve">. A potência ofertada passa a ser dada pela Equação (3.45):</w:t>
       </w:r>
     </w:p>
     <w:tbl>
@@ -24817,7 +25277,7 @@
                                 <m:t>R</m:t>
                               </m:r>
                               <m:r>
-                                <m:t>d</m:t>
+                                <m:t>k</m:t>
                               </m:r>
                               <m:r>
                                 <m:t>P</m:t>
@@ -24926,7 +25386,7 @@
                                 <m:t>R</m:t>
                               </m:r>
                               <m:r>
-                                <m:t>d</m:t>
+                                <m:t>k</m:t>
                               </m:r>
                               <m:r>
                                 <m:t>P</m:t>
@@ -25169,7 +25629,7 @@
         </m:r>
       </m:oMath>
       <w:r>
-        <w:t xml:space="preserve">. Ele é calculado com resolução de R$ 1 mil/(MW·ano) para as três faixas de investimento e as duas taxas de desconto do Quadro 3.3 e, no caso central, decomposto nas parcelas de capital, O&amp;M, uso da rede, consumo auxiliar e uso mercantil, cuja soma é o lance.</w:t>
+        <w:t xml:space="preserve">. Ele é calculado com resolução de R$ 1 mil/(MW·ano) para as três faixas de investimento e as duas taxas de desconto do Quadro 3.3 e, no caso central, decomposto nas parcelas de capital, O&amp;M, uso da rede, consumo auxiliar, uso mercantil e tributos sobre a receita, cuja soma é o lance. Como os tributos sobre a venda de energia e de hidrogênio pouco mudam entre as alternativas com e sem BESS no lance mínimo, em que a operação do lado mercantil coincide, eles são considerados apenas na receita fixa.</w:t>
       </w:r>
     </w:p>
     <w:bookmarkEnd w:id="38"/>
@@ -25999,7 +26459,7 @@
           <m:t> </m:t>
         </m:r>
         <m:r>
-          <m:t>d</m:t>
+          <m:t>k</m:t>
         </m:r>
         <m:r>
           <m:t> </m:t>
@@ -26217,7 +26677,7 @@
                   </m:num>
                   <m:den>
                     <m:r>
-                      <m:t>d</m:t>
+                      <m:t>k</m:t>
                     </m:r>
                   </m:den>
                 </m:f>
@@ -26501,7 +26961,18 @@
         <w:pStyle w:val="FirstParagraph"/>
       </w:pPr>
       <w:r>
-        <w:t xml:space="preserve">isto é, o lance mínimo de um BESS a construir corresponde aproximadamente ao seu custo anual equivalente por MW — capital, O&amp;M com reposição de módulos e uso da rede —, acrescido da recarga e do consumo auxiliar não custeados pela CONCAP e dividido pela disponibilidade. Como o desgaste do despacho já está no O&amp;M, o lance não depende do custo de degradação por MWh e só depende da frequência do despacho por meio do consumo auxiliar, cuja folga diminui quando o módulo é despachado menos vezes. A aproximação desconsidera o valor residual do uso mercantil da bateria e é verificada no Capítulo 4.</w:t>
+        <w:t xml:space="preserve">isto é, o lance mínimo de um BESS a construir corresponde aproximadamente ao seu custo anual equivalente por MW — capital, O&amp;M com reposição de módulos e uso da rede —, acrescido da recarga e do consumo auxiliar não custeados pela CONCAP e dividido pelo fator</w:t>
+      </w:r>
+      <w:r>
+        <w:t xml:space="preserve"> </w:t>
+      </w:r>
+      <m:oMath>
+        <m:r>
+          <m:t>k</m:t>
+        </m:r>
+      </m:oMath>
+      <w:r>
+        <w:t xml:space="preserve">, que reúne a disponibilidade, os tributos sobre a receita e o reajuste. Como o desgaste do despacho já está no O&amp;M, o lance não depende do custo de degradação por MWh e só depende da frequência do despacho por meio do consumo auxiliar, cuja folga diminui quando o módulo é despachado menos vezes. A aproximação desconsidera o valor residual do uso mercantil da bateria e é verificada no Capítulo 4.</w:t>
       </w:r>
     </w:p>
     <w:p>
@@ -26871,7 +27342,7 @@
         </m:sSup>
       </m:oMath>
       <w:r>
-        <w:t xml:space="preserve">). Como, no lance, ambas operam apenas o módulo LRCAP, a diferença entre os dois lances mede o valor do compartilhamento da conexão. O valor do módulo mercantil é avaliado comparando-se o lucro que ele acrescenta na curva de oferta com o seu custo anual.</w:t>
+        <w:t xml:space="preserve">). Como, no lance, ambas operam apenas o módulo LRCAP, a diferença entre os dois lances mede o valor do compartilhamento da conexão. Esse valor pressupõe que a usina FV com o eletrolisador exista por seus próprios méritos; por isso, calcula-se também o VPL dessa usina sem o BESS, com a receita bruta aproximada pelo lucro operacional somado ao custo variável do hidrogênio. O valor do módulo mercantil é avaliado comparando-se o lucro que ele acrescenta na curva de oferta com o seu custo anual.</w:t>
       </w:r>
     </w:p>
     <w:bookmarkEnd w:id="39"/>
@@ -28038,7 +28509,7 @@
         <w:t xml:space="preserve"> </w:t>
       </w:r>
       <w:r>
-        <w:t xml:space="preserve">a receita fixa é rateada linearmente no horizonte, sem reajuste pelo Índice Nacional de Preços ao Consumidor Amplo (IPCA), sem o abatimento mensal por desempenho e sem as penalidades por indisponibilidade, cujos detalhes dependem do edital do leilão; o efeito de uma disponibilidade de 97% sobre o lance é avaliado como sensibilidade;</w:t>
+        <w:t xml:space="preserve">a receita fixa é rateada linearmente no horizonte e suposta reajustada anualmente pelo Índice Nacional de Preços ao Consumidor Amplo (IPCA), regra a confirmar na Portaria e no edital — sem reajuste, o lance mínimo subiria cerca de 25% (Capítulo 4) —, sem o abatimento mensal por desempenho e sem as penalidades por indisponibilidade, cujos detalhes dependem do edital do leilão; o efeito de uma disponibilidade de 97% sobre o lance é avaliado como sensibilidade;</w:t>
       </w:r>
     </w:p>
     <w:p>
@@ -28253,7 +28724,7 @@
         <w:t xml:space="preserve"> </w:t>
       </w:r>
       <w:r>
-        <w:t xml:space="preserve">a análise de viabilidade considera fluxo de caixa constante em termos reais, antes dos tributos sobre a renda e descontado à taxa antes de impostos, sem financiamento, sem benefícios fiscais e sem valor residual; o O&amp;M fixo da FV e do eletrolisador é hipotético, a TUST é a média nacional, e não a do barramento de conexão, a regra de cobrança do armazenamento ainda deve ser confirmada no texto da REN ANEEL nº 1.162/2026, a duração de referência e a composição do custo do BESS são estimadas e o consumo auxiliar é um valor indicativo; o lucro operacional é calculado com os parâmetros provisórios de operação;</w:t>
+        <w:t xml:space="preserve">a análise de viabilidade considera fluxo de caixa constante em termos reais, antes dos tributos sobre a renda e descontado à taxa antes de impostos, com PIS/Cofins no regime cumulativo e sem encargos setoriais, sem prazo de implantação nem juros durante a construção, sem financiamento, sem benefícios fiscais e sem valor residual; o O&amp;M fixo da FV e do eletrolisador é hipotético, a TUST é a média nacional, e não a do barramento de conexão, a regra de cobrança do armazenamento ainda deve ser confirmada no texto da REN ANEEL nº 1.162/2026, a duração de referência e a composição do custo do BESS são estimadas e o consumo auxiliar é um valor indicativo; o lucro operacional é calculado com os parâmetros provisórios de operação;</w:t>
       </w:r>
     </w:p>
     <w:p>
@@ -28445,6 +28916,90 @@
       </w:r>
       <w:r>
         <w:t xml:space="preserve">. Londres: BloombergNEF, 9 dez. 2025. Disponível em: https://about.bnef.com. Acesso em: 3 out. 2026.</w:t>
+      </w:r>
+    </w:p>
+    <w:p>
+      <w:pPr>
+        <w:pStyle w:val="Referencia"/>
+      </w:pPr>
+      <w:r>
+        <w:t xml:space="preserve">BRASIL. Lei nº 9.718, de 27 de novembro de 1998. Altera a Legislação Tributária Federal.</w:t>
+      </w:r>
+      <w:r>
+        <w:t xml:space="preserve"> </w:t>
+      </w:r>
+      <w:r>
+        <w:rPr>
+          <w:b/>
+          <w:bCs/>
+        </w:rPr>
+        <w:t xml:space="preserve">Diário Oficial da União</w:t>
+      </w:r>
+      <w:r>
+        <w:t xml:space="preserve">: seção 1, Brasília, DF, 28 nov. 1998.</w:t>
+      </w:r>
+    </w:p>
+    <w:p>
+      <w:pPr>
+        <w:pStyle w:val="Referencia"/>
+      </w:pPr>
+      <w:r>
+        <w:t xml:space="preserve">BRASIL. Lei nº 10.637, de 30 de dezembro de 2002. Dispõe sobre a não-cumulatividade na cobrança da contribuição para os Programas de Integração Social (PIS) e de Formação do Patrimônio do Servidor Público (Pasep).</w:t>
+      </w:r>
+      <w:r>
+        <w:t xml:space="preserve"> </w:t>
+      </w:r>
+      <w:r>
+        <w:rPr>
+          <w:b/>
+          <w:bCs/>
+        </w:rPr>
+        <w:t xml:space="preserve">Diário Oficial da União</w:t>
+      </w:r>
+      <w:r>
+        <w:t xml:space="preserve">: seção 1, Brasília, DF, 31 dez. 2002.</w:t>
+      </w:r>
+    </w:p>
+    <w:p>
+      <w:pPr>
+        <w:pStyle w:val="Referencia"/>
+      </w:pPr>
+      <w:r>
+        <w:t xml:space="preserve">BRASIL. Lei nº 10.833, de 29 de dezembro de 2003. Altera a Legislação Tributária Federal.</w:t>
+      </w:r>
+      <w:r>
+        <w:t xml:space="preserve"> </w:t>
+      </w:r>
+      <w:r>
+        <w:rPr>
+          <w:b/>
+          <w:bCs/>
+        </w:rPr>
+        <w:t xml:space="preserve">Diário Oficial da União</w:t>
+      </w:r>
+      <w:r>
+        <w:t xml:space="preserve">: seção 1, Brasília, DF, 30 dez. 2003.</w:t>
+      </w:r>
+    </w:p>
+    <w:p>
+      <w:pPr>
+        <w:pStyle w:val="Referencia"/>
+      </w:pPr>
+      <w:r>
+        <w:t xml:space="preserve">BRASIL. Lei nº 12.814, de 16 de maio de 2013. Altera, entre outras, a Lei nº 9.718, de 27 de novembro de 1998, para elevar o limite de receita bruta para opção pelo lucro presumido.</w:t>
+      </w:r>
+      <w:r>
+        <w:t xml:space="preserve"> </w:t>
+      </w:r>
+      <w:r>
+        <w:rPr>
+          <w:b/>
+          <w:bCs/>
+        </w:rPr>
+        <w:t xml:space="preserve">Diário Oficial da União</w:t>
+      </w:r>
+      <w:r>
+        <w:t xml:space="preserve">: seção 1, Brasília, DF, 17 maio 2013.</w:t>
       </w:r>
     </w:p>
     <w:p>

</xml_diff>

<commit_message>
Revisão, itens 9 a 17: metodologia e código da viabilidade
- Custo adicional de importação justificado por componentes, com sensibilidade de R$ 100 e 400/MWh
- VPL com tanque de H2 (DOE), troca de pilhas (EPRI) e juros durante a construção
- Sensibilidades: consumo auxiliar sem a folga da CONCAP, implantação em 0 e 2 anos
- Ressalvas: comparação com térmicas, limiar europeu (Reg. 2023/1184 e 2023/1185),
  direção do viés da previsão perfeita, calendário (2024 e último bloco)

Co-Authored-By: Claude Opus 5.5 <noreply@anthropic.com>
Claude-Session: https://claude.ai/code/session_01YFtn9hiQUHbNLSX7rUNYuK
</commit_message>
<xml_diff>
--- a/docs/dissertacao/cap3_metodologia.docx
+++ b/docs/dissertacao/cap3_metodologia.docx
@@ -2368,7 +2368,7 @@
               <w:pStyle w:val="Compact"/>
             </w:pPr>
             <w:r>
-              <w:t xml:space="preserve">Custo adicional sobre a energia importada</w:t>
+              <w:t xml:space="preserve">Custo adicional sobre a energia importada (uso da rede, encargos e tributos; Seção 3.8.4)</w:t>
             </w:r>
           </w:p>
         </w:tc>
@@ -2390,7 +2390,7 @@
               <w:pStyle w:val="Compact"/>
             </w:pPr>
             <w:r>
-              <w:t xml:space="preserve">250</w:t>
+              <w:t xml:space="preserve">250 (sensibilidade: 100 e 400)</w:t>
             </w:r>
           </w:p>
         </w:tc>
@@ -11614,7 +11614,7 @@
         </m:r>
       </m:oMath>
       <w:r>
-        <w:t xml:space="preserve">, ela reproduz a vedação à importação. A janela semanal coincide com os blocos da decomposição (Seção 3.6.2), de modo que a restrição pertence integralmente a cada subproblema. O valor de 3,4 kgCO₂/kgH₂ corresponde aproximadamente ao critério europeu para combustíveis renováveis de origem não biológica, de redução de 70% das emissões em relação ao comparador fóssil de 94 gCO₂eq/MJ (UNIÃO EUROPEIA, 2023), e é avaliado como sensibilidade.</w:t>
+        <w:t xml:space="preserve">, ela reproduz a vedação à importação. A janela semanal coincide com os blocos da decomposição (Seção 3.6.2), de modo que a restrição pertence integralmente a cada subproblema. O valor de 3,4 kgCO₂/kgH₂ corresponde aproximadamente ao limiar de emissões europeu para combustíveis renováveis de origem não biológica, de redução de 70% em relação ao comparador fóssil de 94 gCO₂eq/MJ (UNIÃO EUROPEIA, 2023b), e é avaliado como sensibilidade. Esse caso reproduz apenas o limiar de emissões, e não o critério europeu completo: para que a energia da rede seja contabilizada como renovável, o Regulamento Delegado (UE) 2023/1184 exige, além do limiar, contratos com instalações renováveis novas (adicionalidade) e correlação temporal e geográfica entre a produção renovável e o consumo do eletrolisador, salvo em zonas de mercado com mais de 90% de energia renovável ou com baixa intensidade de emissões (UNIÃO EUROPEIA, 2023a). Sem essas exigências, a energia importada da rede só tem a sua intensidade de emissões limitada.</w:t>
       </w:r>
     </w:p>
     <w:p>
@@ -22285,8 +22285,38 @@
                   <m:t>−</m:t>
                 </m:r>
                 <m:r>
+                  <m:t>J</m:t>
+                </m:r>
+                <m:r>
+                  <m:t> </m:t>
+                </m:r>
+                <m:r>
                   <m:t>I</m:t>
                 </m:r>
+                <m:r>
+                  <m:rPr>
+                    <m:sty m:val="p"/>
+                  </m:rPr>
+                  <m:t>−</m:t>
+                </m:r>
+                <m:sSup>
+                  <m:e>
+                    <m:r>
+                      <m:t>V</m:t>
+                    </m:r>
+                  </m:e>
+                  <m:sup>
+                    <m:r>
+                      <m:t>p</m:t>
+                    </m:r>
+                    <m:r>
+                      <m:t>i</m:t>
+                    </m:r>
+                    <m:r>
+                      <m:t>l</m:t>
+                    </m:r>
+                  </m:sup>
+                </m:sSup>
                 <m:r>
                   <m:rPr>
                     <m:sty m:val="p"/>
@@ -22543,7 +22573,50 @@
         <w:t xml:space="preserve"> </w:t>
       </w:r>
       <w:r>
-        <w:t xml:space="preserve">é o investimento total na usina FV, no BESS e no eletrolisador,</w:t>
+        <w:t xml:space="preserve">é o investimento total na usina FV, no BESS, no eletrolisador e no tanque de hidrogênio,</w:t>
+      </w:r>
+      <w:r>
+        <w:t xml:space="preserve"> </w:t>
+      </w:r>
+      <m:oMath>
+        <m:r>
+          <m:t>J</m:t>
+        </m:r>
+      </m:oMath>
+      <w:r>
+        <w:t xml:space="preserve"> </w:t>
+      </w:r>
+      <w:r>
+        <w:t xml:space="preserve">é o fator de juros durante a construção,</w:t>
+      </w:r>
+      <w:r>
+        <w:t xml:space="preserve"> </w:t>
+      </w:r>
+      <m:oMath>
+        <m:sSup>
+          <m:e>
+            <m:r>
+              <m:t>V</m:t>
+            </m:r>
+          </m:e>
+          <m:sup>
+            <m:r>
+              <m:t>p</m:t>
+            </m:r>
+            <m:r>
+              <m:t>i</m:t>
+            </m:r>
+            <m:r>
+              <m:t>l</m:t>
+            </m:r>
+          </m:sup>
+        </m:sSup>
+      </m:oMath>
+      <w:r>
+        <w:t xml:space="preserve"> </w:t>
+      </w:r>
+      <w:r>
+        <w:t xml:space="preserve">é o valor presente das trocas de pilhas do eletrolisador,</w:t>
       </w:r>
       <w:r>
         <w:t xml:space="preserve"> </w:t>
@@ -22738,7 +22811,590 @@
         </m:r>
       </m:oMath>
       <w:r>
-        <w:t xml:space="preserve">. A taxa interna de retorno (TIR) é a taxa para a qual o VPL é nulo. Os parâmetros adotados são apresentados no Quadro 3.3.</w:t>
+        <w:t xml:space="preserve">. A taxa interna de retorno (TIR) é a taxa para a qual o VPL é nulo.</w:t>
+      </w:r>
+    </w:p>
+    <w:p>
+      <w:pPr>
+        <w:pStyle w:val="BodyText"/>
+      </w:pPr>
+      <w:r>
+        <w:t xml:space="preserve">O investimento é desembolsado uniformemente nos</w:t>
+      </w:r>
+      <w:r>
+        <w:t xml:space="preserve"> </w:t>
+      </w:r>
+      <m:oMath>
+        <m:r>
+          <m:t>m</m:t>
+        </m:r>
+      </m:oMath>
+      <w:r>
+        <w:t xml:space="preserve"> </w:t>
+      </w:r>
+      <w:r>
+        <w:t xml:space="preserve">anos de implantação anteriores à entrada em operação e capitalizado à taxa de desconto até essa data, com a convenção de meio de período:</w:t>
+      </w:r>
+      <w:r>
+        <w:t xml:space="preserve"> </w:t>
+      </w:r>
+      <m:oMath>
+        <m:r>
+          <m:t>J</m:t>
+        </m:r>
+        <m:r>
+          <m:rPr>
+            <m:sty m:val="p"/>
+          </m:rPr>
+          <m:t>=</m:t>
+        </m:r>
+        <m:f>
+          <m:fPr>
+            <m:type m:val="bar"/>
+          </m:fPr>
+          <m:num>
+            <m:r>
+              <m:t>1</m:t>
+            </m:r>
+          </m:num>
+          <m:den>
+            <m:r>
+              <m:t>m</m:t>
+            </m:r>
+          </m:den>
+        </m:f>
+        <m:nary>
+          <m:naryPr>
+            <m:chr m:val="∑"/>
+            <m:limLoc m:val="undOvr"/>
+            <m:subHide m:val="off"/>
+            <m:supHide m:val="off"/>
+          </m:naryPr>
+          <m:sub>
+            <m:r>
+              <m:t>j</m:t>
+            </m:r>
+            <m:r>
+              <m:rPr>
+                <m:sty m:val="p"/>
+              </m:rPr>
+              <m:t>=</m:t>
+            </m:r>
+            <m:r>
+              <m:t>1</m:t>
+            </m:r>
+          </m:sub>
+          <m:sup>
+            <m:r>
+              <m:t>m</m:t>
+            </m:r>
+          </m:sup>
+          <m:e>
+            <m:r>
+              <m:rPr>
+                <m:sty m:val="p"/>
+              </m:rPr>
+              <m:t>(</m:t>
+            </m:r>
+          </m:e>
+        </m:nary>
+        <m:r>
+          <m:t>1</m:t>
+        </m:r>
+        <m:r>
+          <m:rPr>
+            <m:sty m:val="p"/>
+          </m:rPr>
+          <m:t>+</m:t>
+        </m:r>
+        <m:r>
+          <m:t>i</m:t>
+        </m:r>
+        <m:sSup>
+          <m:e>
+            <m:r>
+              <m:rPr>
+                <m:sty m:val="p"/>
+              </m:rPr>
+              <m:t>)</m:t>
+            </m:r>
+          </m:e>
+          <m:sup>
+            <m:r>
+              <m:t>j</m:t>
+            </m:r>
+            <m:r>
+              <m:rPr>
+                <m:sty m:val="p"/>
+              </m:rPr>
+              <m:t>−</m:t>
+            </m:r>
+            <m:r>
+              <m:t>1</m:t>
+            </m:r>
+            <m:r>
+              <m:rPr>
+                <m:sty m:val="p"/>
+              </m:rPr>
+              <m:t>/</m:t>
+            </m:r>
+            <m:r>
+              <m:t>2</m:t>
+            </m:r>
+          </m:sup>
+        </m:sSup>
+      </m:oMath>
+      <w:r>
+        <w:t xml:space="preserve">, isto é,</w:t>
+      </w:r>
+      <w:r>
+        <w:t xml:space="preserve"> </w:t>
+      </w:r>
+      <m:oMath>
+        <m:r>
+          <m:t>J</m:t>
+        </m:r>
+        <m:r>
+          <m:rPr>
+            <m:sty m:val="p"/>
+          </m:rPr>
+          <m:t>=</m:t>
+        </m:r>
+        <m:r>
+          <m:rPr>
+            <m:sty m:val="p"/>
+          </m:rPr>
+          <m:t>(</m:t>
+        </m:r>
+        <m:r>
+          <m:t>1</m:t>
+        </m:r>
+        <m:r>
+          <m:rPr>
+            <m:sty m:val="p"/>
+          </m:rPr>
+          <m:t>+</m:t>
+        </m:r>
+        <m:r>
+          <m:t>i</m:t>
+        </m:r>
+        <m:sSup>
+          <m:e>
+            <m:r>
+              <m:rPr>
+                <m:sty m:val="p"/>
+              </m:rPr>
+              <m:t>)</m:t>
+            </m:r>
+          </m:e>
+          <m:sup>
+            <m:r>
+              <m:t>1</m:t>
+            </m:r>
+            <m:r>
+              <m:rPr>
+                <m:sty m:val="p"/>
+              </m:rPr>
+              <m:t>/</m:t>
+            </m:r>
+            <m:r>
+              <m:t>2</m:t>
+            </m:r>
+          </m:sup>
+        </m:sSup>
+      </m:oMath>
+      <w:r>
+        <w:t xml:space="preserve"> </w:t>
+      </w:r>
+      <w:r>
+        <w:t xml:space="preserve">para</w:t>
+      </w:r>
+      <w:r>
+        <w:t xml:space="preserve"> </w:t>
+      </w:r>
+      <m:oMath>
+        <m:r>
+          <m:t>m</m:t>
+        </m:r>
+        <m:r>
+          <m:rPr>
+            <m:sty m:val="p"/>
+          </m:rPr>
+          <m:t>=</m:t>
+        </m:r>
+        <m:r>
+          <m:t>1</m:t>
+        </m:r>
+      </m:oMath>
+      <w:r>
+        <w:t xml:space="preserve"> </w:t>
+      </w:r>
+      <w:r>
+        <w:t xml:space="preserve">e</w:t>
+      </w:r>
+      <w:r>
+        <w:t xml:space="preserve"> </w:t>
+      </w:r>
+      <m:oMath>
+        <m:r>
+          <m:t>J</m:t>
+        </m:r>
+        <m:r>
+          <m:rPr>
+            <m:sty m:val="p"/>
+          </m:rPr>
+          <m:t>=</m:t>
+        </m:r>
+        <m:r>
+          <m:t>1</m:t>
+        </m:r>
+      </m:oMath>
+      <w:r>
+        <w:t xml:space="preserve"> </w:t>
+      </w:r>
+      <w:r>
+        <w:t xml:space="preserve">quando se desconsidera a implantação. Supõe-se, assim, que os custos de referência não incluem juros durante a construção, o que deve ser confirmado nos cadernos da EPE. As pilhas do eletrolisador são trocadas a cada</w:t>
+      </w:r>
+      <w:r>
+        <w:t xml:space="preserve"> </w:t>
+      </w:r>
+      <m:oMath>
+        <m:sSup>
+          <m:e>
+            <m:r>
+              <m:t>h</m:t>
+            </m:r>
+          </m:e>
+          <m:sup>
+            <m:r>
+              <m:t>p</m:t>
+            </m:r>
+            <m:r>
+              <m:t>i</m:t>
+            </m:r>
+            <m:r>
+              <m:t>l</m:t>
+            </m:r>
+          </m:sup>
+        </m:sSup>
+      </m:oMath>
+      <w:r>
+        <w:t xml:space="preserve"> </w:t>
+      </w:r>
+      <w:r>
+        <w:t xml:space="preserve">horas equivalentes de operação na potência nominal, ao custo de uma fração</w:t>
+      </w:r>
+      <w:r>
+        <w:t xml:space="preserve"> </w:t>
+      </w:r>
+      <m:oMath>
+        <m:sSup>
+          <m:e>
+            <m:r>
+              <m:t>f</m:t>
+            </m:r>
+          </m:e>
+          <m:sup>
+            <m:r>
+              <m:t>p</m:t>
+            </m:r>
+            <m:r>
+              <m:t>i</m:t>
+            </m:r>
+            <m:r>
+              <m:t>l</m:t>
+            </m:r>
+          </m:sup>
+        </m:sSup>
+      </m:oMath>
+      <w:r>
+        <w:t xml:space="preserve"> </w:t>
+      </w:r>
+      <w:r>
+        <w:t xml:space="preserve">do investimento no eletrolisador: com fator de capacidade</w:t>
+      </w:r>
+      <w:r>
+        <w:t xml:space="preserve"> </w:t>
+      </w:r>
+      <m:oMath>
+        <m:r>
+          <m:t>F</m:t>
+        </m:r>
+        <m:r>
+          <m:t>C</m:t>
+        </m:r>
+      </m:oMath>
+      <w:r>
+        <w:t xml:space="preserve">, a</w:t>
+      </w:r>
+      <w:r>
+        <w:t xml:space="preserve"> </w:t>
+      </w:r>
+      <m:oMath>
+        <m:r>
+          <m:t>j</m:t>
+        </m:r>
+      </m:oMath>
+      <w:r>
+        <w:t xml:space="preserve">-ésima troca ocorre no ano</w:t>
+      </w:r>
+      <w:r>
+        <w:t xml:space="preserve"> </w:t>
+      </w:r>
+      <m:oMath>
+        <m:sSub>
+          <m:e>
+            <m:r>
+              <m:t>a</m:t>
+            </m:r>
+          </m:e>
+          <m:sub>
+            <m:r>
+              <m:t>j</m:t>
+            </m:r>
+          </m:sub>
+        </m:sSub>
+        <m:r>
+          <m:rPr>
+            <m:sty m:val="p"/>
+          </m:rPr>
+          <m:t>=</m:t>
+        </m:r>
+        <m:r>
+          <m:rPr>
+            <m:sty m:val="p"/>
+          </m:rPr>
+          <m:t>⌈</m:t>
+        </m:r>
+        <m:r>
+          <m:t>j</m:t>
+        </m:r>
+        <m:r>
+          <m:t> </m:t>
+        </m:r>
+        <m:sSup>
+          <m:e>
+            <m:r>
+              <m:t>h</m:t>
+            </m:r>
+          </m:e>
+          <m:sup>
+            <m:r>
+              <m:t>p</m:t>
+            </m:r>
+            <m:r>
+              <m:t>i</m:t>
+            </m:r>
+            <m:r>
+              <m:t>l</m:t>
+            </m:r>
+          </m:sup>
+        </m:sSup>
+        <m:r>
+          <m:rPr>
+            <m:sty m:val="p"/>
+          </m:rPr>
+          <m:t>/</m:t>
+        </m:r>
+        <m:r>
+          <m:rPr>
+            <m:sty m:val="p"/>
+          </m:rPr>
+          <m:t>(</m:t>
+        </m:r>
+        <m:r>
+          <m:t>8.760</m:t>
+        </m:r>
+        <m:r>
+          <m:t> </m:t>
+        </m:r>
+        <m:r>
+          <m:t>F</m:t>
+        </m:r>
+        <m:r>
+          <m:t>C</m:t>
+        </m:r>
+        <m:r>
+          <m:rPr>
+            <m:sty m:val="p"/>
+          </m:rPr>
+          <m:t>)</m:t>
+        </m:r>
+        <m:r>
+          <m:rPr>
+            <m:sty m:val="p"/>
+          </m:rPr>
+          <m:t>⌉</m:t>
+        </m:r>
+      </m:oMath>
+      <w:r>
+        <w:t xml:space="preserve"> </w:t>
+      </w:r>
+      <w:r>
+        <w:t xml:space="preserve">e</w:t>
+      </w:r>
+      <w:r>
+        <w:t xml:space="preserve"> </w:t>
+      </w:r>
+      <m:oMath>
+        <m:sSup>
+          <m:e>
+            <m:r>
+              <m:t>V</m:t>
+            </m:r>
+          </m:e>
+          <m:sup>
+            <m:r>
+              <m:t>p</m:t>
+            </m:r>
+            <m:r>
+              <m:t>i</m:t>
+            </m:r>
+            <m:r>
+              <m:t>l</m:t>
+            </m:r>
+          </m:sup>
+        </m:sSup>
+        <m:r>
+          <m:rPr>
+            <m:sty m:val="p"/>
+          </m:rPr>
+          <m:t>=</m:t>
+        </m:r>
+        <m:nary>
+          <m:naryPr>
+            <m:chr m:val="∑"/>
+            <m:limLoc m:val="undOvr"/>
+            <m:subHide m:val="off"/>
+            <m:supHide m:val="on"/>
+          </m:naryPr>
+          <m:sub>
+            <m:r>
+              <m:t>j</m:t>
+            </m:r>
+            <m:r>
+              <m:rPr>
+                <m:sty m:val="p"/>
+              </m:rPr>
+              <m:t>:</m:t>
+            </m:r>
+            <m:r>
+              <m:t> </m:t>
+            </m:r>
+            <m:sSub>
+              <m:e>
+                <m:r>
+                  <m:t>a</m:t>
+                </m:r>
+              </m:e>
+              <m:sub>
+                <m:r>
+                  <m:t>j</m:t>
+                </m:r>
+              </m:sub>
+            </m:sSub>
+            <m:r>
+              <m:rPr>
+                <m:sty m:val="p"/>
+              </m:rPr>
+              <m:t>&lt;</m:t>
+            </m:r>
+            <m:r>
+              <m:t>n</m:t>
+            </m:r>
+          </m:sub>
+          <m:sup>
+            <m:r>
+              <m:t>​</m:t>
+            </m:r>
+          </m:sup>
+          <m:e>
+            <m:sSup>
+              <m:e>
+                <m:r>
+                  <m:t>f</m:t>
+                </m:r>
+              </m:e>
+              <m:sup>
+                <m:r>
+                  <m:t>p</m:t>
+                </m:r>
+                <m:r>
+                  <m:t>i</m:t>
+                </m:r>
+                <m:r>
+                  <m:t>l</m:t>
+                </m:r>
+              </m:sup>
+            </m:sSup>
+          </m:e>
+        </m:nary>
+        <m:sSup>
+          <m:e>
+            <m:r>
+              <m:t>I</m:t>
+            </m:r>
+          </m:e>
+          <m:sup>
+            <m:r>
+              <m:t>e</m:t>
+            </m:r>
+            <m:r>
+              <m:t>l</m:t>
+            </m:r>
+          </m:sup>
+        </m:sSup>
+        <m:r>
+          <m:rPr>
+            <m:sty m:val="p"/>
+          </m:rPr>
+          <m:t>(</m:t>
+        </m:r>
+        <m:r>
+          <m:t>1</m:t>
+        </m:r>
+        <m:r>
+          <m:rPr>
+            <m:sty m:val="p"/>
+          </m:rPr>
+          <m:t>+</m:t>
+        </m:r>
+        <m:r>
+          <m:t>i</m:t>
+        </m:r>
+        <m:sSup>
+          <m:e>
+            <m:r>
+              <m:rPr>
+                <m:sty m:val="p"/>
+              </m:rPr>
+              <m:t>)</m:t>
+            </m:r>
+          </m:e>
+          <m:sup>
+            <m:r>
+              <m:rPr>
+                <m:sty m:val="p"/>
+              </m:rPr>
+              <m:t>−</m:t>
+            </m:r>
+            <m:sSub>
+              <m:e>
+                <m:r>
+                  <m:t>a</m:t>
+                </m:r>
+              </m:e>
+              <m:sub>
+                <m:r>
+                  <m:t>j</m:t>
+                </m:r>
+              </m:sub>
+            </m:sSub>
+          </m:sup>
+        </m:sSup>
+      </m:oMath>
+      <w:r>
+        <w:t xml:space="preserve">; as trocas no último ano ou depois dele não são feitas, pois não há valor residual. Com o fator de capacidade do caso de referência, de 0,37, as 60 mil horas não são atingidas em 15 anos; com a importação de energia, que eleva o fator de capacidade a 0,92, há uma troca no oitavo ano. O compressor que leva o hidrogênio da pressão do eletrolisador à do tanque não foi incluído: sua energia, estimada pela compressão isotérmica de 30 para 160 bar com rendimento de 50%, é de cerca de 1,1 kWh/kg, 2% do consumo específico do eletrolisador. Os parâmetros adotados são apresentados no Quadro 3.3.</w:t>
       </w:r>
     </w:p>
     <w:p>
@@ -22912,6 +23568,124 @@
               <w:pStyle w:val="Compact"/>
             </w:pPr>
             <w:r>
+              <w:t xml:space="preserve">Tanque de hidrogênio</w:t>
+            </w:r>
+          </w:p>
+        </w:tc>
+        <w:tc>
+          <w:tcPr/>
+          <w:p>
+            <w:pPr>
+              <w:pStyle w:val="Compact"/>
+            </w:pPr>
+            <w:r>
+              <w:t xml:space="preserve">US$ 700; 1.000; 1.100/kg armazenado</w:t>
+            </w:r>
+          </w:p>
+        </w:tc>
+        <w:tc>
+          <w:tcPr/>
+          <w:p>
+            <w:pPr>
+              <w:pStyle w:val="Compact"/>
+            </w:pPr>
+            <w:r>
+              <w:t xml:space="preserve">Vasos estacionários a 160 bar: situação de 2010 (US$ 1.000/kg) e meta para 2020 (US$ 700/kg); a 430 bar, US$ 1.100/kg (FENG</w:t>
+            </w:r>
+            <w:r>
+              <w:t xml:space="preserve"> </w:t>
+            </w:r>
+            <w:r>
+              <w:rPr>
+                <w:i/>
+                <w:iCs/>
+              </w:rPr>
+              <w:t xml:space="preserve">et al.</w:t>
+            </w:r>
+            <w:r>
+              <w:t xml:space="preserve">, 2014)</w:t>
+            </w:r>
+          </w:p>
+        </w:tc>
+      </w:tr>
+      <w:tr>
+        <w:tc>
+          <w:tcPr/>
+          <w:p>
+            <w:pPr>
+              <w:pStyle w:val="Compact"/>
+            </w:pPr>
+            <w:r>
+              <w:t xml:space="preserve">Troca de pilhas do eletrolisador</w:t>
+            </w:r>
+          </w:p>
+        </w:tc>
+        <w:tc>
+          <w:tcPr/>
+          <w:p>
+            <w:pPr>
+              <w:pStyle w:val="Compact"/>
+            </w:pPr>
+            <w:r>
+              <w:t xml:space="preserve">40% do investimento no eletrolisador a cada 60.000 h equivalentes</w:t>
+            </w:r>
+          </w:p>
+        </w:tc>
+        <w:tc>
+          <w:tcPr/>
+          <w:p>
+            <w:pPr>
+              <w:pStyle w:val="Compact"/>
+            </w:pPr>
+            <w:r>
+              <w:t xml:space="preserve">EPRI (2022): troca de 35% a 45% do investimento, vida de 60 a 80 mil horas</w:t>
+            </w:r>
+          </w:p>
+        </w:tc>
+      </w:tr>
+      <w:tr>
+        <w:tc>
+          <w:tcPr/>
+          <w:p>
+            <w:pPr>
+              <w:pStyle w:val="Compact"/>
+            </w:pPr>
+            <w:r>
+              <w:t xml:space="preserve">Prazo de implantação</w:t>
+            </w:r>
+          </w:p>
+        </w:tc>
+        <w:tc>
+          <w:tcPr/>
+          <w:p>
+            <w:pPr>
+              <w:pStyle w:val="Compact"/>
+            </w:pPr>
+            <w:r>
+              <w:t xml:space="preserve">1 ano (sensibilidade: 0 e 2 anos), com juros durante a construção à taxa de desconto</w:t>
+            </w:r>
+          </w:p>
+        </w:tc>
+        <w:tc>
+          <w:tcPr/>
+          <w:p>
+            <w:pPr>
+              <w:pStyle w:val="Compact"/>
+            </w:pPr>
+            <w:r>
+              <w:t xml:space="preserve">Hipótese do autor</w:t>
+            </w:r>
+          </w:p>
+        </w:tc>
+      </w:tr>
+      <w:tr>
+        <w:tc>
+          <w:tcPr/>
+          <w:p>
+            <w:pPr>
+              <w:pStyle w:val="Compact"/>
+            </w:pPr>
+            <w:r>
               <w:t xml:space="preserve">O&amp;M fixo anual</w:t>
             </w:r>
           </w:p>
@@ -23465,6 +24239,12 @@
           </m:rPr>
           <m:t>=</m:t>
         </m:r>
+        <m:r>
+          <m:t>J</m:t>
+        </m:r>
+        <m:r>
+          <m:t> </m:t>
+        </m:r>
         <m:sSup>
           <m:e>
             <m:r>
@@ -23611,7 +24391,7 @@
         </m:r>
       </m:oMath>
       <w:r>
-        <w:t xml:space="preserve">, que inclui o capital, o O&amp;M fixo com a reposição parcial de módulos e o acréscimo de uso da rede. O investimento separa as parcelas de potência e de energia,</w:t>
+        <w:t xml:space="preserve">, que inclui o capital, com os juros durante a construção, o O&amp;M fixo com a reposição parcial de módulos e o acréscimo de uso da rede. O investimento separa as parcelas de potência e de energia,</w:t>
       </w:r>
       <w:r>
         <w:t xml:space="preserve"> </w:t>
@@ -24793,7 +25573,24 @@
         <w:t xml:space="preserve"> </w:t>
       </w:r>
       <w:r>
-        <w:t xml:space="preserve">MWh/MW, a folga é de cerca de 100 MWh/MW por ano e cobre um consumo auxiliar de até 1,1% da potência. A receita fixa é multiplicada pelo fator</w:t>
+        <w:t xml:space="preserve">MWh/MW, a folga é de cerca de 100 MWh/MW por ano e cobre um consumo auxiliar de até 1,1% da potência. O uso dessa folga para o consumo auxiliar é uma interpretação: a Portaria custeia a recarga com base no rendimento de referência, mas não trata expressamente do consumo auxiliar medido no ponto de medição do módulo. Por isso, avalia-se também o caso em que todo o consumo auxiliar é pago ao PLD (</w:t>
+      </w:r>
+      <m:oMath>
+        <m:r>
+          <m:t>ϕ</m:t>
+        </m:r>
+        <m:r>
+          <m:rPr>
+            <m:sty m:val="p"/>
+          </m:rPr>
+          <m:t>=</m:t>
+        </m:r>
+        <m:r>
+          <m:t>0</m:t>
+        </m:r>
+      </m:oMath>
+      <w:r>
+        <w:t xml:space="preserve">). A receita fixa é multiplicada pelo fator</w:t>
       </w:r>
       <w:r>
         <w:t xml:space="preserve"> </w:t>
@@ -26694,6 +27491,12 @@
                         <m:type m:val="bar"/>
                       </m:fPr>
                       <m:num>
+                        <m:r>
+                          <m:t>J</m:t>
+                        </m:r>
+                        <m:r>
+                          <m:t> </m:t>
+                        </m:r>
                         <m:sSup>
                           <m:e>
                             <m:r>
@@ -26961,7 +27764,7 @@
         <w:pStyle w:val="FirstParagraph"/>
       </w:pPr>
       <w:r>
-        <w:t xml:space="preserve">isto é, o lance mínimo de um BESS a construir corresponde aproximadamente ao seu custo anual equivalente por MW — capital, O&amp;M com reposição de módulos e uso da rede —, acrescido da recarga e do consumo auxiliar não custeados pela CONCAP e dividido pelo fator</w:t>
+        <w:t xml:space="preserve">isto é, o lance mínimo de um BESS a construir corresponde aproximadamente ao seu custo anual equivalente por MW — capital com os juros durante a construção, O&amp;M com reposição de módulos e uso da rede —, acrescido da recarga e do consumo auxiliar não custeados pela CONCAP e dividido pelo fator</w:t>
       </w:r>
       <w:r>
         <w:t xml:space="preserve"> </w:t>
@@ -27785,6 +28588,75 @@
               <w:pStyle w:val="Compact"/>
             </w:pPr>
             <w:r>
+              <w:t xml:space="preserve">Custo de importação</w:t>
+            </w:r>
+          </w:p>
+        </w:tc>
+        <w:tc>
+          <w:tcPr/>
+          <w:p>
+            <w:pPr>
+              <w:pStyle w:val="Compact"/>
+            </w:pPr>
+            <w:r>
+              <w:t xml:space="preserve">Sem limite de volume</w:t>
+            </w:r>
+          </w:p>
+        </w:tc>
+        <w:tc>
+          <w:tcPr/>
+          <w:p>
+            <w:pPr>
+              <w:pStyle w:val="Compact"/>
+            </w:pPr>
+            <w:r>
+              <w:t xml:space="preserve">Permitida</w:t>
+            </w:r>
+          </w:p>
+        </w:tc>
+        <w:tc>
+          <w:tcPr/>
+          <w:p>
+            <w:pPr>
+              <w:pStyle w:val="Compact"/>
+            </w:pPr>
+            <m:oMath>
+              <m:sSup>
+                <m:e>
+                  <m:r>
+                    <m:t>c</m:t>
+                  </m:r>
+                </m:e>
+                <m:sup>
+                  <m:r>
+                    <m:t>i</m:t>
+                  </m:r>
+                  <m:r>
+                    <m:t>m</m:t>
+                  </m:r>
+                  <m:r>
+                    <m:t>p</m:t>
+                  </m:r>
+                </m:sup>
+              </m:sSup>
+            </m:oMath>
+            <w:r>
+              <w:t xml:space="preserve"> </w:t>
+            </w:r>
+            <w:r>
+              <w:t xml:space="preserve">de R$ 100 ou 400/MWh</w:t>
+            </w:r>
+          </w:p>
+        </w:tc>
+      </w:tr>
+      <w:tr>
+        <w:tc>
+          <w:tcPr/>
+          <w:p>
+            <w:pPr>
+              <w:pStyle w:val="Compact"/>
+            </w:pPr>
+            <w:r>
               <w:t xml:space="preserve">Importação e contrato 3 t/dia</w:t>
             </w:r>
           </w:p>
@@ -28338,7 +29210,36 @@
         </m:sSup>
       </m:oMath>
       <w:r>
-        <w:t xml:space="preserve">, sem limite de emissões. Nos casos com limite de emissões, a energia da rede, ao mesmo custo, supre apenas o eletrolisador e está sujeita às Equações (3.20) e (3.21), o que representa o critério de qualificação do hidrogênio pela intensidade de emissões (BRASIL, 2024). Ambas as configurações são avaliadas como alternativas à hipótese de suprimento exclusivamente fotovoltaico. Para cada caso, além da curva de oferta, registram-se a potência ótima e a operação média nos cenários para a receita fixa de referência, de R$ 600 mil/(MW·ano), e calcula-se o lance mínimo para a construção do BESS (Seção 3.8.2), com o lucro sem BESS recalculado nos casos que alteram o contrato de hidrogênio, a importação ou o eletrolisador.</w:t>
+        <w:t xml:space="preserve">, sem limite de emissões. O custo adicional</w:t>
+      </w:r>
+      <w:r>
+        <w:t xml:space="preserve"> </w:t>
+      </w:r>
+      <m:oMath>
+        <m:sSup>
+          <m:e>
+            <m:r>
+              <m:t>c</m:t>
+            </m:r>
+          </m:e>
+          <m:sup>
+            <m:r>
+              <m:t>i</m:t>
+            </m:r>
+            <m:r>
+              <m:t>m</m:t>
+            </m:r>
+            <m:r>
+              <m:t>p</m:t>
+            </m:r>
+          </m:sup>
+        </m:sSup>
+      </m:oMath>
+      <w:r>
+        <w:t xml:space="preserve"> </w:t>
+      </w:r>
+      <w:r>
+        <w:t xml:space="preserve">representa, de forma agregada, o que um consumidor conectado à rede paga além da energia: o uso da rede na parcela de consumo — a TUST de consumo de R$ 15,23/kW·mês corresponde a cerca de R$ 21/MWh com o eletrolisador a plena carga, e a mais com fator de capacidade menor —, os encargos setoriais — a Conta de Desenvolvimento Energético (CDE), cuja quota anual de uso, de R$ 41,4 bilhões em 2025 (ANEEL, 2025), corresponde a algumas dezenas de reais por MWh consumido, menos em alta tensão, o Proinfa e os encargos de serviços do sistema e de energia de reserva — e os tributos não recuperáveis sobre a energia comprada, como o ICMS quando não creditado. Esses componentes dependem do nível de tensão, da concessionária, do enquadramento do consumidor — por exemplo, como autoprodutor por equiparação — e de benefícios à produção de hidrogênio ainda em regulamentação (BRASIL, 2024). O valor de R$ 250/MWh é, por isso, uma hipótese do autor, situada na faixa superior desses custos, e o caso de importação livre é avaliado também com R$ 100 e R$ 400/MWh. Nos casos com limite de emissões, a energia da rede, ao mesmo custo, supre apenas o eletrolisador e está sujeita às Equações (3.20) e (3.21), o que representa o critério de qualificação do hidrogênio pela intensidade de emissões (BRASIL, 2024). Ambas as configurações são avaliadas como alternativas à hipótese de suprimento exclusivamente fotovoltaico. Para cada caso, além da curva de oferta, registram-se a potência ótima e a operação média nos cenários para a receita fixa de referência, de R$ 600 mil/(MW·ano), e calcula-se o lance mínimo para a construção do BESS (Seção 3.8.2), com o lucro sem BESS recalculado nos casos que alteram o contrato de hidrogênio, a importação ou o eletrolisador.</w:t>
       </w:r>
     </w:p>
     <w:bookmarkEnd w:id="40"/>
@@ -28438,7 +29339,7 @@
         <w:t xml:space="preserve"> </w:t>
       </w:r>
       <w:r>
-        <w:t xml:space="preserve">mesmo na extensão estocástica, a operação de cada cenário é otimizada com conhecimento antecipado das séries daquele ano, o que tende a superestimar o lucro alcançável na operação real. A incerteza tratada pela Seção 3.7 é apenas a variação entre anos; a incerteza do despacho do ONS, cujo risco é alocado ao empreendedor pela Portaria, é representada somente pela regra de despacho baseada no PLD e pela sensibilidade ao número de despachos por ano (Seção 3.8.3), que supõe despachos completos, de</w:t>
+        <w:t xml:space="preserve">mesmo na extensão estocástica, a operação de cada cenário é otimizada com conhecimento antecipado das séries daquele ano, o que tende a superestimar o lucro alcançável na operação real. O viés não é uniforme: ele recai sobretudo sobre o módulo mercantil, cuja arbitragem e cujo suprimento noturno do eletrolisador dependem de conhecer os preços e a irradiância das horas seguintes, enquanto a receita fixa do módulo LRCAP não depende de previsão. Superestima-se, portanto, o custo de oportunidade de contratar a potência no leilão, e a potência ótima de um BESS existente tende a ser subestimada, isto é, um operador real ofertaria ao menos a potência indicada pela curva de oferta. No lance mínimo de um BESS a construir, o módulo mercantil é nulo e a operação do lado mercantil coincide nas alternativas com e sem BESS, de modo que o viés praticamente se cancela; no VPL do empreendimento, ele torna o resultado otimista, o que reforça a conclusão de inviabilidade. A incerteza tratada pela Seção 3.7 é apenas a variação entre anos; a incerteza do despacho do ONS, cujo risco é alocado ao empreendedor pela Portaria, é representada somente pela regra de despacho baseada no PLD e pela sensibilidade ao número de despachos por ano (Seção 3.8.3), que supõe despachos completos, de</w:t>
       </w:r>
       <w:r>
         <w:t xml:space="preserve"> </w:t>
@@ -28724,7 +29625,7 @@
         <w:t xml:space="preserve"> </w:t>
       </w:r>
       <w:r>
-        <w:t xml:space="preserve">a análise de viabilidade considera fluxo de caixa constante em termos reais, antes dos tributos sobre a renda e descontado à taxa antes de impostos, com PIS/Cofins no regime cumulativo e sem encargos setoriais, sem prazo de implantação nem juros durante a construção, sem financiamento, sem benefícios fiscais e sem valor residual; o O&amp;M fixo da FV e do eletrolisador é hipotético, a TUST é a média nacional, e não a do barramento de conexão, a regra de cobrança do armazenamento ainda deve ser confirmada no texto da REN ANEEL nº 1.162/2026, a duração de referência e a composição do custo do BESS são estimadas e o consumo auxiliar é um valor indicativo; o lucro operacional é calculado com os parâmetros provisórios de operação;</w:t>
+        <w:t xml:space="preserve">a análise de viabilidade considera fluxo de caixa constante em termos reais, antes dos tributos sobre a renda e descontado à taxa antes de impostos, com PIS/Cofins no regime cumulativo e sem encargos setoriais, com prazo de implantação de um ano e juros durante a construção à própria taxa de desconto, sem financiamento, sem benefícios fiscais e sem valor residual; o O&amp;M fixo da FV e do eletrolisador é hipotético, o compressor do hidrogênio não está incluído, o custo do tanque refere-se a metas e estimativas do DOE para vasos estacionários, e não a cotações, a TUST é a média nacional, e não a do barramento de conexão, a regra de cobrança do armazenamento ainda deve ser confirmada no texto da REN ANEEL nº 1.162/2026, a duração de referência e a composição do custo do BESS são estimadas e o consumo auxiliar é um valor indicativo; o lucro operacional é calculado com os parâmetros provisórios de operação;</w:t>
       </w:r>
     </w:p>
     <w:p>
@@ -28779,7 +29680,28 @@
         <w:t xml:space="preserve">et al.</w:t>
       </w:r>
       <w:r>
-        <w:t xml:space="preserve">, 2014), corresponderia, sozinho, a 2,6 kgCO₂eq/kgH₂; e a metodologia de certificação — fator médio ou marginal, janela de apuração e fronteira do ciclo de vida — depende da regulamentação do Sistema Brasileiro de Certificação do Hidrogênio.</w:t>
+        <w:t xml:space="preserve">, 2014), corresponderia, sozinho, a 2,6 kgCO₂eq/kgH₂; e a metodologia de certificação — fator médio ou marginal, janela de apuração e fronteira do ciclo de vida — depende da regulamentação do Sistema Brasileiro de Certificação do Hidrogênio;</w:t>
+      </w:r>
+    </w:p>
+    <w:p>
+      <w:pPr>
+        <w:numPr>
+          <w:ilvl w:val="0"/>
+          <w:numId w:val="1005"/>
+        </w:numPr>
+      </w:pPr>
+      <w:r>
+        <w:rPr>
+          <w:b/>
+          <w:bCs/>
+        </w:rPr>
+        <w:t xml:space="preserve">calendário:</w:t>
+      </w:r>
+      <w:r>
+        <w:t xml:space="preserve"> </w:t>
+      </w:r>
+      <w:r>
+        <w:t xml:space="preserve">o ano bissexto de 2024 é operado em 366 dias, mas a receita fixa corresponde a um ano, o que eleva o lucro operacional desse cenário em cerca de um dia de operação, R$ 0,1 milhão, e o lucro esperado em cerca de 0,03%; como o dia adicional está presente com e sem o BESS, o efeito sobre o lance mínimo é desprezível. Como o ano não é múltiplo de sete dias, o último bloco da decomposição tem 8 dias (9 em 2024), e a janela de apuração das emissões desse bloco é de 192 ou 216 horas, em vez de 168.</w:t>
       </w:r>
     </w:p>
     <w:bookmarkEnd w:id="43"/>
@@ -28797,6 +29719,14 @@
         <w:pStyle w:val="Referencia"/>
       </w:pPr>
       <w:r>
+        <w:t xml:space="preserve">ANEEL – AGÊNCIA NACIONAL DE ENERGIA ELÉTRICA. Resolução Homologatória nº 3.484, de 15 de julho de 2025. Aprova o orçamento anual da Conta de Desenvolvimento Energético (CDE) para 2025 e fixa as quotas anuais de CDE-USO e CDE-GD. Brasília: ANEEL, 2025.</w:t>
+      </w:r>
+    </w:p>
+    <w:p>
+      <w:pPr>
+        <w:pStyle w:val="Referencia"/>
+      </w:pPr>
+      <w:r>
         <w:t xml:space="preserve">ANEEL – AGÊNCIA NACIONAL DE ENERGIA ELÉTRICA.</w:t>
       </w:r>
       <w:r>
@@ -29311,6 +30241,27 @@
         <w:pStyle w:val="Referencia"/>
       </w:pPr>
       <w:r>
+        <w:t xml:space="preserve">EPRI.</w:t>
+      </w:r>
+      <w:r>
+        <w:t xml:space="preserve"> </w:t>
+      </w:r>
+      <w:r>
+        <w:rPr>
+          <w:b/>
+          <w:bCs/>
+        </w:rPr>
+        <w:t xml:space="preserve">Technology brief: water electrolyzer stack degradation</w:t>
+      </w:r>
+      <w:r>
+        <w:t xml:space="preserve">. Palo Alto: Electric Power Research Institute, ago. 2022. Produto 3002025148. Disponível em: https://restservice.epri.com/publicdownload/000000003002025148/0/Product. Acesso em: 15 out. 2026.</w:t>
+      </w:r>
+    </w:p>
+    <w:p>
+      <w:pPr>
+        <w:pStyle w:val="Referencia"/>
+      </w:pPr>
+      <w:r>
         <w:t xml:space="preserve">FENG, L.</w:t>
       </w:r>
       <w:r>
@@ -29348,7 +30299,7 @@
         <w:pStyle w:val="Referencia"/>
       </w:pPr>
       <w:r>
-        <w:t xml:space="preserve">HERSBACH, H.</w:t>
+        <w:t xml:space="preserve">FENG, Z.</w:t>
       </w:r>
       <w:r>
         <w:t xml:space="preserve"> </w:t>
@@ -29364,6 +30315,37 @@
         <w:t xml:space="preserve"> </w:t>
       </w:r>
       <w:r>
+        <w:rPr>
+          <w:b/>
+          <w:bCs/>
+        </w:rPr>
+        <w:t xml:space="preserve">Steel concrete composite vessel for 875 bar stationary hydrogen storage</w:t>
+      </w:r>
+      <w:r>
+        <w:t xml:space="preserve">. Apresentação no Annual Merit Review do Hydrogen and Fuel Cells Program. Washington, DC: U.S. Department of Energy, 2014. Disponível em: https://www.hydrogen.energy.gov/docs/hydrogenprogramlibraries/pdfs/review14/pd088_feng_2014_o.pdf. Acesso em: 15 out. 2026.</w:t>
+      </w:r>
+    </w:p>
+    <w:p>
+      <w:pPr>
+        <w:pStyle w:val="Referencia"/>
+      </w:pPr>
+      <w:r>
+        <w:t xml:space="preserve">HERSBACH, H.</w:t>
+      </w:r>
+      <w:r>
+        <w:t xml:space="preserve"> </w:t>
+      </w:r>
+      <w:r>
+        <w:rPr>
+          <w:i/>
+          <w:iCs/>
+        </w:rPr>
+        <w:t xml:space="preserve">et al.</w:t>
+      </w:r>
+      <w:r>
+        <w:t xml:space="preserve"> </w:t>
+      </w:r>
+      <w:r>
         <w:t xml:space="preserve">The ERA5 global reanalysis.</w:t>
       </w:r>
       <w:r>
@@ -29687,7 +30669,7 @@
         <w:pStyle w:val="Referencia"/>
       </w:pPr>
       <w:r>
-        <w:t xml:space="preserve">UNIÃO EUROPEIA. Regulamento Delegado (UE) 2023/1185 da Comissão, de 10 de fevereiro de 2023, que estabelece um limiar mínimo de redução das emissões de gases com efeito de estufa para os combustíveis de carbono reciclado e uma metodologia de avaliação da redução das emissões dos combustíveis renováveis de origem não biológica.</w:t>
+        <w:t xml:space="preserve">UNIÃO EUROPEIA. Regulamento Delegado (UE) 2023/1184 da Comissão, de 10 de fevereiro de 2023, que completa a Diretiva (UE) 2018/2001 do Parlamento Europeu e do Conselho mediante o estabelecimento de uma metodologia da União que defina regras pormenorizadas para a produção de combustíveis líquidos e gasosos renováveis de origem não biológica para os transportes.</w:t>
       </w:r>
       <w:r>
         <w:t xml:space="preserve"> </w:t>
@@ -29700,7 +30682,28 @@
         <w:t xml:space="preserve">Jornal Oficial da União Europeia</w:t>
       </w:r>
       <w:r>
-        <w:t xml:space="preserve">, L 157, 20 jun. 2023.</w:t>
+        <w:t xml:space="preserve">, L 157, 20 jun. 2023a.</w:t>
+      </w:r>
+    </w:p>
+    <w:p>
+      <w:pPr>
+        <w:pStyle w:val="Referencia"/>
+      </w:pPr>
+      <w:r>
+        <w:t xml:space="preserve">UNIÃO EUROPEIA. Regulamento Delegado (UE) 2023/1185 da Comissão, de 10 de fevereiro de 2023, que estabelece um limiar mínimo de redução das emissões de gases com efeito de estufa para os combustíveis de carbono reciclado e uma metodologia de avaliação da redução das emissões dos combustíveis renováveis de origem não biológica.</w:t>
+      </w:r>
+      <w:r>
+        <w:t xml:space="preserve"> </w:t>
+      </w:r>
+      <w:r>
+        <w:rPr>
+          <w:b/>
+          <w:bCs/>
+        </w:rPr>
+        <w:t xml:space="preserve">Jornal Oficial da União Europeia</w:t>
+      </w:r>
+      <w:r>
+        <w:t xml:space="preserve">, L 157, 20 jun. 2023b.</w:t>
       </w:r>
     </w:p>
     <w:p>

</xml_diff>

<commit_message>
Previsão perfeita medida por operação em horizonte rolante (2025; 30, 55 e 60 MW)
Perda de 0,03%, 0,54% e 0 do lucro operacional com previsão FV por persistência; o viés fica no
módulo mercantil e não afeta o lance. Seção 4.3.2, hipótese a) da Seção 3.10 e README.

Co-Authored-By: Claude Opus 5.5 <noreply@anthropic.com>
Claude-Session: https://claude.ai/code/session_01YFtn9hiQUHbNLSX7rUNYuK
</commit_message>
<xml_diff>
--- a/docs/dissertacao/cap3_metodologia.docx
+++ b/docs/dissertacao/cap3_metodologia.docx
@@ -29339,7 +29339,7 @@
         <w:t xml:space="preserve"> </w:t>
       </w:r>
       <w:r>
-        <w:t xml:space="preserve">mesmo na extensão estocástica, a operação de cada cenário é otimizada com conhecimento antecipado das séries daquele ano, o que tende a superestimar o lucro alcançável na operação real. O viés não é uniforme: ele recai sobretudo sobre o módulo mercantil, cuja arbitragem e cujo suprimento noturno do eletrolisador dependem de conhecer os preços e a irradiância das horas seguintes, enquanto a receita fixa do módulo LRCAP não depende de previsão. Superestima-se, portanto, o custo de oportunidade de contratar a potência no leilão, e a potência ótima de um BESS existente tende a ser subestimada, isto é, um operador real ofertaria ao menos a potência indicada pela curva de oferta. No lance mínimo de um BESS a construir, o módulo mercantil é nulo e a operação do lado mercantil coincide nas alternativas com e sem BESS, de modo que o viés praticamente se cancela; no VPL do empreendimento, ele torna o resultado otimista, o que reforça a conclusão de inviabilidade. A incerteza tratada pela Seção 3.7 é apenas a variação entre anos; a incerteza do despacho do ONS, cujo risco é alocado ao empreendedor pela Portaria, é representada somente pela regra de despacho baseada no PLD e pela sensibilidade ao número de despachos por ano (Seção 3.8.3), que supõe despachos completos, de</w:t>
+        <w:t xml:space="preserve">mesmo na extensão estocástica, a operação de cada cenário é otimizada com conhecimento antecipado das séries daquele ano, o que tende a superestimar o lucro alcançável na operação real. O viés não é uniforme: ele recai sobretudo sobre o módulo mercantil, cuja arbitragem e cujo suprimento noturno do eletrolisador dependem de conhecer os preços e a irradiância das horas seguintes, enquanto a receita fixa do módulo LRCAP não depende de previsão. Superestima-se, portanto, o custo de oportunidade de contratar a potência no leilão, e a potência ótima de um BESS existente tende a ser subestimada, isto é, um operador real ofertaria ao menos a potência indicada pela curva de oferta. No lance mínimo de um BESS a construir, o módulo mercantil é nulo e a operação do lado mercantil coincide nas alternativas com e sem BESS, de modo que o viés praticamente se cancela; no VPL do empreendimento, ele torna o resultado otimista, o que reforça a conclusão de inviabilidade. O tamanho desse viés é medido no Capítulo 4 por uma operação em horizonte rolante de 48 h, com o PLD conhecido na véspera e a geração FV prevista por persistência: em 2025, a perda é de no máximo 0,54% do lucro operacional (Subseção 4.3.2). A incerteza tratada pela Seção 3.7 é apenas a variação entre anos; a incerteza do despacho do ONS, cujo risco é alocado ao empreendedor pela Portaria, é representada somente pela regra de despacho baseada no PLD e pela sensibilidade ao número de despachos por ano (Seção 3.8.3), que supõe despachos completos, de</w:t>
       </w:r>
       <w:r>
         <w:t xml:space="preserve"> </w:t>
@@ -30323,6 +30323,27 @@
       </w:r>
       <w:r>
         <w:t xml:space="preserve">. Apresentação no Annual Merit Review do Hydrogen and Fuel Cells Program. Washington, DC: U.S. Department of Energy, 2014. Disponível em: https://www.hydrogen.energy.gov/docs/hydrogenprogramlibraries/pdfs/review14/pd088_feng_2014_o.pdf. Acesso em: 15 out. 2026.</w:t>
+      </w:r>
+    </w:p>
+    <w:p>
+      <w:pPr>
+        <w:pStyle w:val="Referencia"/>
+      </w:pPr>
+      <w:r>
+        <w:t xml:space="preserve">GARCÍA-MIGUEL, P. L. C.; ZARILLI, D.; ALONSO-MARTINEZ, J.; GARCÍA PLAZA, M.; ARNALTES GÓMEZ, S. Optimal operation and market integration of a hybrid farm with green hydrogen and energy storage: a stochastic approach considering wind and electricity price uncertainties.</w:t>
+      </w:r>
+      <w:r>
+        <w:t xml:space="preserve"> </w:t>
+      </w:r>
+      <w:r>
+        <w:rPr>
+          <w:b/>
+          <w:bCs/>
+        </w:rPr>
+        <w:t xml:space="preserve">Sustainability</w:t>
+      </w:r>
+      <w:r>
+        <w:t xml:space="preserve">, v. 16, n. 7, 2856, 2024.</w:t>
       </w:r>
     </w:p>
     <w:p>

</xml_diff>

<commit_message>
Ressalva: divisão do BESS em módulos é interpretação da Portaria (Seção 3.2 e hipótese g)
Co-Authored-By: Claude Opus 5.5 <noreply@anthropic.com>
Claude-Session: https://claude.ai/code/session_01YFtn9hiQUHbNLSX7rUNYuK
</commit_message>
<xml_diff>
--- a/docs/dissertacao/cap3_metodologia.docx
+++ b/docs/dissertacao/cap3_metodologia.docx
@@ -229,7 +229,7 @@
         <w:t xml:space="preserve">módulo mercantil</w:t>
       </w:r>
       <w:r>
-        <w:t xml:space="preserve">, que recebe a capacidade remanescente e é operado pelo empreendedor em conjunto com a usina FV e o eletrolisador. Ambos compartilham o ponto de conexão com o Sistema Interligado Nacional (SIN).</w:t>
+        <w:t xml:space="preserve">, que recebe a capacidade remanescente e é operado pelo empreendedor em conjunto com a usina FV e o eletrolisador. Ambos compartilham o ponto de conexão com o Sistema Interligado Nacional (SIN). Ressalta-se que essa divisão é uma interpretação da norma: a Portaria exige que toda a potência contratada esteja disponível ao ONS e que a energia do sistema contratado seja liquidada em favor da CONCAP, e admite o compartilhamento da conexão, mas não trata expressamente da contratação de parte de uma instalação, com a parcela remanescente operada no mercado sob medição individualizada. A interpretação respeita as duas exigências — o módulo mercantil não recebe receita do leilão, e o módulo LRCAP não gera receita fora dele —, mas sua aceitação deve ser confirmada no edital e nos procedimentos do ONS e da CCEE. Se a divisão não for admitida, deixa de valer a curva de oferta escalonada de um BESS existente (Seção 3.8.1), mas não o lance mínimo de um BESS dimensionado para o contrato (Seção 3.8.3), que não tem módulo mercantil e não depende dessa hipótese.</w:t>
       </w:r>
     </w:p>
     <w:p>
@@ -29498,13 +29498,13 @@
           <w:b/>
           <w:bCs/>
         </w:rPr>
-        <w:t xml:space="preserve">divisão contínua do BESS:</w:t>
-      </w:r>
-      <w:r>
-        <w:t xml:space="preserve"> </w:t>
-      </w:r>
-      <w:r>
-        <w:t xml:space="preserve">a alocação entre os módulos é tratada como contínua, embora na prática seja discreta, em função da modularidade dos contêineres e conversores;</w:t>
+        <w:t xml:space="preserve">divisão do BESS em módulos:</w:t>
+      </w:r>
+      <w:r>
+        <w:t xml:space="preserve"> </w:t>
+      </w:r>
+      <w:r>
+        <w:t xml:space="preserve">a contratação de parte da instalação, com o restante operado no mercado sob medição individualizada, é uma interpretação da Portaria a confirmar no edital (Seção 3.2); sem ela, vale apenas o BESS dimensionado para o contrato. Além disso, a alocação entre os módulos é tratada como contínua, embora na prática seja discreta, em função da modularidade dos contêineres e conversores;</w:t>
       </w:r>
     </w:p>
     <w:p>

</xml_diff>

<commit_message>
Custo do BESS: comparação com BNEF e Ember (2025) e efeito no lance (R$ 0,5 a 1,0 mi)
Co-Authored-By: Claude Opus 5.5 <noreply@anthropic.com>
Claude-Session: https://claude.ai/code/session_01YFtn9hiQUHbNLSX7rUNYuK
</commit_message>
<xml_diff>
--- a/docs/dissertacao/cap3_metodologia.docx
+++ b/docs/dissertacao/cap3_metodologia.docx
@@ -30213,6 +30213,27 @@
       </w:r>
       <w:r>
         <w:t xml:space="preserve">. 2025. Disponível em: https://www.energycentral.com/energy-biz/post/bess-5-mwh-aux-consumption-nB19OmDcUfffS2B. Acesso em: 13 out. 2026.</w:t>
+      </w:r>
+    </w:p>
+    <w:p>
+      <w:pPr>
+        <w:pStyle w:val="Referencia"/>
+      </w:pPr>
+      <w:r>
+        <w:t xml:space="preserve">ENERGY-STORAGE.NEWS.</w:t>
+      </w:r>
+      <w:r>
+        <w:t xml:space="preserve"> </w:t>
+      </w:r>
+      <w:r>
+        <w:rPr>
+          <w:b/>
+          <w:bCs/>
+        </w:rPr>
+        <w:t xml:space="preserve">Battery storage system prices continue to fall sharply, BNEF and Ember reports find</w:t>
+      </w:r>
+      <w:r>
+        <w:t xml:space="preserve">. Londres: Solar Media, dez. 2025. Disponível em: https://www.energy-storage.news. Acesso em: 20 out. 2026.</w:t>
       </w:r>
     </w:p>
     <w:p>

</xml_diff>

<commit_message>
Justificativa do preço do hidrogênio (IEA 2023; estimativas para o Brasil)
Co-Authored-By: Claude Opus 5.5 <noreply@anthropic.com>
Claude-Session: https://claude.ai/code/session_01YFtn9hiQUHbNLSX7rUNYuK
</commit_message>
<xml_diff>
--- a/docs/dissertacao/cap3_metodologia.docx
+++ b/docs/dissertacao/cap3_metodologia.docx
@@ -1921,7 +1921,7 @@
               <w:pStyle w:val="Compact"/>
             </w:pPr>
             <w:r>
-              <w:t xml:space="preserve">Preço de venda do H₂</w:t>
+              <w:t xml:space="preserve">Preço de venda do H₂ (hipótese; Seção 3.5)</w:t>
             </w:r>
           </w:p>
         </w:tc>
@@ -11988,6 +11988,24 @@
       </w:r>
       <w:r>
         <w:t xml:space="preserve">Como ainda não houve leilão de armazenamento em baterias no Brasil, a receita fixa foi delimitada por quatro referências. A inferior é o primeiro leilão do mecanismo italiano de contratação de capacidade de armazenamento (MACSE), realizado em setembro de 2025 com contratos de 15 anos e desenho semelhante ao do LRCAP, cujo preço médio de € 12.959/(MWh·ano) (TERNA, 2025) corresponde, para um sistema de 4 h e com a taxa de câmbio PTAX de 30/09/2025 (R$ 6,2396/€), a cerca de R$ 323 mil/(MW·ano). No LRCAP de março de 2026, que contratou o mesmo produto — potência disponível ao ONS —, termelétricas existentes a óleo e biodiesel obtiveram preço médio de R$ 831 mil/(MW·ano) (CCEE, 2026c), e o conjunto de termelétricas a gás natural, biometano e carvão e de ampliações de hidrelétricas, novas e existentes, R$ 2,334 milhões/(MW·ano) (CCEE, 2026b). Por fim, o custo de investimento de referência de sistemas de baterias, de R$ 5.000 a R$ 6.000/kW (BRASIL; EPE, 2025), corresponde, anualizado à taxa central de 12,1% ao ano em 15 anos (Seção 3.8.2), a R$ 738 mil a R$ 886 mil/(MW·ano), sem considerar operação e manutenção, encargos e reposição de módulos. Com base nessas referências, a análise de sensibilidade abrange receitas fixas de R$ 330 mil a R$ 2,33 milhões/(MW·ano). O valor de R$ 600 mil/(MW·ano) adotado no caso de referência situa-se no extremo inferior dessa faixa, abaixo do preço obtido por usinas existentes e do custo anualizado de investimento em baterias, e constitui, portanto, uma hipótese conservadora quanto à atratividade do leilão.</w:t>
+      </w:r>
+    </w:p>
+    <w:p>
+      <w:pPr>
+        <w:pStyle w:val="BodyText"/>
+      </w:pPr>
+      <w:r>
+        <w:rPr>
+          <w:b/>
+          <w:bCs/>
+        </w:rPr>
+        <w:t xml:space="preserve">Preço do hidrogênio.</w:t>
+      </w:r>
+      <w:r>
+        <w:t xml:space="preserve"> </w:t>
+      </w:r>
+      <w:r>
+        <w:t xml:space="preserve">Não há mercado de hidrogênio renovável consolidado no Brasil, nem preço de referência publicado. O preço de R$ 35/kg, cerca de US$ 6,5/kg pela PTAX de 09/12/2025, foi adotado como o de um comprador disposto a pagar pelo hidrogênio de origem renovável e situa-se acima das referências de custo: a Agência Internacional de Energia indicou custos de US$ 1 a 3/kg para o hidrogênio de origem fóssil e de US$ 3,0 a 7,5/kg para o de origem renovável (IEA, 2023), e estimativas para projetos brasileiros em localidades favoráveis indicam custos nivelados de US$ 2,9 a 3,6/kg (NOVACANA, 2023). O valor adotado corresponde, assim, ao extremo superior do custo do hidrogênio renovável e a cerca de duas vezes o custo estimado em projetos brasileiros de grande escala, e deve ser lido como hipótese otimista quanto à receita do hidrogênio. Por isso, o preço é tratado como parâmetro: o mapa de sensibilidade abrange preços de R$ 10 a R$ 45/kg, e o preço de equilíbrio que anularia o VPL é calculado para cada caso (Seção 3.8.2).</w:t>
       </w:r>
     </w:p>
     <w:bookmarkEnd w:id="24"/>
@@ -30482,10 +30500,10 @@
           <w:b/>
           <w:bCs/>
         </w:rPr>
-        <w:t xml:space="preserve">Global Hydrogen Review 2025</w:t>
-      </w:r>
-      <w:r>
-        <w:t xml:space="preserve">. Paris: IEA, out. 2025.</w:t>
+        <w:t xml:space="preserve">Global Hydrogen Review 2023</w:t>
+      </w:r>
+      <w:r>
+        <w:t xml:space="preserve">. Paris: IEA, set. 2023.</w:t>
       </w:r>
     </w:p>
     <w:p>
@@ -30493,6 +30511,27 @@
         <w:pStyle w:val="Referencia"/>
       </w:pPr>
       <w:r>
+        <w:t xml:space="preserve">IEA – INTERNATIONAL ENERGY AGENCY.</w:t>
+      </w:r>
+      <w:r>
+        <w:t xml:space="preserve"> </w:t>
+      </w:r>
+      <w:r>
+        <w:rPr>
+          <w:b/>
+          <w:bCs/>
+        </w:rPr>
+        <w:t xml:space="preserve">Global Hydrogen Review 2025</w:t>
+      </w:r>
+      <w:r>
+        <w:t xml:space="preserve">. Paris: IEA, out. 2025.</w:t>
+      </w:r>
+    </w:p>
+    <w:p>
+      <w:pPr>
+        <w:pStyle w:val="Referencia"/>
+      </w:pPr>
+      <w:r>
         <w:t xml:space="preserve">IPCC – INTERGOVERNMENTAL PANEL ON CLIMATE CHANGE.</w:t>
       </w:r>
       <w:r>
@@ -30549,6 +30588,27 @@
       </w:r>
       <w:r>
         <w:t xml:space="preserve">. 29 jun. 2026. Disponível em: https://movimentoeconomico.com.br/economia/energia/2026/06/29/aneel-conclui-tarifas-de-transmissao-e-ne-sai-favorecido-no-ciclo-2026-2027/. Acesso em: 13 out. 2026.</w:t>
+      </w:r>
+    </w:p>
+    <w:p>
+      <w:pPr>
+        <w:pStyle w:val="Referencia"/>
+      </w:pPr>
+      <w:r>
+        <w:t xml:space="preserve">NOVACANA.</w:t>
+      </w:r>
+      <w:r>
+        <w:t xml:space="preserve"> </w:t>
+      </w:r>
+      <w:r>
+        <w:rPr>
+          <w:b/>
+          <w:bCs/>
+        </w:rPr>
+        <w:t xml:space="preserve">Custo de produzir hidrogênio verde no Brasil pode cair 51% com incentivos, diz Cela</w:t>
+      </w:r>
+      <w:r>
+        <w:t xml:space="preserve">. 1 set. 2023. Disponível em: https://www.novacana.com/noticias/custo-produzir-hidrogenio-verde-brasil-cair-51-incentivos-cela-010923. Acesso em: 20 out. 2026.</w:t>
       </w:r>
     </w:p>
     <w:p>

</xml_diff>

<commit_message>
Modela a reposição de módulos do BESS (augmentation)
Perda de capacidade por ciclagem e calendário e compra de módulos quando a
capacidade cairia abaixo da necessária para 4 h. Com 1 ciclo/dia custa 46%
do O&M do BESS; com 2 ciclos/dia, 85%. Lance: +6% (limite superior) e +5%
(2 ciclos/dia).

Co-Authored-By: Claude Opus 5.5 <noreply@anthropic.com>
Claude-Session: https://claude.ai/code/session_01YFtn9hiQUHbNLSX7rUNYuK
</commit_message>
<xml_diff>
--- a/docs/dissertacao/cap3_metodologia.docx
+++ b/docs/dissertacao/cap3_metodologia.docx
@@ -11969,7 +11969,546 @@
         <w:t xml:space="preserve">augmentation</w:t>
       </w:r>
       <w:r>
-        <w:t xml:space="preserve">) que mantém a capacidade nominal durante a vida útil, com cerca de um ciclo por dia (NREL, 2024). Cobrar também o desgaste por MWh pagaria a bateria duas vezes.</w:t>
+        <w:t xml:space="preserve">) que mantém a capacidade nominal durante a vida útil, com cerca de um ciclo por dia (NREL, 2024). Cobrar também o desgaste por MWh pagaria a bateria duas vezes. Para verificar se esse O&amp;M comporta a reposição, ela é também modelada explicitamente, fora do modelo de operação: a capacidade nominal</w:t>
+      </w:r>
+      <w:r>
+        <w:t xml:space="preserve"> </w:t>
+      </w:r>
+      <m:oMath>
+        <m:sSub>
+          <m:e>
+            <m:r>
+              <m:t>E</m:t>
+            </m:r>
+          </m:e>
+          <m:sub>
+            <m:r>
+              <m:t>t</m:t>
+            </m:r>
+          </m:sub>
+        </m:sSub>
+      </m:oMath>
+      <w:r>
+        <w:t xml:space="preserve"> </w:t>
+      </w:r>
+      <w:r>
+        <w:t xml:space="preserve">evolui, a cada ano, como</w:t>
+      </w:r>
+      <w:r>
+        <w:t xml:space="preserve"> </w:t>
+      </w:r>
+      <m:oMath>
+        <m:sSub>
+          <m:e>
+            <m:r>
+              <m:t>E</m:t>
+            </m:r>
+          </m:e>
+          <m:sub>
+            <m:r>
+              <m:t>t</m:t>
+            </m:r>
+            <m:r>
+              <m:rPr>
+                <m:sty m:val="p"/>
+              </m:rPr>
+              <m:t>+</m:t>
+            </m:r>
+            <m:r>
+              <m:t>1</m:t>
+            </m:r>
+          </m:sub>
+        </m:sSub>
+        <m:r>
+          <m:rPr>
+            <m:sty m:val="p"/>
+          </m:rPr>
+          <m:t>=</m:t>
+        </m:r>
+        <m:sSub>
+          <m:e>
+            <m:r>
+              <m:t>E</m:t>
+            </m:r>
+          </m:e>
+          <m:sub>
+            <m:r>
+              <m:t>t</m:t>
+            </m:r>
+          </m:sub>
+        </m:sSub>
+        <m:r>
+          <m:rPr>
+            <m:sty m:val="p"/>
+          </m:rPr>
+          <m:t>(</m:t>
+        </m:r>
+        <m:r>
+          <m:t>1</m:t>
+        </m:r>
+        <m:r>
+          <m:rPr>
+            <m:sty m:val="p"/>
+          </m:rPr>
+          <m:t>−</m:t>
+        </m:r>
+        <m:sSup>
+          <m:e>
+            <m:r>
+              <m:t>δ</m:t>
+            </m:r>
+          </m:e>
+          <m:sup>
+            <m:r>
+              <m:t>c</m:t>
+            </m:r>
+            <m:r>
+              <m:t>a</m:t>
+            </m:r>
+            <m:r>
+              <m:t>l</m:t>
+            </m:r>
+          </m:sup>
+        </m:sSup>
+        <m:r>
+          <m:rPr>
+            <m:sty m:val="p"/>
+          </m:rPr>
+          <m:t>)</m:t>
+        </m:r>
+        <m:r>
+          <m:rPr>
+            <m:sty m:val="p"/>
+          </m:rPr>
+          <m:t>−</m:t>
+        </m:r>
+        <m:sSup>
+          <m:e>
+            <m:r>
+              <m:t>δ</m:t>
+            </m:r>
+          </m:e>
+          <m:sup>
+            <m:r>
+              <m:t>c</m:t>
+            </m:r>
+            <m:r>
+              <m:t>i</m:t>
+            </m:r>
+            <m:r>
+              <m:t>c</m:t>
+            </m:r>
+          </m:sup>
+        </m:sSup>
+        <m:r>
+          <m:t>D</m:t>
+        </m:r>
+        <m:r>
+          <m:rPr>
+            <m:sty m:val="p"/>
+          </m:rPr>
+          <m:t>/</m:t>
+        </m:r>
+        <m:r>
+          <m:rPr>
+            <m:sty m:val="p"/>
+          </m:rPr>
+          <m:t>D</m:t>
+        </m:r>
+        <m:r>
+          <m:rPr>
+            <m:sty m:val="p"/>
+          </m:rPr>
+          <m:t>o</m:t>
+        </m:r>
+        <m:r>
+          <m:rPr>
+            <m:sty m:val="p"/>
+          </m:rPr>
+          <m:t>D</m:t>
+        </m:r>
+        <m:r>
+          <m:rPr>
+            <m:sty m:val="p"/>
+          </m:rPr>
+          <m:t>+</m:t>
+        </m:r>
+        <m:sSub>
+          <m:e>
+            <m:r>
+              <m:t>A</m:t>
+            </m:r>
+          </m:e>
+          <m:sub>
+            <m:r>
+              <m:t>t</m:t>
+            </m:r>
+          </m:sub>
+        </m:sSub>
+      </m:oMath>
+      <w:r>
+        <w:t xml:space="preserve">, em que</w:t>
+      </w:r>
+      <w:r>
+        <w:t xml:space="preserve"> </w:t>
+      </w:r>
+      <m:oMath>
+        <m:sSup>
+          <m:e>
+            <m:r>
+              <m:t>δ</m:t>
+            </m:r>
+          </m:e>
+          <m:sup>
+            <m:r>
+              <m:t>c</m:t>
+            </m:r>
+            <m:r>
+              <m:t>a</m:t>
+            </m:r>
+            <m:r>
+              <m:t>l</m:t>
+            </m:r>
+          </m:sup>
+        </m:sSup>
+      </m:oMath>
+      <w:r>
+        <w:t xml:space="preserve"> </w:t>
+      </w:r>
+      <w:r>
+        <w:t xml:space="preserve">é a perda por calendário,</w:t>
+      </w:r>
+      <w:r>
+        <w:t xml:space="preserve"> </w:t>
+      </w:r>
+      <m:oMath>
+        <m:sSup>
+          <m:e>
+            <m:r>
+              <m:t>δ</m:t>
+            </m:r>
+          </m:e>
+          <m:sup>
+            <m:r>
+              <m:t>c</m:t>
+            </m:r>
+            <m:r>
+              <m:t>i</m:t>
+            </m:r>
+            <m:r>
+              <m:t>c</m:t>
+            </m:r>
+          </m:sup>
+        </m:sSup>
+        <m:r>
+          <m:rPr>
+            <m:sty m:val="p"/>
+          </m:rPr>
+          <m:t>=</m:t>
+        </m:r>
+        <m:r>
+          <m:t>0</m:t>
+        </m:r>
+        <m:r>
+          <m:rPr>
+            <m:sty m:val="p"/>
+          </m:rPr>
+          <m:t>,</m:t>
+        </m:r>
+        <m:r>
+          <m:t>2</m:t>
+        </m:r>
+        <m:r>
+          <m:rPr>
+            <m:sty m:val="p"/>
+          </m:rPr>
+          <m:t>/</m:t>
+        </m:r>
+        <m:sSup>
+          <m:e>
+            <m:r>
+              <m:t>N</m:t>
+            </m:r>
+          </m:e>
+          <m:sup>
+            <m:r>
+              <m:t>c</m:t>
+            </m:r>
+            <m:r>
+              <m:t>i</m:t>
+            </m:r>
+            <m:r>
+              <m:t>c</m:t>
+            </m:r>
+          </m:sup>
+        </m:sSup>
+      </m:oMath>
+      <w:r>
+        <w:t xml:space="preserve"> </w:t>
+      </w:r>
+      <w:r>
+        <w:t xml:space="preserve">é a perda por ciclo equivalente, com fim de vida a 80% da capacidade após</w:t>
+      </w:r>
+      <w:r>
+        <w:t xml:space="preserve"> </w:t>
+      </w:r>
+      <m:oMath>
+        <m:sSup>
+          <m:e>
+            <m:r>
+              <m:t>N</m:t>
+            </m:r>
+          </m:e>
+          <m:sup>
+            <m:r>
+              <m:t>c</m:t>
+            </m:r>
+            <m:r>
+              <m:t>i</m:t>
+            </m:r>
+            <m:r>
+              <m:t>c</m:t>
+            </m:r>
+          </m:sup>
+        </m:sSup>
+      </m:oMath>
+      <w:r>
+        <w:t xml:space="preserve"> </w:t>
+      </w:r>
+      <w:r>
+        <w:t xml:space="preserve">ciclos,</w:t>
+      </w:r>
+      <w:r>
+        <w:t xml:space="preserve"> </w:t>
+      </w:r>
+      <m:oMath>
+        <m:r>
+          <m:t>D</m:t>
+        </m:r>
+      </m:oMath>
+      <w:r>
+        <w:t xml:space="preserve"> </w:t>
+      </w:r>
+      <w:r>
+        <w:t xml:space="preserve">é a energia retirada da bateria no ano e</w:t>
+      </w:r>
+      <w:r>
+        <w:t xml:space="preserve"> </w:t>
+      </w:r>
+      <m:oMath>
+        <m:sSub>
+          <m:e>
+            <m:r>
+              <m:t>A</m:t>
+            </m:r>
+          </m:e>
+          <m:sub>
+            <m:r>
+              <m:t>t</m:t>
+            </m:r>
+          </m:sub>
+        </m:sSub>
+      </m:oMath>
+      <w:r>
+        <w:t xml:space="preserve"> </w:t>
+      </w:r>
+      <w:r>
+        <w:t xml:space="preserve">é a energia reposta no início do ano, comprada sempre que a capacidade ao fim do ano ficaria abaixo da necessária para entregar</w:t>
+      </w:r>
+      <w:r>
+        <w:t xml:space="preserve"> </w:t>
+      </w:r>
+      <m:oMath>
+        <m:sSup>
+          <m:e>
+            <m:r>
+              <m:t>H</m:t>
+            </m:r>
+          </m:e>
+          <m:sup>
+            <m:r>
+              <m:t>c</m:t>
+            </m:r>
+            <m:r>
+              <m:t>a</m:t>
+            </m:r>
+            <m:r>
+              <m:t>p</m:t>
+            </m:r>
+          </m:sup>
+        </m:sSup>
+      </m:oMath>
+      <w:r>
+        <w:t xml:space="preserve"> </w:t>
+      </w:r>
+      <w:r>
+        <w:t xml:space="preserve">horas na potência do BESS,</w:t>
+      </w:r>
+      <w:r>
+        <w:t xml:space="preserve"> </w:t>
+      </w:r>
+      <m:oMath>
+        <m:sSup>
+          <m:e>
+            <m:acc>
+              <m:accPr>
+                <m:chr m:val="‾"/>
+              </m:accPr>
+              <m:e>
+                <m:r>
+                  <m:t>P</m:t>
+                </m:r>
+              </m:e>
+            </m:acc>
+          </m:e>
+          <m:sup>
+            <m:r>
+              <m:t>d</m:t>
+            </m:r>
+            <m:r>
+              <m:t>i</m:t>
+            </m:r>
+            <m:r>
+              <m:t>s</m:t>
+            </m:r>
+          </m:sup>
+        </m:sSup>
+        <m:sSup>
+          <m:e>
+            <m:r>
+              <m:t>H</m:t>
+            </m:r>
+          </m:e>
+          <m:sup>
+            <m:r>
+              <m:t>c</m:t>
+            </m:r>
+            <m:r>
+              <m:t>a</m:t>
+            </m:r>
+            <m:r>
+              <m:t>p</m:t>
+            </m:r>
+          </m:sup>
+        </m:sSup>
+        <m:r>
+          <m:rPr>
+            <m:sty m:val="p"/>
+          </m:rPr>
+          <m:t>/</m:t>
+        </m:r>
+        <m:r>
+          <m:rPr>
+            <m:sty m:val="p"/>
+          </m:rPr>
+          <m:t>(</m:t>
+        </m:r>
+        <m:sSup>
+          <m:e>
+            <m:r>
+              <m:t>η</m:t>
+            </m:r>
+          </m:e>
+          <m:sup>
+            <m:r>
+              <m:t>d</m:t>
+            </m:r>
+            <m:r>
+              <m:t>i</m:t>
+            </m:r>
+            <m:r>
+              <m:t>s</m:t>
+            </m:r>
+          </m:sup>
+        </m:sSup>
+        <m:r>
+          <m:t> </m:t>
+        </m:r>
+        <m:r>
+          <m:rPr>
+            <m:sty m:val="p"/>
+          </m:rPr>
+          <m:t>D</m:t>
+        </m:r>
+        <m:r>
+          <m:rPr>
+            <m:sty m:val="p"/>
+          </m:rPr>
+          <m:t>o</m:t>
+        </m:r>
+        <m:r>
+          <m:rPr>
+            <m:sty m:val="p"/>
+          </m:rPr>
+          <m:t>D</m:t>
+        </m:r>
+        <m:r>
+          <m:rPr>
+            <m:sty m:val="p"/>
+          </m:rPr>
+          <m:t>)</m:t>
+        </m:r>
+      </m:oMath>
+      <w:r>
+        <w:t xml:space="preserve">. Adotam-se</w:t>
+      </w:r>
+      <w:r>
+        <w:t xml:space="preserve"> </w:t>
+      </w:r>
+      <m:oMath>
+        <m:sSup>
+          <m:e>
+            <m:r>
+              <m:t>N</m:t>
+            </m:r>
+          </m:e>
+          <m:sup>
+            <m:r>
+              <m:t>c</m:t>
+            </m:r>
+            <m:r>
+              <m:t>i</m:t>
+            </m:r>
+            <m:r>
+              <m:t>c</m:t>
+            </m:r>
+          </m:sup>
+        </m:sSup>
+      </m:oMath>
+      <w:r>
+        <w:t xml:space="preserve"> </w:t>
+      </w:r>
+      <w:r>
+        <w:t xml:space="preserve">= 5.000 ciclos (4.000 a 6.000),</w:t>
+      </w:r>
+      <w:r>
+        <w:t xml:space="preserve"> </w:t>
+      </w:r>
+      <m:oMath>
+        <m:sSup>
+          <m:e>
+            <m:r>
+              <m:t>δ</m:t>
+            </m:r>
+          </m:e>
+          <m:sup>
+            <m:r>
+              <m:t>c</m:t>
+            </m:r>
+            <m:r>
+              <m:t>a</m:t>
+            </m:r>
+            <m:r>
+              <m:t>l</m:t>
+            </m:r>
+          </m:sup>
+        </m:sSup>
+      </m:oMath>
+      <w:r>
+        <w:t xml:space="preserve"> </w:t>
+      </w:r>
+      <w:r>
+        <w:t xml:space="preserve">= 1% ao ano (0,5% a 2%, hipótese) e preço igual à parcela do investimento que escala com a energia; o custo anual equivalente da reposição é comparado ao O&amp;M fixo do BESS na Seção 4.2.3.</w:t>
       </w:r>
     </w:p>
     <w:p>
@@ -29501,7 +30040,7 @@
         <w:t xml:space="preserve"> </w:t>
       </w:r>
       <w:r>
-        <w:t xml:space="preserve">o custo de degradação do BESS existente é proporcional à energia descarregada, sem dependência da profundidade de descarga, e seu valor de referência (R$ 50/MWh) é inferior ao custo integral de reposição dos módulos, o que é tratado por análise de sensibilidade; na decisão de construir o BESS, o desgaste do uso contratado está no O&amp;M fixo, e o uso mercantil mantém o custo por MWh, hipótese conservadora, pois o O&amp;M de referência já cobre cerca de um ciclo por dia;</w:t>
+        <w:t xml:space="preserve">o custo de degradação do BESS existente é proporcional à energia descarregada, sem dependência da profundidade de descarga, e seu valor de referência (R$ 50/MWh) é inferior ao custo integral de reposição dos módulos, o que é tratado por análise de sensibilidade; na decisão de construir o BESS, o desgaste do uso contratado está no O&amp;M fixo, e o uso mercantil mantém o custo por MWh, hipótese conservadora, pois o O&amp;M de referência já cobre cerca de um ciclo por dia; a reposição modelada explicitamente custa cerca de metade desse O&amp;M com um despacho diário, mas o excede com dois despachos diários (Seção 4.2.3);</w:t>
       </w:r>
     </w:p>
     <w:p>

</xml_diff>

<commit_message>
Validação do Benders contra o MILP monolítico (Tabela 4.2)
Sem contrato, mesmo lucro em 28 e 91 dias; com 182 e 365 dias o MILP direto
não converge em 30 min e fica abaixo do Benders. Com contrato de 3 t/dia, a
condição cíclica semanal custa 0,5-2,2% do lucro do mês.

Co-Authored-By: Claude Opus 5.5 <noreply@anthropic.com>
Claude-Session: https://claude.ai/code/session_01YFtn9hiQUHbNLSX7rUNYuK
</commit_message>
<xml_diff>
--- a/docs/dissertacao/cap3_metodologia.docx
+++ b/docs/dissertacao/cap3_metodologia.docx
@@ -12613,7 +12613,23 @@
         <w:t xml:space="preserve"> </w:t>
       </w:r>
       <w:r>
-        <w:t xml:space="preserve">de código aberto HiGHS (HUANGFU; HALL, 2018). Para o horizonte de uma semana, o problema é resolvido em menos de um segundo. Para o horizonte anual, entretanto, a solução direta não foi obtida em 15 minutos de processamento, o que motivou a adoção de uma estratégia de decomposição.</w:t>
+        <w:t xml:space="preserve">de código aberto HiGHS (HUANGFU; HALL, 2018). Para o horizonte de uma semana, o problema é resolvido em menos de um segundo. Para o horizonte anual, entretanto, a solução direta não foi obtida em 15 minutos de processamento e, com 30 minutos, terminou com</w:t>
+      </w:r>
+      <w:r>
+        <w:t xml:space="preserve"> </w:t>
+      </w:r>
+      <w:r>
+        <w:rPr>
+          <w:i/>
+          <w:iCs/>
+        </w:rPr>
+        <w:t xml:space="preserve">gap</w:t>
+      </w:r>
+      <w:r>
+        <w:t xml:space="preserve"> </w:t>
+      </w:r>
+      <w:r>
+        <w:t xml:space="preserve">de 0,09% e solução inferior à da decomposição (Seção 4.1), o que motivou a adoção de uma estratégia de decomposição.</w:t>
       </w:r>
     </w:p>
     <w:bookmarkEnd w:id="25"/>

</xml_diff>

<commit_message>
Lance mínimo como distribuição: Monte Carlo de custos e regras (Figura 4.4)
Mediana de R$ 1,44 mi/(MW.ano) e P10-P90 de R$ 1,17-1,78 mi para o BESS
dimensionado; duração de referência da EPE, reajuste pelo IPCA e cobrança
dupla da TUST explicam ~70% da variância.

Co-Authored-By: Claude Opus 5.5 <noreply@anthropic.com>
Claude-Session: https://claude.ai/code/session_01YFtn9hiQUHbNLSX7rUNYuK
</commit_message>
<xml_diff>
--- a/docs/dissertacao/cap3_metodologia.docx
+++ b/docs/dissertacao/cap3_metodologia.docx
@@ -27000,6 +27000,34 @@
       </m:oMath>
       <w:r>
         <w:t xml:space="preserve">. Ele é calculado com resolução de R$ 1 mil/(MW·ano) para as três faixas de investimento e as duas taxas de desconto do Quadro 3.3 e, no caso central, decomposto nas parcelas de capital, O&amp;M, uso da rede, consumo auxiliar, uso mercantil e tributos sobre a receita, cuja soma é o lance. Como os tributos sobre a venda de energia e de hidrogênio pouco mudam entre as alternativas com e sem BESS no lance mínimo, em que a operação do lado mercantil coincide, eles são considerados apenas na receita fixa.</w:t>
+      </w:r>
+    </w:p>
+    <w:p>
+      <w:pPr>
+        <w:pStyle w:val="BodyText"/>
+      </w:pPr>
+      <w:r>
+        <w:t xml:space="preserve">A análise de sensibilidade varia uma premissa de cada vez. Para expressar o lance como uma distribuição, as premissas de custo e de regra são também sorteadas por Monte Carlo, de forma independente, nas mesmas faixas, com probabilidades atribuídas pelo autor às regras ainda não confirmadas (duração de referência do custo, cobrança dupla da TUST, regime do PIS/Cofins, reajuste da receita, folga da CONCAP e despacho de dois ciclos diários); a importância de cada premissa é medida pela razão de correlação</w:t>
+      </w:r>
+      <w:r>
+        <w:t xml:space="preserve"> </w:t>
+      </w:r>
+      <m:oMath>
+        <m:sSup>
+          <m:e>
+            <m:r>
+              <m:t>η</m:t>
+            </m:r>
+          </m:e>
+          <m:sup>
+            <m:r>
+              <m:t>2</m:t>
+            </m:r>
+          </m:sup>
+        </m:sSup>
+      </m:oMath>
+      <w:r>
+        <w:t xml:space="preserve">, fração da variância do lance explicada por ela isoladamente (Seção 4.2.3).</w:t>
       </w:r>
     </w:p>
     <w:bookmarkEnd w:id="38"/>

</xml_diff>

<commit_message>
Documenta correspondência temporal do H2, troca de irradiância e tamanho da FV
Co-Authored-By: Claude Opus 5.5 <noreply@anthropic.com>
Claude-Session: https://claude.ai/code/session_01YFtn9hiQUHbNLSX7rUNYuK
</commit_message>
<xml_diff>
--- a/docs/dissertacao/cap3_metodologia.docx
+++ b/docs/dissertacao/cap3_metodologia.docx
@@ -11615,6 +11615,146 @@
       </m:oMath>
       <w:r>
         <w:t xml:space="preserve">, ela reproduz a vedação à importação. A janela semanal coincide com os blocos da decomposição (Seção 3.6.2), de modo que a restrição pertence integralmente a cada subproblema. O valor de 3,4 kgCO₂/kgH₂ corresponde aproximadamente ao limiar de emissões europeu para combustíveis renováveis de origem não biológica, de redução de 70% em relação ao comparador fóssil de 94 gCO₂eq/MJ (UNIÃO EUROPEIA, 2023b), e é avaliado como sensibilidade. Esse caso reproduz apenas o limiar de emissões, e não o critério europeu completo: para que a energia da rede seja contabilizada como renovável, o Regulamento Delegado (UE) 2023/1184 exige, além do limiar, contratos com instalações renováveis novas (adicionalidade) e correlação temporal e geográfica entre a produção renovável e o consumo do eletrolisador, salvo em zonas de mercado com mais de 90% de energia renovável ou com baixa intensidade de emissões (UNIÃO EUROPEIA, 2023a). Sem essas exigências, a energia importada da rede só tem a sua intensidade de emissões limitada.</w:t>
+      </w:r>
+    </w:p>
+    <w:p>
+      <w:pPr>
+        <w:pStyle w:val="BodyText"/>
+      </w:pPr>
+      <w:r>
+        <w:t xml:space="preserve">Como alternativa ao limite de intensidade, avalia-se também uma regra de correspondência temporal, inspirada no Regulamento Delegado (UE) 2023/1184, em que a energia comprada da rede, destinada só ao eletrolisador (Equação (3.20)), não excede, em cada janela</w:t>
+      </w:r>
+      <w:r>
+        <w:t xml:space="preserve"> </w:t>
+      </w:r>
+      <m:oMath>
+        <m:r>
+          <m:t>w</m:t>
+        </m:r>
+      </m:oMath>
+      <w:r>
+        <w:t xml:space="preserve"> </w:t>
+      </w:r>
+      <w:r>
+        <w:t xml:space="preserve">de 24 h ou de 168 h, a energia renovável exportada pela própria usina:</w:t>
+      </w:r>
+      <w:r>
+        <w:t xml:space="preserve"> </w:t>
+      </w:r>
+      <m:oMath>
+        <m:nary>
+          <m:naryPr>
+            <m:chr m:val="∑"/>
+            <m:limLoc m:val="undOvr"/>
+            <m:subHide m:val="off"/>
+            <m:supHide m:val="on"/>
+          </m:naryPr>
+          <m:sub>
+            <m:r>
+              <m:t>t</m:t>
+            </m:r>
+            <m:r>
+              <m:rPr>
+                <m:sty m:val="p"/>
+              </m:rPr>
+              <m:t>∈</m:t>
+            </m:r>
+            <m:r>
+              <m:t>w</m:t>
+            </m:r>
+          </m:sub>
+          <m:sup>
+            <m:r>
+              <m:t>​</m:t>
+            </m:r>
+          </m:sup>
+          <m:e>
+            <m:sSubSup>
+              <m:e>
+                <m:r>
+                  <m:t>p</m:t>
+                </m:r>
+              </m:e>
+              <m:sub>
+                <m:r>
+                  <m:t>t</m:t>
+                </m:r>
+              </m:sub>
+              <m:sup>
+                <m:r>
+                  <m:t>i</m:t>
+                </m:r>
+                <m:r>
+                  <m:t>m</m:t>
+                </m:r>
+                <m:r>
+                  <m:t>p</m:t>
+                </m:r>
+              </m:sup>
+            </m:sSubSup>
+          </m:e>
+        </m:nary>
+        <m:r>
+          <m:rPr>
+            <m:sty m:val="p"/>
+          </m:rPr>
+          <m:t>≤</m:t>
+        </m:r>
+        <m:nary>
+          <m:naryPr>
+            <m:chr m:val="∑"/>
+            <m:limLoc m:val="undOvr"/>
+            <m:subHide m:val="off"/>
+            <m:supHide m:val="on"/>
+          </m:naryPr>
+          <m:sub>
+            <m:r>
+              <m:t>t</m:t>
+            </m:r>
+            <m:r>
+              <m:rPr>
+                <m:sty m:val="p"/>
+              </m:rPr>
+              <m:t>∈</m:t>
+            </m:r>
+            <m:r>
+              <m:t>w</m:t>
+            </m:r>
+          </m:sub>
+          <m:sup>
+            <m:r>
+              <m:t>​</m:t>
+            </m:r>
+          </m:sup>
+          <m:e>
+            <m:sSubSup>
+              <m:e>
+                <m:r>
+                  <m:t>p</m:t>
+                </m:r>
+              </m:e>
+              <m:sub>
+                <m:r>
+                  <m:t>t</m:t>
+                </m:r>
+              </m:sub>
+              <m:sup>
+                <m:r>
+                  <m:t>e</m:t>
+                </m:r>
+                <m:r>
+                  <m:t>x</m:t>
+                </m:r>
+                <m:r>
+                  <m:t>p</m:t>
+                </m:r>
+              </m:sup>
+            </m:sSubSup>
+          </m:e>
+        </m:nary>
+      </m:oMath>
+      <w:r>
+        <w:t xml:space="preserve">. A janela mensal admitida pelo regulamento europeu até 2029 não é representável nos blocos semanais da decomposição; a janela semanal, mais restritiva, fornece um limite inferior para o seu efeito. Com janela horária, a regra equivale ao hidrogênio verde estrito, pois a usina não compra e vende energia na mesma hora.</w:t>
       </w:r>
     </w:p>
     <w:p>
@@ -30147,7 +30287,7 @@
         <w:t xml:space="preserve"> </w:t>
       </w:r>
       <w:r>
-        <w:t xml:space="preserve">no caso determinístico, a série de irradiância (2023) e a de preços (2025) referem-se a anos diferentes; no caso estocástico, o mesmo ocorre nos cenários de 2024 e 2025, que utilizam a irradiância de 2023. Para uma usina de pequeno porte em relação ao SIN, a correlação horária entre a geração local e o PLD tende a ser fraca, mas a hipótese deve ser considerada na interpretação dos resultados;</w:t>
+        <w:t xml:space="preserve">no caso determinístico, a série de irradiância (2023) e a de preços (2025) referem-se a anos diferentes; no caso estocástico, o mesmo ocorre nos cenários de 2024 e 2025, que utilizam a irradiância de 2023. Para uma usina de pequeno porte em relação ao SIN, a correlação horária entre a geração local e o PLD tende a ser fraca; trocando a irradiância dos cenários de 2024 e 2025 pela de 2021, 2022 e 2023, a potência ótima varia em no máximo 2,5 MW e a receita mínima de entrada em menos de R$ 1 mil/(MW·ano) (Seção 4.3.2);</w:t>
       </w:r>
     </w:p>
     <w:p>

</xml_diff>

<commit_message>
Documenta a curva de demanda de H2 por faixas
Com 1 ou 2 t/dia a R$ 35/kg e excedente a R$ 16/kg, a receita para ofertar
60 MW cai de R$ 895 mil para ~R$ 300 mil/(MW.ano); P* = 60 MW; lance
inalterado; equilíbrio do H2 de R$ 137-145/kg.

Co-Authored-By: Claude Opus 5.5 <noreply@anthropic.com>
Claude-Session: https://claude.ai/code/session_01YFtn9hiQUHbNLSX7rUNYuK
</commit_message>
<xml_diff>
--- a/docs/dissertacao/cap3_metodologia.docx
+++ b/docs/dissertacao/cap3_metodologia.docx
@@ -10741,6 +10741,354 @@
       </w:r>
       <w:r>
         <w:t xml:space="preserve">ilimitado.</w:t>
+      </w:r>
+    </w:p>
+    <w:p>
+      <w:pPr>
+        <w:pStyle w:val="BodyText"/>
+      </w:pPr>
+      <w:r>
+        <w:rPr>
+          <w:b/>
+          <w:bCs/>
+        </w:rPr>
+        <w:t xml:space="preserve">Curva de demanda por faixas.</w:t>
+      </w:r>
+      <w:r>
+        <w:t xml:space="preserve"> </w:t>
+      </w:r>
+      <w:r>
+        <w:t xml:space="preserve">Entre a demanda ilimitada a preço fixo e o contrato firme, o modelo admite também uma curva de demanda por faixas diárias, aproximação linear por partes de uma demanda elástica ao preço, técnica usada para representar demandas elásticas em modelos de otimização de mercados de energia. O hidrogênio vendido em cada dia é repartido em faixas</w:t>
+      </w:r>
+      <w:r>
+        <w:t xml:space="preserve"> </w:t>
+      </w:r>
+      <m:oMath>
+        <m:r>
+          <m:t>k</m:t>
+        </m:r>
+      </m:oMath>
+      <w:r>
+        <w:t xml:space="preserve"> </w:t>
+      </w:r>
+      <w:r>
+        <w:t xml:space="preserve">de volume máximo</w:t>
+      </w:r>
+      <w:r>
+        <w:t xml:space="preserve"> </w:t>
+      </w:r>
+      <m:oMath>
+        <m:sSub>
+          <m:e>
+            <m:acc>
+              <m:accPr>
+                <m:chr m:val="‾"/>
+              </m:accPr>
+              <m:e>
+                <m:r>
+                  <m:t>q</m:t>
+                </m:r>
+              </m:e>
+            </m:acc>
+          </m:e>
+          <m:sub>
+            <m:r>
+              <m:t>k</m:t>
+            </m:r>
+          </m:sub>
+        </m:sSub>
+      </m:oMath>
+      <w:r>
+        <w:t xml:space="preserve"> </w:t>
+      </w:r>
+      <w:r>
+        <w:t xml:space="preserve">e preço</w:t>
+      </w:r>
+      <w:r>
+        <w:t xml:space="preserve"> </w:t>
+      </w:r>
+      <m:oMath>
+        <m:sSub>
+          <m:e>
+            <m:r>
+              <m:t>π</m:t>
+            </m:r>
+          </m:e>
+          <m:sub>
+            <m:r>
+              <m:t>k</m:t>
+            </m:r>
+          </m:sub>
+        </m:sSub>
+      </m:oMath>
+      <w:r>
+        <w:t xml:space="preserve">, decrescente em</w:t>
+      </w:r>
+      <w:r>
+        <w:t xml:space="preserve"> </w:t>
+      </w:r>
+      <m:oMath>
+        <m:r>
+          <m:t>k</m:t>
+        </m:r>
+      </m:oMath>
+      <w:r>
+        <w:t xml:space="preserve">:</w:t>
+      </w:r>
+      <w:r>
+        <w:t xml:space="preserve"> </w:t>
+      </w:r>
+      <m:oMath>
+        <m:nary>
+          <m:naryPr>
+            <m:chr m:val="∑"/>
+            <m:limLoc m:val="undOvr"/>
+            <m:subHide m:val="off"/>
+            <m:supHide m:val="on"/>
+          </m:naryPr>
+          <m:sub>
+            <m:r>
+              <m:t>k</m:t>
+            </m:r>
+          </m:sub>
+          <m:sup>
+            <m:r>
+              <m:t>​</m:t>
+            </m:r>
+          </m:sup>
+          <m:e>
+            <m:sSub>
+              <m:e>
+                <m:r>
+                  <m:t>q</m:t>
+                </m:r>
+              </m:e>
+              <m:sub>
+                <m:r>
+                  <m:t>d</m:t>
+                </m:r>
+                <m:r>
+                  <m:rPr>
+                    <m:sty m:val="p"/>
+                  </m:rPr>
+                  <m:t>,</m:t>
+                </m:r>
+                <m:r>
+                  <m:t>k</m:t>
+                </m:r>
+              </m:sub>
+            </m:sSub>
+          </m:e>
+        </m:nary>
+        <m:r>
+          <m:rPr>
+            <m:sty m:val="p"/>
+          </m:rPr>
+          <m:t>=</m:t>
+        </m:r>
+        <m:nary>
+          <m:naryPr>
+            <m:chr m:val="∑"/>
+            <m:limLoc m:val="undOvr"/>
+            <m:subHide m:val="off"/>
+            <m:supHide m:val="on"/>
+          </m:naryPr>
+          <m:sub>
+            <m:r>
+              <m:t>t</m:t>
+            </m:r>
+            <m:r>
+              <m:rPr>
+                <m:sty m:val="p"/>
+              </m:rPr>
+              <m:t>∈</m:t>
+            </m:r>
+            <m:r>
+              <m:t>d</m:t>
+            </m:r>
+          </m:sub>
+          <m:sup>
+            <m:r>
+              <m:t>​</m:t>
+            </m:r>
+          </m:sup>
+          <m:e>
+            <m:sSub>
+              <m:e>
+                <m:r>
+                  <m:t>v</m:t>
+                </m:r>
+              </m:e>
+              <m:sub>
+                <m:r>
+                  <m:t>t</m:t>
+                </m:r>
+              </m:sub>
+            </m:sSub>
+          </m:e>
+        </m:nary>
+        <m:r>
+          <m:t> </m:t>
+        </m:r>
+        <m:r>
+          <m:rPr>
+            <m:sty m:val="p"/>
+          </m:rPr>
+          <m:t>Δ</m:t>
+        </m:r>
+        <m:r>
+          <m:t>t</m:t>
+        </m:r>
+      </m:oMath>
+      <w:r>
+        <w:t xml:space="preserve">, com</w:t>
+      </w:r>
+      <w:r>
+        <w:t xml:space="preserve"> </w:t>
+      </w:r>
+      <m:oMath>
+        <m:r>
+          <m:t>0</m:t>
+        </m:r>
+        <m:r>
+          <m:rPr>
+            <m:sty m:val="p"/>
+          </m:rPr>
+          <m:t>≤</m:t>
+        </m:r>
+        <m:sSub>
+          <m:e>
+            <m:r>
+              <m:t>q</m:t>
+            </m:r>
+          </m:e>
+          <m:sub>
+            <m:r>
+              <m:t>d</m:t>
+            </m:r>
+            <m:r>
+              <m:rPr>
+                <m:sty m:val="p"/>
+              </m:rPr>
+              <m:t>,</m:t>
+            </m:r>
+            <m:r>
+              <m:t>k</m:t>
+            </m:r>
+          </m:sub>
+        </m:sSub>
+        <m:r>
+          <m:rPr>
+            <m:sty m:val="p"/>
+          </m:rPr>
+          <m:t>≤</m:t>
+        </m:r>
+        <m:sSub>
+          <m:e>
+            <m:acc>
+              <m:accPr>
+                <m:chr m:val="‾"/>
+              </m:accPr>
+              <m:e>
+                <m:r>
+                  <m:t>q</m:t>
+                </m:r>
+              </m:e>
+            </m:acc>
+          </m:e>
+          <m:sub>
+            <m:r>
+              <m:t>k</m:t>
+            </m:r>
+          </m:sub>
+        </m:sSub>
+      </m:oMath>
+      <w:r>
+        <w:t xml:space="preserve">, e a receita do hidrogênio passa a ser</w:t>
+      </w:r>
+      <w:r>
+        <w:t xml:space="preserve"> </w:t>
+      </w:r>
+      <m:oMath>
+        <m:nary>
+          <m:naryPr>
+            <m:chr m:val="∑"/>
+            <m:limLoc m:val="undOvr"/>
+            <m:subHide m:val="off"/>
+            <m:supHide m:val="on"/>
+          </m:naryPr>
+          <m:sub>
+            <m:r>
+              <m:t>d</m:t>
+            </m:r>
+          </m:sub>
+          <m:sup>
+            <m:r>
+              <m:t>​</m:t>
+            </m:r>
+          </m:sup>
+          <m:e>
+            <m:nary>
+              <m:naryPr>
+                <m:chr m:val="∑"/>
+                <m:limLoc m:val="undOvr"/>
+                <m:subHide m:val="off"/>
+                <m:supHide m:val="on"/>
+              </m:naryPr>
+              <m:sub>
+                <m:r>
+                  <m:t>k</m:t>
+                </m:r>
+              </m:sub>
+              <m:sup>
+                <m:r>
+                  <m:t>​</m:t>
+                </m:r>
+              </m:sup>
+              <m:e>
+                <m:sSub>
+                  <m:e>
+                    <m:r>
+                      <m:t>π</m:t>
+                    </m:r>
+                  </m:e>
+                  <m:sub>
+                    <m:r>
+                      <m:t>k</m:t>
+                    </m:r>
+                  </m:sub>
+                </m:sSub>
+              </m:e>
+            </m:nary>
+          </m:e>
+        </m:nary>
+        <m:r>
+          <m:t> </m:t>
+        </m:r>
+        <m:sSub>
+          <m:e>
+            <m:r>
+              <m:t>q</m:t>
+            </m:r>
+          </m:e>
+          <m:sub>
+            <m:r>
+              <m:t>d</m:t>
+            </m:r>
+            <m:r>
+              <m:rPr>
+                <m:sty m:val="p"/>
+              </m:rPr>
+              <m:t>,</m:t>
+            </m:r>
+            <m:r>
+              <m:t>k</m:t>
+            </m:r>
+          </m:sub>
+        </m:sSub>
+      </m:oMath>
+      <w:r>
+        <w:t xml:space="preserve">. Como os preços decrescem, a receita é côncava no volume, e o ótimo preenche as faixas em ordem, sem variáveis binárias. Avaliam-se duas curvas: até 1 t/dia ou até 2 t/dia a R$ 35/kg, preço de um comprador de hidrogênio renovável, e o excedente a R$ 16/kg, paridade com o hidrogênio de origem fóssil (US$ 3/kg, extremo superior da faixa indicada pela IEA, convertido pela PTAX), acima da qual o comprador recorreria ao hidrogênio cinza.</w:t>
       </w:r>
     </w:p>
     <w:p>
@@ -30324,7 +30672,7 @@
         <w:t xml:space="preserve"> </w:t>
       </w:r>
       <w:r>
-        <w:t xml:space="preserve">sobre volumes anuais, flexibilidade de entrega entre dias, reajuste de preço ou a venda do excedente a outros compradores, e a multa adotada, igual ao preço do hidrogênio, é um valor de referência ainda não calibrado com contratos reais. Somada à receita perdida, ela custa ao empreendedor R$ 70 por kg não entregue, o que torna o contrato praticamente firme e eleva o valor atribuído ao BESS no seu cumprimento (Seção 3.4.5);</w:t>
+        <w:t xml:space="preserve">sobre volumes anuais, flexibilidade de entrega entre dias, reajuste de preço ou a venda do excedente a outros compradores, e a multa adotada, igual ao preço do hidrogênio, é um valor de referência ainda não calibrado com contratos reais. Somada à receita perdida, ela custa ao empreendedor R$ 70 por kg não entregue, o que torna o contrato praticamente firme e eleva o valor atribuído ao BESS no seu cumprimento (Seção 3.4.5). No caso de referência, a demanda é ilimitada a preço fixo; a curva por faixas aproxima uma demanda elástica com apenas duas faixas, cujos volumes e preços são hipóteses, e não incorpora a incerteza da demanda entre cenários;</w:t>
       </w:r>
     </w:p>
     <w:p>

</xml_diff>